<commit_message>
Regenerate Book 1 reading copy after copyedit
Co-Authored-By: Claude Opus 5.5 (1M context) <noreply@anthropic.com>
Claude-Session: https://claude.ai/code/session_01FFN9ELo4KWKZsTKbpif5Vz
</commit_message>
<xml_diff>
--- a/exports/Ides_Book1_FULL_Ch01-34.docx
+++ b/exports/Ides_Book1_FULL_Ch01-34.docx
@@ -27,7 +27,7 @@
         <w:br/>
         <w:t>Book 1 reading export · dinner-first opening · ends at Philippi · author-voice (no em dash)</w:t>
         <w:br/>
-        <w:t>Source: Manuscript f0bb9be (2026-10-22) · generated 2026-10-22 11:56 UTC from claude/project-thread-33runi @ 521b20f · source digest cfe7de4ebb53babc · chapters 1–34</w:t>
+        <w:t>Source: Manuscript f395a6b (2026-10-22) · generated 2026-10-22 12:48 UTC from main @ f395a6b · source digest c2bc4ba377269b30 · chapters 1–34</w:t>
       </w:r>
     </w:p>
     <w:p>
@@ -79,19 +79,19 @@
     <w:p>
       <w:r>
         <w:rPr/>
-        <w:t>The host had given him the third couch, a seat chosen the way a man chooses which cloak to lend a stranger. Not an insult. Not an honour. Sextilius had the couch beside it, still pink from the bath and the afternoon's flattery.</w:t>
-      </w:r>
-    </w:p>
-    <w:p>
-      <w:r>
-        <w:rPr/>
-        <w:t>“They have put us together as a lesson,” Sextilius murmured, tearing bread. “Here is the man who joined Caesar's side early. Here is the man who joined it eventually. Observe the difference in the cushions.”</w:t>
-      </w:r>
-    </w:p>
-    <w:p>
-      <w:r>
-        <w:rPr/>
-        <w:t>“I can't see a difference.”</w:t>
+        <w:t>The host had given him the third couch, a seat chosen the way a man chooses which cloak to lend a stranger. Not an insult. Not an honour. Sextilius had the couch beside it, still pink from the bath and the afternoon’s flattery.</w:t>
+      </w:r>
+    </w:p>
+    <w:p>
+      <w:r>
+        <w:rPr/>
+        <w:t>“They have put us together as a lesson,” Sextilius murmured, tearing bread. “Here is the man who joined Caesar’s side early. Here is the man who joined it eventually. Observe the difference in the cushions.”</w:t>
+      </w:r>
+    </w:p>
+    <w:p>
+      <w:r>
+        <w:rPr/>
+        <w:t>“I can’t see a difference.”</w:t>
       </w:r>
     </w:p>
     <w:p>
@@ -279,7 +279,17 @@
     <w:p>
       <w:r>
         <w:rPr/>
-        <w:t>Sextilius leaned in, wine-bright, while Aebutius explained the Phaedo to Tettius in the tone of a man correcting a tax return. “Digest carefully. There is talk the queen across the river keeps a child under Caesar’s roof. Private hours. Fresh paint. Best not to notice aloud.”</w:t>
+        <w:t xml:space="preserve">Sextilius leaned in, wine-bright, while Aebutius explained the </w:t>
+      </w:r>
+      <w:r>
+        <w:rPr>
+          <w:i/>
+        </w:rPr>
+        <w:t>Phaedo</w:t>
+      </w:r>
+      <w:r>
+        <w:rPr/>
+        <w:t xml:space="preserve"> to Tettius in the tone of a man correcting a tax return. “Digest carefully. There is talk the queen across the river keeps a child under Caesar’s roof. Private hours. Fresh paint. Best not to notice aloud.”</w:t>
       </w:r>
     </w:p>
     <w:p>
@@ -459,7 +469,7 @@
     <w:p>
       <w:r>
         <w:rPr/>
-        <w:t>“Thapsus,” someone said. Then: “Cato.” The names were not fresh, but the Forum still wanted them loud. Shouts. Bets. Sudden philosophy, months after the runner’s dust should have settled. A man at the next board was still arguing Utica hard enough to reopen a vein. Hordeonius didn't shout. Shouting was for men who sold certainty by the jug.</w:t>
+        <w:t>“Thapsus,” someone said. Then: “Cato.” The names were not fresh, but the Forum still wanted them loud. Shouts. Bets. Sudden philosophy, months after the runner’s dust should have settled. A man at the next board was still arguing Utica hard enough to reopen a vein. Hordeonius didn’t shout. Shouting was for men who sold certainty by the jug.</w:t>
       </w:r>
     </w:p>
     <w:p>
@@ -704,7 +714,7 @@
     <w:p>
       <w:r>
         <w:rPr/>
-        <w:t>Captives. Gold. Painted lies on wagons. Four triumphs in one month: Gaul, Egypt, Pontus, Africa. Rome had swallowed Caesar’s whole war in four courses, and Africa had been the last, and the taste was still on the street. Phileros had sent her for oil and eyes: watch who lingered near the Domus Publica’s public smile, count which clients arrived early to borrow the house’s favour. She understood tasks. She didn't understand why men needed wagons to prove they had already won.</w:t>
+        <w:t>Captives. Gold. Painted lies on wagons. Four triumphs in one month: Gaul, Egypt, Pontus, Africa. Rome had swallowed Caesar’s whole war in four courses, and Africa had been the last, and the taste was still on the street. Phileros had sent her for oil and eyes: watch who lingered near the Domus Publica’s public smile, count which clients arrived early to borrow the house’s favour. She understood tasks. She didn’t understand why men needed wagons to prove they had already won.</w:t>
       </w:r>
     </w:p>
     <w:p>
@@ -788,7 +798,7 @@
     <w:p>
       <w:r>
         <w:rPr/>
-        <w:t>Caesar passed at the edge of sight. Or a litter that might as well have been him. She saw only enough to know the house she served was tied to this noise. He didn't look at her. Great men didn't look at errands. She preferred it. Looking made you responsible for what you saw.</w:t>
+        <w:t>Caesar passed at the edge of sight. Or a litter that might as well have been him. She saw only enough to know the house she served was tied to this noise. He didn’t look at her. Great men didn’t look at errands. She preferred it. Looking made you responsible for what you saw.</w:t>
       </w:r>
     </w:p>
     <w:p>
@@ -956,7 +966,7 @@
     <w:p>
       <w:r>
         <w:rPr/>
-        <w:t>When Seius’ turn came, the patron’s nod was thin, already halfway to the next man.</w:t>
+        <w:t>When Seius’s turn came, the patron’s nod was thin, already halfway to the next man.</w:t>
       </w:r>
     </w:p>
     <w:p>
@@ -974,7 +984,7 @@
     <w:p>
       <w:r>
         <w:rPr/>
-        <w:t>Seius smiled like a man who owned useful things. He didn't. He owned a sister’s strained dowry talk and a talent for sweating through wool.</w:t>
+        <w:t>Seius smiled like a man who owned useful things. He didn’t. He owned a sister’s strained dowry talk and a talent for sweating through wool.</w:t>
       </w:r>
     </w:p>
     <w:p>
@@ -986,7 +996,7 @@
     <w:p>
       <w:r>
         <w:rPr/>
-        <w:t>Outside, in the lane’s cold, the middleman who smelled of Hordeonius’ wax waited with the patience of a professional accident. Seius had already borrowed for the toga and for a jar of oil good enough to be seen carrying. Now, it appeared, he would borrow for the borrowing. The sum was small enough to feel temporary and large enough to change what dinners Seius could refuse.</w:t>
+        <w:t>Outside, in the lane’s cold, the middleman who smelled of Hordeonius’s wax waited with the patience of a professional accident. Seius had already borrowed for the toga and for a jar of oil good enough to be seen carrying. Now, it appeared, he would borrow for the borrowing. The sum was small enough to feel temporary and large enough to change what dinners Seius could refuse.</w:t>
       </w:r>
     </w:p>
     <w:p>
@@ -1040,13 +1050,13 @@
     <w:p>
       <w:r>
         <w:rPr/>
-        <w:t>Seius took the terms because refusal meant standing still, and Seia Prima didn't reward stillness. He passed two clients still comparing whose patron had smiled wider. Comparison was the atrium’s second religion. Seius did not join. He was busy inventing a wider smile for home.</w:t>
-      </w:r>
-    </w:p>
-    <w:p>
-      <w:r>
-        <w:rPr/>
-        <w:t>At the house threshold Seia Prima was already waiting with a broom she did not need, waiting was her way of auditing. She took one look at his mouth and did not ask about the atrium.</w:t>
+        <w:t>Seius took the terms because refusal meant standing still, and Seia Prima didn’t reward stillness. He passed two clients still comparing whose patron had smiled wider. Comparison was the atrium’s second religion. Seius did not join. He was busy inventing a wider smile for home.</w:t>
+      </w:r>
+    </w:p>
+    <w:p>
+      <w:r>
+        <w:rPr/>
+        <w:t>At the house threshold Seia Prima was already waiting with a broom she did not need; waiting was her way of auditing. She took one look at his mouth and did not ask about the atrium.</w:t>
       </w:r>
     </w:p>
     <w:p>
@@ -1335,7 +1345,27 @@
     <w:p>
       <w:r>
         <w:rPr/>
-        <w:t>An older miles on his right mumbled a prayer that sounded like a shopping list: knees, sons, the next donative, land near Capua if the gods and clerks both remembered. Laberius didn’t mock him. He still needed water. He filed donative dated beside colony rumour the way he filed water: needed, not guaranteed.</w:t>
+        <w:t xml:space="preserve">An older miles on his right mumbled a prayer that sounded like a shopping list: knees, sons, the next donative, land near Capua if the gods and clerks both remembered. Laberius didn’t mock him. He still needed water. He filed </w:t>
+      </w:r>
+      <w:r>
+        <w:rPr>
+          <w:i/>
+        </w:rPr>
+        <w:t>donative dated</w:t>
+      </w:r>
+      <w:r>
+        <w:rPr/>
+        <w:t xml:space="preserve"> beside </w:t>
+      </w:r>
+      <w:r>
+        <w:rPr>
+          <w:i/>
+        </w:rPr>
+        <w:t>colony rumour</w:t>
+      </w:r>
+      <w:r>
+        <w:rPr/>
+        <w:t xml:space="preserve"> the way he filed water: needed, not guaranteed.</w:t>
       </w:r>
     </w:p>
     <w:p>
@@ -1740,7 +1770,7 @@
     <w:p>
       <w:r>
         <w:rPr/>
-        <w:t>On the temple steps above the Forum, heat came off the stone into Octavian’s thin shoes. He stood where important men’s shadows fell and practiced being invisible on purpose.</w:t>
+        <w:t>On the temple steps above the Forum, heat came off the stone into Octavian’s thin shoes. He stood where important men’s shadows fell and practised being invisible on purpose.</w:t>
       </w:r>
     </w:p>
     <w:p>
@@ -1935,7 +1965,7 @@
     <w:p>
       <w:r>
         <w:rPr/>
-        <w:t>“When he calls,” Octavian agreed. He almost added a colder clause about mouths and mornings, then bit it off. He kept what he could own without saying it: the dust route, the wind, Agrippa’s stubborn loyalty, and the attendant’s late bow, filed where names that arrive early get spent.</w:t>
+        <w:t>“When he calls,” Octavian agreed. He almost added a colder clause about mouths and mornings, then bit it off. He kept what he could own without saying it: the dust-route, the wind, Agrippa’s stubborn loyalty, and the attendant’s late bow, filed where names that arrive early get spent.</w:t>
       </w:r>
     </w:p>
     <w:p>
@@ -2766,7 +2796,7 @@
     <w:p>
       <w:r>
         <w:rPr/>
-        <w:t>Brutus’ jaw worked, as if clemency were a coin under his tongue he had not chosen to swallow. The diadem’s fear still hung between them. Cassius watched it try to dress postponement up as virtue. “If, only if, anything were ever done, it would have to be law’s face, not a street. I have not agreed to a plan. I have named the only face I could live with. That is not permission.”</w:t>
+        <w:t>Brutus’s jaw worked, as if clemency were a coin under his tongue he had not chosen to swallow. The diadem’s fear still hung between them. Cassius watched it try to dress postponement up as virtue. “If, only if, anything were ever done, it would have to be law’s face, not a street. I have not agreed to a plan. I have named the only face I could live with. That is not permission.”</w:t>
       </w:r>
     </w:p>
     <w:p>
@@ -2956,7 +2986,7 @@
     <w:p>
       <w:r>
         <w:rPr/>
-        <w:t>“Not now,” he said. “Send to Atticus’ people if they want Latin about ditches.”</w:t>
+        <w:t>“Not now,” he said. “Send to Atticus’s people if they want Latin about ditches.”</w:t>
       </w:r>
     </w:p>
     <w:p>
@@ -3379,7 +3409,7 @@
     <w:p>
       <w:r>
         <w:rPr/>
-        <w:t>Cassius’ nod was small. Small nods moved armies.</w:t>
+        <w:t>Cassius’s nod was small. Small nods moved armies.</w:t>
       </w:r>
     </w:p>
     <w:p>
@@ -3670,7 +3700,17 @@
     <w:p>
       <w:r>
         <w:rPr/>
-        <w:t>“I am with the Republic,” Seius said, which was what men said when they meant I am with my skin.</w:t>
+        <w:t xml:space="preserve">“I am with the Republic,” Seius said, which was what men said when they meant </w:t>
+      </w:r>
+      <w:r>
+        <w:rPr>
+          <w:i/>
+        </w:rPr>
+        <w:t>I am with my skin</w:t>
+      </w:r>
+      <w:r>
+        <w:rPr/>
+        <w:t>.</w:t>
       </w:r>
     </w:p>
     <w:p>
@@ -3811,7 +3851,17 @@
     <w:p>
       <w:r>
         <w:rPr/>
-        <w:t>Paullus left offended in the expensive way. Hordeonius blotted nothing. He only entered inquiry, political softness, refuse in a hand so neat it looked like virtue, then checked his ring.</w:t>
+        <w:t xml:space="preserve">Paullus left offended in the expensive way. Hordeonius blotted nothing. He only entered </w:t>
+      </w:r>
+      <w:r>
+        <w:rPr>
+          <w:i/>
+        </w:rPr>
+        <w:t>inquiry, political softness, refuse</w:t>
+      </w:r>
+      <w:r>
+        <w:rPr/>
+        <w:t xml:space="preserve"> in a hand so neat it looked like virtue, then checked his ring.</w:t>
       </w:r>
     </w:p>
     <w:p>
@@ -3829,7 +3879,17 @@
     <w:p>
       <w:r>
         <w:rPr/>
-        <w:t>“Then bring me a name that bleeds,” Hordeonius said, already blotting. “Otherwise Visellius pays as written.” He entered soft hours, storm weather without looking up. A consul walking free of a bad morning was the kind of morning he would not underwrite without an invoice. “I sell umbrellas. I do not join the rain.”</w:t>
+        <w:t xml:space="preserve">“Then bring me a name that bleeds,” Hordeonius said, already blotting. “Otherwise Visellius pays as written.” He entered </w:t>
+      </w:r>
+      <w:r>
+        <w:rPr>
+          <w:i/>
+        </w:rPr>
+        <w:t>soft hours, storm weather</w:t>
+      </w:r>
+      <w:r>
+        <w:rPr/>
+        <w:t xml:space="preserve"> without looking up. A consul walking free of a bad morning was the kind of morning he would not underwrite without an invoice. “I sell umbrellas. I do not join the rain.”</w:t>
       </w:r>
     </w:p>
     <w:p>
@@ -3898,7 +3958,17 @@
     <w:p>
       <w:r>
         <w:rPr/>
-        <w:t>He took copies, left the originals for whoever played magistrate this week, and entered Visellius, A.: doubtful with a care that felt like closing a child’s eyes. On the street he heard his own name already mutating into rumour, interest you paid without a contract. Tablets, he noted, could kill as quietly as speeches.</w:t>
+        <w:t xml:space="preserve">He took copies, left the originals for whoever played magistrate this week, and entered </w:t>
+      </w:r>
+      <w:r>
+        <w:rPr>
+          <w:i/>
+        </w:rPr>
+        <w:t>Visellius, A.: doubtful</w:t>
+      </w:r>
+      <w:r>
+        <w:rPr/>
+        <w:t xml:space="preserve"> with a care that felt like closing a child’s eyes. On the street he heard his own name already mutating into rumour, interest you paid without a contract. Tablets, he noted, could kill as quietly as speeches.</w:t>
       </w:r>
     </w:p>
     <w:p>
@@ -4396,7 +4466,7 @@
     <w:p>
       <w:r>
         <w:rPr/>
-        <w:t>The visitor himself, someone Decimus-shaped, or Trebonius-shaped; she never got the face clean, was in the atrium speaking cheerfully about schedules. Cheerful men blended into the walls in this house. He praised the household’s order loud enough for any door-slave to sell later as loyalty. The attendant, waiting with a cloak, answered with the smile attendants wore when masters performed friendship, then, to another cloak, soft enough that stone might miss it:</w:t>
+        <w:t>The visitor himself (someone Decimus-shaped, or Trebonius-shaped; she never got the face clean) was in the atrium speaking cheerfully about schedules. Cheerful men blended into the walls in this house. He praised the household’s order loud enough for any door-slave to sell later as loyalty. The attendant, waiting with a cloak, answered with the smile attendants wore when masters performed friendship, then, to another cloak, soft enough that stone might miss it:</w:t>
       </w:r>
     </w:p>
     <w:p>
@@ -4675,7 +4745,7 @@
     <w:p>
       <w:r>
         <w:rPr/>
-        <w:t>“Bores,” Trebonius said, “also hold consuls while better men invent their knives.” He sipped nothing from an empty hand and went to practice a longer hold. The spare-Antony mercy now had a body attached: Trebonius’s voice as a leash.</w:t>
+        <w:t>“Bores,” Trebonius said, “also hold consuls while better men invent their knives.” He sipped nothing from an empty hand and went to practise a longer hold. The spare-Antony mercy now had a body attached: Trebonius’s voice as a leash.</w:t>
       </w:r>
     </w:p>
     <w:p>
@@ -5327,7 +5397,7 @@
     <w:p>
       <w:r>
         <w:rPr/>
-        <w:t>The Sacra Via was already loud. March mornings in Rome never waited for great men. Shop fronts were opening. Someone argued about fish. Decimus walked through it with the cheer of a man sent to collect a friend for dinner. The dinner was the Senate. The friend was Caesar. Decimus’ heart sat in his throat like a swallowed coin.</w:t>
+        <w:t>The Sacra Via was already loud. March mornings in Rome never waited for great men. Shop fronts were opening. Someone argued about fish. Decimus walked through it with the cheer of a man sent to collect a friend for dinner. The dinner was the Senate. The friend was Caesar. Decimus’s heart sat in his throat like a swallowed coin.</w:t>
       </w:r>
     </w:p>
     <w:p>
@@ -5445,7 +5515,7 @@
     <w:p>
       <w:r>
         <w:rPr/>
-        <w:t>“Enough,” Caesar said, and the room rearranged around the word. His gaze flicked, doors, lists, Decimus’ face, Calpurnia’s knuckles white on wood. “The sacrifices have been sour.”</w:t>
+        <w:t>“Enough,” Caesar said, and the room rearranged around the word. His gaze flicked, doors, lists, Decimus’s face, Calpurnia’s knuckles white on wood. “The sacrifices have been sour.”</w:t>
       </w:r>
     </w:p>
     <w:p>
@@ -5481,7 +5551,17 @@
     <w:p>
       <w:r>
         <w:rPr/>
-        <w:t>He put out his hand, and his chin tipped, half a breath, the old road signal: ditch clear, philosophy later. Calpurnia saw it. Her mouth tightened. She recognised the habit that had always meant he will go with this man. Decimus felt the tip fail under her eyes, too small a betrayal to name, too large to take back, and held the hand open anyway without finishing the joke that used to follow the tip in Spain.</w:t>
+        <w:t xml:space="preserve">He put out his hand, and his chin tipped, half a breath, the old road signal: ditch clear, philosophy later. Calpurnia saw it. Her mouth tightened. She recognised the habit that had always meant </w:t>
+      </w:r>
+      <w:r>
+        <w:rPr>
+          <w:i/>
+        </w:rPr>
+        <w:t>he will go with this man</w:t>
+      </w:r>
+      <w:r>
+        <w:rPr/>
+        <w:t>. Decimus felt the tip fail under her eyes, too small a betrayal to name, too large to take back, and held the hand open anyway without finishing the joke that used to follow the tip in Spain.</w:t>
       </w:r>
     </w:p>
     <w:p>
@@ -5511,7 +5591,7 @@
     <w:p>
       <w:r>
         <w:rPr/>
-        <w:t>Caesar didn’t speak. Decimus filled the air anyway, soft logistics, the chatter of loyalty: which way, how many, Antony would be, Antony would be held. Trebonius’ job. Decimus didn’t say that. He said, “It will be a short session,” and smiled. Shortness was not mercy. It only sounded like it.</w:t>
+        <w:t>Caesar didn’t speak. Decimus filled the air anyway, soft logistics, the chatter of loyalty: which way, how many, Antony would be, Antony would be held. Trebonius’s job. Decimus didn’t say that. He said, “It will be a short session,” and smiled. Shortness was not mercy. It only sounded like it.</w:t>
       </w:r>
     </w:p>
     <w:p>
@@ -5592,7 +5672,7 @@
     <w:p>
       <w:r>
         <w:rPr/>
-        <w:t>Phileros’ lamp bobbed from the vestibule. “If it’s thieves…”</w:t>
+        <w:t>Phileros’s lamp bobbed from the vestibule. “If it’s thieves…”</w:t>
       </w:r>
     </w:p>
     <w:p>
@@ -5640,7 +5720,7 @@
     <w:p>
       <w:r>
         <w:rPr/>
-        <w:t>Against her ribs, under linen, the wax fragment held its few words. Pressed yesterday when a visitor’s attendant had muttered near the peristyle, wrong-ended: friends, spare, stay, danger, something like consul. She hadn’t understood the Senate-shape of it. She understood enough to be afraid of Phileros finding it. Phileros believed door-knowledge was a priesthood, and priesthoods did not share.</w:t>
+        <w:t>Against her ribs, under linen, the wax fragment held its few words. Pressed yesterday when a visitor’s attendant had muttered near the peristyle, wrong-ended: friends, spare, stay, danger, something like consul. She hadn’t understood the Senate shape of it. She understood enough to be afraid of Phileros finding it. Phileros believed door-knowledge was a priesthood, and priesthoods did not share.</w:t>
       </w:r>
     </w:p>
     <w:p>
@@ -5700,7 +5780,7 @@
     <w:p>
       <w:r>
         <w:rPr/>
-        <w:t>What would she hand Caesar? A mutter? Against Decimus’ open hands and the Senate’s hunger for his attendance? Against Calpurnia’s broken weather, already spent?</w:t>
+        <w:t>What would she hand Caesar? A mutter? Against Decimus’s open hands and the Senate’s hunger for his attendance? Against Calpurnia’s broken weather, already spent?</w:t>
       </w:r>
     </w:p>
     <w:p>
@@ -5742,7 +5822,7 @@
     <w:p>
       <w:r>
         <w:rPr/>
-        <w:t>She knew only that her fragment had failed in a vestibule that smelled of onion, and that Decimus’ cheer still hung in the atrium like perfume after a guest has gone.</w:t>
+        <w:t>She knew only that her fragment had failed in a vestibule that smelled of onion, and that Decimus’s cheer still hung in the atrium like perfume after a guest has gone.</w:t>
       </w:r>
     </w:p>
     <w:p>
@@ -5790,7 +5870,7 @@
     <w:p>
       <w:r>
         <w:rPr/>
-        <w:t>“A man from the college. Or a man who knows a man from the college.” Phileros’ shoulders performed helplessness. “They always look insulted if you want them to.”</w:t>
+        <w:t>“A man from the college. Or a man who knows a man from the college.” Phileros’s shoulders performed helplessness. “They always look insulted if you want them to.”</w:t>
       </w:r>
     </w:p>
     <w:p>
@@ -6045,7 +6125,7 @@
     <w:p>
       <w:r>
         <w:rPr/>
-        <w:t>At the portico of Pompey the air changed. Shade, columns, the smell of stone that had watched other men’s ambitions. The Senate sat here while their own house stayed unfinished; Pompey’s statue waited inside. Senators clustered in the false casualness of men who had arrived early on purpose. Decimus saw Casca’s shoulder, Tillius’ mouth already shaped for petition, Cassius too still. Brutus stood carved for a different century.</w:t>
+        <w:t>At the portico of Pompey the air changed. Shade, columns, the smell of stone that had watched other men’s ambitions. The Senate sat here while their own house stayed unfinished; Pompey’s statue waited inside. Senators clustered in the false casualness of men who had arrived early on purpose. Decimus saw Casca’s shoulder, Tillius’s mouth already shaped for petition, Cassius too still. Brutus stood carved for a different century.</w:t>
       </w:r>
     </w:p>
     <w:p>
@@ -6081,7 +6161,7 @@
     <w:p>
       <w:r>
         <w:rPr/>
-        <w:t>Decimus wiped his clean hands on his tunic, once, where no one would see, and went to find Trebonius’ eye.</w:t>
+        <w:t>Decimus wiped his clean hands on his tunic, once, where no one would see, and went to find Trebonius’s eye.</w:t>
       </w:r>
     </w:p>
     <w:p>
@@ -6096,7 +6176,7 @@
     <w:p>
       <w:r>
         <w:rPr/>
-        <w:t>Antony liked the Theatre of Pompey complex the way soldiers liked any place with shade and a crowd to read. Columns made people smaller. Smaller people told the truth faster, or lied worse, either was useful.</w:t>
+        <w:t>Antony liked the Theatre of Pompey complex the way soldiers liked any place with shade and a crowd to read. Columns made people smaller. Smaller people told the truth faster, or lied worse; either was useful.</w:t>
       </w:r>
     </w:p>
     <w:p>
@@ -6126,7 +6206,7 @@
     <w:p>
       <w:r>
         <w:rPr/>
-        <w:t>“It’s a man in my debt who swears he has news from Gaul that won’t keep.” Trebonius’ hand on Antony’s elbow was friendly. Friendly hands steered. Antony allowed himself to be steered a few paces into the portico’s shoulder, where the Senate’s murmur became a wall.</w:t>
+        <w:t>“It’s a man in my debt who swears he has news from Gaul that won’t keep.” Trebonius’s hand on Antony’s elbow was friendly. Friendly hands steered. Antony allowed himself to be steered a few paces into the portico’s shoulder, where the Senate’s murmur became a wall.</w:t>
       </w:r>
     </w:p>
     <w:p>
@@ -6216,7 +6296,7 @@
     <w:p>
       <w:r>
         <w:rPr/>
-        <w:t>Antony’s body understood before his politics did. He shook Trebonius’ hand off without thinking it rude.</w:t>
+        <w:t>Antony’s body understood before his politics did. He shook Trebonius’s hand off without thinking it rude.</w:t>
       </w:r>
     </w:p>
     <w:p>
@@ -6228,7 +6308,7 @@
     <w:p>
       <w:r>
         <w:rPr/>
-        <w:t>Trebonius’ face was still warm. Warm, while the Curia poured men out like a broken jar. Togas, bare heads, eyes too white.</w:t>
+        <w:t>Trebonius’s face was still warm. Warm, while the Curia poured men out like a broken jar. Togas, bare heads, eyes too white.</w:t>
       </w:r>
     </w:p>
     <w:p>
@@ -6294,7 +6374,7 @@
     <w:p>
       <w:r>
         <w:rPr/>
-        <w:t xml:space="preserve">One door. Too many togae. Benches ran along both sides in tiers. Pompey’s statue at the far end of the room, enemy’s face in marble, watching: the most honest piece of furniture in Rome. Caesar came in with that slight forward lean of a man late for his own power, Decimus’ cheer still faintly on him like perfume. He sat. Or half-sat. The golden chair made its small theatre of precedence: the Senate’s own vote, gilt above their benches, saying </w:t>
+        <w:t xml:space="preserve">One door. Too many togas. Benches ran along both sides in tiers. Pompey’s statue at the far end of the room, enemy’s face in marble, watching: the most honest piece of furniture in Rome. Caesar came in with that slight forward lean of a man late for his own power, Decimus’s cheer still faintly on him like perfume. He sat. Or half-sat. The golden chair made its small theatre of precedence: the Senate’s own vote, gilt above their benches, saying </w:t>
       </w:r>
       <w:r>
         <w:rPr>
@@ -6322,13 +6402,13 @@
     <w:p>
       <w:r>
         <w:rPr/>
-        <w:t>Now, Cassius thought, not as prayer. Prayer was Brutus’ department.</w:t>
-      </w:r>
-    </w:p>
-    <w:p>
-      <w:r>
-        <w:rPr/>
-        <w:t>Tillius’ hands found the toga. Pulled.</w:t>
+        <w:t>Now, Cassius thought, not as prayer. Prayer was Brutus’s department.</w:t>
+      </w:r>
+    </w:p>
+    <w:p>
+      <w:r>
+        <w:rPr/>
+        <w:t>Tillius’s hands found the toga. Pulled.</w:t>
       </w:r>
     </w:p>
     <w:p>
@@ -6364,7 +6444,7 @@
     <w:p>
       <w:r>
         <w:rPr/>
-        <w:t>He didn’t see a tyrant in that instant. He saw a body that had walked through Gaul and Alexandria and the stubborn Spanish hills. A body that might yet stand up and make this morning a botched thing. Cassius’ blade went in where flesh allowed it. Heat ran over his knuckles.</w:t>
+        <w:t>He didn’t see a tyrant in that instant. He saw a body that had walked through Gaul and Alexandria and the stubborn Spanish hills. A body that might yet stand up and make this morning a botched thing. Cassius’s blade went in where flesh allowed it. Heat ran over his knuckles.</w:t>
       </w:r>
     </w:p>
     <w:p>
@@ -6382,7 +6462,7 @@
     <w:p>
       <w:r>
         <w:rPr/>
-        <w:t>The plan had been simple, and in the room it was not. There were more than sixty of them, and not all of them knew where to stand. Men struck at Caesar and at each other. A blade opened Brutus’ hand. The conspirators had sworn to be a surgery and they were, for a few breaths, a pack.</w:t>
+        <w:t>The plan had been simple, and in the room it was not. There were more than sixty of them, and not all of them knew where to stand. Men struck at Caesar and at each other. A blade opened Brutus’s hand. The conspirators had sworn to be a surgery and they were, for a few breaths, a pack.</w:t>
       </w:r>
     </w:p>
     <w:p>
@@ -6427,7 +6507,7 @@
     <w:p>
       <w:r>
         <w:rPr/>
-        <w:t>Men he respected shoved. Men he did not respect shoved harder. Caesar’s mouth opened on pain and command at once. Brutus’ ancestors, imagined, arranged on their shelves at home, did not lean in to help. They watched, as masks watch.</w:t>
+        <w:t>Men he respected shoved. Men he did not respect shoved harder. Caesar’s mouth opened on pain and command at once. Brutus’s ancestors, imagined, arranged on their shelves at home, did not lean in to help. They watched, as masks watch.</w:t>
       </w:r>
     </w:p>
     <w:p>
@@ -6529,7 +6609,7 @@
     <w:p>
       <w:r>
         <w:rPr/>
-        <w:t>Cassius’ hand found Brutus’ elbow hard enough to bruise. “Capitol,” Cassius said, practical as salt, station face for anyone still listening.</w:t>
+        <w:t>Cassius’s hand found Brutus’s elbow hard enough to bruise. “Capitol,” Cassius said, practical as salt, station face for anyone still listening.</w:t>
       </w:r>
     </w:p>
     <w:p>
@@ -6742,7 +6822,7 @@
     <w:p>
       <w:r>
         <w:rPr/>
-        <w:t xml:space="preserve">Brutus spoke. He heard himself speak. The words were right (libertas, tyrant, law, ancestors), each one a stone from a good road. He had learned </w:t>
+        <w:t>Brutus spoke. He heard himself speak. The words were right (</w:t>
       </w:r>
       <w:r>
         <w:rPr>
@@ -6752,6 +6832,16 @@
       </w:r>
       <w:r>
         <w:rPr/>
+        <w:t xml:space="preserve">, tyrant, law, ancestors), each one a stone from a good road. He had learned </w:t>
+      </w:r>
+      <w:r>
+        <w:rPr>
+          <w:i/>
+        </w:rPr>
+        <w:t>libertas</w:t>
+      </w:r>
+      <w:r>
+        <w:rPr/>
         <w:t xml:space="preserve"> as a schoolboy, in the same lesson as the first Brutus and the last king. Below, the Forum didn’t become a choir. It became noise with legs. Cheers happened in patches and died. Someone shouted for Caesar. Someone shouted for the dead man’s veterans. Someone shouted for grain. Grain was not a consul.</w:t>
       </w:r>
     </w:p>
@@ -6788,7 +6878,7 @@
     <w:p>
       <w:r>
         <w:rPr/>
-        <w:t>Brutus watched a knot of women shove a knot of men and felt the first cold thought that was not philosophical: we have killed a man the city loved more than it loves our vocabulary. Under it, smaller and worse: I killed a man who forgave me and kept me close. The late hour after the spare returned without asking leave stood beside the Forum noise. Wine gone warm. Ordinary talk. The war treated as a misunderstanding their house could afford. The rock could not make private guilt public enough to share. He wanted, badly, to wait until the Forum rearranged itself into the audience the words deserved. Waiting was the softest cowardice available. It looked like hope.</w:t>
+        <w:t>Brutus watched a knot of women shove a knot of men and felt the first cold thought that was not philosophical: we have killed a man the city loved more than it loves our vocabulary. Under it, smaller and worse: I killed a man who forgave me and kept me close. The late hour after the spare returned without asking leave and stood beside the Forum noise. Wine gone warm. Ordinary talk. The war treated as a misunderstanding their house could afford. The rock could not make private guilt public enough to share. He wanted, badly, to wait until the Forum rearranged itself into the audience the words deserved. Waiting was the softest cowardice available. It looked like hope.</w:t>
       </w:r>
     </w:p>
     <w:p>
@@ -6876,7 +6966,7 @@
     <w:p>
       <w:r>
         <w:rPr/>
-        <w:t>Toward evening the light went copper. The Capitol’s stone held heat. Brutus’ hands smelled of metal no matter how often he washed them in a basin someone provided like a sacrament. He dried them on his toga and still would not look at his own palms. Eyes could not make the spare into something other than blood. He drafted, in his head, the speech he might write down so the day would have a cleaner spine than it deserved. Drafting was another way of not leaving.</w:t>
+        <w:t>Toward evening the light went copper. The Capitol’s stone held heat. Brutus’s hands smelled of metal no matter how often he washed them in a basin someone provided like a sacrament. He dried them on his toga and still would not look at his own palms. Eyes could not make the spare into something other than blood. He drafted, in his head, the speech he might write down so the day would have a cleaner spine than it deserved. Drafting was another way of not leaving.</w:t>
       </w:r>
     </w:p>
     <w:p>
@@ -6939,7 +7029,7 @@
     <w:p>
       <w:r>
         <w:rPr/>
-        <w:t>Lepidus’ men were a fact in the city’s body: the legion on the Tiber island, the only organised soldiers close to Rome. Facts could be marched into the Forum and made into a butcher’s festival. M. Pacuvius (scar through the eyebrow, Antony’s old donative contact) said as much, hopeful as a dog.</w:t>
+        <w:t>Lepidus’s men were a fact in the city’s body: the legion on the Tiber island, the only organised soldiers close to Rome. Facts could be marched into the Forum and made into a butcher’s festival. M. Pacuvius (scar through the eyebrow, Antony’s old donative contact) said as much, hopeful as a dog.</w:t>
       </w:r>
     </w:p>
     <w:p>
@@ -7059,7 +7149,7 @@
     <w:p>
       <w:r>
         <w:rPr/>
-        <w:t>Pacuvius made the face of a man receiving wisdom, chin tip, eyes grateful, the station grin that kept consuls from smelling mutiny. “As you say. Rooms. Doors. Feed them soft.”</w:t>
+        <w:t>Pacuvius made the face of a man receiving wisdom, chin-tip, eyes grateful, the station grin that kept consuls from smelling mutiny. “As you say. Rooms. Doors. Feed them soft.”</w:t>
       </w:r>
     </w:p>
     <w:p>
@@ -7122,7 +7212,7 @@
     <w:p>
       <w:r>
         <w:rPr/>
-        <w:t>Brutus’ people wanted praise and protection. Antony’s people wanted the dictator’s papers to remain law so the city did not tip into a void where every debt could be renegotiated with a knife. Cicero heard both and performed the old trick: show each side the part of its face that could still be called Republic.</w:t>
+        <w:t>Brutus’s people wanted praise and protection. Antony’s people wanted the dictator’s papers to remain law so the city did not tip into a void where every debt could be renegotiated with a knife. Cicero heard both and performed the old trick: show each side the part of its face that could still be called Republic.</w:t>
       </w:r>
     </w:p>
     <w:p>
@@ -7230,7 +7320,37 @@
     <w:p>
       <w:r>
         <w:rPr/>
-        <w:t>Cicero heard enough to file gardens / boy / queen / wound beside amnesty, and Decimus / second line as a debt the dead man still held on the living. He did not enter the corridor argument. Entering would have made him a stall. He preferred rooms that asked for periods. The praise-smile lasted until the temple steps; then it was only a face arranging itself for Atticus.</w:t>
+        <w:t xml:space="preserve">Cicero heard enough to file </w:t>
+      </w:r>
+      <w:r>
+        <w:rPr>
+          <w:i/>
+        </w:rPr>
+        <w:t>gardens / boy / queen / wound</w:t>
+      </w:r>
+      <w:r>
+        <w:rPr/>
+        <w:t xml:space="preserve"> beside </w:t>
+      </w:r>
+      <w:r>
+        <w:rPr>
+          <w:i/>
+        </w:rPr>
+        <w:t>amnesty</w:t>
+      </w:r>
+      <w:r>
+        <w:rPr/>
+        <w:t xml:space="preserve">, and </w:t>
+      </w:r>
+      <w:r>
+        <w:rPr>
+          <w:i/>
+        </w:rPr>
+        <w:t>Decimus / second line</w:t>
+      </w:r>
+      <w:r>
+        <w:rPr/>
+        <w:t xml:space="preserve"> as a debt the dead man still held on the living. He did not enter the corridor argument. Entering would have made him a stall. He preferred rooms that asked for periods. The praise-smile lasted until the temple steps; then it was only a face arranging itself for Atticus.</w:t>
       </w:r>
     </w:p>
     <w:p>
@@ -7308,7 +7428,7 @@
     <w:p>
       <w:r>
         <w:rPr/>
-        <w:t>A junior senator (Seius’ type, though not Seius) laughed too loudly. Sosia, on the next stool, did not. The laugh wanted company; the stall offered rates instead. Hordeonius didn’t join the laugh. Humour was for men who didn’t hold other men’s winters in wax, unless the humour sold a second cup without confessing appetite.</w:t>
+        <w:t>A junior senator (Seius’s type, though not Seius) laughed too loudly. Sosia, on the next stool, did not. The laugh wanted company; the stall offered rates instead. Hordeonius didn’t join the laugh. Humour was for men who didn’t hold other men’s winters in wax, unless the humour sold a second cup without confessing appetite.</w:t>
       </w:r>
     </w:p>
     <w:p>
@@ -7344,7 +7464,7 @@
     <w:p>
       <w:r>
         <w:rPr/>
-        <w:t>He entered prices the way other men entered omens. Up a hair on river-adjacent leases. Down on properties too near Liberators’ doors. A man tried to sell him, quietly, a copy of Visellius’ old debt marks, the ghost of a ledger already closed, hinting Basilus and an Antonian name could still be made to squeal.</w:t>
+        <w:t>He entered prices the way other men entered omens. Up a hair on river-adjacent leases. Down on properties too near Liberators’ doors. A man tried to sell him, quietly, a copy of Visellius’s old debt marks, the ghost of a ledger already closed, hinting Basilus and an Antonian name could still be made to squeal.</w:t>
       </w:r>
     </w:p>
     <w:p>
@@ -7452,13 +7572,13 @@
     <w:p>
       <w:r>
         <w:rPr/>
-        <w:t>“He loved you,” Antony said in Decimus’ general direction though Decimus wasn’t there to receive it. Loved you enough to write you into the will and die on your schedule. Second degree. Second line. The portico joke had grown teeth and ink. The laugh wanted to become a story. Antony swallowed it. Stories would be for the Forum.</w:t>
-      </w:r>
-    </w:p>
-    <w:p>
-      <w:r>
-        <w:rPr/>
-        <w:t>What mattered: the boy. The name. The crowd’s three hundred reasons to remember Caesar as a father instead of a corpse produced by philosophers. Antony priced the boy the way he priced soft cohorts: thin shoes; a careful mother, Caesar’s niece Atia, who kept her son near her and her opinions nearer; a paper son who had never fed a veteran. Useful ink. Not a rival. He filed that price without writing it down.</w:t>
+        <w:t>“He loved you,” Antony said in Decimus’s general direction, though Decimus wasn’t there to receive it. Loved you enough to write you into the will and die on your schedule. Second degree. Second line. The portico joke had grown teeth and ink. The laugh wanted to become a story. Antony swallowed it. Stories would be for the Forum.</w:t>
+      </w:r>
+    </w:p>
+    <w:p>
+      <w:r>
+        <w:rPr/>
+        <w:t>What mattered: the boy. The name. The crowd’s three hundred reasons to remember Caesar as a father instead of a corpse produced by philosophers. Antony priced the boy the way he priced soft cohorts: thin shoes; a careful mother, Caesar’s niece Atia, who kept her son near her and her opinions nearer; a paper-son who had never fed a veteran. Useful ink. Not a rival. He filed that price without writing it down.</w:t>
       </w:r>
     </w:p>
     <w:p>
@@ -7527,7 +7647,7 @@
     <w:p>
       <w:r>
         <w:rPr/>
-        <w:t>Nysa saw, for a blink, Decimus’ open morning face in the Domus atrium. She didn’t have a philosophy for it. She had a stomach.</w:t>
+        <w:t>Nysa saw, for a blink, Decimus’s open morning face in the Domus atrium. She didn’t have a philosophy for it. She had a stomach.</w:t>
       </w:r>
     </w:p>
     <w:p>
@@ -7809,7 +7929,7 @@
     <w:p>
       <w:r>
         <w:rPr/>
-        <w:t>When the crowd surged, she surged or be crushed. Her incomplete wax stabbed her ribs. She kept it. Relics were stupid. She was allowed one stupidity.</w:t>
+        <w:t>When the crowd surged, she surged rather than be crushed. Her incomplete wax stabbed her ribs. She kept it. Relics were stupid. She was allowed one stupidity.</w:t>
       </w:r>
     </w:p>
     <w:p>
@@ -8046,7 +8166,7 @@
     <w:p>
       <w:r>
         <w:rPr/>
-        <w:t>Brutus’ face was pale under soot. “They burned Helvius for a name. If you take Cisalpine now, you take Antony’s hunger with it. Come east with us first. Let the nearer knife wait until the Forum’s heat cools.”</w:t>
+        <w:t>Brutus’s face was pale under soot. “They burned Helvius for a name. If you take Cisalpine now, you take Antony’s hunger with it. Come east with us first. Let the nearer knife wait until the Forum’s heat cools.”</w:t>
       </w:r>
     </w:p>
     <w:p>
@@ -8076,7 +8196,7 @@
     <w:p>
       <w:r>
         <w:rPr/>
-        <w:t>“I am not asking for a blessing.” Decimus clasped Brutus’ forearm once: friend, co-murderer, stranger already arguing about timing. “Do not wait for the Forum to love you. It loved a corpse more.”</w:t>
+        <w:t>“I am not asking for a blessing.” Decimus clasped Brutus’s forearm once: friend, co-murderer, stranger already arguing about timing. “Do not wait for the Forum to love you. It loved a corpse more.”</w:t>
       </w:r>
     </w:p>
     <w:p>
@@ -8088,7 +8208,17 @@
     <w:p>
       <w:r>
         <w:rPr/>
-        <w:t>On the road north, while that smoke thinned behind him into other men’s problems, he sent two letters. One went to Plancus across the Alps, whose letters were always very good and whose legions were always very close to home: courteous, asking for a meeting that smelled like alliance and for twenty wagons of grain if the meeting could not be soon. One went to a man who owed Lepidus a favour, asking only for a safe night’s roof near Mutina’s approaches. Mutina, on the Via Aemilia, was the fortress he had built in his head a year ago, ditches and all. He counted the twenty in his head the way he counted remounts before rain: numbers that kept men fed. Plancus’s reply arrived soft: praise, delay, no date, and a careful line that grain “could not yet be spared from his own columns.” Decimus read yet twice, then looked at the empty stretch of road where wagons should have been and were not. The Lepidus channel returned a messenger who wouldn’t meet his eyes, wouldn’t dismount long enough to take a second tablet back. Decimus held the first letter like a receipt with no goods attached. He folded both silences into the map-case hard enough that the wax edge bit his thumb. Nearer knives, he told himself, were still knives you could see. Friends who would not send grain or a roof had already begun the road that ended without wagons. The will’s second line traveled with him like pitch he could not wipe.</w:t>
+        <w:t xml:space="preserve">On the road north, while that smoke thinned behind him into other men’s problems, he sent two letters. One went to Plancus across the Alps, whose letters were always very good and whose legions were always very close to home: courteous, asking for a meeting that smelled like alliance and for twenty wagons of grain if the meeting could not be soon. One went to a man who owed Lepidus a favour, asking only for a safe night’s roof near Mutina’s approaches. Mutina, on the Via Aemilia, was the fortress he had built in his head a year ago, ditches and all. He counted the twenty in his head the way he counted remounts before rain: numbers that kept men fed. Plancus’s reply arrived soft: praise, delay, no date, and a careful line that grain “could not yet be spared from his own columns.” Decimus read </w:t>
+      </w:r>
+      <w:r>
+        <w:rPr>
+          <w:i/>
+        </w:rPr>
+        <w:t>yet</w:t>
+      </w:r>
+      <w:r>
+        <w:rPr/>
+        <w:t xml:space="preserve"> twice, then looked at the empty stretch of road where wagons should have been and were not. The Lepidus channel returned a messenger who wouldn’t meet his eyes, wouldn’t dismount long enough to take a second tablet back. Decimus held the first letter like a receipt with no goods attached. He folded both silences into the map-case hard enough that the wax edge bit his thumb. Nearer knives, he told himself, were still knives you could see. Friends who would not send grain or a roof had already begun the road that ended without wagons. The will’s second line travelled with him like pitch he could not wipe.</w:t>
       </w:r>
     </w:p>
     <w:p>
@@ -8457,7 +8587,7 @@
     <w:p>
       <w:r>
         <w:rPr/>
-        <w:t>“Off the Apollonia boat at Brundisium. Caesar’s old soldiers walked out on the road to look at him. Now he’s making for his stepfather’s villa on the bay, Philippus’, near Naples.”</w:t>
+        <w:t>“Off the Apollonia boat at Brundisium. Caesar’s old soldiers walked out on the road to look at him. Now he’s making for his stepfather’s villa on the bay, Philippus’s, near Naples.”</w:t>
       </w:r>
     </w:p>
     <w:p>
@@ -8539,7 +8669,7 @@
         <w:rPr>
           <w:i/>
         </w:rPr>
-        <w:t>wine shops already practicing the laugh</w:t>
+        <w:t>wine shops already practising the laugh</w:t>
       </w:r>
       <w:r>
         <w:rPr/>
@@ -8686,7 +8816,7 @@
     <w:p>
       <w:r>
         <w:rPr/>
-        <w:t>Cassius’ letters, from his own house nearer the coast, smelled of ships and contempt. Brutus answered carefully, sentence by sentence. Care might still travel where he could not. At the gate a client offered a purse “for expenses on the road south, if the praetor would only write one introduction.” Brutus returned the purse unopened. “I will not buy quiet with other men’s coin,” he said. The client bowed too low and went.</w:t>
+        <w:t>Cassius’s letters, from his own house nearer the coast, smelled of ships and contempt. Brutus answered carefully, sentence by sentence. Care might still travel where he could not. At the gate a client offered a purse “for expenses on the road south, if the praetor would only write one introduction.” Brutus returned the purse unopened. “I will not buy quiet with other men’s coin,” he said. The client bowed too low and went.</w:t>
       </w:r>
     </w:p>
     <w:p>
@@ -8780,7 +8910,7 @@
     <w:p>
       <w:r>
         <w:rPr/>
-        <w:t>Octavian stood in Philippus’ villa light: sea glare, careful chairs, advice thick as oil. Atia’s fear sat in the room without needing a seat. She had already rearranged the cushions twice. Cushions could not refuse a will. Philippus spoke of safety, of refusal, of not taking a dead man’s quarrel into a living throat. Outside, a gardener clipped something that didn’t need clipping. Noise for courage.</w:t>
+        <w:t>Octavian stood in Philippus’s villa light: sea glare, careful chairs, advice thick as oil. Atia’s fear sat in the room without needing a seat. She had already rearranged the cushions twice. Cushions could not refuse a will. Philippus spoke of safety, of refusal, of not taking a dead man’s quarrel into a living throat. Outside, a gardener clipped something that didn’t need clipping. Noise for courage.</w:t>
       </w:r>
     </w:p>
     <w:p>
@@ -9151,7 +9281,7 @@
     <w:p>
       <w:r>
         <w:rPr/>
-        <w:t>A whisperer tried again to sell him Visellius’ old tablet ghosts, Basilus orbit, an Antonian hand, the Subura stair that still had a rumour attached. He laid a scrap on the stool: names in a February hand, men sounded at the baths before the Ides. Ash could not pay.</w:t>
+        <w:t>A whisperer tried again to sell him Visellius’s old tablet ghosts, Basilus orbit, an Antonian hand, the Subura stair that still had a rumour attached. He laid a scrap on the stool: names in a February hand, men sounded at the baths before the Ides. Ash could not pay.</w:t>
       </w:r>
     </w:p>
     <w:p>
@@ -9163,7 +9293,7 @@
     <w:p>
       <w:r>
         <w:rPr/>
-        <w:t>The whisperer bowed as if receiving a funeral oration. “Of course. Living seals.” His offense waited for the next pillar: “He’ll price a boy’s name and call a murder tablet poetry. Ask him for Basilus and he sells you piety.” Sosia’s mouth twitched, almost audible, then he drank so the twitch would look like thirst.</w:t>
+        <w:t>The whisperer bowed as if receiving a funeral oration. “Of course. Living seals.” His offence waited for the next pillar: “He’ll price a boy’s name and call a murder tablet poetry. Ask him for Basilus and he sells you piety.” Sosia’s mouth twitched, almost audible, then he drank so the twitch would look like thirst.</w:t>
       </w:r>
     </w:p>
     <w:p>
@@ -9181,7 +9311,7 @@
     <w:p>
       <w:r>
         <w:rPr/>
-        <w:t>“Brutus’ sea house,” Sosia said, “a day down the coast. He’s sitting there out of Rome’s reach, and his mother has moved her clerks in after him.”</w:t>
+        <w:t>“Brutus’s sea house,” Sosia said, “a day down the coast. He’s sitting there out of Rome’s reach, and his mother has moved her clerks in after him.”</w:t>
       </w:r>
     </w:p>
     <w:p>
@@ -9531,7 +9661,7 @@
     <w:p>
       <w:r>
         <w:rPr/>
-        <w:t>“Philosophers,” the scar said. “Down at Brutus’s sea-house at Antium, the lot of them, and his mother’s clerks with them. Servilia’s already rewriting paper so her boys don’t have to carry corn like freedmen. You’ll hear it before the Senate does.”</w:t>
+        <w:t>“Philosophers,” the scar said. “Down at Brutus’s sea house at Antium, the lot of them, and his mother’s clerks with them. Servilia’s already rewriting paper so her boys don’t have to carry corn like freedmen. You’ll hear it before the Senate does.”</w:t>
       </w:r>
     </w:p>
     <w:p>
@@ -9580,7 +9710,7 @@
     <w:p>
       <w:r>
         <w:rPr/>
-        <w:t>Brutus asked Cicero to speak as if speech could still be strategy. He had a tablet on his knee with the Senate’s seal broken, and he tapped it once. “Grain buyers,” he said. “Asia for me, Sicily for Cassius. A praetor’s excuse to be out of Rome past ten nights, and a merchant’s errand to dress it.” The room held Porcia’s severity, Tertulla’s stillness, Favonius’ moral cough, and Servilia, who listened the way bankers listened to interest. Servilia had married that daughter to Cassius. One family, both knives; Cicero had always admired the economy. Favonius he remembered barefoot behind Cato in the Forum, copying the old man’s feet, and remembered the story that he had told Brutus last winter a civil war was worse than a king. Nobody had handed him a dagger in March. He had come to Antium anyway, to cough. A steward, Hilarus if Cicero’s memory of names still worked, poured wine that nobody truly tasted.</w:t>
+        <w:t>Brutus asked Cicero to speak as if speech could still be strategy. He had a tablet on his knee with the Senate’s seal broken, and he tapped it once. “Grain buyers,” he said. “Asia for me, Sicily for Cassius. A praetor’s excuse to be out of Rome past ten nights, and a merchant’s errand to dress it.” The room held Porcia’s severity, Tertulla’s stillness, Favonius’s moral cough, and Servilia, who listened the way bankers listened to interest. Servilia had married that daughter to Cassius. One family, both knives; Cicero had always admired the economy. Favonius he remembered barefoot behind Cato in the Forum, copying the old man’s feet, and remembered the story that he had told Brutus last winter that a civil war was worse than a king. Nobody had handed him a dagger in March. He had come to Antium anyway, to cough. A steward, Hilarus if Cicero’s memory of names still worked, poured wine that nobody truly tasted.</w:t>
       </w:r>
     </w:p>
     <w:p>
@@ -9604,7 +9734,7 @@
     <w:p>
       <w:r>
         <w:rPr/>
-        <w:t>Porcia’s mouth tightened at every compromise. Tertulla watched her husband’s empty place. Absence was an argument. Favonius coughed morality into the pauses until the pauses preferred Cassius’ dust to Favonius’ virtue.</w:t>
+        <w:t>Porcia’s mouth tightened at every compromise. Tertulla watched her husband’s empty place. Absence was an argument. Favonius coughed morality into the pauses until the pauses preferred Cassius’s dust to Favonius’s virtue.</w:t>
       </w:r>
     </w:p>
     <w:p>
@@ -9640,7 +9770,7 @@
     <w:p>
       <w:r>
         <w:rPr/>
-        <w:t>Brutus’ face did the old slow collapse into resolve. The Rome-return balloon, Cicero’s prettiest paragraph, died in Brutus’ throat. East became less a choice than a harbour with a direction.</w:t>
+        <w:t>Brutus’s face did the old slow collapse into resolve. The Rome-return balloon, Cicero’s prettiest paragraph, died in Brutus’s throat. East became less a choice than a harbour with a direction.</w:t>
       </w:r>
     </w:p>
     <w:p>
@@ -10077,7 +10207,7 @@
     <w:p>
       <w:r>
         <w:rPr/>
-        <w:t>At mid-morning an envoy came anyway, cloak clean, smile practiced, the sort of man who carried other men’s threats as if they were invitations to dinner. He stood in the command room where the wall map of the Via Aemilia still showed Decimus’s pins as facts. An aide hovered with a wax roll. A levy clerk waited at the door with pay marks still wet. The room wanted to be polite. It was already a siege rehearsal.</w:t>
+        <w:t>At mid-morning an envoy came anyway, cloak clean, smile practised, the sort of man who carried other men’s threats as if they were invitations to dinner. He stood in the command room where the wall map of the Via Aemilia still showed Decimus’s pins as facts. An aide hovered with a wax roll. A levy clerk waited at the door with pay marks still wet. The room wanted to be polite. It was already a siege rehearsal.</w:t>
       </w:r>
     </w:p>
     <w:p>
@@ -10400,7 +10530,7 @@
     <w:p>
       <w:r>
         <w:rPr/>
-        <w:t>Antony had opened a count in public, not a negotiation. Decimus’s throat tightened, the old key turning. He didn't climb down. Climbing down would've looked like confession.</w:t>
+        <w:t>Antony had opened a count in public, not a negotiation. Decimus’s throat tightened, the old key turning. He didn’t climb down. Climbing down would’ve looked like confession.</w:t>
       </w:r>
     </w:p>
     <w:p>
@@ -10484,7 +10614,7 @@
     <w:p>
       <w:r>
         <w:rPr/>
-        <w:t>He walked the walls at night with a cloak that did not keep the Ides out. The deed felt far and stupidly intimate, a debt owed a corpse who had trusted his cheer. An aide offered wine. Decimus refused, then took half a cup anyway. He checked a gate twice and didn't tell anyone why the second check felt like apology. Below, Antony’s fires multiplied. The siege had a face now. The face that had counted his smoke.</w:t>
+        <w:t>He walked the walls at night with a cloak that did not keep the Ides out. The deed felt far and stupidly intimate, a debt owed a corpse who had trusted his cheer. An aide offered wine. Decimus refused, then took half a cup anyway. He checked a gate twice and didn’t tell anyone why the second check felt like apology. Below, Antony’s fires multiplied. The siege had a face now. The face that had counted his smoke.</w:t>
       </w:r>
     </w:p>
     <w:p>
@@ -10533,7 +10663,7 @@
     <w:p>
       <w:r>
         <w:rPr/>
-        <w:t xml:space="preserve">Octavian listened to himself become a tool. When Cicero’s gaze sought approval, he gave a nod calibrated to obedience and nothing else. He didn't think </w:t>
+        <w:t xml:space="preserve">Octavian listened to himself become a tool. When Cicero’s gaze sought approval, he gave a nod calibrated to obedience and nothing else. He didn’t think </w:t>
       </w:r>
       <w:r>
         <w:rPr>
@@ -10565,7 +10695,7 @@
     <w:p>
       <w:r>
         <w:rPr/>
-        <w:t>Afterward a senator clasped his arm and called him the Republic’s luck. Octavian returned the clasp at half strength. Half strength still looked like gratitude if you did not measure. Agrippa’s stillness held until the clasp ended. Only then did he match pace toward the vendor street. A northern courier’s fragments stayed unmerged in Octavian’s hand: Decimus holding, Antony digging, Pacuvius still hungry for storm. Cicero left looking like a man certain he had saved the Republic. Outside, a vendor sold hot food and called no one Caesar. Octavian heard him and didn't correct him.</w:t>
+        <w:t>Afterward a senator clasped his arm and called him the Republic’s luck. Octavian returned the clasp at half strength. Half strength still looked like gratitude if you did not measure. Agrippa’s stillness held until the clasp ended. Only then did he match pace toward the vendor street. A northern courier’s fragments stayed unmerged in Octavian’s hand: Decimus holding, Antony digging, Pacuvius still hungry for storm. Cicero left looking like a man certain he had saved the Republic. Outside, a vendor sold hot food and called no one Caesar. Octavian heard him and didn’t correct him.</w:t>
       </w:r>
     </w:p>
     <w:p>
@@ -10604,13 +10734,13 @@
     <w:p>
       <w:r>
         <w:rPr/>
-        <w:t>Laberius’ world narrowed to mud and which eagle still stood.</w:t>
-      </w:r>
-    </w:p>
-    <w:p>
-      <w:r>
-        <w:rPr/>
-        <w:t>In rooms with clean sandals this would be named success before the mud dried. In the ditch it was screaming. Martians refusing to be held. Someone’s javelin nearly killing him until a voice yelled his century’s joke-name. Antony’s men came out hard. Hard enough that Laberius smelled the old Spanish stubbornness again, the kind that did not care who Rome called consul. Hirtius hit harder when the day turned. Laberius didn't see strategy. He saw a standard tilt. He saw a friend open at the neck. Blood mixed with meltwater and ran pink off the rim of his shield.</w:t>
+        <w:t>Laberius’s world narrowed to mud and which eagle still stood.</w:t>
+      </w:r>
+    </w:p>
+    <w:p>
+      <w:r>
+        <w:rPr/>
+        <w:t>In rooms with clean sandals this would be named success before the mud dried. In the ditch it was screaming. Martians refusing to be held. Someone’s javelin nearly killing him until a voice yelled his century’s joke-name. Antony’s men came out hard. Hard enough that Laberius smelled the old Spanish stubbornness again, the kind that did not care who Rome called consul. Hirtius hit harder when the day turned. Laberius didn’t see strategy. He saw a standard tilt. He saw a friend open at the neck. Blood mixed with meltwater and ran pink off the rim of his shield.</w:t>
       </w:r>
     </w:p>
     <w:p>
@@ -10634,7 +10764,7 @@
     <w:p>
       <w:r>
         <w:rPr/>
-        <w:t>Pay talk lived under the noise like a second drum. Who owed donatives. Which Caesar’s name still fed mouths. Whether Hirtius’ clean reputation meant Rome finally understood mud. Capua still sat in Laberius’s boots as an unpaid date. Forum smoke had taught him the dirt could walk without clerks. Mutina mud taught him it could drown you while walking. A boy from another century asked if they were fighting for the Senate or for bread. Laberius said, “Fight for the man on your left. Capua argues later, if later still has a road.”</w:t>
+        <w:t>Pay talk lived under the noise like a second drum. Who owed donatives. Which Caesar’s name still fed mouths. Whether Hirtius’s clean reputation meant Rome finally understood mud. Capua still sat in Laberius’s boots as an unpaid date. Forum smoke had taught him the dirt could walk without clerks. Mutina mud taught him it could drown you while walking. A boy from another century asked if they were fighting for the Senate or for bread. Laberius said, “Fight for the man on your left. Capua argues later, if later still has a road.”</w:t>
       </w:r>
     </w:p>
     <w:p>
@@ -10652,7 +10782,7 @@
     <w:p>
       <w:r>
         <w:rPr/>
-        <w:t>That was one fact Laberius could keep: Hirtius down, confirmed by a man who had touched him. Pansa’s name still swam in the yell-water, wounded, dying, fine, poisoned, blessed. “They carried him off at Forum Gallorum,” Vibius said. “A week back, that village down the road with a market’s name. Javelin in the side. I saw the litter. I didn’t see inside it.” Laberius didn't promote any Pansa version. Vibius had a litter. Nobody had a shoulder.</w:t>
+        <w:t>That was one fact Laberius could keep: Hirtius down, confirmed by a man who had touched him. Pansa’s name still swam in the yell-water, wounded, dying, fine, poisoned, blessed. “They carried him off at Forum Gallorum,” Vibius said. “A week back, that village down the road with a market’s name. Javelin in the side. I saw the litter. I didn’t see inside it.” Laberius didn’t promote any Pansa version. Vibius had a litter. Nobody had a shoulder.</w:t>
       </w:r>
     </w:p>
     <w:p>
@@ -10664,7 +10794,7 @@
     <w:p>
       <w:r>
         <w:rPr/>
-        <w:t>Water ran into his boots. He had stopped noticing wet hours ago; noticing returned when the fighting thinned and the cold found room. Vibius pointed at Mutina’s wall, still closed. “Town’s still his,” Vibius said, meaning Decimus. Laberius grunted. Walls didn't feed the ditch.</w:t>
+        <w:t>Water ran into his boots. He had stopped noticing wet hours ago; noticing returned when the fighting thinned and the cold found room. Vibius pointed at Mutina’s wall, still closed. “Town’s still his,” Vibius said, meaning Decimus. Laberius grunted. Walls didn’t feed the ditch.</w:t>
       </w:r>
     </w:p>
     <w:p>
@@ -10676,7 +10806,7 @@
     <w:p>
       <w:r>
         <w:rPr/>
-        <w:t>He stacked a shield that was not his. The owner would not need it. Somewhere behind, gallopers already carried “great success” toward Rome. Laberius carried a friend’s boots, left boot split at the heel, still warm somehow. He knew Hirtius was dead. He knew Antony’s near shields had thinned. What Rome would buy with those two facts, he left to the gallopers. He didn't follow their dust.</w:t>
+        <w:t>He stacked a shield that was not his. The owner would not need it. Somewhere behind, gallopers already carried “great success” toward Rome. Laberius carried a friend’s boots, left boot split at the heel, still warm somehow. He knew Hirtius was dead. He knew Antony’s near shields had thinned. What Rome would buy with those two facts, he left to the gallopers. He didn’t follow their dust.</w:t>
       </w:r>
     </w:p>
     <w:p>
@@ -10715,7 +10845,7 @@
     <w:p>
       <w:r>
         <w:rPr/>
-        <w:t xml:space="preserve">He labeled all three </w:t>
+        <w:t xml:space="preserve">He labelled all three </w:t>
       </w:r>
       <w:r>
         <w:rPr>
@@ -10839,7 +10969,7 @@
     <w:p>
       <w:r>
         <w:rPr/>
-        <w:t>Cicero’s praise arrived sweet and late. Decimus read one line of congratulation twice, then folded it into a pack already too light on grain. He wrote one more letter that tried to sound steady, gates held, honour intact. He stopped mid-sentence when his hand cramped. He didn't send a second copy.</w:t>
+        <w:t>Cicero’s praise arrived sweet and late. Decimus read one line of congratulation twice, then folded it into a pack already too light on grain. He wrote one more letter that tried to sound steady, gates held, honour intact. He stopped mid-sentence when his hand cramped. He didn’t send a second copy.</w:t>
       </w:r>
     </w:p>
     <w:p>
@@ -10869,7 +10999,7 @@
     <w:p>
       <w:r>
         <w:rPr/>
-        <w:t>“Let them,” Decimus said. “We take the west fork before dark. The east ford is watched, I smelled horse-lines on the wind this morning. Plancus has crossed. Lepidus’s man returned the tablet. We do not wait for dates that practice absence.”</w:t>
+        <w:t>“Let them,” Decimus said. “We take the west fork before dark. The east ford is watched, I smelled horse-lines on the wind this morning. Plancus has crossed. Lepidus’s man returned the tablet. We do not wait for dates that practise absence.”</w:t>
       </w:r>
     </w:p>
     <w:p>
@@ -10881,7 +11011,7 @@
     <w:p>
       <w:r>
         <w:rPr/>
-        <w:t>Decimus heard the names as doors that had already closed while he counted hinges. “Then we do not invent a fifth name for hope,” he said. The first aide opened his mouth on another complaint. Decimus was already counting remaining waterskins aloud, making the count the argument beside the named absences. At a crossroads shrine someone had left a cheap wreath for “the liberators.” Rain had ruined it. Decimus didn't stop to fix it. He checked his horse’s mouth for sores and found none. The sores were in the map. Every promised friend a thinner line than yesterday.</w:t>
+        <w:t>Decimus heard the names as doors that had already closed while he counted hinges. “Then we do not invent a fifth name for hope,” he said. The first aide opened his mouth on another complaint. Decimus was already counting remaining waterskins aloud, making the count the argument beside the named absences. At a crossroads shrine someone had left a cheap wreath for “the liberators.” Rain had ruined it. Decimus didn’t stop to fix it. He checked his horse’s mouth for sores and found none. The sores were in the map. Every promised friend a thinner line than yesterday.</w:t>
       </w:r>
     </w:p>
     <w:p>
@@ -10893,7 +11023,7 @@
     <w:p>
       <w:r>
         <w:rPr/>
-        <w:t>On the second day the staff was smaller. One man had “gone for water” and not returned. Decimus didn't send a search. Searches taught the road your remaining number.</w:t>
+        <w:t>On the second day the staff was smaller. One man had “gone for water” and not returned. Decimus didn’t send a search. Searches taught the road your remaining number.</w:t>
       </w:r>
     </w:p>
     <w:p>
@@ -10962,7 +11092,7 @@
     <w:p>
       <w:r>
         <w:rPr/>
-        <w:t>Octavian’s throat tightened once, shame or fever, he didn't sort it. He looked at the pay chests, not at Agrippa’s face. “Then we pay before we argue. Men who are owed invent worse stories than senators do.”</w:t>
+        <w:t>Octavian’s throat tightened once, shame or fever; he didn’t sort it. He looked at the pay chests, not at Agrippa’s face. “Then we pay before we argue. Men who are owed invent worse stories than senators do.”</w:t>
       </w:r>
     </w:p>
     <w:p>
@@ -11050,7 +11180,7 @@
     <w:p>
       <w:r>
         <w:rPr/>
-        <w:t>A senator who had voted him an ovation and then forgotten to pay for it called him the gods’ gift and waited for a smile of destiny. Octavian looked at him until the man found something to do with his hands. A soldier shouted the name Caesar as paymaster; Octavian didn't bow to it like a hymn. He let the shout stand because paymaster was a job his hands already understood better than luck.</w:t>
+        <w:t>A senator who had voted him an ovation and then forgotten to pay for it called him the gods’ gift and waited for a smile of destiny. Octavian looked at him until the man found something to do with his hands. A soldier shouted the name Caesar as paymaster; Octavian didn’t bow to it like a hymn. He let the shout stand because paymaster was a job his hands already understood better than luck.</w:t>
       </w:r>
     </w:p>
     <w:p>
@@ -11062,7 +11192,7 @@
     <w:p>
       <w:r>
         <w:rPr/>
-        <w:t>By autumn a courier brought Decimus’s end as three incompatible stories. Ditch. Alps. Lepidus’s smile. Antony’s purse, no purse, a speech, no speech. Octavian kept all three on separate scraps and didn't let the clerks merge them. What the stories shared was enough for the ranks: the last Liberator in Italy was gone, and the north had no one left to hold it but Antony and Lepidus. In the same week a tablet came under two seals pressed side by side in the same wax, Lepidus’s and Antony’s: talk, on the river island below Bononia, between the camps, where no city could listen. Decimus’s absence didn't make him wise. It made Bononia feel caused. The empty north. The men behind him louder.</w:t>
+        <w:t>By autumn a courier brought Decimus’s end as three incompatible stories. Ditch. Alps. Lepidus’s smile. Antony’s purse, no purse, a speech, no speech. Octavian kept all three on separate scraps and didn’t let the clerks merge them. What the stories shared was enough for the ranks: the last Liberator in Italy was gone, and the north had no one left to hold it but Antony and Lepidus. In the same week a tablet came under two seals pressed side by side in the same wax, Lepidus’s and Antony’s: talk, on the river island below Bononia, between the camps, where no city could listen. Decimus’s absence didn’t make him wise. It made Bononia feel caused. The empty north. The men behind him louder.</w:t>
       </w:r>
     </w:p>
     <w:p>
@@ -11224,7 +11354,7 @@
     <w:p>
       <w:r>
         <w:rPr/>
-        <w:t>Antony poured wine that did not taste like celebration. He did not look at Octavian while pouring. Octavian let him not look, and didn't drink deep. Lepidus drank as men drink when they hope the cup will make them smaller than the map. Outside, a horse screamed at nothing. Inside, the lists grew.</w:t>
+        <w:t>Antony poured wine that did not taste like celebration. He did not look at Octavian while pouring. Octavian let him not look, and didn’t drink deep. Lepidus drank as men drink when they hope the cup will make them smaller than the map. Outside, a horse screamed at nothing. Inside, the lists grew.</w:t>
       </w:r>
     </w:p>
     <w:p>
@@ -11248,7 +11378,7 @@
     <w:p>
       <w:r>
         <w:rPr/>
-        <w:t>Seius found his name absent and felt holy relief, then shame at the holiness. He walked past a posted list twice to be sure, eyes watering from more than wind. A neighbour who had once loaned him applause was present in black letters. Seius didn't stop walking. Stopping looked like guilt.</w:t>
+        <w:t>Seius found his name absent and felt holy relief, then shame at the holiness. He walked past a posted list twice to be sure, eyes watering from more than wind. A neighbour who had once loaned him applause was present in black letters. Seius didn’t stop walking. Stopping looked like guilt.</w:t>
       </w:r>
     </w:p>
     <w:p>
@@ -11260,7 +11390,7 @@
     <w:p>
       <w:r>
         <w:rPr/>
-        <w:t>“I do not know that spelling,” Seius said. True enough to keep his door; false enough that Gavius’s mouth flattened. The woman stepped back. Kinship itself felt contagious. Seius bought oil he did not need so his hands would look busy. He congratulated no one. He locked doors and checked the locks twice. Seia Prima asked if honesty still mattered. He said honesty was a peacetime crop. She didn't laugh. “Then harvest carefully,” she said. “Peacetime crops still get taxed when the lists are hungry.” He almost smiled at her, old Seia who audited his atrium smile against paper. He stopped before smiling looked like relief worth posting. In bed he rehearsed congratulations for whoever won the next rumour, and hated the rehearsal even as he perfected it.</w:t>
+        <w:t>“I do not know that spelling,” Seius said. True enough to keep his door; false enough that Gavius’s mouth flattened. The woman stepped back. Kinship itself felt contagious. Seius bought oil he did not need so his hands would look busy. He congratulated no one. He locked doors and checked the locks twice. Seia Prima asked if honesty still mattered. He said honesty was a peacetime crop. She didn’t laugh. “Then harvest carefully,” she said. “Peacetime crops still get taxed when the lists are hungry.” He almost smiled at her, old Seia who audited his atrium smile against paper. He stopped before smiling looked like relief worth posting. In bed he rehearsed congratulations for whoever won the next rumour, and hated the rehearsal even as he perfected it.</w:t>
       </w:r>
     </w:p>
     <w:p>
@@ -11281,7 +11411,7 @@
     <w:p>
       <w:r>
         <w:rPr/>
-        <w:t xml:space="preserve">“I am preserving value,” he informed his empty shelf. The shelf didn't absolve. Sosia looked at him the way he looked at a bad joke. He had not told one. Truth under proscription sounded like a joke whether you meant one or not. He entered </w:t>
+        <w:t xml:space="preserve">“I am preserving value,” he informed his empty shelf. The shelf didn’t absolve. Sosia looked at him the way he looked at a bad joke. He had not told one. Truth under proscription sounded like a joke whether you meant one or not. He entered </w:t>
       </w:r>
       <w:r>
         <w:rPr>
@@ -11291,7 +11421,7 @@
       </w:r>
       <w:r>
         <w:rPr/>
-        <w:t xml:space="preserve"> in a private cipher and hated that honesty still felt like bookkeeping virtue. In the dark he smelled Visellius’ old room for no reason and told himself archaeology was closed.</w:t>
+        <w:t xml:space="preserve"> in a private cipher and hated that honesty still felt like bookkeeping virtue. In the dark he smelled Visellius’s old room for no reason and told himself archaeology was closed.</w:t>
       </w:r>
     </w:p>
     <w:p>
@@ -11376,7 +11506,7 @@
     <w:p>
       <w:r>
         <w:rPr/>
-        <w:t>Proscription had turned his name into a price. A freedman had brought the copy to Tusculum: his own name, and his brother Quintus’s, and the nephew’s, under an edict sealed by three men. One of the three was the boy. He tried to treat the price as a rhetorical problem and failed. Rhetoric needed an audience; hunters weren't one. He catalogued, helplessly, the old skills: period, antithesis, the pause that made juries lean. None of them lengthened a road.</w:t>
+        <w:t>Proscription had turned his name into a price. A freedman had brought the copy to Tusculum: his own name, and his brother Quintus’s, and the nephew’s, under an edict sealed by three men. One of the three was the boy. He tried to treat the price as a rhetorical problem and failed. Rhetoric needed an audience; hunters weren’t one. He catalogued, helplessly, the old skills: period, antithesis, the pause that made juries lean. None of them lengthened a road.</w:t>
       </w:r>
     </w:p>
     <w:p>
@@ -11394,13 +11524,13 @@
     <w:p>
       <w:r>
         <w:rPr/>
-        <w:t>A boy selling fish by the verge stared at the litter. Fame might have been a colour on it. Cicero almost shaped a greeting and then didn't. Greeting belonged to mornings when names weren't prices. He counted the poles’ rhythm and tried to turn it into a period. The period refused to close.</w:t>
-      </w:r>
-    </w:p>
-    <w:p>
-      <w:r>
-        <w:rPr/>
-        <w:t>“Faster,” he told the bearers, then hated the undignified word. Speed wasn't eloquence. Speed was what animals did when the forest closed. He tried a mental period about courage and found only the rhythm of poles on stone. The litter didn't care about antithesis.</w:t>
+        <w:t>A boy selling fish by the verge stared at the litter. Fame might have been a colour on it. Cicero almost shaped a greeting and then didn’t. Greeting belonged to mornings when names weren’t prices. He counted the poles’ rhythm and tried to turn it into a period. The period refused to close.</w:t>
+      </w:r>
+    </w:p>
+    <w:p>
+      <w:r>
+        <w:rPr/>
+        <w:t>“Faster,” he told the bearers, then hated the undignified word. Speed wasn’t eloquence. Speed was what animals did when the forest closed. He tried a mental period about courage and found only the rhythm of poles on stone. The litter didn’t care about antithesis.</w:t>
       </w:r>
     </w:p>
     <w:p>
@@ -11424,7 +11554,7 @@
     <w:p>
       <w:r>
         <w:rPr/>
-        <w:t>He didn't deliver a final Philippic. Rhetoric needed breath and an hour. He had seconds and a neck. He offered them the stillness he had practised in courts when the verdict was already known. He almost shaped a line about the Republic. He let it die unspoken.</w:t>
+        <w:t>He didn’t deliver a final Philippic. Rhetoric needed breath and an hour. He had seconds and a neck. He offered them the stillness he had practised in courts when the verdict was already known. He almost shaped a line about the Republic. He let it die unspoken.</w:t>
       </w:r>
     </w:p>
     <w:p>
@@ -11442,13 +11572,13 @@
     <w:p>
       <w:r>
         <w:rPr/>
-        <w:t>The sea kept sounding like itself. That offended him more than the blades. The surf didn't pause for a verdict.</w:t>
-      </w:r>
-    </w:p>
-    <w:p>
-      <w:r>
-        <w:rPr/>
-        <w:t>His last clear thought was the petty wish that Atticus would understand the silence without needing a courier to explain it. And that the boy wouldn't mistake silence for permission.</w:t>
+        <w:t>The sea kept sounding like itself. That offended him more than the blades. The surf didn’t pause for a verdict.</w:t>
+      </w:r>
+    </w:p>
+    <w:p>
+      <w:r>
+        <w:rPr/>
+        <w:t>His last clear thought was the petty wish that Atticus would understand the silence without needing a courier to explain it. And that the boy wouldn’t mistake silence for permission.</w:t>
       </w:r>
     </w:p>
     <w:p>
@@ -11478,13 +11608,13 @@
     <w:p>
       <w:r>
         <w:rPr/>
-        <w:t>Cassius listened to a city’s elders explain poverty with practiced dignity.</w:t>
-      </w:r>
-    </w:p>
-    <w:p>
-      <w:r>
-        <w:rPr/>
-        <w:t>The hall smelled of oil and fear-sweat dressed as perfume. Outside, harbour noise argued with temple bells. A fly walked the rim of a cup. Elders in a half-circle, interpreters at their shoulders, a young clerk with a face already practising hatred. “Liberty costs,” he said. “Rome’s disease is expensive. You will help cure it.” He didn't raise his voice.</w:t>
+        <w:t>Cassius listened to a city’s elders explain poverty with practised dignity.</w:t>
+      </w:r>
+    </w:p>
+    <w:p>
+      <w:r>
+        <w:rPr/>
+        <w:t>The hall smelled of oil and fear-sweat dressed as perfume. Outside, harbour noise argued with temple bells. A fly walked the rim of a cup. Elders in a half-circle, interpreters at their shoulders, a young clerk with a face already practising hatred. “Liberty costs,” he said. “Rome’s disease is expensive. You will help cure it.” He didn’t raise his voice.</w:t>
       </w:r>
     </w:p>
     <w:p>
@@ -11496,7 +11626,7 @@
     <w:p>
       <w:r>
         <w:rPr/>
-        <w:t>He let silence work after the sentence. Brutus’ tool, borrowed without credit. Silence made elders fill the air with offers, most of them dates that were not dates.</w:t>
+        <w:t>He let silence work after the sentence. Brutus’s tool, borrowed without credit. Silence made elders fill the air with offers, most of them dates that were not dates.</w:t>
       </w:r>
     </w:p>
     <w:p>
@@ -11578,7 +11708,7 @@
     <w:p>
       <w:r>
         <w:rPr/>
-        <w:t xml:space="preserve">Before the audience closed, a courier from the west, dust, salt, a seal cracked by too many hands, brought news that arrived as three incompatible tablets. Mutina won and lost. Consuls dead. Lists in Italy. The boy with fasces, and a court in his consulship that had called the names of every man of March, Cassius’s among them, to empty benches and condemned the benches. Antony still breathing, and the three of them looking east. One tablet named Decimus without poetry: gone, or going, or already a line item in someone else’s revenge. Cassius kept all three and didn't merge them for the hall. Privately the Decimus line cracked something the extraction had been keeping neat. The man who had opened Caesar’s morning with cheer, who had taken the nearer knife and Cisalpine as if a road were still a friendship, now traveled west as rumour ink: lists, fasces, a name that had once been access. Cassius had recruited doors through that access. The west was pricing the door-opener as meat. He didn't halt the silver for a rumour’s sake. He entered </w:t>
+        <w:t xml:space="preserve">Before the audience closed, a courier from the west, dust, salt, a seal cracked by too many hands, brought news that arrived as three incompatible tablets. Mutina won and lost. Consuls dead. Lists in Italy. The boy with fasces, and a court in his consulship that had called the names of every man of March, Cassius’s among them, to empty benches and condemned the benches. Antony still breathing, and the three of them looking east. One tablet named Decimus without poetry: gone, or going, or already a line item in someone else’s revenge. Cassius kept all three and didn’t merge them for the hall. Privately the Decimus line cracked something the extraction had been keeping neat. The man who had opened Caesar’s morning with cheer, who had taken the nearer knife and Cisalpine as if a road were still a friendship, now travelled west as rumour ink: lists, fasces, a name that had once been access. Cassius had recruited doors through that access. The west was pricing the door-opener as meat. He didn’t halt the silver for a rumour’s sake. He entered </w:t>
       </w:r>
       <w:r>
         <w:rPr>
@@ -11598,13 +11728,13 @@
       </w:r>
       <w:r>
         <w:rPr/>
-        <w:t xml:space="preserve"> in the only ledger he trusted, the one behind his eyes. Trebonius had stood in that column since the winter, since Dolabella’s soldiers came into his bedroom at Smyrna before dawn and carried the market-day man’s head out with them. Laodicea had settled Trebonius. Decimus had no Laodicea. He felt the entry as personal debit, not geography. The crack traveled with him anyway.</w:t>
-      </w:r>
-    </w:p>
-    <w:p>
-      <w:r>
-        <w:rPr/>
-        <w:t xml:space="preserve">An officer asked if they were becoming what they killed. Cassius watched the short-weight sack being restacked and said only, “We are becoming paid.” He didn't offer the Forum a prettier noun. He dismissed the elders with a bow that meant </w:t>
+        <w:t xml:space="preserve"> in the only ledger he trusted, the one behind his eyes. Trebonius had stood in that column since the winter, since Dolabella’s soldiers came into his bedroom at Smyrna before dawn and carried the market-day man’s head out with them. Laodicea had settled Trebonius. Decimus had no Laodicea. He felt the entry as personal debit, not geography. The crack travelled with him anyway.</w:t>
+      </w:r>
+    </w:p>
+    <w:p>
+      <w:r>
+        <w:rPr/>
+        <w:t xml:space="preserve">An officer asked if they were becoming what they killed. Cassius watched the short-weight sack being restacked and said only, “We are becoming paid.” He didn’t offer the Forum a prettier noun. He dismissed the elders with a bow that meant </w:t>
       </w:r>
       <w:r>
         <w:rPr>
@@ -11620,7 +11750,7 @@
     <w:p>
       <w:r>
         <w:rPr/>
-        <w:t>On the steps, wind off the harbour tried to steal a paper. Cassius pinned it with a thumb and didn't smile. Escaped papers became other men’s geometry. He preferred his own, even when his own now held Decimus as an open wound in the column.</w:t>
+        <w:t>On the steps, wind off the harbour tried to steal a paper. Cassius pinned it with a thumb and didn’t smile. Escaped papers became other men’s geometry. He preferred his own, even when his own now held Decimus as an open wound in the column.</w:t>
       </w:r>
     </w:p>
     <w:p>
@@ -11691,7 +11821,7 @@
     <w:p>
       <w:r>
         <w:rPr/>
-        <w:t xml:space="preserve">News from Italy had reached the mint tent as gossip: lists, fasces, a boy paid in fear, and Decimus’s name traveling wrong, the nearer knife become a rumour of ending. Brutus didn't ask which version was true. Asking would've required a Forum he no longer owned. The GO night’s clean hands felt suddenly like someone else’s. One honest doubt crossed him: </w:t>
+        <w:t xml:space="preserve">News from Italy had reached the mint tent as gossip: lists, fasces, a boy paid in fear, and Decimus’s name travelling wrong, the nearer knife become a rumour of ending. Brutus didn’t ask which version was true. Asking would’ve required a Forum he no longer owned. The GO night’s clean hands felt suddenly like someone else’s. One honest doubt crossed him: </w:t>
       </w:r>
       <w:r>
         <w:rPr>
@@ -11790,7 +11920,7 @@
     <w:p>
       <w:r>
         <w:rPr/>
-        <w:t>Dust coated his teeth. He spat and pointed and the pointing became cohorts moving, not clean, not parade, but moving. Someone shouted Cassius’ name from a direction that might have been victory or panic. Antony didn't pause to translate the shout. Another came down the line from the north, carried by a rider with no helmet: Brutus’s men were in the boy’s camp, cutting up the tents. The boy had a fever and Agrippa. Let them keep their own camp. Translation was for after the counting, if counting still had owners.</w:t>
+        <w:t>Dust coated his teeth. He spat and pointed and the pointing became cohorts moving, not clean, not parade, but moving. Someone shouted Cassius’s name from a direction that might have been victory or panic. Antony didn’t pause to translate the shout. Another came down the line from the north, carried by a rider with no helmet: Brutus’s men were in the boy’s camp, cutting up the tents. The boy had a fever and Agrippa. Let them keep their own camp. Translation was for after the counting, if counting still had owners.</w:t>
       </w:r>
     </w:p>
     <w:p>
@@ -11817,13 +11947,13 @@
     <w:p>
       <w:r>
         <w:rPr/>
-        <w:t>Dust found every gap in Laberius’ teeth; the eagle staff was the only upright fact he trusted. The young Caesar’s men had been lent to the spades, so it was Antony’s marsh his century stood in this morning. Behind him, from the north, the shouting said the boy’s own camp was gone, tents, mules and Laberius’s spare tunic with it.</w:t>
-      </w:r>
-    </w:p>
-    <w:p>
-      <w:r>
-        <w:rPr/>
-        <w:t>He saw a signal, or thought he did: flags in dust, an eagle dipping toward a ditch that might have been a marsh yesterday. Vibius yelled that Cassius’ side was broken. Someone else yelled the opposite with equal faith and a different god’s name attached. Laberius believed the yell nearest his ear and the ache in his forearms. Plains lied through mouths that needed the story more than the mud did.</w:t>
+        <w:t>Dust found every gap in Laberius’s teeth; the eagle staff was the only upright fact he trusted. The young Caesar’s men had been lent to the spades, so it was Antony’s marsh his century stood in this morning. Behind him, from the north, the shouting said the boy’s own camp was gone, tents, mules and Laberius’s spare tunic with it.</w:t>
+      </w:r>
+    </w:p>
+    <w:p>
+      <w:r>
+        <w:rPr/>
+        <w:t>He saw a signal, or thought he did: flags in dust, an eagle dipping toward a ditch that might have been a marsh yesterday. Vibius yelled that Cassius’s side was broken. Someone else yelled the opposite with equal faith and a different god’s name attached. Laberius believed the yell nearest his ear and the ache in his forearms. Plains lied through mouths that needed the story more than the mud did.</w:t>
       </w:r>
     </w:p>
     <w:p>
@@ -11835,7 +11965,7 @@
     <w:p>
       <w:r>
         <w:rPr/>
-        <w:t>His own eagle still stood. He put his hand on the staff once: wood, sweat, the crack that had been there since Mutina’s ditch. He kept it there while the shouts about Cassius’ hill cancelled each other. He did not know Cassius’ hill. He knew thirst and the next order that might be wrong.</w:t>
+        <w:t>His own eagle still stood. He put his hand on the staff once: wood, sweat, the crack that had been there since Mutina’s ditch. He kept it there while the shouts about Cassius’s hill cancelled each other. He did not know Cassius’s hill. He knew thirst and the next order that might be wrong.</w:t>
       </w:r>
     </w:p>
     <w:p>
@@ -11862,7 +11992,7 @@
     <w:p>
       <w:r>
         <w:rPr/>
-        <w:t xml:space="preserve">Dust made the man’s tongue thick; fear made it thicker. He had lost a sandal somewhere on the climb; one foot bled into the packed dirt of Cassius’ forward post. The map in Cassius’ head hungered for confirmation anyway. The first report said </w:t>
+        <w:t xml:space="preserve">Dust made the man’s tongue thick; fear made it thicker. He had lost a sandal somewhere on the climb; one foot bled into the packed dirt of Cassius’s forward post. The map in Cassius’s head hungered for confirmation anyway. The first report said </w:t>
       </w:r>
       <w:r>
         <w:rPr>
@@ -11872,7 +12002,7 @@
       </w:r>
       <w:r>
         <w:rPr/>
-        <w:t xml:space="preserve"> in a shape that matched Cassius’ worst sketch of the day. Standards gone. Wing broken. Brutus somewhere beyond the marsh and silent. Cassius’s hand found a tablet edge and gripped until the wax remembered his thumb.</w:t>
+        <w:t xml:space="preserve"> in a shape that matched Cassius’s worst sketch of the day. Standards gone. Wing broken. Brutus somewhere beyond the marsh and silent. Cassius’s hand found a tablet edge and gripped until the wax remembered his thumb.</w:t>
       </w:r>
     </w:p>
     <w:p>
@@ -11896,7 +12026,7 @@
     <w:p>
       <w:r>
         <w:rPr/>
-        <w:t>The runner came back empty-mouthed. No second count. Only another man who had heard the first yell secondhand and wanted to be useful by repeating it louder. A friend, attendant, someone with too much loyalty and not enough eyes, tried to amend the first report and only added fog. Brutus’ success, if it existed beyond the lying air, did not fit in either throat.</w:t>
+        <w:t>The runner came back empty-mouthed. No second count. Only another man who had heard the first yell secondhand and wanted to be useful by repeating it louder. A friend, attendant, someone with too much loyalty and not enough eyes, tried to amend the first report and only added fog. Brutus’s success, if it existed beyond the lying air, did not fit in either throat.</w:t>
       </w:r>
     </w:p>
     <w:p>
@@ -11948,7 +12078,7 @@
     <w:p>
       <w:r>
         <w:rPr/>
-        <w:t>He didn't speechify liberty. He didn't correct the map. He treated the incomplete report as closed by belief. He closed the account the only way left.</w:t>
+        <w:t>He didn’t speechify liberty. He didn’t correct the map. He treated the incomplete report as closed by belief. He closed the account the only way left.</w:t>
       </w:r>
     </w:p>
     <w:p>
@@ -12005,7 +12135,7 @@
     <w:p>
       <w:r>
         <w:rPr/>
-        <w:t>He didn't deliver a speech about it. This was weight and breath and mud that took boots the way grief took time.</w:t>
+        <w:t>He didn’t deliver a speech about it. This was weight and breath and mud that took boots the way grief took time.</w:t>
       </w:r>
     </w:p>
     <w:p>
@@ -12104,7 +12234,7 @@
     <w:p>
       <w:r>
         <w:rPr/>
-        <w:t>Fever made the tent canvas pulse. Twenty days ago Brutus’s men had come through this camp and run their swords through the litter he had left an hour before. His doctor had dreamed something and had him carried out into the marsh. Octavian remembered reeds, and lying very still, and being told afterward that it had been prudence. Sweat ran into his eyes and made the map swim. A courier asked for orders. Octavian gave two that mattered: hold the camp ditch; do not chase beyond the markers Agrippa had set. And one that only sounded like command, a sentence about courage he regretted as soon as it left his mouth. He didn't invent himself as genius of the plain. He survived noise. He survived other men’s versions of his usefulness.</w:t>
+        <w:t>Fever made the tent canvas pulse. Twenty days ago Brutus’s men had come through this camp and run their swords through the litter he had left an hour before. His doctor had dreamed something and had him carried out into the marsh. Octavian remembered reeds, and lying very still, and being told afterward that it had been prudence. Sweat ran into his eyes and made the map swim. A courier asked for orders. Octavian gave two that mattered: hold the camp ditch; do not chase beyond the markers Agrippa had set. And one that only sounded like command, a sentence about courage he regretted as soon as it left his mouth. He didn’t invent himself as genius of the plain. He survived noise. He survived other men’s versions of his usefulness.</w:t>
       </w:r>
     </w:p>
     <w:p>
@@ -12132,7 +12262,7 @@
     <w:p>
       <w:r>
         <w:rPr/>
-        <w:t>When someone tried to crown him with the day’s glory in a sentence, Octavian kept breathing and didn't bow. Sweat ran into the corner of his mouth; he swallowed it and asked Agrippa for the next count of the ditch.</w:t>
+        <w:t>When someone tried to crown him with the day’s glory in a sentence, Octavian kept breathing and didn’t bow. Sweat ran into the corner of his mouth; he swallowed it and asked Agrippa for the next count of the ditch.</w:t>
       </w:r>
     </w:p>
     <w:p>
@@ -12144,7 +12274,7 @@
     <w:p>
       <w:r>
         <w:rPr/>
-        <w:t>“They will want farms that belong to someone else,” Octavian said. He didn't dress it. He kept one hand flat on the list of promised acres until the paper stopped fluttering. Paper would not hold the soil still. That was the next war’s seed, held in the same breath as survival. He did not invent a destiny for it. He named the want. He kept breathing.</w:t>
+        <w:t>“They will want farms that belong to someone else,” Octavian said. He didn’t dress it. He kept one hand flat on the list of promised acres until the paper stopped fluttering. Paper would not hold the soil still. That was the next war’s seed, held in the same breath as survival. He did not invent a destiny for it. He named the want. He kept breathing.</w:t>
       </w:r>
     </w:p>
     <w:p>

</xml_diff>

<commit_message>
Book 1 mechanical copyedit (Gate 2) and regenerated reading copy (#155)
* Book 1 mechanical copyedit (Gate 2)

Curly apostrophes, possessive -s's, UK spelling, ledger and Latin
italics, five punctuation and grammar fixes; log in
archive/reports/mechanical_copyedit_book1.md.

Co-Authored-By: Claude Opus 5.5 (1M context) <noreply@anthropic.com>
Claude-Session: https://claude.ai/code/session_01FFN9ELo4KWKZsTKbpif5Vz

* Regenerate Book 1 reading copy after copyedit

Co-Authored-By: Claude Opus 5.5 (1M context) <noreply@anthropic.com>
Claude-Session: https://claude.ai/code/session_01FFN9ELo4KWKZsTKbpif5Vz

---------

Co-authored-by: Claude <noreply@anthropic.com>
</commit_message>
<xml_diff>
--- a/exports/Ides_Book1_FULL_Ch01-34.docx
+++ b/exports/Ides_Book1_FULL_Ch01-34.docx
@@ -27,7 +27,7 @@
         <w:br/>
         <w:t>Book 1 reading export · dinner-first opening · ends at Philippi · author-voice (no em dash)</w:t>
         <w:br/>
-        <w:t>Source: Manuscript f0bb9be (2026-10-22) · generated 2026-10-22 11:56 UTC from claude/project-thread-33runi @ 521b20f · source digest cfe7de4ebb53babc · chapters 1–34</w:t>
+        <w:t>Source: Manuscript f395a6b (2026-10-22) · generated 2026-10-22 12:48 UTC from main @ f395a6b · source digest c2bc4ba377269b30 · chapters 1–34</w:t>
       </w:r>
     </w:p>
     <w:p>
@@ -79,19 +79,19 @@
     <w:p>
       <w:r>
         <w:rPr/>
-        <w:t>The host had given him the third couch, a seat chosen the way a man chooses which cloak to lend a stranger. Not an insult. Not an honour. Sextilius had the couch beside it, still pink from the bath and the afternoon's flattery.</w:t>
-      </w:r>
-    </w:p>
-    <w:p>
-      <w:r>
-        <w:rPr/>
-        <w:t>“They have put us together as a lesson,” Sextilius murmured, tearing bread. “Here is the man who joined Caesar's side early. Here is the man who joined it eventually. Observe the difference in the cushions.”</w:t>
-      </w:r>
-    </w:p>
-    <w:p>
-      <w:r>
-        <w:rPr/>
-        <w:t>“I can't see a difference.”</w:t>
+        <w:t>The host had given him the third couch, a seat chosen the way a man chooses which cloak to lend a stranger. Not an insult. Not an honour. Sextilius had the couch beside it, still pink from the bath and the afternoon’s flattery.</w:t>
+      </w:r>
+    </w:p>
+    <w:p>
+      <w:r>
+        <w:rPr/>
+        <w:t>“They have put us together as a lesson,” Sextilius murmured, tearing bread. “Here is the man who joined Caesar’s side early. Here is the man who joined it eventually. Observe the difference in the cushions.”</w:t>
+      </w:r>
+    </w:p>
+    <w:p>
+      <w:r>
+        <w:rPr/>
+        <w:t>“I can’t see a difference.”</w:t>
       </w:r>
     </w:p>
     <w:p>
@@ -279,7 +279,17 @@
     <w:p>
       <w:r>
         <w:rPr/>
-        <w:t>Sextilius leaned in, wine-bright, while Aebutius explained the Phaedo to Tettius in the tone of a man correcting a tax return. “Digest carefully. There is talk the queen across the river keeps a child under Caesar’s roof. Private hours. Fresh paint. Best not to notice aloud.”</w:t>
+        <w:t xml:space="preserve">Sextilius leaned in, wine-bright, while Aebutius explained the </w:t>
+      </w:r>
+      <w:r>
+        <w:rPr>
+          <w:i/>
+        </w:rPr>
+        <w:t>Phaedo</w:t>
+      </w:r>
+      <w:r>
+        <w:rPr/>
+        <w:t xml:space="preserve"> to Tettius in the tone of a man correcting a tax return. “Digest carefully. There is talk the queen across the river keeps a child under Caesar’s roof. Private hours. Fresh paint. Best not to notice aloud.”</w:t>
       </w:r>
     </w:p>
     <w:p>
@@ -459,7 +469,7 @@
     <w:p>
       <w:r>
         <w:rPr/>
-        <w:t>“Thapsus,” someone said. Then: “Cato.” The names were not fresh, but the Forum still wanted them loud. Shouts. Bets. Sudden philosophy, months after the runner’s dust should have settled. A man at the next board was still arguing Utica hard enough to reopen a vein. Hordeonius didn't shout. Shouting was for men who sold certainty by the jug.</w:t>
+        <w:t>“Thapsus,” someone said. Then: “Cato.” The names were not fresh, but the Forum still wanted them loud. Shouts. Bets. Sudden philosophy, months after the runner’s dust should have settled. A man at the next board was still arguing Utica hard enough to reopen a vein. Hordeonius didn’t shout. Shouting was for men who sold certainty by the jug.</w:t>
       </w:r>
     </w:p>
     <w:p>
@@ -704,7 +714,7 @@
     <w:p>
       <w:r>
         <w:rPr/>
-        <w:t>Captives. Gold. Painted lies on wagons. Four triumphs in one month: Gaul, Egypt, Pontus, Africa. Rome had swallowed Caesar’s whole war in four courses, and Africa had been the last, and the taste was still on the street. Phileros had sent her for oil and eyes: watch who lingered near the Domus Publica’s public smile, count which clients arrived early to borrow the house’s favour. She understood tasks. She didn't understand why men needed wagons to prove they had already won.</w:t>
+        <w:t>Captives. Gold. Painted lies on wagons. Four triumphs in one month: Gaul, Egypt, Pontus, Africa. Rome had swallowed Caesar’s whole war in four courses, and Africa had been the last, and the taste was still on the street. Phileros had sent her for oil and eyes: watch who lingered near the Domus Publica’s public smile, count which clients arrived early to borrow the house’s favour. She understood tasks. She didn’t understand why men needed wagons to prove they had already won.</w:t>
       </w:r>
     </w:p>
     <w:p>
@@ -788,7 +798,7 @@
     <w:p>
       <w:r>
         <w:rPr/>
-        <w:t>Caesar passed at the edge of sight. Or a litter that might as well have been him. She saw only enough to know the house she served was tied to this noise. He didn't look at her. Great men didn't look at errands. She preferred it. Looking made you responsible for what you saw.</w:t>
+        <w:t>Caesar passed at the edge of sight. Or a litter that might as well have been him. She saw only enough to know the house she served was tied to this noise. He didn’t look at her. Great men didn’t look at errands. She preferred it. Looking made you responsible for what you saw.</w:t>
       </w:r>
     </w:p>
     <w:p>
@@ -956,7 +966,7 @@
     <w:p>
       <w:r>
         <w:rPr/>
-        <w:t>When Seius’ turn came, the patron’s nod was thin, already halfway to the next man.</w:t>
+        <w:t>When Seius’s turn came, the patron’s nod was thin, already halfway to the next man.</w:t>
       </w:r>
     </w:p>
     <w:p>
@@ -974,7 +984,7 @@
     <w:p>
       <w:r>
         <w:rPr/>
-        <w:t>Seius smiled like a man who owned useful things. He didn't. He owned a sister’s strained dowry talk and a talent for sweating through wool.</w:t>
+        <w:t>Seius smiled like a man who owned useful things. He didn’t. He owned a sister’s strained dowry talk and a talent for sweating through wool.</w:t>
       </w:r>
     </w:p>
     <w:p>
@@ -986,7 +996,7 @@
     <w:p>
       <w:r>
         <w:rPr/>
-        <w:t>Outside, in the lane’s cold, the middleman who smelled of Hordeonius’ wax waited with the patience of a professional accident. Seius had already borrowed for the toga and for a jar of oil good enough to be seen carrying. Now, it appeared, he would borrow for the borrowing. The sum was small enough to feel temporary and large enough to change what dinners Seius could refuse.</w:t>
+        <w:t>Outside, in the lane’s cold, the middleman who smelled of Hordeonius’s wax waited with the patience of a professional accident. Seius had already borrowed for the toga and for a jar of oil good enough to be seen carrying. Now, it appeared, he would borrow for the borrowing. The sum was small enough to feel temporary and large enough to change what dinners Seius could refuse.</w:t>
       </w:r>
     </w:p>
     <w:p>
@@ -1040,13 +1050,13 @@
     <w:p>
       <w:r>
         <w:rPr/>
-        <w:t>Seius took the terms because refusal meant standing still, and Seia Prima didn't reward stillness. He passed two clients still comparing whose patron had smiled wider. Comparison was the atrium’s second religion. Seius did not join. He was busy inventing a wider smile for home.</w:t>
-      </w:r>
-    </w:p>
-    <w:p>
-      <w:r>
-        <w:rPr/>
-        <w:t>At the house threshold Seia Prima was already waiting with a broom she did not need, waiting was her way of auditing. She took one look at his mouth and did not ask about the atrium.</w:t>
+        <w:t>Seius took the terms because refusal meant standing still, and Seia Prima didn’t reward stillness. He passed two clients still comparing whose patron had smiled wider. Comparison was the atrium’s second religion. Seius did not join. He was busy inventing a wider smile for home.</w:t>
+      </w:r>
+    </w:p>
+    <w:p>
+      <w:r>
+        <w:rPr/>
+        <w:t>At the house threshold Seia Prima was already waiting with a broom she did not need; waiting was her way of auditing. She took one look at his mouth and did not ask about the atrium.</w:t>
       </w:r>
     </w:p>
     <w:p>
@@ -1335,7 +1345,27 @@
     <w:p>
       <w:r>
         <w:rPr/>
-        <w:t>An older miles on his right mumbled a prayer that sounded like a shopping list: knees, sons, the next donative, land near Capua if the gods and clerks both remembered. Laberius didn’t mock him. He still needed water. He filed donative dated beside colony rumour the way he filed water: needed, not guaranteed.</w:t>
+        <w:t xml:space="preserve">An older miles on his right mumbled a prayer that sounded like a shopping list: knees, sons, the next donative, land near Capua if the gods and clerks both remembered. Laberius didn’t mock him. He still needed water. He filed </w:t>
+      </w:r>
+      <w:r>
+        <w:rPr>
+          <w:i/>
+        </w:rPr>
+        <w:t>donative dated</w:t>
+      </w:r>
+      <w:r>
+        <w:rPr/>
+        <w:t xml:space="preserve"> beside </w:t>
+      </w:r>
+      <w:r>
+        <w:rPr>
+          <w:i/>
+        </w:rPr>
+        <w:t>colony rumour</w:t>
+      </w:r>
+      <w:r>
+        <w:rPr/>
+        <w:t xml:space="preserve"> the way he filed water: needed, not guaranteed.</w:t>
       </w:r>
     </w:p>
     <w:p>
@@ -1740,7 +1770,7 @@
     <w:p>
       <w:r>
         <w:rPr/>
-        <w:t>On the temple steps above the Forum, heat came off the stone into Octavian’s thin shoes. He stood where important men’s shadows fell and practiced being invisible on purpose.</w:t>
+        <w:t>On the temple steps above the Forum, heat came off the stone into Octavian’s thin shoes. He stood where important men’s shadows fell and practised being invisible on purpose.</w:t>
       </w:r>
     </w:p>
     <w:p>
@@ -1935,7 +1965,7 @@
     <w:p>
       <w:r>
         <w:rPr/>
-        <w:t>“When he calls,” Octavian agreed. He almost added a colder clause about mouths and mornings, then bit it off. He kept what he could own without saying it: the dust route, the wind, Agrippa’s stubborn loyalty, and the attendant’s late bow, filed where names that arrive early get spent.</w:t>
+        <w:t>“When he calls,” Octavian agreed. He almost added a colder clause about mouths and mornings, then bit it off. He kept what he could own without saying it: the dust-route, the wind, Agrippa’s stubborn loyalty, and the attendant’s late bow, filed where names that arrive early get spent.</w:t>
       </w:r>
     </w:p>
     <w:p>
@@ -2766,7 +2796,7 @@
     <w:p>
       <w:r>
         <w:rPr/>
-        <w:t>Brutus’ jaw worked, as if clemency were a coin under his tongue he had not chosen to swallow. The diadem’s fear still hung between them. Cassius watched it try to dress postponement up as virtue. “If, only if, anything were ever done, it would have to be law’s face, not a street. I have not agreed to a plan. I have named the only face I could live with. That is not permission.”</w:t>
+        <w:t>Brutus’s jaw worked, as if clemency were a coin under his tongue he had not chosen to swallow. The diadem’s fear still hung between them. Cassius watched it try to dress postponement up as virtue. “If, only if, anything were ever done, it would have to be law’s face, not a street. I have not agreed to a plan. I have named the only face I could live with. That is not permission.”</w:t>
       </w:r>
     </w:p>
     <w:p>
@@ -2956,7 +2986,7 @@
     <w:p>
       <w:r>
         <w:rPr/>
-        <w:t>“Not now,” he said. “Send to Atticus’ people if they want Latin about ditches.”</w:t>
+        <w:t>“Not now,” he said. “Send to Atticus’s people if they want Latin about ditches.”</w:t>
       </w:r>
     </w:p>
     <w:p>
@@ -3379,7 +3409,7 @@
     <w:p>
       <w:r>
         <w:rPr/>
-        <w:t>Cassius’ nod was small. Small nods moved armies.</w:t>
+        <w:t>Cassius’s nod was small. Small nods moved armies.</w:t>
       </w:r>
     </w:p>
     <w:p>
@@ -3670,7 +3700,17 @@
     <w:p>
       <w:r>
         <w:rPr/>
-        <w:t>“I am with the Republic,” Seius said, which was what men said when they meant I am with my skin.</w:t>
+        <w:t xml:space="preserve">“I am with the Republic,” Seius said, which was what men said when they meant </w:t>
+      </w:r>
+      <w:r>
+        <w:rPr>
+          <w:i/>
+        </w:rPr>
+        <w:t>I am with my skin</w:t>
+      </w:r>
+      <w:r>
+        <w:rPr/>
+        <w:t>.</w:t>
       </w:r>
     </w:p>
     <w:p>
@@ -3811,7 +3851,17 @@
     <w:p>
       <w:r>
         <w:rPr/>
-        <w:t>Paullus left offended in the expensive way. Hordeonius blotted nothing. He only entered inquiry, political softness, refuse in a hand so neat it looked like virtue, then checked his ring.</w:t>
+        <w:t xml:space="preserve">Paullus left offended in the expensive way. Hordeonius blotted nothing. He only entered </w:t>
+      </w:r>
+      <w:r>
+        <w:rPr>
+          <w:i/>
+        </w:rPr>
+        <w:t>inquiry, political softness, refuse</w:t>
+      </w:r>
+      <w:r>
+        <w:rPr/>
+        <w:t xml:space="preserve"> in a hand so neat it looked like virtue, then checked his ring.</w:t>
       </w:r>
     </w:p>
     <w:p>
@@ -3829,7 +3879,17 @@
     <w:p>
       <w:r>
         <w:rPr/>
-        <w:t>“Then bring me a name that bleeds,” Hordeonius said, already blotting. “Otherwise Visellius pays as written.” He entered soft hours, storm weather without looking up. A consul walking free of a bad morning was the kind of morning he would not underwrite without an invoice. “I sell umbrellas. I do not join the rain.”</w:t>
+        <w:t xml:space="preserve">“Then bring me a name that bleeds,” Hordeonius said, already blotting. “Otherwise Visellius pays as written.” He entered </w:t>
+      </w:r>
+      <w:r>
+        <w:rPr>
+          <w:i/>
+        </w:rPr>
+        <w:t>soft hours, storm weather</w:t>
+      </w:r>
+      <w:r>
+        <w:rPr/>
+        <w:t xml:space="preserve"> without looking up. A consul walking free of a bad morning was the kind of morning he would not underwrite without an invoice. “I sell umbrellas. I do not join the rain.”</w:t>
       </w:r>
     </w:p>
     <w:p>
@@ -3898,7 +3958,17 @@
     <w:p>
       <w:r>
         <w:rPr/>
-        <w:t>He took copies, left the originals for whoever played magistrate this week, and entered Visellius, A.: doubtful with a care that felt like closing a child’s eyes. On the street he heard his own name already mutating into rumour, interest you paid without a contract. Tablets, he noted, could kill as quietly as speeches.</w:t>
+        <w:t xml:space="preserve">He took copies, left the originals for whoever played magistrate this week, and entered </w:t>
+      </w:r>
+      <w:r>
+        <w:rPr>
+          <w:i/>
+        </w:rPr>
+        <w:t>Visellius, A.: doubtful</w:t>
+      </w:r>
+      <w:r>
+        <w:rPr/>
+        <w:t xml:space="preserve"> with a care that felt like closing a child’s eyes. On the street he heard his own name already mutating into rumour, interest you paid without a contract. Tablets, he noted, could kill as quietly as speeches.</w:t>
       </w:r>
     </w:p>
     <w:p>
@@ -4396,7 +4466,7 @@
     <w:p>
       <w:r>
         <w:rPr/>
-        <w:t>The visitor himself, someone Decimus-shaped, or Trebonius-shaped; she never got the face clean, was in the atrium speaking cheerfully about schedules. Cheerful men blended into the walls in this house. He praised the household’s order loud enough for any door-slave to sell later as loyalty. The attendant, waiting with a cloak, answered with the smile attendants wore when masters performed friendship, then, to another cloak, soft enough that stone might miss it:</w:t>
+        <w:t>The visitor himself (someone Decimus-shaped, or Trebonius-shaped; she never got the face clean) was in the atrium speaking cheerfully about schedules. Cheerful men blended into the walls in this house. He praised the household’s order loud enough for any door-slave to sell later as loyalty. The attendant, waiting with a cloak, answered with the smile attendants wore when masters performed friendship, then, to another cloak, soft enough that stone might miss it:</w:t>
       </w:r>
     </w:p>
     <w:p>
@@ -4675,7 +4745,7 @@
     <w:p>
       <w:r>
         <w:rPr/>
-        <w:t>“Bores,” Trebonius said, “also hold consuls while better men invent their knives.” He sipped nothing from an empty hand and went to practice a longer hold. The spare-Antony mercy now had a body attached: Trebonius’s voice as a leash.</w:t>
+        <w:t>“Bores,” Trebonius said, “also hold consuls while better men invent their knives.” He sipped nothing from an empty hand and went to practise a longer hold. The spare-Antony mercy now had a body attached: Trebonius’s voice as a leash.</w:t>
       </w:r>
     </w:p>
     <w:p>
@@ -5327,7 +5397,7 @@
     <w:p>
       <w:r>
         <w:rPr/>
-        <w:t>The Sacra Via was already loud. March mornings in Rome never waited for great men. Shop fronts were opening. Someone argued about fish. Decimus walked through it with the cheer of a man sent to collect a friend for dinner. The dinner was the Senate. The friend was Caesar. Decimus’ heart sat in his throat like a swallowed coin.</w:t>
+        <w:t>The Sacra Via was already loud. March mornings in Rome never waited for great men. Shop fronts were opening. Someone argued about fish. Decimus walked through it with the cheer of a man sent to collect a friend for dinner. The dinner was the Senate. The friend was Caesar. Decimus’s heart sat in his throat like a swallowed coin.</w:t>
       </w:r>
     </w:p>
     <w:p>
@@ -5445,7 +5515,7 @@
     <w:p>
       <w:r>
         <w:rPr/>
-        <w:t>“Enough,” Caesar said, and the room rearranged around the word. His gaze flicked, doors, lists, Decimus’ face, Calpurnia’s knuckles white on wood. “The sacrifices have been sour.”</w:t>
+        <w:t>“Enough,” Caesar said, and the room rearranged around the word. His gaze flicked, doors, lists, Decimus’s face, Calpurnia’s knuckles white on wood. “The sacrifices have been sour.”</w:t>
       </w:r>
     </w:p>
     <w:p>
@@ -5481,7 +5551,17 @@
     <w:p>
       <w:r>
         <w:rPr/>
-        <w:t>He put out his hand, and his chin tipped, half a breath, the old road signal: ditch clear, philosophy later. Calpurnia saw it. Her mouth tightened. She recognised the habit that had always meant he will go with this man. Decimus felt the tip fail under her eyes, too small a betrayal to name, too large to take back, and held the hand open anyway without finishing the joke that used to follow the tip in Spain.</w:t>
+        <w:t xml:space="preserve">He put out his hand, and his chin tipped, half a breath, the old road signal: ditch clear, philosophy later. Calpurnia saw it. Her mouth tightened. She recognised the habit that had always meant </w:t>
+      </w:r>
+      <w:r>
+        <w:rPr>
+          <w:i/>
+        </w:rPr>
+        <w:t>he will go with this man</w:t>
+      </w:r>
+      <w:r>
+        <w:rPr/>
+        <w:t>. Decimus felt the tip fail under her eyes, too small a betrayal to name, too large to take back, and held the hand open anyway without finishing the joke that used to follow the tip in Spain.</w:t>
       </w:r>
     </w:p>
     <w:p>
@@ -5511,7 +5591,7 @@
     <w:p>
       <w:r>
         <w:rPr/>
-        <w:t>Caesar didn’t speak. Decimus filled the air anyway, soft logistics, the chatter of loyalty: which way, how many, Antony would be, Antony would be held. Trebonius’ job. Decimus didn’t say that. He said, “It will be a short session,” and smiled. Shortness was not mercy. It only sounded like it.</w:t>
+        <w:t>Caesar didn’t speak. Decimus filled the air anyway, soft logistics, the chatter of loyalty: which way, how many, Antony would be, Antony would be held. Trebonius’s job. Decimus didn’t say that. He said, “It will be a short session,” and smiled. Shortness was not mercy. It only sounded like it.</w:t>
       </w:r>
     </w:p>
     <w:p>
@@ -5592,7 +5672,7 @@
     <w:p>
       <w:r>
         <w:rPr/>
-        <w:t>Phileros’ lamp bobbed from the vestibule. “If it’s thieves…”</w:t>
+        <w:t>Phileros’s lamp bobbed from the vestibule. “If it’s thieves…”</w:t>
       </w:r>
     </w:p>
     <w:p>
@@ -5640,7 +5720,7 @@
     <w:p>
       <w:r>
         <w:rPr/>
-        <w:t>Against her ribs, under linen, the wax fragment held its few words. Pressed yesterday when a visitor’s attendant had muttered near the peristyle, wrong-ended: friends, spare, stay, danger, something like consul. She hadn’t understood the Senate-shape of it. She understood enough to be afraid of Phileros finding it. Phileros believed door-knowledge was a priesthood, and priesthoods did not share.</w:t>
+        <w:t>Against her ribs, under linen, the wax fragment held its few words. Pressed yesterday when a visitor’s attendant had muttered near the peristyle, wrong-ended: friends, spare, stay, danger, something like consul. She hadn’t understood the Senate shape of it. She understood enough to be afraid of Phileros finding it. Phileros believed door-knowledge was a priesthood, and priesthoods did not share.</w:t>
       </w:r>
     </w:p>
     <w:p>
@@ -5700,7 +5780,7 @@
     <w:p>
       <w:r>
         <w:rPr/>
-        <w:t>What would she hand Caesar? A mutter? Against Decimus’ open hands and the Senate’s hunger for his attendance? Against Calpurnia’s broken weather, already spent?</w:t>
+        <w:t>What would she hand Caesar? A mutter? Against Decimus’s open hands and the Senate’s hunger for his attendance? Against Calpurnia’s broken weather, already spent?</w:t>
       </w:r>
     </w:p>
     <w:p>
@@ -5742,7 +5822,7 @@
     <w:p>
       <w:r>
         <w:rPr/>
-        <w:t>She knew only that her fragment had failed in a vestibule that smelled of onion, and that Decimus’ cheer still hung in the atrium like perfume after a guest has gone.</w:t>
+        <w:t>She knew only that her fragment had failed in a vestibule that smelled of onion, and that Decimus’s cheer still hung in the atrium like perfume after a guest has gone.</w:t>
       </w:r>
     </w:p>
     <w:p>
@@ -5790,7 +5870,7 @@
     <w:p>
       <w:r>
         <w:rPr/>
-        <w:t>“A man from the college. Or a man who knows a man from the college.” Phileros’ shoulders performed helplessness. “They always look insulted if you want them to.”</w:t>
+        <w:t>“A man from the college. Or a man who knows a man from the college.” Phileros’s shoulders performed helplessness. “They always look insulted if you want them to.”</w:t>
       </w:r>
     </w:p>
     <w:p>
@@ -6045,7 +6125,7 @@
     <w:p>
       <w:r>
         <w:rPr/>
-        <w:t>At the portico of Pompey the air changed. Shade, columns, the smell of stone that had watched other men’s ambitions. The Senate sat here while their own house stayed unfinished; Pompey’s statue waited inside. Senators clustered in the false casualness of men who had arrived early on purpose. Decimus saw Casca’s shoulder, Tillius’ mouth already shaped for petition, Cassius too still. Brutus stood carved for a different century.</w:t>
+        <w:t>At the portico of Pompey the air changed. Shade, columns, the smell of stone that had watched other men’s ambitions. The Senate sat here while their own house stayed unfinished; Pompey’s statue waited inside. Senators clustered in the false casualness of men who had arrived early on purpose. Decimus saw Casca’s shoulder, Tillius’s mouth already shaped for petition, Cassius too still. Brutus stood carved for a different century.</w:t>
       </w:r>
     </w:p>
     <w:p>
@@ -6081,7 +6161,7 @@
     <w:p>
       <w:r>
         <w:rPr/>
-        <w:t>Decimus wiped his clean hands on his tunic, once, where no one would see, and went to find Trebonius’ eye.</w:t>
+        <w:t>Decimus wiped his clean hands on his tunic, once, where no one would see, and went to find Trebonius’s eye.</w:t>
       </w:r>
     </w:p>
     <w:p>
@@ -6096,7 +6176,7 @@
     <w:p>
       <w:r>
         <w:rPr/>
-        <w:t>Antony liked the Theatre of Pompey complex the way soldiers liked any place with shade and a crowd to read. Columns made people smaller. Smaller people told the truth faster, or lied worse, either was useful.</w:t>
+        <w:t>Antony liked the Theatre of Pompey complex the way soldiers liked any place with shade and a crowd to read. Columns made people smaller. Smaller people told the truth faster, or lied worse; either was useful.</w:t>
       </w:r>
     </w:p>
     <w:p>
@@ -6126,7 +6206,7 @@
     <w:p>
       <w:r>
         <w:rPr/>
-        <w:t>“It’s a man in my debt who swears he has news from Gaul that won’t keep.” Trebonius’ hand on Antony’s elbow was friendly. Friendly hands steered. Antony allowed himself to be steered a few paces into the portico’s shoulder, where the Senate’s murmur became a wall.</w:t>
+        <w:t>“It’s a man in my debt who swears he has news from Gaul that won’t keep.” Trebonius’s hand on Antony’s elbow was friendly. Friendly hands steered. Antony allowed himself to be steered a few paces into the portico’s shoulder, where the Senate’s murmur became a wall.</w:t>
       </w:r>
     </w:p>
     <w:p>
@@ -6216,7 +6296,7 @@
     <w:p>
       <w:r>
         <w:rPr/>
-        <w:t>Antony’s body understood before his politics did. He shook Trebonius’ hand off without thinking it rude.</w:t>
+        <w:t>Antony’s body understood before his politics did. He shook Trebonius’s hand off without thinking it rude.</w:t>
       </w:r>
     </w:p>
     <w:p>
@@ -6228,7 +6308,7 @@
     <w:p>
       <w:r>
         <w:rPr/>
-        <w:t>Trebonius’ face was still warm. Warm, while the Curia poured men out like a broken jar. Togas, bare heads, eyes too white.</w:t>
+        <w:t>Trebonius’s face was still warm. Warm, while the Curia poured men out like a broken jar. Togas, bare heads, eyes too white.</w:t>
       </w:r>
     </w:p>
     <w:p>
@@ -6294,7 +6374,7 @@
     <w:p>
       <w:r>
         <w:rPr/>
-        <w:t xml:space="preserve">One door. Too many togae. Benches ran along both sides in tiers. Pompey’s statue at the far end of the room, enemy’s face in marble, watching: the most honest piece of furniture in Rome. Caesar came in with that slight forward lean of a man late for his own power, Decimus’ cheer still faintly on him like perfume. He sat. Or half-sat. The golden chair made its small theatre of precedence: the Senate’s own vote, gilt above their benches, saying </w:t>
+        <w:t xml:space="preserve">One door. Too many togas. Benches ran along both sides in tiers. Pompey’s statue at the far end of the room, enemy’s face in marble, watching: the most honest piece of furniture in Rome. Caesar came in with that slight forward lean of a man late for his own power, Decimus’s cheer still faintly on him like perfume. He sat. Or half-sat. The golden chair made its small theatre of precedence: the Senate’s own vote, gilt above their benches, saying </w:t>
       </w:r>
       <w:r>
         <w:rPr>
@@ -6322,13 +6402,13 @@
     <w:p>
       <w:r>
         <w:rPr/>
-        <w:t>Now, Cassius thought, not as prayer. Prayer was Brutus’ department.</w:t>
-      </w:r>
-    </w:p>
-    <w:p>
-      <w:r>
-        <w:rPr/>
-        <w:t>Tillius’ hands found the toga. Pulled.</w:t>
+        <w:t>Now, Cassius thought, not as prayer. Prayer was Brutus’s department.</w:t>
+      </w:r>
+    </w:p>
+    <w:p>
+      <w:r>
+        <w:rPr/>
+        <w:t>Tillius’s hands found the toga. Pulled.</w:t>
       </w:r>
     </w:p>
     <w:p>
@@ -6364,7 +6444,7 @@
     <w:p>
       <w:r>
         <w:rPr/>
-        <w:t>He didn’t see a tyrant in that instant. He saw a body that had walked through Gaul and Alexandria and the stubborn Spanish hills. A body that might yet stand up and make this morning a botched thing. Cassius’ blade went in where flesh allowed it. Heat ran over his knuckles.</w:t>
+        <w:t>He didn’t see a tyrant in that instant. He saw a body that had walked through Gaul and Alexandria and the stubborn Spanish hills. A body that might yet stand up and make this morning a botched thing. Cassius’s blade went in where flesh allowed it. Heat ran over his knuckles.</w:t>
       </w:r>
     </w:p>
     <w:p>
@@ -6382,7 +6462,7 @@
     <w:p>
       <w:r>
         <w:rPr/>
-        <w:t>The plan had been simple, and in the room it was not. There were more than sixty of them, and not all of them knew where to stand. Men struck at Caesar and at each other. A blade opened Brutus’ hand. The conspirators had sworn to be a surgery and they were, for a few breaths, a pack.</w:t>
+        <w:t>The plan had been simple, and in the room it was not. There were more than sixty of them, and not all of them knew where to stand. Men struck at Caesar and at each other. A blade opened Brutus’s hand. The conspirators had sworn to be a surgery and they were, for a few breaths, a pack.</w:t>
       </w:r>
     </w:p>
     <w:p>
@@ -6427,7 +6507,7 @@
     <w:p>
       <w:r>
         <w:rPr/>
-        <w:t>Men he respected shoved. Men he did not respect shoved harder. Caesar’s mouth opened on pain and command at once. Brutus’ ancestors, imagined, arranged on their shelves at home, did not lean in to help. They watched, as masks watch.</w:t>
+        <w:t>Men he respected shoved. Men he did not respect shoved harder. Caesar’s mouth opened on pain and command at once. Brutus’s ancestors, imagined, arranged on their shelves at home, did not lean in to help. They watched, as masks watch.</w:t>
       </w:r>
     </w:p>
     <w:p>
@@ -6529,7 +6609,7 @@
     <w:p>
       <w:r>
         <w:rPr/>
-        <w:t>Cassius’ hand found Brutus’ elbow hard enough to bruise. “Capitol,” Cassius said, practical as salt, station face for anyone still listening.</w:t>
+        <w:t>Cassius’s hand found Brutus’s elbow hard enough to bruise. “Capitol,” Cassius said, practical as salt, station face for anyone still listening.</w:t>
       </w:r>
     </w:p>
     <w:p>
@@ -6742,7 +6822,7 @@
     <w:p>
       <w:r>
         <w:rPr/>
-        <w:t xml:space="preserve">Brutus spoke. He heard himself speak. The words were right (libertas, tyrant, law, ancestors), each one a stone from a good road. He had learned </w:t>
+        <w:t>Brutus spoke. He heard himself speak. The words were right (</w:t>
       </w:r>
       <w:r>
         <w:rPr>
@@ -6752,6 +6832,16 @@
       </w:r>
       <w:r>
         <w:rPr/>
+        <w:t xml:space="preserve">, tyrant, law, ancestors), each one a stone from a good road. He had learned </w:t>
+      </w:r>
+      <w:r>
+        <w:rPr>
+          <w:i/>
+        </w:rPr>
+        <w:t>libertas</w:t>
+      </w:r>
+      <w:r>
+        <w:rPr/>
         <w:t xml:space="preserve"> as a schoolboy, in the same lesson as the first Brutus and the last king. Below, the Forum didn’t become a choir. It became noise with legs. Cheers happened in patches and died. Someone shouted for Caesar. Someone shouted for the dead man’s veterans. Someone shouted for grain. Grain was not a consul.</w:t>
       </w:r>
     </w:p>
@@ -6788,7 +6878,7 @@
     <w:p>
       <w:r>
         <w:rPr/>
-        <w:t>Brutus watched a knot of women shove a knot of men and felt the first cold thought that was not philosophical: we have killed a man the city loved more than it loves our vocabulary. Under it, smaller and worse: I killed a man who forgave me and kept me close. The late hour after the spare returned without asking leave stood beside the Forum noise. Wine gone warm. Ordinary talk. The war treated as a misunderstanding their house could afford. The rock could not make private guilt public enough to share. He wanted, badly, to wait until the Forum rearranged itself into the audience the words deserved. Waiting was the softest cowardice available. It looked like hope.</w:t>
+        <w:t>Brutus watched a knot of women shove a knot of men and felt the first cold thought that was not philosophical: we have killed a man the city loved more than it loves our vocabulary. Under it, smaller and worse: I killed a man who forgave me and kept me close. The late hour after the spare returned without asking leave and stood beside the Forum noise. Wine gone warm. Ordinary talk. The war treated as a misunderstanding their house could afford. The rock could not make private guilt public enough to share. He wanted, badly, to wait until the Forum rearranged itself into the audience the words deserved. Waiting was the softest cowardice available. It looked like hope.</w:t>
       </w:r>
     </w:p>
     <w:p>
@@ -6876,7 +6966,7 @@
     <w:p>
       <w:r>
         <w:rPr/>
-        <w:t>Toward evening the light went copper. The Capitol’s stone held heat. Brutus’ hands smelled of metal no matter how often he washed them in a basin someone provided like a sacrament. He dried them on his toga and still would not look at his own palms. Eyes could not make the spare into something other than blood. He drafted, in his head, the speech he might write down so the day would have a cleaner spine than it deserved. Drafting was another way of not leaving.</w:t>
+        <w:t>Toward evening the light went copper. The Capitol’s stone held heat. Brutus’s hands smelled of metal no matter how often he washed them in a basin someone provided like a sacrament. He dried them on his toga and still would not look at his own palms. Eyes could not make the spare into something other than blood. He drafted, in his head, the speech he might write down so the day would have a cleaner spine than it deserved. Drafting was another way of not leaving.</w:t>
       </w:r>
     </w:p>
     <w:p>
@@ -6939,7 +7029,7 @@
     <w:p>
       <w:r>
         <w:rPr/>
-        <w:t>Lepidus’ men were a fact in the city’s body: the legion on the Tiber island, the only organised soldiers close to Rome. Facts could be marched into the Forum and made into a butcher’s festival. M. Pacuvius (scar through the eyebrow, Antony’s old donative contact) said as much, hopeful as a dog.</w:t>
+        <w:t>Lepidus’s men were a fact in the city’s body: the legion on the Tiber island, the only organised soldiers close to Rome. Facts could be marched into the Forum and made into a butcher’s festival. M. Pacuvius (scar through the eyebrow, Antony’s old donative contact) said as much, hopeful as a dog.</w:t>
       </w:r>
     </w:p>
     <w:p>
@@ -7059,7 +7149,7 @@
     <w:p>
       <w:r>
         <w:rPr/>
-        <w:t>Pacuvius made the face of a man receiving wisdom, chin tip, eyes grateful, the station grin that kept consuls from smelling mutiny. “As you say. Rooms. Doors. Feed them soft.”</w:t>
+        <w:t>Pacuvius made the face of a man receiving wisdom, chin-tip, eyes grateful, the station grin that kept consuls from smelling mutiny. “As you say. Rooms. Doors. Feed them soft.”</w:t>
       </w:r>
     </w:p>
     <w:p>
@@ -7122,7 +7212,7 @@
     <w:p>
       <w:r>
         <w:rPr/>
-        <w:t>Brutus’ people wanted praise and protection. Antony’s people wanted the dictator’s papers to remain law so the city did not tip into a void where every debt could be renegotiated with a knife. Cicero heard both and performed the old trick: show each side the part of its face that could still be called Republic.</w:t>
+        <w:t>Brutus’s people wanted praise and protection. Antony’s people wanted the dictator’s papers to remain law so the city did not tip into a void where every debt could be renegotiated with a knife. Cicero heard both and performed the old trick: show each side the part of its face that could still be called Republic.</w:t>
       </w:r>
     </w:p>
     <w:p>
@@ -7230,7 +7320,37 @@
     <w:p>
       <w:r>
         <w:rPr/>
-        <w:t>Cicero heard enough to file gardens / boy / queen / wound beside amnesty, and Decimus / second line as a debt the dead man still held on the living. He did not enter the corridor argument. Entering would have made him a stall. He preferred rooms that asked for periods. The praise-smile lasted until the temple steps; then it was only a face arranging itself for Atticus.</w:t>
+        <w:t xml:space="preserve">Cicero heard enough to file </w:t>
+      </w:r>
+      <w:r>
+        <w:rPr>
+          <w:i/>
+        </w:rPr>
+        <w:t>gardens / boy / queen / wound</w:t>
+      </w:r>
+      <w:r>
+        <w:rPr/>
+        <w:t xml:space="preserve"> beside </w:t>
+      </w:r>
+      <w:r>
+        <w:rPr>
+          <w:i/>
+        </w:rPr>
+        <w:t>amnesty</w:t>
+      </w:r>
+      <w:r>
+        <w:rPr/>
+        <w:t xml:space="preserve">, and </w:t>
+      </w:r>
+      <w:r>
+        <w:rPr>
+          <w:i/>
+        </w:rPr>
+        <w:t>Decimus / second line</w:t>
+      </w:r>
+      <w:r>
+        <w:rPr/>
+        <w:t xml:space="preserve"> as a debt the dead man still held on the living. He did not enter the corridor argument. Entering would have made him a stall. He preferred rooms that asked for periods. The praise-smile lasted until the temple steps; then it was only a face arranging itself for Atticus.</w:t>
       </w:r>
     </w:p>
     <w:p>
@@ -7308,7 +7428,7 @@
     <w:p>
       <w:r>
         <w:rPr/>
-        <w:t>A junior senator (Seius’ type, though not Seius) laughed too loudly. Sosia, on the next stool, did not. The laugh wanted company; the stall offered rates instead. Hordeonius didn’t join the laugh. Humour was for men who didn’t hold other men’s winters in wax, unless the humour sold a second cup without confessing appetite.</w:t>
+        <w:t>A junior senator (Seius’s type, though not Seius) laughed too loudly. Sosia, on the next stool, did not. The laugh wanted company; the stall offered rates instead. Hordeonius didn’t join the laugh. Humour was for men who didn’t hold other men’s winters in wax, unless the humour sold a second cup without confessing appetite.</w:t>
       </w:r>
     </w:p>
     <w:p>
@@ -7344,7 +7464,7 @@
     <w:p>
       <w:r>
         <w:rPr/>
-        <w:t>He entered prices the way other men entered omens. Up a hair on river-adjacent leases. Down on properties too near Liberators’ doors. A man tried to sell him, quietly, a copy of Visellius’ old debt marks, the ghost of a ledger already closed, hinting Basilus and an Antonian name could still be made to squeal.</w:t>
+        <w:t>He entered prices the way other men entered omens. Up a hair on river-adjacent leases. Down on properties too near Liberators’ doors. A man tried to sell him, quietly, a copy of Visellius’s old debt marks, the ghost of a ledger already closed, hinting Basilus and an Antonian name could still be made to squeal.</w:t>
       </w:r>
     </w:p>
     <w:p>
@@ -7452,13 +7572,13 @@
     <w:p>
       <w:r>
         <w:rPr/>
-        <w:t>“He loved you,” Antony said in Decimus’ general direction though Decimus wasn’t there to receive it. Loved you enough to write you into the will and die on your schedule. Second degree. Second line. The portico joke had grown teeth and ink. The laugh wanted to become a story. Antony swallowed it. Stories would be for the Forum.</w:t>
-      </w:r>
-    </w:p>
-    <w:p>
-      <w:r>
-        <w:rPr/>
-        <w:t>What mattered: the boy. The name. The crowd’s three hundred reasons to remember Caesar as a father instead of a corpse produced by philosophers. Antony priced the boy the way he priced soft cohorts: thin shoes; a careful mother, Caesar’s niece Atia, who kept her son near her and her opinions nearer; a paper son who had never fed a veteran. Useful ink. Not a rival. He filed that price without writing it down.</w:t>
+        <w:t>“He loved you,” Antony said in Decimus’s general direction, though Decimus wasn’t there to receive it. Loved you enough to write you into the will and die on your schedule. Second degree. Second line. The portico joke had grown teeth and ink. The laugh wanted to become a story. Antony swallowed it. Stories would be for the Forum.</w:t>
+      </w:r>
+    </w:p>
+    <w:p>
+      <w:r>
+        <w:rPr/>
+        <w:t>What mattered: the boy. The name. The crowd’s three hundred reasons to remember Caesar as a father instead of a corpse produced by philosophers. Antony priced the boy the way he priced soft cohorts: thin shoes; a careful mother, Caesar’s niece Atia, who kept her son near her and her opinions nearer; a paper-son who had never fed a veteran. Useful ink. Not a rival. He filed that price without writing it down.</w:t>
       </w:r>
     </w:p>
     <w:p>
@@ -7527,7 +7647,7 @@
     <w:p>
       <w:r>
         <w:rPr/>
-        <w:t>Nysa saw, for a blink, Decimus’ open morning face in the Domus atrium. She didn’t have a philosophy for it. She had a stomach.</w:t>
+        <w:t>Nysa saw, for a blink, Decimus’s open morning face in the Domus atrium. She didn’t have a philosophy for it. She had a stomach.</w:t>
       </w:r>
     </w:p>
     <w:p>
@@ -7809,7 +7929,7 @@
     <w:p>
       <w:r>
         <w:rPr/>
-        <w:t>When the crowd surged, she surged or be crushed. Her incomplete wax stabbed her ribs. She kept it. Relics were stupid. She was allowed one stupidity.</w:t>
+        <w:t>When the crowd surged, she surged rather than be crushed. Her incomplete wax stabbed her ribs. She kept it. Relics were stupid. She was allowed one stupidity.</w:t>
       </w:r>
     </w:p>
     <w:p>
@@ -8046,7 +8166,7 @@
     <w:p>
       <w:r>
         <w:rPr/>
-        <w:t>Brutus’ face was pale under soot. “They burned Helvius for a name. If you take Cisalpine now, you take Antony’s hunger with it. Come east with us first. Let the nearer knife wait until the Forum’s heat cools.”</w:t>
+        <w:t>Brutus’s face was pale under soot. “They burned Helvius for a name. If you take Cisalpine now, you take Antony’s hunger with it. Come east with us first. Let the nearer knife wait until the Forum’s heat cools.”</w:t>
       </w:r>
     </w:p>
     <w:p>
@@ -8076,7 +8196,7 @@
     <w:p>
       <w:r>
         <w:rPr/>
-        <w:t>“I am not asking for a blessing.” Decimus clasped Brutus’ forearm once: friend, co-murderer, stranger already arguing about timing. “Do not wait for the Forum to love you. It loved a corpse more.”</w:t>
+        <w:t>“I am not asking for a blessing.” Decimus clasped Brutus’s forearm once: friend, co-murderer, stranger already arguing about timing. “Do not wait for the Forum to love you. It loved a corpse more.”</w:t>
       </w:r>
     </w:p>
     <w:p>
@@ -8088,7 +8208,17 @@
     <w:p>
       <w:r>
         <w:rPr/>
-        <w:t>On the road north, while that smoke thinned behind him into other men’s problems, he sent two letters. One went to Plancus across the Alps, whose letters were always very good and whose legions were always very close to home: courteous, asking for a meeting that smelled like alliance and for twenty wagons of grain if the meeting could not be soon. One went to a man who owed Lepidus a favour, asking only for a safe night’s roof near Mutina’s approaches. Mutina, on the Via Aemilia, was the fortress he had built in his head a year ago, ditches and all. He counted the twenty in his head the way he counted remounts before rain: numbers that kept men fed. Plancus’s reply arrived soft: praise, delay, no date, and a careful line that grain “could not yet be spared from his own columns.” Decimus read yet twice, then looked at the empty stretch of road where wagons should have been and were not. The Lepidus channel returned a messenger who wouldn’t meet his eyes, wouldn’t dismount long enough to take a second tablet back. Decimus held the first letter like a receipt with no goods attached. He folded both silences into the map-case hard enough that the wax edge bit his thumb. Nearer knives, he told himself, were still knives you could see. Friends who would not send grain or a roof had already begun the road that ended without wagons. The will’s second line traveled with him like pitch he could not wipe.</w:t>
+        <w:t xml:space="preserve">On the road north, while that smoke thinned behind him into other men’s problems, he sent two letters. One went to Plancus across the Alps, whose letters were always very good and whose legions were always very close to home: courteous, asking for a meeting that smelled like alliance and for twenty wagons of grain if the meeting could not be soon. One went to a man who owed Lepidus a favour, asking only for a safe night’s roof near Mutina’s approaches. Mutina, on the Via Aemilia, was the fortress he had built in his head a year ago, ditches and all. He counted the twenty in his head the way he counted remounts before rain: numbers that kept men fed. Plancus’s reply arrived soft: praise, delay, no date, and a careful line that grain “could not yet be spared from his own columns.” Decimus read </w:t>
+      </w:r>
+      <w:r>
+        <w:rPr>
+          <w:i/>
+        </w:rPr>
+        <w:t>yet</w:t>
+      </w:r>
+      <w:r>
+        <w:rPr/>
+        <w:t xml:space="preserve"> twice, then looked at the empty stretch of road where wagons should have been and were not. The Lepidus channel returned a messenger who wouldn’t meet his eyes, wouldn’t dismount long enough to take a second tablet back. Decimus held the first letter like a receipt with no goods attached. He folded both silences into the map-case hard enough that the wax edge bit his thumb. Nearer knives, he told himself, were still knives you could see. Friends who would not send grain or a roof had already begun the road that ended without wagons. The will’s second line travelled with him like pitch he could not wipe.</w:t>
       </w:r>
     </w:p>
     <w:p>
@@ -8457,7 +8587,7 @@
     <w:p>
       <w:r>
         <w:rPr/>
-        <w:t>“Off the Apollonia boat at Brundisium. Caesar’s old soldiers walked out on the road to look at him. Now he’s making for his stepfather’s villa on the bay, Philippus’, near Naples.”</w:t>
+        <w:t>“Off the Apollonia boat at Brundisium. Caesar’s old soldiers walked out on the road to look at him. Now he’s making for his stepfather’s villa on the bay, Philippus’s, near Naples.”</w:t>
       </w:r>
     </w:p>
     <w:p>
@@ -8539,7 +8669,7 @@
         <w:rPr>
           <w:i/>
         </w:rPr>
-        <w:t>wine shops already practicing the laugh</w:t>
+        <w:t>wine shops already practising the laugh</w:t>
       </w:r>
       <w:r>
         <w:rPr/>
@@ -8686,7 +8816,7 @@
     <w:p>
       <w:r>
         <w:rPr/>
-        <w:t>Cassius’ letters, from his own house nearer the coast, smelled of ships and contempt. Brutus answered carefully, sentence by sentence. Care might still travel where he could not. At the gate a client offered a purse “for expenses on the road south, if the praetor would only write one introduction.” Brutus returned the purse unopened. “I will not buy quiet with other men’s coin,” he said. The client bowed too low and went.</w:t>
+        <w:t>Cassius’s letters, from his own house nearer the coast, smelled of ships and contempt. Brutus answered carefully, sentence by sentence. Care might still travel where he could not. At the gate a client offered a purse “for expenses on the road south, if the praetor would only write one introduction.” Brutus returned the purse unopened. “I will not buy quiet with other men’s coin,” he said. The client bowed too low and went.</w:t>
       </w:r>
     </w:p>
     <w:p>
@@ -8780,7 +8910,7 @@
     <w:p>
       <w:r>
         <w:rPr/>
-        <w:t>Octavian stood in Philippus’ villa light: sea glare, careful chairs, advice thick as oil. Atia’s fear sat in the room without needing a seat. She had already rearranged the cushions twice. Cushions could not refuse a will. Philippus spoke of safety, of refusal, of not taking a dead man’s quarrel into a living throat. Outside, a gardener clipped something that didn’t need clipping. Noise for courage.</w:t>
+        <w:t>Octavian stood in Philippus’s villa light: sea glare, careful chairs, advice thick as oil. Atia’s fear sat in the room without needing a seat. She had already rearranged the cushions twice. Cushions could not refuse a will. Philippus spoke of safety, of refusal, of not taking a dead man’s quarrel into a living throat. Outside, a gardener clipped something that didn’t need clipping. Noise for courage.</w:t>
       </w:r>
     </w:p>
     <w:p>
@@ -9151,7 +9281,7 @@
     <w:p>
       <w:r>
         <w:rPr/>
-        <w:t>A whisperer tried again to sell him Visellius’ old tablet ghosts, Basilus orbit, an Antonian hand, the Subura stair that still had a rumour attached. He laid a scrap on the stool: names in a February hand, men sounded at the baths before the Ides. Ash could not pay.</w:t>
+        <w:t>A whisperer tried again to sell him Visellius’s old tablet ghosts, Basilus orbit, an Antonian hand, the Subura stair that still had a rumour attached. He laid a scrap on the stool: names in a February hand, men sounded at the baths before the Ides. Ash could not pay.</w:t>
       </w:r>
     </w:p>
     <w:p>
@@ -9163,7 +9293,7 @@
     <w:p>
       <w:r>
         <w:rPr/>
-        <w:t>The whisperer bowed as if receiving a funeral oration. “Of course. Living seals.” His offense waited for the next pillar: “He’ll price a boy’s name and call a murder tablet poetry. Ask him for Basilus and he sells you piety.” Sosia’s mouth twitched, almost audible, then he drank so the twitch would look like thirst.</w:t>
+        <w:t>The whisperer bowed as if receiving a funeral oration. “Of course. Living seals.” His offence waited for the next pillar: “He’ll price a boy’s name and call a murder tablet poetry. Ask him for Basilus and he sells you piety.” Sosia’s mouth twitched, almost audible, then he drank so the twitch would look like thirst.</w:t>
       </w:r>
     </w:p>
     <w:p>
@@ -9181,7 +9311,7 @@
     <w:p>
       <w:r>
         <w:rPr/>
-        <w:t>“Brutus’ sea house,” Sosia said, “a day down the coast. He’s sitting there out of Rome’s reach, and his mother has moved her clerks in after him.”</w:t>
+        <w:t>“Brutus’s sea house,” Sosia said, “a day down the coast. He’s sitting there out of Rome’s reach, and his mother has moved her clerks in after him.”</w:t>
       </w:r>
     </w:p>
     <w:p>
@@ -9531,7 +9661,7 @@
     <w:p>
       <w:r>
         <w:rPr/>
-        <w:t>“Philosophers,” the scar said. “Down at Brutus’s sea-house at Antium, the lot of them, and his mother’s clerks with them. Servilia’s already rewriting paper so her boys don’t have to carry corn like freedmen. You’ll hear it before the Senate does.”</w:t>
+        <w:t>“Philosophers,” the scar said. “Down at Brutus’s sea house at Antium, the lot of them, and his mother’s clerks with them. Servilia’s already rewriting paper so her boys don’t have to carry corn like freedmen. You’ll hear it before the Senate does.”</w:t>
       </w:r>
     </w:p>
     <w:p>
@@ -9580,7 +9710,7 @@
     <w:p>
       <w:r>
         <w:rPr/>
-        <w:t>Brutus asked Cicero to speak as if speech could still be strategy. He had a tablet on his knee with the Senate’s seal broken, and he tapped it once. “Grain buyers,” he said. “Asia for me, Sicily for Cassius. A praetor’s excuse to be out of Rome past ten nights, and a merchant’s errand to dress it.” The room held Porcia’s severity, Tertulla’s stillness, Favonius’ moral cough, and Servilia, who listened the way bankers listened to interest. Servilia had married that daughter to Cassius. One family, both knives; Cicero had always admired the economy. Favonius he remembered barefoot behind Cato in the Forum, copying the old man’s feet, and remembered the story that he had told Brutus last winter a civil war was worse than a king. Nobody had handed him a dagger in March. He had come to Antium anyway, to cough. A steward, Hilarus if Cicero’s memory of names still worked, poured wine that nobody truly tasted.</w:t>
+        <w:t>Brutus asked Cicero to speak as if speech could still be strategy. He had a tablet on his knee with the Senate’s seal broken, and he tapped it once. “Grain buyers,” he said. “Asia for me, Sicily for Cassius. A praetor’s excuse to be out of Rome past ten nights, and a merchant’s errand to dress it.” The room held Porcia’s severity, Tertulla’s stillness, Favonius’s moral cough, and Servilia, who listened the way bankers listened to interest. Servilia had married that daughter to Cassius. One family, both knives; Cicero had always admired the economy. Favonius he remembered barefoot behind Cato in the Forum, copying the old man’s feet, and remembered the story that he had told Brutus last winter that a civil war was worse than a king. Nobody had handed him a dagger in March. He had come to Antium anyway, to cough. A steward, Hilarus if Cicero’s memory of names still worked, poured wine that nobody truly tasted.</w:t>
       </w:r>
     </w:p>
     <w:p>
@@ -9604,7 +9734,7 @@
     <w:p>
       <w:r>
         <w:rPr/>
-        <w:t>Porcia’s mouth tightened at every compromise. Tertulla watched her husband’s empty place. Absence was an argument. Favonius coughed morality into the pauses until the pauses preferred Cassius’ dust to Favonius’ virtue.</w:t>
+        <w:t>Porcia’s mouth tightened at every compromise. Tertulla watched her husband’s empty place. Absence was an argument. Favonius coughed morality into the pauses until the pauses preferred Cassius’s dust to Favonius’s virtue.</w:t>
       </w:r>
     </w:p>
     <w:p>
@@ -9640,7 +9770,7 @@
     <w:p>
       <w:r>
         <w:rPr/>
-        <w:t>Brutus’ face did the old slow collapse into resolve. The Rome-return balloon, Cicero’s prettiest paragraph, died in Brutus’ throat. East became less a choice than a harbour with a direction.</w:t>
+        <w:t>Brutus’s face did the old slow collapse into resolve. The Rome-return balloon, Cicero’s prettiest paragraph, died in Brutus’s throat. East became less a choice than a harbour with a direction.</w:t>
       </w:r>
     </w:p>
     <w:p>
@@ -10077,7 +10207,7 @@
     <w:p>
       <w:r>
         <w:rPr/>
-        <w:t>At mid-morning an envoy came anyway, cloak clean, smile practiced, the sort of man who carried other men’s threats as if they were invitations to dinner. He stood in the command room where the wall map of the Via Aemilia still showed Decimus’s pins as facts. An aide hovered with a wax roll. A levy clerk waited at the door with pay marks still wet. The room wanted to be polite. It was already a siege rehearsal.</w:t>
+        <w:t>At mid-morning an envoy came anyway, cloak clean, smile practised, the sort of man who carried other men’s threats as if they were invitations to dinner. He stood in the command room where the wall map of the Via Aemilia still showed Decimus’s pins as facts. An aide hovered with a wax roll. A levy clerk waited at the door with pay marks still wet. The room wanted to be polite. It was already a siege rehearsal.</w:t>
       </w:r>
     </w:p>
     <w:p>
@@ -10400,7 +10530,7 @@
     <w:p>
       <w:r>
         <w:rPr/>
-        <w:t>Antony had opened a count in public, not a negotiation. Decimus’s throat tightened, the old key turning. He didn't climb down. Climbing down would've looked like confession.</w:t>
+        <w:t>Antony had opened a count in public, not a negotiation. Decimus’s throat tightened, the old key turning. He didn’t climb down. Climbing down would’ve looked like confession.</w:t>
       </w:r>
     </w:p>
     <w:p>
@@ -10484,7 +10614,7 @@
     <w:p>
       <w:r>
         <w:rPr/>
-        <w:t>He walked the walls at night with a cloak that did not keep the Ides out. The deed felt far and stupidly intimate, a debt owed a corpse who had trusted his cheer. An aide offered wine. Decimus refused, then took half a cup anyway. He checked a gate twice and didn't tell anyone why the second check felt like apology. Below, Antony’s fires multiplied. The siege had a face now. The face that had counted his smoke.</w:t>
+        <w:t>He walked the walls at night with a cloak that did not keep the Ides out. The deed felt far and stupidly intimate, a debt owed a corpse who had trusted his cheer. An aide offered wine. Decimus refused, then took half a cup anyway. He checked a gate twice and didn’t tell anyone why the second check felt like apology. Below, Antony’s fires multiplied. The siege had a face now. The face that had counted his smoke.</w:t>
       </w:r>
     </w:p>
     <w:p>
@@ -10533,7 +10663,7 @@
     <w:p>
       <w:r>
         <w:rPr/>
-        <w:t xml:space="preserve">Octavian listened to himself become a tool. When Cicero’s gaze sought approval, he gave a nod calibrated to obedience and nothing else. He didn't think </w:t>
+        <w:t xml:space="preserve">Octavian listened to himself become a tool. When Cicero’s gaze sought approval, he gave a nod calibrated to obedience and nothing else. He didn’t think </w:t>
       </w:r>
       <w:r>
         <w:rPr>
@@ -10565,7 +10695,7 @@
     <w:p>
       <w:r>
         <w:rPr/>
-        <w:t>Afterward a senator clasped his arm and called him the Republic’s luck. Octavian returned the clasp at half strength. Half strength still looked like gratitude if you did not measure. Agrippa’s stillness held until the clasp ended. Only then did he match pace toward the vendor street. A northern courier’s fragments stayed unmerged in Octavian’s hand: Decimus holding, Antony digging, Pacuvius still hungry for storm. Cicero left looking like a man certain he had saved the Republic. Outside, a vendor sold hot food and called no one Caesar. Octavian heard him and didn't correct him.</w:t>
+        <w:t>Afterward a senator clasped his arm and called him the Republic’s luck. Octavian returned the clasp at half strength. Half strength still looked like gratitude if you did not measure. Agrippa’s stillness held until the clasp ended. Only then did he match pace toward the vendor street. A northern courier’s fragments stayed unmerged in Octavian’s hand: Decimus holding, Antony digging, Pacuvius still hungry for storm. Cicero left looking like a man certain he had saved the Republic. Outside, a vendor sold hot food and called no one Caesar. Octavian heard him and didn’t correct him.</w:t>
       </w:r>
     </w:p>
     <w:p>
@@ -10604,13 +10734,13 @@
     <w:p>
       <w:r>
         <w:rPr/>
-        <w:t>Laberius’ world narrowed to mud and which eagle still stood.</w:t>
-      </w:r>
-    </w:p>
-    <w:p>
-      <w:r>
-        <w:rPr/>
-        <w:t>In rooms with clean sandals this would be named success before the mud dried. In the ditch it was screaming. Martians refusing to be held. Someone’s javelin nearly killing him until a voice yelled his century’s joke-name. Antony’s men came out hard. Hard enough that Laberius smelled the old Spanish stubbornness again, the kind that did not care who Rome called consul. Hirtius hit harder when the day turned. Laberius didn't see strategy. He saw a standard tilt. He saw a friend open at the neck. Blood mixed with meltwater and ran pink off the rim of his shield.</w:t>
+        <w:t>Laberius’s world narrowed to mud and which eagle still stood.</w:t>
+      </w:r>
+    </w:p>
+    <w:p>
+      <w:r>
+        <w:rPr/>
+        <w:t>In rooms with clean sandals this would be named success before the mud dried. In the ditch it was screaming. Martians refusing to be held. Someone’s javelin nearly killing him until a voice yelled his century’s joke-name. Antony’s men came out hard. Hard enough that Laberius smelled the old Spanish stubbornness again, the kind that did not care who Rome called consul. Hirtius hit harder when the day turned. Laberius didn’t see strategy. He saw a standard tilt. He saw a friend open at the neck. Blood mixed with meltwater and ran pink off the rim of his shield.</w:t>
       </w:r>
     </w:p>
     <w:p>
@@ -10634,7 +10764,7 @@
     <w:p>
       <w:r>
         <w:rPr/>
-        <w:t>Pay talk lived under the noise like a second drum. Who owed donatives. Which Caesar’s name still fed mouths. Whether Hirtius’ clean reputation meant Rome finally understood mud. Capua still sat in Laberius’s boots as an unpaid date. Forum smoke had taught him the dirt could walk without clerks. Mutina mud taught him it could drown you while walking. A boy from another century asked if they were fighting for the Senate or for bread. Laberius said, “Fight for the man on your left. Capua argues later, if later still has a road.”</w:t>
+        <w:t>Pay talk lived under the noise like a second drum. Who owed donatives. Which Caesar’s name still fed mouths. Whether Hirtius’s clean reputation meant Rome finally understood mud. Capua still sat in Laberius’s boots as an unpaid date. Forum smoke had taught him the dirt could walk without clerks. Mutina mud taught him it could drown you while walking. A boy from another century asked if they were fighting for the Senate or for bread. Laberius said, “Fight for the man on your left. Capua argues later, if later still has a road.”</w:t>
       </w:r>
     </w:p>
     <w:p>
@@ -10652,7 +10782,7 @@
     <w:p>
       <w:r>
         <w:rPr/>
-        <w:t>That was one fact Laberius could keep: Hirtius down, confirmed by a man who had touched him. Pansa’s name still swam in the yell-water, wounded, dying, fine, poisoned, blessed. “They carried him off at Forum Gallorum,” Vibius said. “A week back, that village down the road with a market’s name. Javelin in the side. I saw the litter. I didn’t see inside it.” Laberius didn't promote any Pansa version. Vibius had a litter. Nobody had a shoulder.</w:t>
+        <w:t>That was one fact Laberius could keep: Hirtius down, confirmed by a man who had touched him. Pansa’s name still swam in the yell-water, wounded, dying, fine, poisoned, blessed. “They carried him off at Forum Gallorum,” Vibius said. “A week back, that village down the road with a market’s name. Javelin in the side. I saw the litter. I didn’t see inside it.” Laberius didn’t promote any Pansa version. Vibius had a litter. Nobody had a shoulder.</w:t>
       </w:r>
     </w:p>
     <w:p>
@@ -10664,7 +10794,7 @@
     <w:p>
       <w:r>
         <w:rPr/>
-        <w:t>Water ran into his boots. He had stopped noticing wet hours ago; noticing returned when the fighting thinned and the cold found room. Vibius pointed at Mutina’s wall, still closed. “Town’s still his,” Vibius said, meaning Decimus. Laberius grunted. Walls didn't feed the ditch.</w:t>
+        <w:t>Water ran into his boots. He had stopped noticing wet hours ago; noticing returned when the fighting thinned and the cold found room. Vibius pointed at Mutina’s wall, still closed. “Town’s still his,” Vibius said, meaning Decimus. Laberius grunted. Walls didn’t feed the ditch.</w:t>
       </w:r>
     </w:p>
     <w:p>
@@ -10676,7 +10806,7 @@
     <w:p>
       <w:r>
         <w:rPr/>
-        <w:t>He stacked a shield that was not his. The owner would not need it. Somewhere behind, gallopers already carried “great success” toward Rome. Laberius carried a friend’s boots, left boot split at the heel, still warm somehow. He knew Hirtius was dead. He knew Antony’s near shields had thinned. What Rome would buy with those two facts, he left to the gallopers. He didn't follow their dust.</w:t>
+        <w:t>He stacked a shield that was not his. The owner would not need it. Somewhere behind, gallopers already carried “great success” toward Rome. Laberius carried a friend’s boots, left boot split at the heel, still warm somehow. He knew Hirtius was dead. He knew Antony’s near shields had thinned. What Rome would buy with those two facts, he left to the gallopers. He didn’t follow their dust.</w:t>
       </w:r>
     </w:p>
     <w:p>
@@ -10715,7 +10845,7 @@
     <w:p>
       <w:r>
         <w:rPr/>
-        <w:t xml:space="preserve">He labeled all three </w:t>
+        <w:t xml:space="preserve">He labelled all three </w:t>
       </w:r>
       <w:r>
         <w:rPr>
@@ -10839,7 +10969,7 @@
     <w:p>
       <w:r>
         <w:rPr/>
-        <w:t>Cicero’s praise arrived sweet and late. Decimus read one line of congratulation twice, then folded it into a pack already too light on grain. He wrote one more letter that tried to sound steady, gates held, honour intact. He stopped mid-sentence when his hand cramped. He didn't send a second copy.</w:t>
+        <w:t>Cicero’s praise arrived sweet and late. Decimus read one line of congratulation twice, then folded it into a pack already too light on grain. He wrote one more letter that tried to sound steady, gates held, honour intact. He stopped mid-sentence when his hand cramped. He didn’t send a second copy.</w:t>
       </w:r>
     </w:p>
     <w:p>
@@ -10869,7 +10999,7 @@
     <w:p>
       <w:r>
         <w:rPr/>
-        <w:t>“Let them,” Decimus said. “We take the west fork before dark. The east ford is watched, I smelled horse-lines on the wind this morning. Plancus has crossed. Lepidus’s man returned the tablet. We do not wait for dates that practice absence.”</w:t>
+        <w:t>“Let them,” Decimus said. “We take the west fork before dark. The east ford is watched, I smelled horse-lines on the wind this morning. Plancus has crossed. Lepidus’s man returned the tablet. We do not wait for dates that practise absence.”</w:t>
       </w:r>
     </w:p>
     <w:p>
@@ -10881,7 +11011,7 @@
     <w:p>
       <w:r>
         <w:rPr/>
-        <w:t>Decimus heard the names as doors that had already closed while he counted hinges. “Then we do not invent a fifth name for hope,” he said. The first aide opened his mouth on another complaint. Decimus was already counting remaining waterskins aloud, making the count the argument beside the named absences. At a crossroads shrine someone had left a cheap wreath for “the liberators.” Rain had ruined it. Decimus didn't stop to fix it. He checked his horse’s mouth for sores and found none. The sores were in the map. Every promised friend a thinner line than yesterday.</w:t>
+        <w:t>Decimus heard the names as doors that had already closed while he counted hinges. “Then we do not invent a fifth name for hope,” he said. The first aide opened his mouth on another complaint. Decimus was already counting remaining waterskins aloud, making the count the argument beside the named absences. At a crossroads shrine someone had left a cheap wreath for “the liberators.” Rain had ruined it. Decimus didn’t stop to fix it. He checked his horse’s mouth for sores and found none. The sores were in the map. Every promised friend a thinner line than yesterday.</w:t>
       </w:r>
     </w:p>
     <w:p>
@@ -10893,7 +11023,7 @@
     <w:p>
       <w:r>
         <w:rPr/>
-        <w:t>On the second day the staff was smaller. One man had “gone for water” and not returned. Decimus didn't send a search. Searches taught the road your remaining number.</w:t>
+        <w:t>On the second day the staff was smaller. One man had “gone for water” and not returned. Decimus didn’t send a search. Searches taught the road your remaining number.</w:t>
       </w:r>
     </w:p>
     <w:p>
@@ -10962,7 +11092,7 @@
     <w:p>
       <w:r>
         <w:rPr/>
-        <w:t>Octavian’s throat tightened once, shame or fever, he didn't sort it. He looked at the pay chests, not at Agrippa’s face. “Then we pay before we argue. Men who are owed invent worse stories than senators do.”</w:t>
+        <w:t>Octavian’s throat tightened once, shame or fever; he didn’t sort it. He looked at the pay chests, not at Agrippa’s face. “Then we pay before we argue. Men who are owed invent worse stories than senators do.”</w:t>
       </w:r>
     </w:p>
     <w:p>
@@ -11050,7 +11180,7 @@
     <w:p>
       <w:r>
         <w:rPr/>
-        <w:t>A senator who had voted him an ovation and then forgotten to pay for it called him the gods’ gift and waited for a smile of destiny. Octavian looked at him until the man found something to do with his hands. A soldier shouted the name Caesar as paymaster; Octavian didn't bow to it like a hymn. He let the shout stand because paymaster was a job his hands already understood better than luck.</w:t>
+        <w:t>A senator who had voted him an ovation and then forgotten to pay for it called him the gods’ gift and waited for a smile of destiny. Octavian looked at him until the man found something to do with his hands. A soldier shouted the name Caesar as paymaster; Octavian didn’t bow to it like a hymn. He let the shout stand because paymaster was a job his hands already understood better than luck.</w:t>
       </w:r>
     </w:p>
     <w:p>
@@ -11062,7 +11192,7 @@
     <w:p>
       <w:r>
         <w:rPr/>
-        <w:t>By autumn a courier brought Decimus’s end as three incompatible stories. Ditch. Alps. Lepidus’s smile. Antony’s purse, no purse, a speech, no speech. Octavian kept all three on separate scraps and didn't let the clerks merge them. What the stories shared was enough for the ranks: the last Liberator in Italy was gone, and the north had no one left to hold it but Antony and Lepidus. In the same week a tablet came under two seals pressed side by side in the same wax, Lepidus’s and Antony’s: talk, on the river island below Bononia, between the camps, where no city could listen. Decimus’s absence didn't make him wise. It made Bononia feel caused. The empty north. The men behind him louder.</w:t>
+        <w:t>By autumn a courier brought Decimus’s end as three incompatible stories. Ditch. Alps. Lepidus’s smile. Antony’s purse, no purse, a speech, no speech. Octavian kept all three on separate scraps and didn’t let the clerks merge them. What the stories shared was enough for the ranks: the last Liberator in Italy was gone, and the north had no one left to hold it but Antony and Lepidus. In the same week a tablet came under two seals pressed side by side in the same wax, Lepidus’s and Antony’s: talk, on the river island below Bononia, between the camps, where no city could listen. Decimus’s absence didn’t make him wise. It made Bononia feel caused. The empty north. The men behind him louder.</w:t>
       </w:r>
     </w:p>
     <w:p>
@@ -11224,7 +11354,7 @@
     <w:p>
       <w:r>
         <w:rPr/>
-        <w:t>Antony poured wine that did not taste like celebration. He did not look at Octavian while pouring. Octavian let him not look, and didn't drink deep. Lepidus drank as men drink when they hope the cup will make them smaller than the map. Outside, a horse screamed at nothing. Inside, the lists grew.</w:t>
+        <w:t>Antony poured wine that did not taste like celebration. He did not look at Octavian while pouring. Octavian let him not look, and didn’t drink deep. Lepidus drank as men drink when they hope the cup will make them smaller than the map. Outside, a horse screamed at nothing. Inside, the lists grew.</w:t>
       </w:r>
     </w:p>
     <w:p>
@@ -11248,7 +11378,7 @@
     <w:p>
       <w:r>
         <w:rPr/>
-        <w:t>Seius found his name absent and felt holy relief, then shame at the holiness. He walked past a posted list twice to be sure, eyes watering from more than wind. A neighbour who had once loaned him applause was present in black letters. Seius didn't stop walking. Stopping looked like guilt.</w:t>
+        <w:t>Seius found his name absent and felt holy relief, then shame at the holiness. He walked past a posted list twice to be sure, eyes watering from more than wind. A neighbour who had once loaned him applause was present in black letters. Seius didn’t stop walking. Stopping looked like guilt.</w:t>
       </w:r>
     </w:p>
     <w:p>
@@ -11260,7 +11390,7 @@
     <w:p>
       <w:r>
         <w:rPr/>
-        <w:t>“I do not know that spelling,” Seius said. True enough to keep his door; false enough that Gavius’s mouth flattened. The woman stepped back. Kinship itself felt contagious. Seius bought oil he did not need so his hands would look busy. He congratulated no one. He locked doors and checked the locks twice. Seia Prima asked if honesty still mattered. He said honesty was a peacetime crop. She didn't laugh. “Then harvest carefully,” she said. “Peacetime crops still get taxed when the lists are hungry.” He almost smiled at her, old Seia who audited his atrium smile against paper. He stopped before smiling looked like relief worth posting. In bed he rehearsed congratulations for whoever won the next rumour, and hated the rehearsal even as he perfected it.</w:t>
+        <w:t>“I do not know that spelling,” Seius said. True enough to keep his door; false enough that Gavius’s mouth flattened. The woman stepped back. Kinship itself felt contagious. Seius bought oil he did not need so his hands would look busy. He congratulated no one. He locked doors and checked the locks twice. Seia Prima asked if honesty still mattered. He said honesty was a peacetime crop. She didn’t laugh. “Then harvest carefully,” she said. “Peacetime crops still get taxed when the lists are hungry.” He almost smiled at her, old Seia who audited his atrium smile against paper. He stopped before smiling looked like relief worth posting. In bed he rehearsed congratulations for whoever won the next rumour, and hated the rehearsal even as he perfected it.</w:t>
       </w:r>
     </w:p>
     <w:p>
@@ -11281,7 +11411,7 @@
     <w:p>
       <w:r>
         <w:rPr/>
-        <w:t xml:space="preserve">“I am preserving value,” he informed his empty shelf. The shelf didn't absolve. Sosia looked at him the way he looked at a bad joke. He had not told one. Truth under proscription sounded like a joke whether you meant one or not. He entered </w:t>
+        <w:t xml:space="preserve">“I am preserving value,” he informed his empty shelf. The shelf didn’t absolve. Sosia looked at him the way he looked at a bad joke. He had not told one. Truth under proscription sounded like a joke whether you meant one or not. He entered </w:t>
       </w:r>
       <w:r>
         <w:rPr>
@@ -11291,7 +11421,7 @@
       </w:r>
       <w:r>
         <w:rPr/>
-        <w:t xml:space="preserve"> in a private cipher and hated that honesty still felt like bookkeeping virtue. In the dark he smelled Visellius’ old room for no reason and told himself archaeology was closed.</w:t>
+        <w:t xml:space="preserve"> in a private cipher and hated that honesty still felt like bookkeeping virtue. In the dark he smelled Visellius’s old room for no reason and told himself archaeology was closed.</w:t>
       </w:r>
     </w:p>
     <w:p>
@@ -11376,7 +11506,7 @@
     <w:p>
       <w:r>
         <w:rPr/>
-        <w:t>Proscription had turned his name into a price. A freedman had brought the copy to Tusculum: his own name, and his brother Quintus’s, and the nephew’s, under an edict sealed by three men. One of the three was the boy. He tried to treat the price as a rhetorical problem and failed. Rhetoric needed an audience; hunters weren't one. He catalogued, helplessly, the old skills: period, antithesis, the pause that made juries lean. None of them lengthened a road.</w:t>
+        <w:t>Proscription had turned his name into a price. A freedman had brought the copy to Tusculum: his own name, and his brother Quintus’s, and the nephew’s, under an edict sealed by three men. One of the three was the boy. He tried to treat the price as a rhetorical problem and failed. Rhetoric needed an audience; hunters weren’t one. He catalogued, helplessly, the old skills: period, antithesis, the pause that made juries lean. None of them lengthened a road.</w:t>
       </w:r>
     </w:p>
     <w:p>
@@ -11394,13 +11524,13 @@
     <w:p>
       <w:r>
         <w:rPr/>
-        <w:t>A boy selling fish by the verge stared at the litter. Fame might have been a colour on it. Cicero almost shaped a greeting and then didn't. Greeting belonged to mornings when names weren't prices. He counted the poles’ rhythm and tried to turn it into a period. The period refused to close.</w:t>
-      </w:r>
-    </w:p>
-    <w:p>
-      <w:r>
-        <w:rPr/>
-        <w:t>“Faster,” he told the bearers, then hated the undignified word. Speed wasn't eloquence. Speed was what animals did when the forest closed. He tried a mental period about courage and found only the rhythm of poles on stone. The litter didn't care about antithesis.</w:t>
+        <w:t>A boy selling fish by the verge stared at the litter. Fame might have been a colour on it. Cicero almost shaped a greeting and then didn’t. Greeting belonged to mornings when names weren’t prices. He counted the poles’ rhythm and tried to turn it into a period. The period refused to close.</w:t>
+      </w:r>
+    </w:p>
+    <w:p>
+      <w:r>
+        <w:rPr/>
+        <w:t>“Faster,” he told the bearers, then hated the undignified word. Speed wasn’t eloquence. Speed was what animals did when the forest closed. He tried a mental period about courage and found only the rhythm of poles on stone. The litter didn’t care about antithesis.</w:t>
       </w:r>
     </w:p>
     <w:p>
@@ -11424,7 +11554,7 @@
     <w:p>
       <w:r>
         <w:rPr/>
-        <w:t>He didn't deliver a final Philippic. Rhetoric needed breath and an hour. He had seconds and a neck. He offered them the stillness he had practised in courts when the verdict was already known. He almost shaped a line about the Republic. He let it die unspoken.</w:t>
+        <w:t>He didn’t deliver a final Philippic. Rhetoric needed breath and an hour. He had seconds and a neck. He offered them the stillness he had practised in courts when the verdict was already known. He almost shaped a line about the Republic. He let it die unspoken.</w:t>
       </w:r>
     </w:p>
     <w:p>
@@ -11442,13 +11572,13 @@
     <w:p>
       <w:r>
         <w:rPr/>
-        <w:t>The sea kept sounding like itself. That offended him more than the blades. The surf didn't pause for a verdict.</w:t>
-      </w:r>
-    </w:p>
-    <w:p>
-      <w:r>
-        <w:rPr/>
-        <w:t>His last clear thought was the petty wish that Atticus would understand the silence without needing a courier to explain it. And that the boy wouldn't mistake silence for permission.</w:t>
+        <w:t>The sea kept sounding like itself. That offended him more than the blades. The surf didn’t pause for a verdict.</w:t>
+      </w:r>
+    </w:p>
+    <w:p>
+      <w:r>
+        <w:rPr/>
+        <w:t>His last clear thought was the petty wish that Atticus would understand the silence without needing a courier to explain it. And that the boy wouldn’t mistake silence for permission.</w:t>
       </w:r>
     </w:p>
     <w:p>
@@ -11478,13 +11608,13 @@
     <w:p>
       <w:r>
         <w:rPr/>
-        <w:t>Cassius listened to a city’s elders explain poverty with practiced dignity.</w:t>
-      </w:r>
-    </w:p>
-    <w:p>
-      <w:r>
-        <w:rPr/>
-        <w:t>The hall smelled of oil and fear-sweat dressed as perfume. Outside, harbour noise argued with temple bells. A fly walked the rim of a cup. Elders in a half-circle, interpreters at their shoulders, a young clerk with a face already practising hatred. “Liberty costs,” he said. “Rome’s disease is expensive. You will help cure it.” He didn't raise his voice.</w:t>
+        <w:t>Cassius listened to a city’s elders explain poverty with practised dignity.</w:t>
+      </w:r>
+    </w:p>
+    <w:p>
+      <w:r>
+        <w:rPr/>
+        <w:t>The hall smelled of oil and fear-sweat dressed as perfume. Outside, harbour noise argued with temple bells. A fly walked the rim of a cup. Elders in a half-circle, interpreters at their shoulders, a young clerk with a face already practising hatred. “Liberty costs,” he said. “Rome’s disease is expensive. You will help cure it.” He didn’t raise his voice.</w:t>
       </w:r>
     </w:p>
     <w:p>
@@ -11496,7 +11626,7 @@
     <w:p>
       <w:r>
         <w:rPr/>
-        <w:t>He let silence work after the sentence. Brutus’ tool, borrowed without credit. Silence made elders fill the air with offers, most of them dates that were not dates.</w:t>
+        <w:t>He let silence work after the sentence. Brutus’s tool, borrowed without credit. Silence made elders fill the air with offers, most of them dates that were not dates.</w:t>
       </w:r>
     </w:p>
     <w:p>
@@ -11578,7 +11708,7 @@
     <w:p>
       <w:r>
         <w:rPr/>
-        <w:t xml:space="preserve">Before the audience closed, a courier from the west, dust, salt, a seal cracked by too many hands, brought news that arrived as three incompatible tablets. Mutina won and lost. Consuls dead. Lists in Italy. The boy with fasces, and a court in his consulship that had called the names of every man of March, Cassius’s among them, to empty benches and condemned the benches. Antony still breathing, and the three of them looking east. One tablet named Decimus without poetry: gone, or going, or already a line item in someone else’s revenge. Cassius kept all three and didn't merge them for the hall. Privately the Decimus line cracked something the extraction had been keeping neat. The man who had opened Caesar’s morning with cheer, who had taken the nearer knife and Cisalpine as if a road were still a friendship, now traveled west as rumour ink: lists, fasces, a name that had once been access. Cassius had recruited doors through that access. The west was pricing the door-opener as meat. He didn't halt the silver for a rumour’s sake. He entered </w:t>
+        <w:t xml:space="preserve">Before the audience closed, a courier from the west, dust, salt, a seal cracked by too many hands, brought news that arrived as three incompatible tablets. Mutina won and lost. Consuls dead. Lists in Italy. The boy with fasces, and a court in his consulship that had called the names of every man of March, Cassius’s among them, to empty benches and condemned the benches. Antony still breathing, and the three of them looking east. One tablet named Decimus without poetry: gone, or going, or already a line item in someone else’s revenge. Cassius kept all three and didn’t merge them for the hall. Privately the Decimus line cracked something the extraction had been keeping neat. The man who had opened Caesar’s morning with cheer, who had taken the nearer knife and Cisalpine as if a road were still a friendship, now travelled west as rumour ink: lists, fasces, a name that had once been access. Cassius had recruited doors through that access. The west was pricing the door-opener as meat. He didn’t halt the silver for a rumour’s sake. He entered </w:t>
       </w:r>
       <w:r>
         <w:rPr>
@@ -11598,13 +11728,13 @@
       </w:r>
       <w:r>
         <w:rPr/>
-        <w:t xml:space="preserve"> in the only ledger he trusted, the one behind his eyes. Trebonius had stood in that column since the winter, since Dolabella’s soldiers came into his bedroom at Smyrna before dawn and carried the market-day man’s head out with them. Laodicea had settled Trebonius. Decimus had no Laodicea. He felt the entry as personal debit, not geography. The crack traveled with him anyway.</w:t>
-      </w:r>
-    </w:p>
-    <w:p>
-      <w:r>
-        <w:rPr/>
-        <w:t xml:space="preserve">An officer asked if they were becoming what they killed. Cassius watched the short-weight sack being restacked and said only, “We are becoming paid.” He didn't offer the Forum a prettier noun. He dismissed the elders with a bow that meant </w:t>
+        <w:t xml:space="preserve"> in the only ledger he trusted, the one behind his eyes. Trebonius had stood in that column since the winter, since Dolabella’s soldiers came into his bedroom at Smyrna before dawn and carried the market-day man’s head out with them. Laodicea had settled Trebonius. Decimus had no Laodicea. He felt the entry as personal debit, not geography. The crack travelled with him anyway.</w:t>
+      </w:r>
+    </w:p>
+    <w:p>
+      <w:r>
+        <w:rPr/>
+        <w:t xml:space="preserve">An officer asked if they were becoming what they killed. Cassius watched the short-weight sack being restacked and said only, “We are becoming paid.” He didn’t offer the Forum a prettier noun. He dismissed the elders with a bow that meant </w:t>
       </w:r>
       <w:r>
         <w:rPr>
@@ -11620,7 +11750,7 @@
     <w:p>
       <w:r>
         <w:rPr/>
-        <w:t>On the steps, wind off the harbour tried to steal a paper. Cassius pinned it with a thumb and didn't smile. Escaped papers became other men’s geometry. He preferred his own, even when his own now held Decimus as an open wound in the column.</w:t>
+        <w:t>On the steps, wind off the harbour tried to steal a paper. Cassius pinned it with a thumb and didn’t smile. Escaped papers became other men’s geometry. He preferred his own, even when his own now held Decimus as an open wound in the column.</w:t>
       </w:r>
     </w:p>
     <w:p>
@@ -11691,7 +11821,7 @@
     <w:p>
       <w:r>
         <w:rPr/>
-        <w:t xml:space="preserve">News from Italy had reached the mint tent as gossip: lists, fasces, a boy paid in fear, and Decimus’s name traveling wrong, the nearer knife become a rumour of ending. Brutus didn't ask which version was true. Asking would've required a Forum he no longer owned. The GO night’s clean hands felt suddenly like someone else’s. One honest doubt crossed him: </w:t>
+        <w:t xml:space="preserve">News from Italy had reached the mint tent as gossip: lists, fasces, a boy paid in fear, and Decimus’s name travelling wrong, the nearer knife become a rumour of ending. Brutus didn’t ask which version was true. Asking would’ve required a Forum he no longer owned. The GO night’s clean hands felt suddenly like someone else’s. One honest doubt crossed him: </w:t>
       </w:r>
       <w:r>
         <w:rPr>
@@ -11790,7 +11920,7 @@
     <w:p>
       <w:r>
         <w:rPr/>
-        <w:t>Dust coated his teeth. He spat and pointed and the pointing became cohorts moving, not clean, not parade, but moving. Someone shouted Cassius’ name from a direction that might have been victory or panic. Antony didn't pause to translate the shout. Another came down the line from the north, carried by a rider with no helmet: Brutus’s men were in the boy’s camp, cutting up the tents. The boy had a fever and Agrippa. Let them keep their own camp. Translation was for after the counting, if counting still had owners.</w:t>
+        <w:t>Dust coated his teeth. He spat and pointed and the pointing became cohorts moving, not clean, not parade, but moving. Someone shouted Cassius’s name from a direction that might have been victory or panic. Antony didn’t pause to translate the shout. Another came down the line from the north, carried by a rider with no helmet: Brutus’s men were in the boy’s camp, cutting up the tents. The boy had a fever and Agrippa. Let them keep their own camp. Translation was for after the counting, if counting still had owners.</w:t>
       </w:r>
     </w:p>
     <w:p>
@@ -11817,13 +11947,13 @@
     <w:p>
       <w:r>
         <w:rPr/>
-        <w:t>Dust found every gap in Laberius’ teeth; the eagle staff was the only upright fact he trusted. The young Caesar’s men had been lent to the spades, so it was Antony’s marsh his century stood in this morning. Behind him, from the north, the shouting said the boy’s own camp was gone, tents, mules and Laberius’s spare tunic with it.</w:t>
-      </w:r>
-    </w:p>
-    <w:p>
-      <w:r>
-        <w:rPr/>
-        <w:t>He saw a signal, or thought he did: flags in dust, an eagle dipping toward a ditch that might have been a marsh yesterday. Vibius yelled that Cassius’ side was broken. Someone else yelled the opposite with equal faith and a different god’s name attached. Laberius believed the yell nearest his ear and the ache in his forearms. Plains lied through mouths that needed the story more than the mud did.</w:t>
+        <w:t>Dust found every gap in Laberius’s teeth; the eagle staff was the only upright fact he trusted. The young Caesar’s men had been lent to the spades, so it was Antony’s marsh his century stood in this morning. Behind him, from the north, the shouting said the boy’s own camp was gone, tents, mules and Laberius’s spare tunic with it.</w:t>
+      </w:r>
+    </w:p>
+    <w:p>
+      <w:r>
+        <w:rPr/>
+        <w:t>He saw a signal, or thought he did: flags in dust, an eagle dipping toward a ditch that might have been a marsh yesterday. Vibius yelled that Cassius’s side was broken. Someone else yelled the opposite with equal faith and a different god’s name attached. Laberius believed the yell nearest his ear and the ache in his forearms. Plains lied through mouths that needed the story more than the mud did.</w:t>
       </w:r>
     </w:p>
     <w:p>
@@ -11835,7 +11965,7 @@
     <w:p>
       <w:r>
         <w:rPr/>
-        <w:t>His own eagle still stood. He put his hand on the staff once: wood, sweat, the crack that had been there since Mutina’s ditch. He kept it there while the shouts about Cassius’ hill cancelled each other. He did not know Cassius’ hill. He knew thirst and the next order that might be wrong.</w:t>
+        <w:t>His own eagle still stood. He put his hand on the staff once: wood, sweat, the crack that had been there since Mutina’s ditch. He kept it there while the shouts about Cassius’s hill cancelled each other. He did not know Cassius’s hill. He knew thirst and the next order that might be wrong.</w:t>
       </w:r>
     </w:p>
     <w:p>
@@ -11862,7 +11992,7 @@
     <w:p>
       <w:r>
         <w:rPr/>
-        <w:t xml:space="preserve">Dust made the man’s tongue thick; fear made it thicker. He had lost a sandal somewhere on the climb; one foot bled into the packed dirt of Cassius’ forward post. The map in Cassius’ head hungered for confirmation anyway. The first report said </w:t>
+        <w:t xml:space="preserve">Dust made the man’s tongue thick; fear made it thicker. He had lost a sandal somewhere on the climb; one foot bled into the packed dirt of Cassius’s forward post. The map in Cassius’s head hungered for confirmation anyway. The first report said </w:t>
       </w:r>
       <w:r>
         <w:rPr>
@@ -11872,7 +12002,7 @@
       </w:r>
       <w:r>
         <w:rPr/>
-        <w:t xml:space="preserve"> in a shape that matched Cassius’ worst sketch of the day. Standards gone. Wing broken. Brutus somewhere beyond the marsh and silent. Cassius’s hand found a tablet edge and gripped until the wax remembered his thumb.</w:t>
+        <w:t xml:space="preserve"> in a shape that matched Cassius’s worst sketch of the day. Standards gone. Wing broken. Brutus somewhere beyond the marsh and silent. Cassius’s hand found a tablet edge and gripped until the wax remembered his thumb.</w:t>
       </w:r>
     </w:p>
     <w:p>
@@ -11896,7 +12026,7 @@
     <w:p>
       <w:r>
         <w:rPr/>
-        <w:t>The runner came back empty-mouthed. No second count. Only another man who had heard the first yell secondhand and wanted to be useful by repeating it louder. A friend, attendant, someone with too much loyalty and not enough eyes, tried to amend the first report and only added fog. Brutus’ success, if it existed beyond the lying air, did not fit in either throat.</w:t>
+        <w:t>The runner came back empty-mouthed. No second count. Only another man who had heard the first yell secondhand and wanted to be useful by repeating it louder. A friend, attendant, someone with too much loyalty and not enough eyes, tried to amend the first report and only added fog. Brutus’s success, if it existed beyond the lying air, did not fit in either throat.</w:t>
       </w:r>
     </w:p>
     <w:p>
@@ -11948,7 +12078,7 @@
     <w:p>
       <w:r>
         <w:rPr/>
-        <w:t>He didn't speechify liberty. He didn't correct the map. He treated the incomplete report as closed by belief. He closed the account the only way left.</w:t>
+        <w:t>He didn’t speechify liberty. He didn’t correct the map. He treated the incomplete report as closed by belief. He closed the account the only way left.</w:t>
       </w:r>
     </w:p>
     <w:p>
@@ -12005,7 +12135,7 @@
     <w:p>
       <w:r>
         <w:rPr/>
-        <w:t>He didn't deliver a speech about it. This was weight and breath and mud that took boots the way grief took time.</w:t>
+        <w:t>He didn’t deliver a speech about it. This was weight and breath and mud that took boots the way grief took time.</w:t>
       </w:r>
     </w:p>
     <w:p>
@@ -12104,7 +12234,7 @@
     <w:p>
       <w:r>
         <w:rPr/>
-        <w:t>Fever made the tent canvas pulse. Twenty days ago Brutus’s men had come through this camp and run their swords through the litter he had left an hour before. His doctor had dreamed something and had him carried out into the marsh. Octavian remembered reeds, and lying very still, and being told afterward that it had been prudence. Sweat ran into his eyes and made the map swim. A courier asked for orders. Octavian gave two that mattered: hold the camp ditch; do not chase beyond the markers Agrippa had set. And one that only sounded like command, a sentence about courage he regretted as soon as it left his mouth. He didn't invent himself as genius of the plain. He survived noise. He survived other men’s versions of his usefulness.</w:t>
+        <w:t>Fever made the tent canvas pulse. Twenty days ago Brutus’s men had come through this camp and run their swords through the litter he had left an hour before. His doctor had dreamed something and had him carried out into the marsh. Octavian remembered reeds, and lying very still, and being told afterward that it had been prudence. Sweat ran into his eyes and made the map swim. A courier asked for orders. Octavian gave two that mattered: hold the camp ditch; do not chase beyond the markers Agrippa had set. And one that only sounded like command, a sentence about courage he regretted as soon as it left his mouth. He didn’t invent himself as genius of the plain. He survived noise. He survived other men’s versions of his usefulness.</w:t>
       </w:r>
     </w:p>
     <w:p>
@@ -12132,7 +12262,7 @@
     <w:p>
       <w:r>
         <w:rPr/>
-        <w:t>When someone tried to crown him with the day’s glory in a sentence, Octavian kept breathing and didn't bow. Sweat ran into the corner of his mouth; he swallowed it and asked Agrippa for the next count of the ditch.</w:t>
+        <w:t>When someone tried to crown him with the day’s glory in a sentence, Octavian kept breathing and didn’t bow. Sweat ran into the corner of his mouth; he swallowed it and asked Agrippa for the next count of the ditch.</w:t>
       </w:r>
     </w:p>
     <w:p>
@@ -12144,7 +12274,7 @@
     <w:p>
       <w:r>
         <w:rPr/>
-        <w:t>“They will want farms that belong to someone else,” Octavian said. He didn't dress it. He kept one hand flat on the list of promised acres until the paper stopped fluttering. Paper would not hold the soil still. That was the next war’s seed, held in the same breath as survival. He did not invent a destiny for it. He named the want. He kept breathing.</w:t>
+        <w:t>“They will want farms that belong to someone else,” Octavian said. He didn’t dress it. He kept one hand flat on the list of promised acres until the paper stopped fluttering. Paper would not hold the soil still. That was the next war’s seed, held in the same breath as survival. He did not invent a destiny for it. He named the want. He kept breathing.</w:t>
       </w:r>
     </w:p>
     <w:p>

</xml_diff>

<commit_message>
Regenerate Book 1 reading copy after copyedit follow-up
Co-Authored-By: Claude Opus 5.5 (1M context) <noreply@anthropic.com>
Claude-Session: https://claude.ai/code/session_01FFN9ELo4KWKZsTKbpif5Vz
</commit_message>
<xml_diff>
--- a/exports/Ides_Book1_FULL_Ch01-34.docx
+++ b/exports/Ides_Book1_FULL_Ch01-34.docx
@@ -27,7 +27,7 @@
         <w:br/>
         <w:t>Book 1 reading export · dinner-first opening · ends at Philippi · author-voice (no em dash)</w:t>
         <w:br/>
-        <w:t>Source: Manuscript f395a6b (2026-10-22) · generated 2026-10-22 12:48 UTC from main @ f395a6b · source digest c2bc4ba377269b30 · chapters 1–34</w:t>
+        <w:t>Source: Manuscript 756df13 (2026-10-22) · generated 2026-10-22 13:13 UTC from main @ 756df13 · source digest 51fd5a0093ab158f · chapters 1–34</w:t>
       </w:r>
     </w:p>
     <w:p>
@@ -1557,7 +1557,27 @@
     <w:p>
       <w:r>
         <w:rPr/>
-        <w:t>Before Porcia could press again, a steward brought word that his mother’s messenger waited in the outer court. Servilia. The whole city knew she was the woman Caesar had loved longest; Brutus had spent twenty years not knowing it. Not quite an invitation. A mother’s reminder: pardoned sons still owed dinners they did not choose. Soft chains got priced in women’s rooms first. Men’s masks judged later. Porcia’s mouth tightened. “She sends weather,” Porcia said. “I send refusal. Do not confuse the two.” Brutus heard plant, not summons. Women’s power was already arguing his courtesy while he still held a warm cup.</w:t>
+        <w:t xml:space="preserve">Before Porcia could press again, a steward brought word that his mother’s messenger waited in the outer court. Servilia. The whole city knew she was the woman Caesar had loved longest; Brutus had spent twenty years not knowing it. Not quite an invitation. A mother’s reminder: pardoned sons still owed dinners they did not choose. Soft chains got priced in women’s rooms first. Men’s masks judged later. Porcia’s mouth tightened. “She sends weather,” Porcia said. “I send refusal. Do not confuse the two.” Brutus heard </w:t>
+      </w:r>
+      <w:r>
+        <w:rPr>
+          <w:i/>
+        </w:rPr>
+        <w:t>plant</w:t>
+      </w:r>
+      <w:r>
+        <w:rPr/>
+        <w:t xml:space="preserve">, not </w:t>
+      </w:r>
+      <w:r>
+        <w:rPr>
+          <w:i/>
+        </w:rPr>
+        <w:t>summons</w:t>
+      </w:r>
+      <w:r>
+        <w:rPr/>
+        <w:t>. Women’s power was already arguing his courtesy while he still held a warm cup.</w:t>
       </w:r>
     </w:p>
     <w:p>
@@ -3169,7 +3189,17 @@
     <w:p>
       <w:r>
         <w:rPr/>
-        <w:t>“Then find another tradition,” Brutus said, and heard his own voice go sharp. “I will not be the respectable front for a gang. Caesar spared me. That spare still sits in this house whether we like the masks or not.” He hated how thin “debt” sounded. The man had not only signed a tablet. He had kept a place for him at ordinary tables afterward, hand on his shoulder like kinship that politics had not earned. Killing that hand later would not be surgery in the blood. It would be answering warmth with steel and calling the answer law.</w:t>
+        <w:t xml:space="preserve">“Then find another tradition,” Brutus said, and heard his own voice go sharp. “I will not be the respectable front for a gang. Caesar spared me. That spare still sits in this house whether we like the masks or not.” He hated how thin </w:t>
+      </w:r>
+      <w:r>
+        <w:rPr>
+          <w:i/>
+        </w:rPr>
+        <w:t>debt</w:t>
+      </w:r>
+      <w:r>
+        <w:rPr/>
+        <w:t xml:space="preserve"> sounded. The man had not only signed a tablet. He had kept a place for him at ordinary tables afterward, hand on his shoulder like kinship that politics had not earned. Killing that hand later would not be surgery in the blood. It would be answering warmth with steel and calling the answer law.</w:t>
       </w:r>
     </w:p>
     <w:p>
@@ -4112,7 +4142,17 @@
     <w:p>
       <w:r>
         <w:rPr/>
-        <w:t>Nysa set the basin down more carefully than the water required. When the washerwoman said beware, two kitchen girls glanced at the service door and one checked the bar with her thumb, habit, not theology. Nysa noted which doors got the thumb. Doors that stayed careful meant fewer costs for incomplete messages. Senate and gods could keep their own names.</w:t>
+        <w:t xml:space="preserve">Nysa set the basin down more carefully than the water required. When the washerwoman said </w:t>
+      </w:r>
+      <w:r>
+        <w:rPr>
+          <w:i/>
+        </w:rPr>
+        <w:t>beware</w:t>
+      </w:r>
+      <w:r>
+        <w:rPr/>
+        <w:t>, two kitchen girls glanced at the service door and one checked the bar with her thumb, habit, not theology. Nysa noted which doors got the thumb. Doors that stayed careful meant fewer costs for incomplete messages. Senate and gods could keep their own names.</w:t>
       </w:r>
     </w:p>
     <w:p>
@@ -4478,7 +4518,37 @@
     <w:p>
       <w:r>
         <w:rPr/>
-        <w:t>The words arrived wrong-ended, emphasis on stays or spare or friends: she couldn’t tell which noun owned the verb. The second cloak hissed that the visitor’s small talk was getting expensive. Phileros barked for mats. The attendant shut his mouth so hard Nysa heard teeth, then, once the visitor’s cheerful back had turned toward the tablinum, muttered to the cloak-friend, exit-soft and venom-clear: “Spare, stay, friends, pick a noun before the house does. I’m tired of smiling at schedules that smell like knives.”</w:t>
+        <w:t xml:space="preserve">The words arrived wrong-ended, emphasis on </w:t>
+      </w:r>
+      <w:r>
+        <w:rPr>
+          <w:i/>
+        </w:rPr>
+        <w:t>stays</w:t>
+      </w:r>
+      <w:r>
+        <w:rPr/>
+        <w:t xml:space="preserve"> or </w:t>
+      </w:r>
+      <w:r>
+        <w:rPr>
+          <w:i/>
+        </w:rPr>
+        <w:t>spare</w:t>
+      </w:r>
+      <w:r>
+        <w:rPr/>
+        <w:t xml:space="preserve"> or </w:t>
+      </w:r>
+      <w:r>
+        <w:rPr>
+          <w:i/>
+        </w:rPr>
+        <w:t>friends</w:t>
+      </w:r>
+      <w:r>
+        <w:rPr/>
+        <w:t>: she couldn’t tell which noun owned the verb. The second cloak hissed that the visitor’s small talk was getting expensive. Phileros barked for mats. The attendant shut his mouth so hard Nysa heard teeth, then, once the visitor’s cheerful back had turned toward the tablinum, muttered to the cloak-friend, exit-soft and venom-clear: “Spare, stay, friends, pick a noun before the house does. I’m tired of smiling at schedules that smell like knives.”</w:t>
       </w:r>
     </w:p>
     <w:p>
@@ -4496,7 +4566,37 @@
     <w:p>
       <w:r>
         <w:rPr/>
-        <w:t>She walked on with empty hands and a full head. In the side room she pressed what she had into wax with a stylus that shook once and then obeyed: friends · spare? · stay / danger · consul? Incomplete. Ugly. Misfiled even as she wrote it, she put friends largest because the voice had bitten that word, and consul small because it might have been the thing spared or the thing ignored. Hers either way.</w:t>
+        <w:t xml:space="preserve">She walked on with empty hands and a full head. In the side room she pressed what she had into wax with a stylus that shook once and then obeyed: </w:t>
+      </w:r>
+      <w:r>
+        <w:rPr>
+          <w:i/>
+        </w:rPr>
+        <w:t>friends · spare? · stay / danger · consul?</w:t>
+      </w:r>
+      <w:r>
+        <w:rPr/>
+        <w:t xml:space="preserve"> Incomplete. Ugly. Misfiled even as she wrote it, she put </w:t>
+      </w:r>
+      <w:r>
+        <w:rPr>
+          <w:i/>
+        </w:rPr>
+        <w:t>friends</w:t>
+      </w:r>
+      <w:r>
+        <w:rPr/>
+        <w:t xml:space="preserve"> largest because the voice had bitten that word, and </w:t>
+      </w:r>
+      <w:r>
+        <w:rPr>
+          <w:i/>
+        </w:rPr>
+        <w:t>consul</w:t>
+      </w:r>
+      <w:r>
+        <w:rPr/>
+        <w:t xml:space="preserve"> small because it might have been the thing spared or the thing ignored. Hers either way.</w:t>
       </w:r>
     </w:p>
     <w:p>
@@ -5457,7 +5557,27 @@
     <w:p>
       <w:r>
         <w:rPr/>
-        <w:t>The word king did what it always did in that house. Everyone in the atrium knew what king meant since February. A man who stayed home for a woman’s dream could be called many things. A man who dismissed the Senate by whim could be called only one.</w:t>
+        <w:t xml:space="preserve">The word </w:t>
+      </w:r>
+      <w:r>
+        <w:rPr>
+          <w:i/>
+        </w:rPr>
+        <w:t>king</w:t>
+      </w:r>
+      <w:r>
+        <w:rPr/>
+        <w:t xml:space="preserve"> did what it always did in that house. Everyone in the atrium knew what </w:t>
+      </w:r>
+      <w:r>
+        <w:rPr>
+          <w:i/>
+        </w:rPr>
+        <w:t>king</w:t>
+      </w:r>
+      <w:r>
+        <w:rPr/>
+        <w:t xml:space="preserve"> meant since February. A man who stayed home for a woman’s dream could be called many things. A man who dismissed the Senate by whim could be called only one.</w:t>
       </w:r>
     </w:p>
     <w:p>
@@ -5720,7 +5840,57 @@
     <w:p>
       <w:r>
         <w:rPr/>
-        <w:t>Against her ribs, under linen, the wax fragment held its few words. Pressed yesterday when a visitor’s attendant had muttered near the peristyle, wrong-ended: friends, spare, stay, danger, something like consul. She hadn’t understood the Senate shape of it. She understood enough to be afraid of Phileros finding it. Phileros believed door-knowledge was a priesthood, and priesthoods did not share.</w:t>
+        <w:t xml:space="preserve">Against her ribs, under linen, the wax fragment held its few words. Pressed yesterday when a visitor’s attendant had muttered near the peristyle, wrong-ended: </w:t>
+      </w:r>
+      <w:r>
+        <w:rPr>
+          <w:i/>
+        </w:rPr>
+        <w:t>friends</w:t>
+      </w:r>
+      <w:r>
+        <w:rPr/>
+        <w:t xml:space="preserve">, </w:t>
+      </w:r>
+      <w:r>
+        <w:rPr>
+          <w:i/>
+        </w:rPr>
+        <w:t>spare</w:t>
+      </w:r>
+      <w:r>
+        <w:rPr/>
+        <w:t xml:space="preserve">, </w:t>
+      </w:r>
+      <w:r>
+        <w:rPr>
+          <w:i/>
+        </w:rPr>
+        <w:t>stay</w:t>
+      </w:r>
+      <w:r>
+        <w:rPr/>
+        <w:t xml:space="preserve">, </w:t>
+      </w:r>
+      <w:r>
+        <w:rPr>
+          <w:i/>
+        </w:rPr>
+        <w:t>danger</w:t>
+      </w:r>
+      <w:r>
+        <w:rPr/>
+        <w:t xml:space="preserve">, something like </w:t>
+      </w:r>
+      <w:r>
+        <w:rPr>
+          <w:i/>
+        </w:rPr>
+        <w:t>consul</w:t>
+      </w:r>
+      <w:r>
+        <w:rPr/>
+        <w:t>. She hadn’t understood the Senate shape of it. She understood enough to be afraid of Phileros finding it. Phileros believed door-knowledge was a priesthood, and priesthoods did not share.</w:t>
       </w:r>
     </w:p>
     <w:p>
@@ -6314,7 +6484,77 @@
     <w:p>
       <w:r>
         <w:rPr/>
-        <w:t>“Caesar,” someone yelled, and then the name became a dozen other words: blood, knives, Brutus, liberty, murder, the consul, where is the consul.</w:t>
+        <w:t xml:space="preserve">“Caesar,” someone yelled, and then the name became a dozen other words: </w:t>
+      </w:r>
+      <w:r>
+        <w:rPr>
+          <w:i/>
+        </w:rPr>
+        <w:t>blood</w:t>
+      </w:r>
+      <w:r>
+        <w:rPr/>
+        <w:t xml:space="preserve">, </w:t>
+      </w:r>
+      <w:r>
+        <w:rPr>
+          <w:i/>
+        </w:rPr>
+        <w:t>knives</w:t>
+      </w:r>
+      <w:r>
+        <w:rPr/>
+        <w:t xml:space="preserve">, </w:t>
+      </w:r>
+      <w:r>
+        <w:rPr>
+          <w:i/>
+        </w:rPr>
+        <w:t>Brutus</w:t>
+      </w:r>
+      <w:r>
+        <w:rPr/>
+        <w:t xml:space="preserve">, </w:t>
+      </w:r>
+      <w:r>
+        <w:rPr>
+          <w:i/>
+        </w:rPr>
+        <w:t>liberty</w:t>
+      </w:r>
+      <w:r>
+        <w:rPr/>
+        <w:t xml:space="preserve">, </w:t>
+      </w:r>
+      <w:r>
+        <w:rPr>
+          <w:i/>
+        </w:rPr>
+        <w:t>murder</w:t>
+      </w:r>
+      <w:r>
+        <w:rPr/>
+        <w:t xml:space="preserve">, </w:t>
+      </w:r>
+      <w:r>
+        <w:rPr>
+          <w:i/>
+        </w:rPr>
+        <w:t>the consul</w:t>
+      </w:r>
+      <w:r>
+        <w:rPr/>
+        <w:t xml:space="preserve">, </w:t>
+      </w:r>
+      <w:r>
+        <w:rPr>
+          <w:i/>
+        </w:rPr>
+        <w:t>where is the consul</w:t>
+      </w:r>
+      <w:r>
+        <w:rPr/>
+        <w:t>.</w:t>
       </w:r>
     </w:p>
     <w:p>
@@ -6690,7 +6930,17 @@
     <w:p>
       <w:r>
         <w:rPr/>
-        <w:t>The name Antony snagged. Nysa did not see Antony. She saw a gap where a large man might have been and heard, already, two freedmen inventing the rest.</w:t>
+        <w:t xml:space="preserve">The name </w:t>
+      </w:r>
+      <w:r>
+        <w:rPr>
+          <w:i/>
+        </w:rPr>
+        <w:t>Antony</w:t>
+      </w:r>
+      <w:r>
+        <w:rPr/>
+        <w:t xml:space="preserve"> snagged. Nysa did not see Antony. She saw a gap where a large man might have been and heard, already, two freedmen inventing the rest.</w:t>
       </w:r>
     </w:p>
     <w:p>
@@ -8446,7 +8696,17 @@
     <w:p>
       <w:r>
         <w:rPr/>
-        <w:t>He didn’t say son. The word sat unused behind his teeth: kinship soft, political poison until proven. He stood in Apollonia’s wind and practised breathing until breathing looked like command.</w:t>
+        <w:t xml:space="preserve">He didn’t say </w:t>
+      </w:r>
+      <w:r>
+        <w:rPr>
+          <w:i/>
+        </w:rPr>
+        <w:t>son</w:t>
+      </w:r>
+      <w:r>
+        <w:rPr/>
+        <w:t>. The word sat unused behind his teeth: kinship soft, political poison until proven. He stood in Apollonia’s wind and practised breathing until breathing looked like command.</w:t>
       </w:r>
     </w:p>
     <w:p>
@@ -9432,7 +9692,27 @@
     <w:p>
       <w:r>
         <w:rPr/>
-        <w:t>Dama muttered that the chickens had better taste than the new authority. Nysa did not join the joke loud enough to travel. She let it land as a breath through the nose, enough that Phileros saw he’d been heard. She thought of her burned fragment and touched the empty place in her tunic where it had sat. She hid one blank tablet there out of habit, then put it back on the shelf. Blank wax in the wrong hands had already become someone else’s line item. The incomplete spare/stay splinter was ash. The house’s new seals were not. Danger continued without the old wax.</w:t>
+        <w:t xml:space="preserve">Dama muttered that the chickens had better taste than the new authority. Nysa did not join the joke loud enough to travel. She let it land as a breath through the nose, enough that Phileros saw he’d been heard. She thought of her burned fragment and touched the empty place in her tunic where it had sat. She hid one blank tablet there out of habit, then put it back on the shelf. Blank wax in the wrong hands had already become someone else’s line item. The incomplete </w:t>
+      </w:r>
+      <w:r>
+        <w:rPr>
+          <w:i/>
+        </w:rPr>
+        <w:t>spare</w:t>
+      </w:r>
+      <w:r>
+        <w:rPr/>
+        <w:t>/</w:t>
+      </w:r>
+      <w:r>
+        <w:rPr>
+          <w:i/>
+        </w:rPr>
+        <w:t>stay</w:t>
+      </w:r>
+      <w:r>
+        <w:rPr/>
+        <w:t xml:space="preserve"> splinter was ash. The house’s new seals were not. Danger continued without the old wax.</w:t>
       </w:r>
     </w:p>
     <w:p>
@@ -9880,7 +10160,7 @@
       </w:r>
       <w:r>
         <w:rPr/>
-        <w:t xml:space="preserve"> staying on the deck. He already saw Asia’s taxes rearranging themselves, those fat coast cities across the Aegean that had paid Pompey, then Caesar, and would pay whoever arrived next with ships: cities as ledgers, ledgers as legions. Liberty would need pay. He didn’t say </w:t>
+        <w:t xml:space="preserve"> staying on the deck. Cassius already saw Asia’s taxes rearranging themselves, those fat coast cities across the Aegean that had paid Pompey, then Caesar, and would pay whoever arrived next with ships: cities as ledgers, ledgers as legions. Liberty would need pay. He didn’t say </w:t>
       </w:r>
       <w:r>
         <w:rPr>
@@ -10657,7 +10937,27 @@
     <w:p>
       <w:r>
         <w:rPr/>
-        <w:t>“The young Caesar,” Cicero said, and the name seemed to catch in his throat on the way out, “will march with the consuls and defend the state against Antony’s madness.” The senator muttered adoption and armies in one breath, hoping grammar could make them one animal, then closed his mouth into agreement. Octavian watched Cicero take the closing for virtue’s return.</w:t>
+        <w:t xml:space="preserve">“The young Caesar,” Cicero said, and the name seemed to catch in his throat on the way out, “will march with the consuls and defend the state against Antony’s madness.” The senator muttered </w:t>
+      </w:r>
+      <w:r>
+        <w:rPr>
+          <w:i/>
+        </w:rPr>
+        <w:t>adoption</w:t>
+      </w:r>
+      <w:r>
+        <w:rPr/>
+        <w:t xml:space="preserve"> and </w:t>
+      </w:r>
+      <w:r>
+        <w:rPr>
+          <w:i/>
+        </w:rPr>
+        <w:t>armies</w:t>
+      </w:r>
+      <w:r>
+        <w:rPr/>
+        <w:t xml:space="preserve"> in one breath, hoping grammar could make them one animal, then closed his mouth into agreement. Octavian watched Cicero take the closing for virtue’s return.</w:t>
       </w:r>
     </w:p>
     <w:p>
@@ -11180,7 +11480,17 @@
     <w:p>
       <w:r>
         <w:rPr/>
-        <w:t>A senator who had voted him an ovation and then forgotten to pay for it called him the gods’ gift and waited for a smile of destiny. Octavian looked at him until the man found something to do with his hands. A soldier shouted the name Caesar as paymaster; Octavian didn’t bow to it like a hymn. He let the shout stand because paymaster was a job his hands already understood better than luck.</w:t>
+        <w:t xml:space="preserve">A senator who had voted him an ovation and then forgotten to pay for it called him the gods’ gift and waited for a smile of destiny. Octavian looked at him until the man found something to do with his hands. A soldier shouted the name </w:t>
+      </w:r>
+      <w:r>
+        <w:rPr>
+          <w:i/>
+        </w:rPr>
+        <w:t>Caesar</w:t>
+      </w:r>
+      <w:r>
+        <w:rPr/>
+        <w:t xml:space="preserve"> as paymaster; Octavian didn’t bow to it like a hymn. He let the shout stand because paymaster was a job his hands already understood better than luck.</w:t>
       </w:r>
     </w:p>
     <w:p>
@@ -11614,7 +11924,7 @@
     <w:p>
       <w:r>
         <w:rPr/>
-        <w:t>The hall smelled of oil and fear-sweat dressed as perfume. Outside, harbour noise argued with temple bells. A fly walked the rim of a cup. Elders in a half-circle, interpreters at their shoulders, a young clerk with a face already practising hatred. “Liberty costs,” he said. “Rome’s disease is expensive. You will help cure it.” He didn’t raise his voice.</w:t>
+        <w:t>The hall smelled of oil and fear-sweat dressed as perfume. Outside, harbour noise argued with temple bells. A fly walked the rim of a cup. Elders in a half-circle, interpreters at their shoulders, a young clerk with a face already practising hatred. “Liberty costs,” Cassius said. “Rome’s disease is expensive. You will help cure it.” He didn’t raise his voice.</w:t>
       </w:r>
     </w:p>
     <w:p>

</xml_diff>

<commit_message>
Book 1: words-as-words italics and Cassius referent (#156)
* Book 1: words-as-words italics and Cassius referent (Ch 25, 32)

Co-Authored-By: Claude Opus 5.5 (1M context) <noreply@anthropic.com>
Claude-Session: https://claude.ai/code/session_01FFN9ELo4KWKZsTKbpif5Vz

* Regenerate Book 1 reading copy after copyedit follow-up

Co-Authored-By: Claude Opus 5.5 (1M context) <noreply@anthropic.com>
Claude-Session: https://claude.ai/code/session_01FFN9ELo4KWKZsTKbpif5Vz

---------

Co-authored-by: Claude <noreply@anthropic.com>
</commit_message>
<xml_diff>
--- a/exports/Ides_Book1_FULL_Ch01-34.docx
+++ b/exports/Ides_Book1_FULL_Ch01-34.docx
@@ -27,7 +27,7 @@
         <w:br/>
         <w:t>Book 1 reading export · dinner-first opening · ends at Philippi · author-voice (no em dash)</w:t>
         <w:br/>
-        <w:t>Source: Manuscript f395a6b (2026-10-22) · generated 2026-10-22 12:48 UTC from main @ f395a6b · source digest c2bc4ba377269b30 · chapters 1–34</w:t>
+        <w:t>Source: Manuscript 756df13 (2026-10-22) · generated 2026-10-22 13:13 UTC from main @ 756df13 · source digest 51fd5a0093ab158f · chapters 1–34</w:t>
       </w:r>
     </w:p>
     <w:p>
@@ -1557,7 +1557,27 @@
     <w:p>
       <w:r>
         <w:rPr/>
-        <w:t>Before Porcia could press again, a steward brought word that his mother’s messenger waited in the outer court. Servilia. The whole city knew she was the woman Caesar had loved longest; Brutus had spent twenty years not knowing it. Not quite an invitation. A mother’s reminder: pardoned sons still owed dinners they did not choose. Soft chains got priced in women’s rooms first. Men’s masks judged later. Porcia’s mouth tightened. “She sends weather,” Porcia said. “I send refusal. Do not confuse the two.” Brutus heard plant, not summons. Women’s power was already arguing his courtesy while he still held a warm cup.</w:t>
+        <w:t xml:space="preserve">Before Porcia could press again, a steward brought word that his mother’s messenger waited in the outer court. Servilia. The whole city knew she was the woman Caesar had loved longest; Brutus had spent twenty years not knowing it. Not quite an invitation. A mother’s reminder: pardoned sons still owed dinners they did not choose. Soft chains got priced in women’s rooms first. Men’s masks judged later. Porcia’s mouth tightened. “She sends weather,” Porcia said. “I send refusal. Do not confuse the two.” Brutus heard </w:t>
+      </w:r>
+      <w:r>
+        <w:rPr>
+          <w:i/>
+        </w:rPr>
+        <w:t>plant</w:t>
+      </w:r>
+      <w:r>
+        <w:rPr/>
+        <w:t xml:space="preserve">, not </w:t>
+      </w:r>
+      <w:r>
+        <w:rPr>
+          <w:i/>
+        </w:rPr>
+        <w:t>summons</w:t>
+      </w:r>
+      <w:r>
+        <w:rPr/>
+        <w:t>. Women’s power was already arguing his courtesy while he still held a warm cup.</w:t>
       </w:r>
     </w:p>
     <w:p>
@@ -3169,7 +3189,17 @@
     <w:p>
       <w:r>
         <w:rPr/>
-        <w:t>“Then find another tradition,” Brutus said, and heard his own voice go sharp. “I will not be the respectable front for a gang. Caesar spared me. That spare still sits in this house whether we like the masks or not.” He hated how thin “debt” sounded. The man had not only signed a tablet. He had kept a place for him at ordinary tables afterward, hand on his shoulder like kinship that politics had not earned. Killing that hand later would not be surgery in the blood. It would be answering warmth with steel and calling the answer law.</w:t>
+        <w:t xml:space="preserve">“Then find another tradition,” Brutus said, and heard his own voice go sharp. “I will not be the respectable front for a gang. Caesar spared me. That spare still sits in this house whether we like the masks or not.” He hated how thin </w:t>
+      </w:r>
+      <w:r>
+        <w:rPr>
+          <w:i/>
+        </w:rPr>
+        <w:t>debt</w:t>
+      </w:r>
+      <w:r>
+        <w:rPr/>
+        <w:t xml:space="preserve"> sounded. The man had not only signed a tablet. He had kept a place for him at ordinary tables afterward, hand on his shoulder like kinship that politics had not earned. Killing that hand later would not be surgery in the blood. It would be answering warmth with steel and calling the answer law.</w:t>
       </w:r>
     </w:p>
     <w:p>
@@ -4112,7 +4142,17 @@
     <w:p>
       <w:r>
         <w:rPr/>
-        <w:t>Nysa set the basin down more carefully than the water required. When the washerwoman said beware, two kitchen girls glanced at the service door and one checked the bar with her thumb, habit, not theology. Nysa noted which doors got the thumb. Doors that stayed careful meant fewer costs for incomplete messages. Senate and gods could keep their own names.</w:t>
+        <w:t xml:space="preserve">Nysa set the basin down more carefully than the water required. When the washerwoman said </w:t>
+      </w:r>
+      <w:r>
+        <w:rPr>
+          <w:i/>
+        </w:rPr>
+        <w:t>beware</w:t>
+      </w:r>
+      <w:r>
+        <w:rPr/>
+        <w:t>, two kitchen girls glanced at the service door and one checked the bar with her thumb, habit, not theology. Nysa noted which doors got the thumb. Doors that stayed careful meant fewer costs for incomplete messages. Senate and gods could keep their own names.</w:t>
       </w:r>
     </w:p>
     <w:p>
@@ -4478,7 +4518,37 @@
     <w:p>
       <w:r>
         <w:rPr/>
-        <w:t>The words arrived wrong-ended, emphasis on stays or spare or friends: she couldn’t tell which noun owned the verb. The second cloak hissed that the visitor’s small talk was getting expensive. Phileros barked for mats. The attendant shut his mouth so hard Nysa heard teeth, then, once the visitor’s cheerful back had turned toward the tablinum, muttered to the cloak-friend, exit-soft and venom-clear: “Spare, stay, friends, pick a noun before the house does. I’m tired of smiling at schedules that smell like knives.”</w:t>
+        <w:t xml:space="preserve">The words arrived wrong-ended, emphasis on </w:t>
+      </w:r>
+      <w:r>
+        <w:rPr>
+          <w:i/>
+        </w:rPr>
+        <w:t>stays</w:t>
+      </w:r>
+      <w:r>
+        <w:rPr/>
+        <w:t xml:space="preserve"> or </w:t>
+      </w:r>
+      <w:r>
+        <w:rPr>
+          <w:i/>
+        </w:rPr>
+        <w:t>spare</w:t>
+      </w:r>
+      <w:r>
+        <w:rPr/>
+        <w:t xml:space="preserve"> or </w:t>
+      </w:r>
+      <w:r>
+        <w:rPr>
+          <w:i/>
+        </w:rPr>
+        <w:t>friends</w:t>
+      </w:r>
+      <w:r>
+        <w:rPr/>
+        <w:t>: she couldn’t tell which noun owned the verb. The second cloak hissed that the visitor’s small talk was getting expensive. Phileros barked for mats. The attendant shut his mouth so hard Nysa heard teeth, then, once the visitor’s cheerful back had turned toward the tablinum, muttered to the cloak-friend, exit-soft and venom-clear: “Spare, stay, friends, pick a noun before the house does. I’m tired of smiling at schedules that smell like knives.”</w:t>
       </w:r>
     </w:p>
     <w:p>
@@ -4496,7 +4566,37 @@
     <w:p>
       <w:r>
         <w:rPr/>
-        <w:t>She walked on with empty hands and a full head. In the side room she pressed what she had into wax with a stylus that shook once and then obeyed: friends · spare? · stay / danger · consul? Incomplete. Ugly. Misfiled even as she wrote it, she put friends largest because the voice had bitten that word, and consul small because it might have been the thing spared or the thing ignored. Hers either way.</w:t>
+        <w:t xml:space="preserve">She walked on with empty hands and a full head. In the side room she pressed what she had into wax with a stylus that shook once and then obeyed: </w:t>
+      </w:r>
+      <w:r>
+        <w:rPr>
+          <w:i/>
+        </w:rPr>
+        <w:t>friends · spare? · stay / danger · consul?</w:t>
+      </w:r>
+      <w:r>
+        <w:rPr/>
+        <w:t xml:space="preserve"> Incomplete. Ugly. Misfiled even as she wrote it, she put </w:t>
+      </w:r>
+      <w:r>
+        <w:rPr>
+          <w:i/>
+        </w:rPr>
+        <w:t>friends</w:t>
+      </w:r>
+      <w:r>
+        <w:rPr/>
+        <w:t xml:space="preserve"> largest because the voice had bitten that word, and </w:t>
+      </w:r>
+      <w:r>
+        <w:rPr>
+          <w:i/>
+        </w:rPr>
+        <w:t>consul</w:t>
+      </w:r>
+      <w:r>
+        <w:rPr/>
+        <w:t xml:space="preserve"> small because it might have been the thing spared or the thing ignored. Hers either way.</w:t>
       </w:r>
     </w:p>
     <w:p>
@@ -5457,7 +5557,27 @@
     <w:p>
       <w:r>
         <w:rPr/>
-        <w:t>The word king did what it always did in that house. Everyone in the atrium knew what king meant since February. A man who stayed home for a woman’s dream could be called many things. A man who dismissed the Senate by whim could be called only one.</w:t>
+        <w:t xml:space="preserve">The word </w:t>
+      </w:r>
+      <w:r>
+        <w:rPr>
+          <w:i/>
+        </w:rPr>
+        <w:t>king</w:t>
+      </w:r>
+      <w:r>
+        <w:rPr/>
+        <w:t xml:space="preserve"> did what it always did in that house. Everyone in the atrium knew what </w:t>
+      </w:r>
+      <w:r>
+        <w:rPr>
+          <w:i/>
+        </w:rPr>
+        <w:t>king</w:t>
+      </w:r>
+      <w:r>
+        <w:rPr/>
+        <w:t xml:space="preserve"> meant since February. A man who stayed home for a woman’s dream could be called many things. A man who dismissed the Senate by whim could be called only one.</w:t>
       </w:r>
     </w:p>
     <w:p>
@@ -5720,7 +5840,57 @@
     <w:p>
       <w:r>
         <w:rPr/>
-        <w:t>Against her ribs, under linen, the wax fragment held its few words. Pressed yesterday when a visitor’s attendant had muttered near the peristyle, wrong-ended: friends, spare, stay, danger, something like consul. She hadn’t understood the Senate shape of it. She understood enough to be afraid of Phileros finding it. Phileros believed door-knowledge was a priesthood, and priesthoods did not share.</w:t>
+        <w:t xml:space="preserve">Against her ribs, under linen, the wax fragment held its few words. Pressed yesterday when a visitor’s attendant had muttered near the peristyle, wrong-ended: </w:t>
+      </w:r>
+      <w:r>
+        <w:rPr>
+          <w:i/>
+        </w:rPr>
+        <w:t>friends</w:t>
+      </w:r>
+      <w:r>
+        <w:rPr/>
+        <w:t xml:space="preserve">, </w:t>
+      </w:r>
+      <w:r>
+        <w:rPr>
+          <w:i/>
+        </w:rPr>
+        <w:t>spare</w:t>
+      </w:r>
+      <w:r>
+        <w:rPr/>
+        <w:t xml:space="preserve">, </w:t>
+      </w:r>
+      <w:r>
+        <w:rPr>
+          <w:i/>
+        </w:rPr>
+        <w:t>stay</w:t>
+      </w:r>
+      <w:r>
+        <w:rPr/>
+        <w:t xml:space="preserve">, </w:t>
+      </w:r>
+      <w:r>
+        <w:rPr>
+          <w:i/>
+        </w:rPr>
+        <w:t>danger</w:t>
+      </w:r>
+      <w:r>
+        <w:rPr/>
+        <w:t xml:space="preserve">, something like </w:t>
+      </w:r>
+      <w:r>
+        <w:rPr>
+          <w:i/>
+        </w:rPr>
+        <w:t>consul</w:t>
+      </w:r>
+      <w:r>
+        <w:rPr/>
+        <w:t>. She hadn’t understood the Senate shape of it. She understood enough to be afraid of Phileros finding it. Phileros believed door-knowledge was a priesthood, and priesthoods did not share.</w:t>
       </w:r>
     </w:p>
     <w:p>
@@ -6314,7 +6484,77 @@
     <w:p>
       <w:r>
         <w:rPr/>
-        <w:t>“Caesar,” someone yelled, and then the name became a dozen other words: blood, knives, Brutus, liberty, murder, the consul, where is the consul.</w:t>
+        <w:t xml:space="preserve">“Caesar,” someone yelled, and then the name became a dozen other words: </w:t>
+      </w:r>
+      <w:r>
+        <w:rPr>
+          <w:i/>
+        </w:rPr>
+        <w:t>blood</w:t>
+      </w:r>
+      <w:r>
+        <w:rPr/>
+        <w:t xml:space="preserve">, </w:t>
+      </w:r>
+      <w:r>
+        <w:rPr>
+          <w:i/>
+        </w:rPr>
+        <w:t>knives</w:t>
+      </w:r>
+      <w:r>
+        <w:rPr/>
+        <w:t xml:space="preserve">, </w:t>
+      </w:r>
+      <w:r>
+        <w:rPr>
+          <w:i/>
+        </w:rPr>
+        <w:t>Brutus</w:t>
+      </w:r>
+      <w:r>
+        <w:rPr/>
+        <w:t xml:space="preserve">, </w:t>
+      </w:r>
+      <w:r>
+        <w:rPr>
+          <w:i/>
+        </w:rPr>
+        <w:t>liberty</w:t>
+      </w:r>
+      <w:r>
+        <w:rPr/>
+        <w:t xml:space="preserve">, </w:t>
+      </w:r>
+      <w:r>
+        <w:rPr>
+          <w:i/>
+        </w:rPr>
+        <w:t>murder</w:t>
+      </w:r>
+      <w:r>
+        <w:rPr/>
+        <w:t xml:space="preserve">, </w:t>
+      </w:r>
+      <w:r>
+        <w:rPr>
+          <w:i/>
+        </w:rPr>
+        <w:t>the consul</w:t>
+      </w:r>
+      <w:r>
+        <w:rPr/>
+        <w:t xml:space="preserve">, </w:t>
+      </w:r>
+      <w:r>
+        <w:rPr>
+          <w:i/>
+        </w:rPr>
+        <w:t>where is the consul</w:t>
+      </w:r>
+      <w:r>
+        <w:rPr/>
+        <w:t>.</w:t>
       </w:r>
     </w:p>
     <w:p>
@@ -6690,7 +6930,17 @@
     <w:p>
       <w:r>
         <w:rPr/>
-        <w:t>The name Antony snagged. Nysa did not see Antony. She saw a gap where a large man might have been and heard, already, two freedmen inventing the rest.</w:t>
+        <w:t xml:space="preserve">The name </w:t>
+      </w:r>
+      <w:r>
+        <w:rPr>
+          <w:i/>
+        </w:rPr>
+        <w:t>Antony</w:t>
+      </w:r>
+      <w:r>
+        <w:rPr/>
+        <w:t xml:space="preserve"> snagged. Nysa did not see Antony. She saw a gap where a large man might have been and heard, already, two freedmen inventing the rest.</w:t>
       </w:r>
     </w:p>
     <w:p>
@@ -8446,7 +8696,17 @@
     <w:p>
       <w:r>
         <w:rPr/>
-        <w:t>He didn’t say son. The word sat unused behind his teeth: kinship soft, political poison until proven. He stood in Apollonia’s wind and practised breathing until breathing looked like command.</w:t>
+        <w:t xml:space="preserve">He didn’t say </w:t>
+      </w:r>
+      <w:r>
+        <w:rPr>
+          <w:i/>
+        </w:rPr>
+        <w:t>son</w:t>
+      </w:r>
+      <w:r>
+        <w:rPr/>
+        <w:t>. The word sat unused behind his teeth: kinship soft, political poison until proven. He stood in Apollonia’s wind and practised breathing until breathing looked like command.</w:t>
       </w:r>
     </w:p>
     <w:p>
@@ -9432,7 +9692,27 @@
     <w:p>
       <w:r>
         <w:rPr/>
-        <w:t>Dama muttered that the chickens had better taste than the new authority. Nysa did not join the joke loud enough to travel. She let it land as a breath through the nose, enough that Phileros saw he’d been heard. She thought of her burned fragment and touched the empty place in her tunic where it had sat. She hid one blank tablet there out of habit, then put it back on the shelf. Blank wax in the wrong hands had already become someone else’s line item. The incomplete spare/stay splinter was ash. The house’s new seals were not. Danger continued without the old wax.</w:t>
+        <w:t xml:space="preserve">Dama muttered that the chickens had better taste than the new authority. Nysa did not join the joke loud enough to travel. She let it land as a breath through the nose, enough that Phileros saw he’d been heard. She thought of her burned fragment and touched the empty place in her tunic where it had sat. She hid one blank tablet there out of habit, then put it back on the shelf. Blank wax in the wrong hands had already become someone else’s line item. The incomplete </w:t>
+      </w:r>
+      <w:r>
+        <w:rPr>
+          <w:i/>
+        </w:rPr>
+        <w:t>spare</w:t>
+      </w:r>
+      <w:r>
+        <w:rPr/>
+        <w:t>/</w:t>
+      </w:r>
+      <w:r>
+        <w:rPr>
+          <w:i/>
+        </w:rPr>
+        <w:t>stay</w:t>
+      </w:r>
+      <w:r>
+        <w:rPr/>
+        <w:t xml:space="preserve"> splinter was ash. The house’s new seals were not. Danger continued without the old wax.</w:t>
       </w:r>
     </w:p>
     <w:p>
@@ -9880,7 +10160,7 @@
       </w:r>
       <w:r>
         <w:rPr/>
-        <w:t xml:space="preserve"> staying on the deck. He already saw Asia’s taxes rearranging themselves, those fat coast cities across the Aegean that had paid Pompey, then Caesar, and would pay whoever arrived next with ships: cities as ledgers, ledgers as legions. Liberty would need pay. He didn’t say </w:t>
+        <w:t xml:space="preserve"> staying on the deck. Cassius already saw Asia’s taxes rearranging themselves, those fat coast cities across the Aegean that had paid Pompey, then Caesar, and would pay whoever arrived next with ships: cities as ledgers, ledgers as legions. Liberty would need pay. He didn’t say </w:t>
       </w:r>
       <w:r>
         <w:rPr>
@@ -10657,7 +10937,27 @@
     <w:p>
       <w:r>
         <w:rPr/>
-        <w:t>“The young Caesar,” Cicero said, and the name seemed to catch in his throat on the way out, “will march with the consuls and defend the state against Antony’s madness.” The senator muttered adoption and armies in one breath, hoping grammar could make them one animal, then closed his mouth into agreement. Octavian watched Cicero take the closing for virtue’s return.</w:t>
+        <w:t xml:space="preserve">“The young Caesar,” Cicero said, and the name seemed to catch in his throat on the way out, “will march with the consuls and defend the state against Antony’s madness.” The senator muttered </w:t>
+      </w:r>
+      <w:r>
+        <w:rPr>
+          <w:i/>
+        </w:rPr>
+        <w:t>adoption</w:t>
+      </w:r>
+      <w:r>
+        <w:rPr/>
+        <w:t xml:space="preserve"> and </w:t>
+      </w:r>
+      <w:r>
+        <w:rPr>
+          <w:i/>
+        </w:rPr>
+        <w:t>armies</w:t>
+      </w:r>
+      <w:r>
+        <w:rPr/>
+        <w:t xml:space="preserve"> in one breath, hoping grammar could make them one animal, then closed his mouth into agreement. Octavian watched Cicero take the closing for virtue’s return.</w:t>
       </w:r>
     </w:p>
     <w:p>
@@ -11180,7 +11480,17 @@
     <w:p>
       <w:r>
         <w:rPr/>
-        <w:t>A senator who had voted him an ovation and then forgotten to pay for it called him the gods’ gift and waited for a smile of destiny. Octavian looked at him until the man found something to do with his hands. A soldier shouted the name Caesar as paymaster; Octavian didn’t bow to it like a hymn. He let the shout stand because paymaster was a job his hands already understood better than luck.</w:t>
+        <w:t xml:space="preserve">A senator who had voted him an ovation and then forgotten to pay for it called him the gods’ gift and waited for a smile of destiny. Octavian looked at him until the man found something to do with his hands. A soldier shouted the name </w:t>
+      </w:r>
+      <w:r>
+        <w:rPr>
+          <w:i/>
+        </w:rPr>
+        <w:t>Caesar</w:t>
+      </w:r>
+      <w:r>
+        <w:rPr/>
+        <w:t xml:space="preserve"> as paymaster; Octavian didn’t bow to it like a hymn. He let the shout stand because paymaster was a job his hands already understood better than luck.</w:t>
       </w:r>
     </w:p>
     <w:p>
@@ -11614,7 +11924,7 @@
     <w:p>
       <w:r>
         <w:rPr/>
-        <w:t>The hall smelled of oil and fear-sweat dressed as perfume. Outside, harbour noise argued with temple bells. A fly walked the rim of a cup. Elders in a half-circle, interpreters at their shoulders, a young clerk with a face already practising hatred. “Liberty costs,” he said. “Rome’s disease is expensive. You will help cure it.” He didn’t raise his voice.</w:t>
+        <w:t>The hall smelled of oil and fear-sweat dressed as perfume. Outside, harbour noise argued with temple bells. A fly walked the rim of a cup. Elders in a half-circle, interpreters at their shoulders, a young clerk with a face already practising hatred. “Liberty costs,” Cassius said. “Rome’s disease is expensive. You will help cure it.” He didn’t raise his voice.</w:t>
       </w:r>
     </w:p>
     <w:p>

</xml_diff>

<commit_message>
Regenerate Book 1 reading copy (T9)
Co-Authored-By: Claude Opus 5.5 (1M context) <noreply@anthropic.com>
Claude-Session: https://claude.ai/code/session_016J1A9VbrbaLp4Q5XYAjW4F
</commit_message>
<xml_diff>
--- a/exports/Ides_Book1_FULL_Ch01-34.docx
+++ b/exports/Ides_Book1_FULL_Ch01-34.docx
@@ -27,7 +27,7 @@
         <w:br/>
         <w:t>Book 1 reading export · dinner-first opening · ends at Philippi · author-voice (no em dash)</w:t>
         <w:br/>
-        <w:t>Source: Manuscript 756df13 (2026-10-22) · generated 2026-10-22 13:13 UTC from main @ 756df13 · source digest 51fd5a0093ab158f · chapters 1–34</w:t>
+        <w:t>Source: Manuscript 5c1ea67 (2026-10-23) · generated 2026-10-23 21:13 UTC from main @ 5c1ea67 · source digest f57481c9536e3443 · chapters 1–34</w:t>
       </w:r>
     </w:p>
     <w:p>
@@ -9468,6 +9468,211 @@
     </w:p>
     <w:p>
       <w:pPr>
+        <w:spacing w:before="200"/>
+      </w:pPr>
+      <w:r>
+        <w:rPr/>
+        <w:t>Pompey’s Gardens</w:t>
+      </w:r>
+    </w:p>
+    <w:p>
+      <w:r>
+        <w:rPr/>
+        <w:t>The praetor who heard him was an Antonius.</w:t>
+      </w:r>
+    </w:p>
+    <w:p>
+      <w:r>
+        <w:rPr/>
+        <w:t>Brutus’s chair had stood empty since April, and wills still had to be heard, so the consul’s younger brother sat in it. Gaius Antonius had the family jaw and less behind it. He looked like a man who had been told the family joke and was waiting for his turn to tell it. Octavian stood below the tribunal in a toga Atia had had brushed twice on the road. Six witnesses stood at his back, Philippus’s choosing, men with good ears and no opinions. Agrippa stood further off by a fruit seller, where a friend could pass for a customer.</w:t>
+      </w:r>
+    </w:p>
+    <w:p>
+      <w:r>
+        <w:rPr/>
+        <w:t>“Gaius Octavius, son of Gaius,” the praetor read, and looked up. “You know the form.”</w:t>
+      </w:r>
+    </w:p>
+    <w:p>
+      <w:r>
+        <w:rPr/>
+        <w:t>“I accept the inheritance of Gaius Julius Caesar,” Octavian said, “and his name with it.”</w:t>
+      </w:r>
+    </w:p>
+    <w:p>
+      <w:r>
+        <w:rPr/>
+        <w:t xml:space="preserve">He had said the sentence on every stage of the Appian Way until the mule-driver could say it with him. He said it now without the road in it. The clerk wrote. A man in the crowd called </w:t>
+      </w:r>
+      <w:r>
+        <w:rPr>
+          <w:i/>
+        </w:rPr>
+        <w:t>Caesar</w:t>
+      </w:r>
+      <w:r>
+        <w:rPr/>
+        <w:t xml:space="preserve"> a little too loud and a second man hushed him, and the hush carried further than the name.</w:t>
+      </w:r>
+    </w:p>
+    <w:p>
+      <w:r>
+        <w:rPr/>
+        <w:t>Gaius Antonius leaned on one elbow, friendly. Octavian had heard that lean described in wine shops; it belonged to the brother. “Mine will want to know you said it clearly.”</w:t>
+      </w:r>
+    </w:p>
+    <w:p>
+      <w:r>
+        <w:rPr/>
+        <w:t>“Tell him I did.”</w:t>
+      </w:r>
+    </w:p>
+    <w:p>
+      <w:r>
+        <w:rPr/>
+        <w:t>“He’ll laugh.”</w:t>
+      </w:r>
+    </w:p>
+    <w:p>
+      <w:r>
+        <w:rPr/>
+        <w:t>“Then he will have heard it,” Octavian said.</w:t>
+      </w:r>
+    </w:p>
+    <w:p>
+      <w:r>
+        <w:rPr/>
+        <w:t>The praetor’s eyes went over the crowd the way a steward’s go over a store-room before the master asks. Octavian watched him count. He noted which faces the man stopped on, and that he stopped on the loud one twice.</w:t>
+      </w:r>
+    </w:p>
+    <w:p>
+      <w:r>
+        <w:rPr/>
+        <w:t>Antony received him three days later in Pompey’s gardens, out past the theatre on the Campus side, and made him wait at the gate long enough for the waiting to say what Antony would not.</w:t>
+      </w:r>
+    </w:p>
+    <w:p>
+      <w:r>
+        <w:rPr/>
+        <w:t>“Pompey’s gardens,” Agrippa said at the gate, looking at the gilded finials. “Pompey’s statue in the Curia. Pompey’s house on the Carinae.” He kicked a pebble off the step. “He collects Pompey.”</w:t>
+      </w:r>
+    </w:p>
+    <w:p>
+      <w:r>
+        <w:rPr/>
+        <w:t>Octavian did not answer. Gate slaves had ears and wanted supper.</w:t>
+      </w:r>
+    </w:p>
+    <w:p>
+      <w:r>
+        <w:rPr/>
+        <w:t>When the gate opened, the consul was lying on a couch in a garden room that smelled of bath oil and cut box, with a dish of early figs and two friends who did not get up. Antony’s hair was still wet. He looked bigger lying down than most men looked standing. He waved the boy toward a stool. Octavian stood.</w:t>
+      </w:r>
+    </w:p>
+    <w:p>
+      <w:r>
+        <w:rPr/>
+        <w:t>“The will leaves three hundred sesterces to every citizen in Rome,” Octavian said. “The heir pays the legacies. The money he left is in the Temple of Ops. I have come for it.”</w:t>
+      </w:r>
+    </w:p>
+    <w:p>
+      <w:r>
+        <w:rPr/>
+        <w:t>Antony ate a fig. He took his time over it, as if the boy might change his mind before he swallowed.</w:t>
+      </w:r>
+    </w:p>
+    <w:p>
+      <w:r>
+        <w:rPr/>
+        <w:t>“The money he left,” he said, “was the state’s money, and the state has spent it. Your great-uncle ran the treasury like a camp chest. Half of what was in it was promised before you were off the boat.” He wiped his fingers on a napkin a slave held out. “And while you were learning Greek at Apollonia, boy, I stood in that Senate the day after the Ides and kept his acts alive. If I had not, they would have thrown him in the Tiber like a dead tyrant, and his will after him, and his name with it. You are standing in my garden on a name I saved. You might call that a legacy.”</w:t>
+      </w:r>
+    </w:p>
+    <w:p>
+      <w:r>
+        <w:rPr/>
+        <w:t>One of the friends laughed. Antony let him.</w:t>
+      </w:r>
+    </w:p>
+    <w:p>
+      <w:r>
+        <w:rPr/>
+        <w:t>Behind the couch a clerk went past on some errand, a cord at his belt with keys on it. Octavian saw the keys and did not look at them twice.</w:t>
+      </w:r>
+    </w:p>
+    <w:p>
+      <w:r>
+        <w:rPr/>
+        <w:t>“Then the people will be paid from my own estate,” he said.</w:t>
+      </w:r>
+    </w:p>
+    <w:p>
+      <w:r>
+        <w:rPr/>
+        <w:t>Antony’s eyebrows went up. He had good eyebrows for it. “With what?”</w:t>
+      </w:r>
+    </w:p>
+    <w:p>
+      <w:r>
+        <w:rPr/>
+        <w:t>“With what is mine.”</w:t>
+      </w:r>
+    </w:p>
+    <w:p>
+      <w:r>
+        <w:rPr/>
+        <w:t>“Your father’s farms at Velitrae?” Antony laughed, generous with it. “Sell them, then. Sell your mother’s jewels. Rome will drink your health for a month and forget the face. Go home to Philippus. He has the right idea. He sat out the whole war and he is the best-fed man in Campania.”</w:t>
+      </w:r>
+    </w:p>
+    <w:p>
+      <w:r>
+        <w:rPr/>
+        <w:t>Octavian found that he was standing with his weight on one hip and a hand loose at his side, as the consul stood when he stood, and he set both feet square again. He did not know how long he had been copying the man. Long enough for the friends to see it, perhaps. He bowed the exact depth owed a consul by a private citizen, no more, and went out past the gate slaves into the evening.</w:t>
+      </w:r>
+    </w:p>
+    <w:p>
+      <w:r>
+        <w:rPr/>
+        <w:t>“That went well,” Agrippa said on the road back, which was the nearest Agrippa came to a joke.</w:t>
+      </w:r>
+    </w:p>
+    <w:p>
+      <w:r>
+        <w:rPr/>
+        <w:t>“It went,” Octavian said. “He told me what he has. A treasury and a laugh. Now I know what I have.”</w:t>
+      </w:r>
+    </w:p>
+    <w:p>
+      <w:r>
+        <w:rPr/>
+        <w:t>At Philippus’s town house that night the lamps burned late. A banker’s freedman sat at the table with tablets: the Velitrae land, a house, a share in a Campanian vineyard that had come down through the Octavii, a list of slaves with their trades beside their names. Atia came in with a box under her arm and set it on the table without a word, and Octavian understood that the box was her jewels and that she had brought them herself so that no slave could be blamed for carrying them.</w:t>
+      </w:r>
+    </w:p>
+    <w:p>
+      <w:r>
+        <w:rPr/>
+        <w:t>Philippus looked at the list the way he had looked at the sea at Puteoli, as a thing that would go on with or without his leave. “You are selling your father’s land,” he said, “to pay a dead man’s promise to strangers.”</w:t>
+      </w:r>
+    </w:p>
+    <w:p>
+      <w:r>
+        <w:rPr/>
+        <w:t>“To every citizen in the city,” Octavian said. “Strangers vote. Strangers stand in the Forum when the consul speaks.” He pushed the box back toward his mother. “Not these. Not yet.”</w:t>
+      </w:r>
+    </w:p>
+    <w:p>
+      <w:r>
+        <w:rPr/>
+        <w:t>Atia did not take it. She left it on the table and went out.</w:t>
+      </w:r>
+    </w:p>
+    <w:p>
+      <w:r>
+        <w:rPr/>
+        <w:t>The freedman held the first sale tablet ready. Octavian took off the ring, warmed the wax over the lamp, and pressed the seal. The pale band on his finger showed for the time it took, and then the ring was back on it.</w:t>
+      </w:r>
+    </w:p>
+    <w:p>
+      <w:pPr>
         <w:spacing w:before="280"/>
       </w:pPr>
       <w:r>
@@ -9724,7 +9929,31 @@
     <w:p>
       <w:r>
         <w:rPr/>
-        <w:t>Before dusk the steward sent her across the Sacra Via with a sealed receipt for Antony’s people, kindness that used her legs. “The Carinae,” he said. “Pompey’s old house. The consul’s now.” In the kitchen they said Antony had bought it at Caesar’s auction and never paid. The door she reached was not Domus. It smelled of different oil and men who borrowed authority. A clerk there took the seal without looking at her face. Then he offered, mild as a gift, that a careful girl might stay attached to the new inventory if she learned the new bow. Nysa gave the bow the atrium had taught and walked back while she still could. She kept her eyes on doors that no longer held her mornings.</w:t>
+        <w:t>Before dusk the steward sent her across the Sacra Via with a sealed receipt for Antony’s people, kindness that used her legs. “The Carinae,” he said. “Pompey’s old house. The consul’s now.” In the kitchen they said Antony had bought it at Caesar’s auction and never paid. The door she reached was not Domus. It smelled of different oil and men who borrowed authority. A clerk there took the seal without looking at her face. Then he offered, mild as a gift, that a careful girl might stay attached to the new inventory if she learned the new bow.</w:t>
+      </w:r>
+    </w:p>
+    <w:p>
+      <w:r>
+        <w:rPr/>
+        <w:t>Nysa looked past him into the atrium. Calpurnia’s women were already chosen for wherever Calpurnia went next, and Nysa was not one of them. The Domus was going to Lepidus’s people with its cupboards. The Subura had rooms, and rooms had rent. The clerk waited the way men wait who have already counted the answer.</w:t>
+      </w:r>
+    </w:p>
+    <w:p>
+      <w:r>
+        <w:rPr/>
+        <w:t>A kitchen girl came through the door behind her with a basket, and Nysa watched her bow to the clerk: shallower than the Domus bow, quicker, the eyes down before the head moved, a bow that took less time because in this house there were more people to give it to. Nysa gave it back to the clerk on the first try.</w:t>
+      </w:r>
+    </w:p>
+    <w:p>
+      <w:r>
+        <w:rPr/>
+        <w:t>He nodded as if a jar had been shelved. “The kitchen,” he said. “Tomorrow, before light. The steward likes to know who carries.”</w:t>
+      </w:r>
+    </w:p>
+    <w:p>
+      <w:r>
+        <w:rPr/>
+        <w:t>She walked back across the Sacra Via for her bundle while the streets were still hers to cross. She did not tell Phileros which bow she had given. He saw it anyway in the morning, when she gave it to him at the gate out of a night’s practice, and he laughed his short laugh, and this time it was not too short.</w:t>
       </w:r>
     </w:p>
     <w:p>
@@ -10104,6 +10333,217 @@
       </w:pPr>
       <w:r>
         <w:rPr/>
+        <w:t>The Hair of the Star</w:t>
+      </w:r>
+    </w:p>
+    <w:p>
+      <w:r>
+        <w:rPr/>
+        <w:t>The steward of the Carinae house wanted numbers, and he wanted them small.</w:t>
+      </w:r>
+    </w:p>
+    <w:p>
+      <w:r>
+        <w:rPr/>
+        <w:t xml:space="preserve">“You count,” he told Nysa on the morning the boy’s games opened, as if counting were a dish she had brought over from the Domus with her bundle. “Calpurnia’s people say you count doors. Count heads. How many shout when his name is called. How many for the dead man. How many for the horses. The consul is not going. The consul will ask me at dinner, and I will not be the man who tells him </w:t>
+      </w:r>
+      <w:r>
+        <w:rPr>
+          <w:i/>
+        </w:rPr>
+        <w:t>a great many</w:t>
+      </w:r>
+      <w:r>
+        <w:rPr/>
+        <w:t>.”</w:t>
+      </w:r>
+    </w:p>
+    <w:p>
+      <w:r>
+        <w:rPr/>
+        <w:t>Three months in that house had taught her its bow and most of its noise. Fulvia’s women counted silver at dawn and nobody in the kitchen pretended to grieve for anyone. Antony came in from the baths shouting for wine and the whole house turned toward the shout the way a field turns toward weather. She had stopped flinching at it in the first month. In the second she had learned which cupboard the steward watered the good wine in.</w:t>
+      </w:r>
+    </w:p>
+    <w:p>
+      <w:r>
+        <w:rPr/>
+        <w:t>He gave her a cloak with no colour in it and a kitchen boy to hold her place on the benches, and she went.</w:t>
+      </w:r>
+    </w:p>
+    <w:p>
+      <w:r>
+        <w:rPr/>
+        <w:t xml:space="preserve">At the entrance Matius’s men were handing out the edict on boards: games for the Victory of Caesar, given by Gaius Caesar his son. A fuller beside her read it aloud for those who could not, and stopped at </w:t>
+      </w:r>
+      <w:r>
+        <w:rPr>
+          <w:i/>
+        </w:rPr>
+        <w:t>son</w:t>
+      </w:r>
+      <w:r>
+        <w:rPr/>
+        <w:t xml:space="preserve"> to see whether anyone would argue. Nobody did. “Matius pays,” someone said behind her. “Caesar’s old friend. The boy hasn’t the money; he sold his farms for the legacy.” “Then who’s paying for the beasts?” “Caesar’s friends. Same as always.”</w:t>
+      </w:r>
+    </w:p>
+    <w:p>
+      <w:r>
+        <w:rPr/>
+        <w:t>Nysa found the boy’s seats before she found the boy. They were the seats with the space beside them.</w:t>
+      </w:r>
+    </w:p>
+    <w:p>
+      <w:r>
+        <w:rPr/>
+        <w:t>A procession came along the track before the first race with Caesar’s gilded chair in it, the one the Senate had voted him, carried shoulder-high under a gold crown. The bearers took short steps under it. Gilt or not, it was heavy, and they carried it like a thing that might still be sat in. They brought it as far as the boy’s row, and three men in good cloaks stepped into the aisle in front of them. One of the three was a tribune; she knew it by the way the others let him speak. He did not raise his voice. The bearers looked toward the boy. The boy did not move.</w:t>
+      </w:r>
+    </w:p>
+    <w:p>
+      <w:r>
+        <w:rPr/>
+        <w:t>The chair went back under its cloth, and the crown with it.</w:t>
+      </w:r>
+    </w:p>
+    <w:p>
+      <w:r>
+        <w:rPr/>
+        <w:t>The noise that came off the benches then was not a cheer. It came from low in the crowd, from the cheap rows, and it went on after the chair had gone. Nysa began to count it. Rows, then tens in a row, then the rows behind that she could see from her place, the way she had counted guests at the Domus when Calpurnia wanted to know whether the bread would last. By the time the first chariots came round she had a number. She did not like it, and so she counted again.</w:t>
+      </w:r>
+    </w:p>
+    <w:p>
+      <w:r>
+        <w:rPr/>
+        <w:t xml:space="preserve">The boy himself she saw only as a shape: pale, very still, in the place where his father would have sat, with a man beside him who stood when the boy did not. When the herald called </w:t>
+      </w:r>
+      <w:r>
+        <w:rPr>
+          <w:i/>
+        </w:rPr>
+        <w:t>Gaius Caesar</w:t>
+      </w:r>
+      <w:r>
+        <w:rPr/>
+        <w:t>, the cheap rows stood. The good rows looked at one another first and then some of them stood.</w:t>
+      </w:r>
+    </w:p>
+    <w:p>
+      <w:r>
+        <w:rPr/>
+        <w:t>On the fourth day, an hour before sunset, the star came.</w:t>
+      </w:r>
+    </w:p>
+    <w:p>
+      <w:r>
+        <w:rPr/>
+        <w:t>She was on the street outside, buying a cup of water for the kitchen boy, when the people around her stopped talking and turned north. Low over the roofs there was a star where no star should be at that hour, bright, with a tail of light behind it like hair blown back from a running face. A veteran with one ear beside the water-seller put his cup down. “He watches,” he said, not loud.</w:t>
+      </w:r>
+    </w:p>
+    <w:p>
+      <w:r>
+        <w:rPr/>
+        <w:t>“It’s his soul,” a woman said. “Going up. They burned him and he’s going up.”</w:t>
+      </w:r>
+    </w:p>
+    <w:p>
+      <w:r>
+        <w:rPr/>
+        <w:t>“Comets mean kings die,” said a Greek with a basket of figs. “Ask anyone in Alexandria.”</w:t>
+      </w:r>
+    </w:p>
+    <w:p>
+      <w:r>
+        <w:rPr/>
+        <w:t>“It means weather,” said the water-seller, who wanted his cup back.</w:t>
+      </w:r>
+    </w:p>
+    <w:p>
+      <w:r>
+        <w:rPr/>
+        <w:t>Someone further along was explaining it to a crowd, and Nysa heard, “They say the hair of the star means…” and then a cheer went up from inside the walls and drowned the rest. She never learned what the hair meant. She thought about it afterward, scrubbing pans, and decided she had been better off without the end of the sentence.</w:t>
+      </w:r>
+    </w:p>
+    <w:p>
+      <w:r>
+        <w:rPr/>
+        <w:t>It came back every evening for seven evenings, at the same hour, in the same part of the sky. By the third evening the boy’s people had a song about it. By the fifth the song had a verse about the chair.</w:t>
+      </w:r>
+    </w:p>
+    <w:p>
+      <w:r>
+        <w:rPr/>
+        <w:t>At the end of the games the steward found her in the scullery. “Well?”</w:t>
+      </w:r>
+    </w:p>
+    <w:p>
+      <w:r>
+        <w:rPr/>
+        <w:t xml:space="preserve">She thought of the number she had counted twice. She thought of his face when he said </w:t>
+      </w:r>
+      <w:r>
+        <w:rPr>
+          <w:i/>
+        </w:rPr>
+        <w:t>a great many</w:t>
+      </w:r>
+      <w:r>
+        <w:rPr/>
+        <w:t>. She thought of the Domus, where the people who carried bad numbers into a room were the ones the room remembered afterwards.</w:t>
+      </w:r>
+    </w:p>
+    <w:p>
+      <w:r>
+        <w:rPr/>
+        <w:t>“Some thousands,” she said. “The cheap rows, mostly. Fewer than turned out for the fullers’ guild at a funeral. The rest shouted for the horses.”</w:t>
+      </w:r>
+    </w:p>
+    <w:p>
+      <w:r>
+        <w:rPr/>
+        <w:t>He let his breath go. “And the star?”</w:t>
+      </w:r>
+    </w:p>
+    <w:p>
+      <w:r>
+        <w:rPr/>
+        <w:t>“Weather,” she said. “The water-seller said.”</w:t>
+      </w:r>
+    </w:p>
+    <w:p>
+      <w:r>
+        <w:rPr/>
+        <w:t>That night, through the wall of the dining room, she heard the steward tell it, and heard Antony laugh. It was a big laugh, the kind he gave at dinner when the wine was good. She stood in the dark passage with a jug and listened to her own number go round the table and come back larger as a joke.</w:t>
+      </w:r>
+    </w:p>
+    <w:p>
+      <w:r>
+        <w:rPr/>
+        <w:t>Later, when the kitchen was dark, one of Fulvia’s women came down with a lamp and stood in the scullery door. She was the one who counted silver at dawn. She did not sit.</w:t>
+      </w:r>
+    </w:p>
+    <w:p>
+      <w:r>
+        <w:rPr/>
+        <w:t>“How many,” she said, “really?”</w:t>
+      </w:r>
+    </w:p>
+    <w:p>
+      <w:r>
+        <w:rPr/>
+        <w:t>Nysa looked at the lamp and not at the woman. Then she told her the true number, the one she had counted twice.</w:t>
+      </w:r>
+    </w:p>
+    <w:p>
+      <w:r>
+        <w:rPr/>
+        <w:t>The woman nodded once, as if it matched something she already had, and took the lamp back up the stair. Nysa stood in the dark kitchen a while. It was the first time anyone in that house had asked her for the true one.</w:t>
+      </w:r>
+    </w:p>
+    <w:p>
+      <w:pPr>
+        <w:spacing w:before="200"/>
+      </w:pPr>
+      <w:r>
+        <w:rPr/>
         <w:t>East</w:t>
       </w:r>
     </w:p>
@@ -10469,6 +10909,479 @@
       </w:pPr>
       <w:r>
         <w:rPr/>
+        <w:t>A Hundred Apiece</w:t>
+      </w:r>
+    </w:p>
+    <w:p>
+      <w:r>
+        <w:rPr/>
+        <w:t>The legions came off the ships from Macedonia looking for a consul, and Antony gave them one.</w:t>
+      </w:r>
+    </w:p>
+    <w:p>
+      <w:r>
+        <w:rPr/>
+        <w:t>He stood on a platform of planks on the harbour ground at Brundisium with the sea behind him and four legions in front, the Martian, the Fourth, the Second, the Thirty-fifth, and the old excitement went up through his legs the way it always did before a crowd of soldiers. These were Caesar’s men, raised for Parthia, the best-drilled legions in the world. He had drunk with half their centurions in Gaul. He knew how to stand in front of them. Shoulders loose, voice from the belly. Give them a joke first.</w:t>
+      </w:r>
+    </w:p>
+    <w:p>
+      <w:r>
+        <w:rPr/>
+        <w:t>He gave them the joke. A few laughed. Then he gave them the money.</w:t>
+      </w:r>
+    </w:p>
+    <w:p>
+      <w:r>
+        <w:rPr/>
+        <w:t>“A hundred denarii a man,” he said, “as a gift from your consul, on the day you land.”</w:t>
+      </w:r>
+    </w:p>
+    <w:p>
+      <w:r>
+        <w:rPr/>
+        <w:t>He heard the laugh begin at the back. It was not the laugh he had asked for. It went forward through the ranks the way fire goes along a dry hedge, and the front ranks did not stop it. Somebody near the Martian eagle called out a number. Antony did not hear the number. He heard the shape of it, and that it was larger than his.</w:t>
+      </w:r>
+    </w:p>
+    <w:p>
+      <w:r>
+        <w:rPr/>
+        <w:t>He knew then that the boy’s men had been in the camp before him. He had seen the leaflets on the quay that morning, scraps of papyrus trodden into the wet, and had stepped on them.</w:t>
+      </w:r>
+    </w:p>
+    <w:p>
+      <w:r>
+        <w:rPr/>
+        <w:t>“Who said that?” he said.</w:t>
+      </w:r>
+    </w:p>
+    <w:p>
+      <w:r>
+        <w:rPr/>
+        <w:t>Nobody said who.</w:t>
+      </w:r>
+    </w:p>
+    <w:p>
+      <w:r>
+        <w:rPr/>
+        <w:t>“Tribunes,” Antony said, not loud now, and the tribunes came to the foot of the planks. “I want the names of the men who were talking in your camps before I landed. The ones with money in their mouths. You know them. Bring me the lists.”</w:t>
+      </w:r>
+    </w:p>
+    <w:p>
+      <w:r>
+        <w:rPr/>
+        <w:t>By evening there were lists. He did not read them. He had the names of the centurions on them written on sherds and put into a helmet, because a consul could not kill four legions and could not let one laugh go unpaid either. In his host’s house, in the colonnade off the courtyard, the men whose sherds came out of the helmet were brought in one at a time.</w:t>
+      </w:r>
+    </w:p>
+    <w:p>
+      <w:r>
+        <w:rPr/>
+        <w:t>Fulvia sat beside him. She had asked to. He had not refused her; he did not refuse her much, and tonight he wanted someone in the colonnade who would not look away first. The soldiers doing the work did it quickly, because he had told them quickly. The sound was not loud. A grunt, a scuff on the paving, a weight going down. The second time it was the same. After that he stopped hearing the differences between them.</w:t>
+      </w:r>
+    </w:p>
+    <w:p>
+      <w:r>
+        <w:rPr/>
+        <w:t>At some point he looked at his wife. There was a fleck of red high on her cheekbone, under the eye. She had not moved her head and she did not move it now. She did not wipe it away while the next man was brought in, or the one after.</w:t>
+      </w:r>
+    </w:p>
+    <w:p>
+      <w:r>
+        <w:rPr/>
+        <w:t>When it was over the courtyard smelled of the sea and of the other thing. A slave brought a basin. Fulvia dipped two fingers and touched them to her cheek, without hurry, and looked at the water afterward.</w:t>
+      </w:r>
+    </w:p>
+    <w:p>
+      <w:r>
+        <w:rPr/>
+        <w:t>“Tomorrow they will take your hundred,” she said, “and not laugh.”</w:t>
+      </w:r>
+    </w:p>
+    <w:p>
+      <w:r>
+        <w:rPr/>
+        <w:t>“That’s what I want.”</w:t>
+      </w:r>
+    </w:p>
+    <w:p>
+      <w:r>
+        <w:rPr/>
+        <w:t>“Is it?” She dried her fingers on the slave’s cloth. “A man who laughs at your money still thinks you have money. A man who takes it in silence is counting the other offer. The boy said five hundred. They know the sum. Now they also know you kill for less.”</w:t>
+      </w:r>
+    </w:p>
+    <w:p>
+      <w:r>
+        <w:rPr/>
+        <w:t>Antony drank. The wine did nothing he asked of it. “The boy has some farms,” he said, “and the loan of Matius’s strongbox. I have four legions.”</w:t>
+      </w:r>
+    </w:p>
+    <w:p>
+      <w:r>
+        <w:rPr/>
+        <w:t>“You have four legions on a beach,” Fulvia said. “March them to Rome before they finish counting.”</w:t>
+      </w:r>
+    </w:p>
+    <w:p>
+      <w:r>
+        <w:rPr/>
+        <w:t>In the morning the ranks filed past the pay-tables and took the hundred apiece. They took it without a word. Antony stood on the planks and watched them do it and could not find the joke for it. Along the quay the boy’s leaflets lay where they had lain the day before, wet through. No one had picked them up. No one had needed to. A tribune of the Martians came to report the camp quiet and stayed a breath too long, looking at the colonnade.</w:t>
+      </w:r>
+    </w:p>
+    <w:p>
+      <w:r>
+        <w:rPr/>
+        <w:t>“They’re saying a name in the Fourth,” he said. “Not yours, consul.”</w:t>
+      </w:r>
+    </w:p>
+    <w:p>
+      <w:r>
+        <w:rPr/>
+        <w:t>“Let them say it on the march,” Antony said. “Marching is a cure for most opinions.”</w:t>
+      </w:r>
+    </w:p>
+    <w:p>
+      <w:pPr>
+        <w:spacing w:before="200"/>
+      </w:pPr>
+      <w:r>
+        <w:rPr/>
+        <w:t>Five Hundred</w:t>
+      </w:r>
+    </w:p>
+    <w:p>
+      <w:r>
+        <w:rPr/>
+        <w:t>The boy came to Casilinum himself, which nobody had expected.</w:t>
+      </w:r>
+    </w:p>
+    <w:p>
+      <w:r>
+        <w:rPr/>
+        <w:t>Laberius had walked over from the colony because Vibius said there would be money and Vibius was usually right about money and wrong about everything else. The square by the Volturnus bridge was full of men who had been told the same thing. Some had come on mules. One had come on a crutch. The boy stood on the steps of a temple with a cloak too warm for the day, thinner than his name, with a big young man at his shoulder who did the looking for both of them.</w:t>
+      </w:r>
+    </w:p>
+    <w:p>
+      <w:r>
+        <w:rPr/>
+        <w:t xml:space="preserve">He made a short speech. It was a bad speech. He said </w:t>
+      </w:r>
+      <w:r>
+        <w:rPr>
+          <w:i/>
+        </w:rPr>
+        <w:t>my father</w:t>
+      </w:r>
+      <w:r>
+        <w:rPr/>
+        <w:t xml:space="preserve"> four times, and </w:t>
+      </w:r>
+      <w:r>
+        <w:rPr>
+          <w:i/>
+        </w:rPr>
+        <w:t>what is owed</w:t>
+      </w:r>
+      <w:r>
+        <w:rPr/>
+        <w:t xml:space="preserve"> twice, and he did not tell a single joke. The men listened the way men listen to a paymaster, which is to say for the number.</w:t>
+      </w:r>
+    </w:p>
+    <w:p>
+      <w:r>
+        <w:rPr/>
+        <w:t>“Five hundred denarii,” the boy said. “To every man who enrols. Now, at the tables. More when the work is done.”</w:t>
+      </w:r>
+    </w:p>
+    <w:p>
+      <w:r>
+        <w:rPr/>
+        <w:t>Nobody laughed. A noise went round the square that Laberius had heard twice in his life, both times on the morning of a donative, and the man on the crutch said “Five hundred” to himself as if the words had a taste.</w:t>
+      </w:r>
+    </w:p>
+    <w:p>
+      <w:r>
+        <w:rPr/>
+        <w:t xml:space="preserve">The scar-lipped veteran from the colony forum in the spring was standing three men along. He caught Laberius’s eye and lifted his chin. </w:t>
+      </w:r>
+      <w:r>
+        <w:rPr>
+          <w:i/>
+        </w:rPr>
+        <w:t>The shadow learned.</w:t>
+      </w:r>
+      <w:r>
+        <w:rPr/>
+        <w:t xml:space="preserve"> He did not need to say it.</w:t>
+      </w:r>
+    </w:p>
+    <w:p>
+      <w:r>
+        <w:rPr/>
+        <w:t>“Five hundred’s a number,” Laberius said to Vibius. “Brundisium will have heard it. Antony will say six.”</w:t>
+      </w:r>
+    </w:p>
+    <w:p>
+      <w:r>
+        <w:rPr/>
+        <w:t>“Antony said one,” Vibius said. “Ask the sailors.”</w:t>
+      </w:r>
+    </w:p>
+    <w:p>
+      <w:r>
+        <w:rPr/>
+        <w:t>There were three pay-tables under an awning by the bridge, and a clerk at each with the colony rolls open in front of him, the surveyor’s rolls, the ones with the plots marked in a neat hand. Laberius had not seen those rolls since a surveyor had read his name from one at Munda’s end and tied his twine. He had thought they lived in a cupboard in Rome where the dead man’s clerks kept them.</w:t>
+      </w:r>
+    </w:p>
+    <w:p>
+      <w:r>
+        <w:rPr/>
+        <w:t>The clerk at the middle table was a freedman with ink on his thumb and a cough. “Name.”</w:t>
+      </w:r>
+    </w:p>
+    <w:p>
+      <w:r>
+        <w:rPr/>
+        <w:t>“Sextus Laberius Cordus. Spain. Munda.”</w:t>
+      </w:r>
+    </w:p>
+    <w:p>
+      <w:r>
+        <w:rPr/>
+        <w:t>The clerk ran his thumb down a column, turned a leaf, ran it down again. “Laberius. Colony plot by Capua, fourth line from the Volturnus road, marked after Munda.” He looked up. “Twine, it says. Not stones yet.”</w:t>
+      </w:r>
+    </w:p>
+    <w:p>
+      <w:r>
+        <w:rPr/>
+        <w:t>“Twine,” Laberius said. “Still.”</w:t>
+      </w:r>
+    </w:p>
+    <w:p>
+      <w:r>
+        <w:rPr/>
+        <w:t>“The stones are a matter for after,” the clerk said, not unkindly. He had said it before that morning, many times. “The coin is now.” He wrote the day on a tablet, the fifth before the Ides of October, and Laberius’s name beside it, and pushed the tablet across for his mark.</w:t>
+      </w:r>
+    </w:p>
+    <w:p>
+      <w:r>
+        <w:rPr/>
+        <w:t>Laberius looked at the date. He looked at the column where his name sat in someone else’s neat hand, his row of twine, the road, Munda. The boy had not bought his land; the clerk had said as much. But the boy’s people had gone into the dead man’s cupboards and come out with the rolls, and carried them down the Appian Way to a bridge on the Volturnus, so that a clerk with a cough could find a man’s twine with his thumb. Antony’s man in the spring had offered wine and a road. This one knew where the dirt was.</w:t>
+      </w:r>
+    </w:p>
+    <w:p>
+      <w:r>
+        <w:rPr/>
+        <w:t>He made his mark.</w:t>
+      </w:r>
+    </w:p>
+    <w:p>
+      <w:r>
+        <w:rPr/>
+        <w:t>The bag the clerk counted out to him weighed about what a full water-skin weighed on the march. He felt it pull on his belt. Vibius, at the next table, was laughing for no reason with a bag in each hand, one of them borrowed off a man who had not enrolled.</w:t>
+      </w:r>
+    </w:p>
+    <w:p>
+      <w:r>
+        <w:rPr/>
+        <w:t>On the walk back over the bridge the scar-lipped veteran fell in beside him.</w:t>
+      </w:r>
+    </w:p>
+    <w:p>
+      <w:r>
+        <w:rPr/>
+        <w:t>“Feeds us now, the shadow,” the veteran said.</w:t>
+      </w:r>
+    </w:p>
+    <w:p>
+      <w:r>
+        <w:rPr/>
+        <w:t>“Pays us,” Laberius said. “It isn’t the same.”</w:t>
+      </w:r>
+    </w:p>
+    <w:p>
+      <w:r>
+        <w:rPr/>
+        <w:t>“Tastes the same.”</w:t>
+      </w:r>
+    </w:p>
+    <w:p>
+      <w:r>
+        <w:rPr/>
+        <w:t>“Ask me when he wants something for it,” Laberius said. The twine near Capua had not moved, and would not move tonight, and he knew it. He held the bag against his hip with one hand all the way home anyway.</w:t>
+      </w:r>
+    </w:p>
+    <w:p>
+      <w:pPr>
+        <w:spacing w:before="200"/>
+      </w:pPr>
+      <w:r>
+        <w:rPr/>
+        <w:t>The Statue</w:t>
+      </w:r>
+    </w:p>
+    <w:p>
+      <w:r>
+        <w:rPr/>
+        <w:t>He came into Rome with three thousand men and found the Forum smaller than he remembered.</w:t>
+      </w:r>
+    </w:p>
+    <w:p>
+      <w:r>
+        <w:rPr/>
+        <w:t>They held the Temple of Castor and its steps, which was the nearest thing in the Forum to a fort, and the men who had taken his five hundred stood about on the steps and in the street below with their swords on, looking at the city as if it might owe them something too. Octavian had written to Cicero every day for a week: come to Rome, stand beside me, the Senate listens to you. Cicero had written back from the coast with advice and without himself. Today he was still on the coast.</w:t>
+      </w:r>
+    </w:p>
+    <w:p>
+      <w:r>
+        <w:rPr/>
+        <w:t>The tribune Cannutius spoke first. He spoke against Antony well and at length, because he had nothing to lose by it and enjoyed the sound. Then he called Gaius Caesar to the front of the steps.</w:t>
+      </w:r>
+    </w:p>
+    <w:p>
+      <w:r>
+        <w:rPr/>
+        <w:t>Octavian had written the speech three times. He gave it the fourth way, shorter. He spoke of his father’s murder and his father’s friends, of the money Antony would not give the people and he had given them himself, of the consul who had killed Caesar’s centurions at Brundisium for laughing. Below him the veterans listened in a way he could not read. They had listened at Casilinum for the number. He did not know what they were listening for now.</w:t>
+      </w:r>
+    </w:p>
+    <w:p>
+      <w:r>
+        <w:rPr/>
+        <w:t>At the end, as he had planned, he turned to the bronze statue of Caesar that stood by the temple and lifted his right hand to it.</w:t>
+      </w:r>
+    </w:p>
+    <w:p>
+      <w:r>
+        <w:rPr/>
+        <w:t>“As I hope to attain my father’s honours,” he said, “I swear…”</w:t>
+      </w:r>
+    </w:p>
+    <w:p>
+      <w:r>
+        <w:rPr/>
+        <w:t>He heard the noise change before he finished. It came from the veterans, and it was not a cheer.</w:t>
+      </w:r>
+    </w:p>
+    <w:p>
+      <w:r>
+        <w:rPr/>
+        <w:t>“We came to guard you,” a man called from the street. Octavian knew the face a moment later: a scar through the lip, one of the Casilinum men. “From him. Not to kill him. He was Caesar’s too.”</w:t>
+      </w:r>
+    </w:p>
+    <w:p>
+      <w:r>
+        <w:rPr/>
+        <w:t xml:space="preserve">Others took it up. </w:t>
+      </w:r>
+      <w:r>
+        <w:rPr>
+          <w:i/>
+        </w:rPr>
+        <w:t>Caesar’s too.</w:t>
+      </w:r>
+      <w:r>
+        <w:rPr/>
+        <w:t xml:space="preserve"> </w:t>
+      </w:r>
+      <w:r>
+        <w:rPr>
+          <w:i/>
+        </w:rPr>
+        <w:t>We didn’t enrol to fight the consul.</w:t>
+      </w:r>
+      <w:r>
+        <w:rPr/>
+        <w:t xml:space="preserve"> A man near the steps took off his helmet and held it under his arm like a man leaving a dinner.</w:t>
+      </w:r>
+    </w:p>
+    <w:p>
+      <w:r>
+        <w:rPr/>
+        <w:t>Octavian finished the oath, because there was nothing to be done with half an oath. Then he stood and watched his army decide.</w:t>
+      </w:r>
+    </w:p>
+    <w:p>
+      <w:r>
+        <w:rPr/>
+        <w:t>By dark a third of them had gone. By the next morning it was more. They went in twos and threes, in the direction of their colonies, some of them still with his five hundred in their belts. He let them go. He could not have stopped them without asking the rest to stop them, and he did not know what the rest would do.</w:t>
+      </w:r>
+    </w:p>
+    <w:p>
+      <w:r>
+        <w:rPr/>
+        <w:t>A veteran by the temple steps did not go. He was an ordinary man, broad, quiet, with Campanian dust still on his boots, and he stood with his back to a column and counted the men who were leaving as they went past him, his lips moving. When he caught Octavian looking at him he stopped counting and did not explain.</w:t>
+      </w:r>
+    </w:p>
+    <w:p>
+      <w:r>
+        <w:rPr/>
+        <w:t>“Antony will be in the city in a fortnight,” Agrippa said that night. “With four legions.”</w:t>
+      </w:r>
+    </w:p>
+    <w:p>
+      <w:r>
+        <w:rPr/>
+        <w:t>“Then we will not be in it,” Octavian said.</w:t>
+      </w:r>
+    </w:p>
+    <w:p>
+      <w:r>
+        <w:rPr/>
+        <w:t>They went north into Etruria, to Arretium, where Maecenas’s family had money and houses and the winter came early. Octavian drilled what he had left on frozen ground and wrote to Cicero again, more carefully. He did not mention the oath, or the helmet. He had learned at the Temple of Castor that veterans would take his money to stand near Antony and would not take it to kill him. He did not yet know what he had that would change their minds.</w:t>
+      </w:r>
+    </w:p>
+    <w:p>
+      <w:r>
+        <w:rPr/>
+        <w:t>Toward the end of the month a rider came up the road from the south, one of Agrippa’s, with frost in his beard.</w:t>
+      </w:r>
+    </w:p>
+    <w:p>
+      <w:r>
+        <w:rPr/>
+        <w:t>“Alba Fucens,” he said. “The Martian legion. They shut the gates on Antony and shot at him from the walls. They’ve declared for you.”</w:t>
+      </w:r>
+    </w:p>
+    <w:p>
+      <w:r>
+        <w:rPr/>
+        <w:t>Octavian put the tablet down.</w:t>
+      </w:r>
+    </w:p>
+    <w:p>
+      <w:r>
+        <w:rPr/>
+        <w:t>“And the Fourth,” the rider said. “Two days after. Antony came to the walls with money in his hand and talked about Brundisium as if they’d forgotten it. They hadn’t.”</w:t>
+      </w:r>
+    </w:p>
+    <w:p>
+      <w:r>
+        <w:rPr/>
+        <w:t>Agrippa let out a breath that was almost a laugh. Octavian did not laugh. He sat down at the table, because his knees wanted him to, and kept his hands flat on it until they were still.</w:t>
+      </w:r>
+    </w:p>
+    <w:p>
+      <w:r>
+        <w:rPr/>
+        <w:t>“Pay them,” he said. “What I promised. Then the same again.”</w:t>
+      </w:r>
+    </w:p>
+    <w:p>
+      <w:r>
+        <w:rPr/>
+        <w:t>“With what?” Agrippa said.</w:t>
+      </w:r>
+    </w:p>
+    <w:p>
+      <w:r>
+        <w:rPr/>
+        <w:t>Octavian did not answer that. He took a clean tablet and began a letter to Cicero, the shortest he had written him. This time he knew he would have an answer.</w:t>
+      </w:r>
+    </w:p>
+    <w:p>
+      <w:pPr>
+        <w:spacing w:before="200"/>
+      </w:pPr>
+      <w:r>
+        <w:rPr/>
         <w:t>Cisalpine</w:t>
       </w:r>
     </w:p>
@@ -10655,7 +11568,7 @@
     <w:p>
       <w:r>
         <w:rPr/>
-        <w:t>The sentence did not need an answer. A rider came up the Via Aemilia from Ariminum with his horse lathered to the girth: Antony had left Rome with the Macedonian legions behind him and was on the road north. Not hurrying. That was worse.</w:t>
+        <w:t>The sentence did not need an answer. A rider came up the Via Aemilia from Ariminum with his horse lathered to the girth: Antony had left Rome with what the boy had left him of the Macedonian legions and was on the road north. Not hurrying. That was worse.</w:t>
       </w:r>
     </w:p>
     <w:p>
@@ -11758,7 +12671,7 @@
     <w:p>
       <w:r>
         <w:rPr/>
-        <w:t>Phileros drank less now; fear sobered some men and ruined others. He asked Nysa if the Domus still had a mistress worth fearing. She said fear had moved house. She kept her eyes down and her feet moving. Survival was an unprinted decree. In a side court she found a broken seal stamp and left it; broken seals let new law pretend to be old. She passed a posted list without reading every name. Reading every name invited your own onto the wood. She still felt the ink like heat. She did not look for Calpurnia’s old corridors of dread. Those corridors had been sold with the seals.</w:t>
+        <w:t>Phileros drank less now; fear sobered some men and ruined others. He came to the Carinae kitchen door, where Nysa had carried for Antony’s steward since the spring before last, and asked her if the Domus still had a mistress worth fearing. She said fear had moved house. She kept her eyes down and her feet moving. Survival was an unprinted decree. In a side court she found a broken seal stamp and left it; broken seals let new law pretend to be old. She passed a posted list without reading every name. Reading every name invited your own onto the wood. She still felt the ink like heat. She did not look for Calpurnia’s old corridors of dread. Those corridors had been sold with the seals.</w:t>
       </w:r>
     </w:p>
     <w:p>

</xml_diff>

<commit_message>
Regenerate Book 1 reading copy (prologue, Ch 1)
Co-Authored-By: Claude Opus 5.5 (1M context) <noreply@anthropic.com>
Claude-Session: https://claude.ai/code/session_016J1A9VbrbaLp4Q5XYAjW4F
</commit_message>
<xml_diff>
--- a/exports/Ides_Book1_FULL_Ch01-34.docx
+++ b/exports/Ides_Book1_FULL_Ch01-34.docx
@@ -17,7 +17,7 @@
     <w:p>
       <w:r>
         <w:rPr/>
-        <w:t>THIS FILE CONTAINS ALL 34 CHAPTERS · OPENS WITH CHAPTER 1</w:t>
+        <w:t>THIS FILE CONTAINS THE PROLOGUE AND ALL 34 CHAPTERS · OPENS WITH THE PROLOGUE</w:t>
       </w:r>
     </w:p>
     <w:p>
@@ -25,9 +25,9 @@
         <w:rPr/>
         <w:t>Prose export for reading · metadata stripped</w:t>
         <w:br/>
-        <w:t>Book 1 reading export · dinner-first opening · ends at Philippi · author-voice (no em dash)</w:t>
+        <w:t>Book 1 reading export · Utica prologue, then Ch 1 dinner · ends at Philippi · author-voice (no em dash)</w:t>
         <w:br/>
-        <w:t>Source: Manuscript 5c1ea67 (2026-10-23) · generated 2026-10-23 21:13 UTC from main @ 5c1ea67 · source digest f57481c9536e3443 · chapters 1–34</w:t>
+        <w:t>Source: Manuscript a25fdce (2026-10-23) · generated 2026-10-23 21:17 UTC from main @ a25fdce · source digest c45cb7e5df99c08c · prologue and chapters 1–34</w:t>
       </w:r>
     </w:p>
     <w:p>
@@ -37,6 +37,216 @@
       </w:r>
     </w:p>
     <w:p/>
+    <w:p>
+      <w:pPr>
+        <w:spacing w:before="280"/>
+      </w:pPr>
+      <w:r>
+        <w:rPr/>
+        <w:t>Prologue</w:t>
+      </w:r>
+    </w:p>
+    <w:p>
+      <w:r>
+        <w:rPr/>
+        <w:t>Utica</w:t>
+      </w:r>
+    </w:p>
+    <w:p>
+      <w:pPr>
+        <w:spacing w:before="200"/>
+      </w:pPr>
+      <w:r>
+        <w:rPr/>
+        <w:t>The Physician</w:t>
+      </w:r>
+    </w:p>
+    <w:p>
+      <w:r>
+        <w:rPr/>
+        <w:t>They sent for Cleanthes because of the hand.</w:t>
+      </w:r>
+    </w:p>
+    <w:p>
+      <w:r>
+        <w:rPr/>
+        <w:t>It was the right hand, and it was swollen across the knuckles to the shape of a small loaf, and the skin over the second knuckle had split. Cato held it out to him on the couch the way a man holds out a tablet for sealing, without interest. A lamp stood on the stand beside him and a book lay open under it, a roll of good papyrus, wound most of the way to the end.</w:t>
+      </w:r>
+    </w:p>
+    <w:p>
+      <w:r>
+        <w:rPr/>
+        <w:t>“A slave’s teeth,” Cato said. “He would not bring me my sword. I struck him.”</w:t>
+      </w:r>
+    </w:p>
+    <w:p>
+      <w:r>
+        <w:rPr/>
+        <w:t>Cleanthes knew which slave. He had passed him in the court with his mouth full of blood and a boy holding a cloth to it. He did not say so. He cleaned the split with wine, felt each finger for a break and found none, and began to bind the hand in linen, firmly, so that it would not swell further in the night.</w:t>
+      </w:r>
+    </w:p>
+    <w:p>
+      <w:r>
+        <w:rPr/>
+        <w:t>“Not too tight,” Cato said. “I shall want it.”</w:t>
+      </w:r>
+    </w:p>
+    <w:p>
+      <w:r>
+        <w:rPr/>
+        <w:t>Cleanthes kept his eyes on the linen.</w:t>
+      </w:r>
+    </w:p>
+    <w:p>
+      <w:r>
+        <w:rPr/>
+        <w:t>All day the harbour had been full of shouting. Since the news of the battle had come from Thapsus, Cato had done nothing but put other men on ships: senators, knights, the young men of good family who had come to Africa to fight for the Republic and would now have to go home and explain themselves. He had stood on the mole in the wind and counted them aboard, and argued with captains about the price, and lent money to men who had none. Caesar was two days off, or one. The people of Utica, who had never wanted any of these Romans in the first place, had begun to speak of mercy in the market as if mercy were a ship that would call for them too.</w:t>
+      </w:r>
+    </w:p>
+    <w:p>
+      <w:r>
+        <w:rPr/>
+        <w:t>At dinner, Cleanthes had heard from the kitchen, Cato had argued philosophy with his guests, louder than was his custom. The question was whether only the good man is free. A Peripatetic called Demetrius had taken the other side, as Peripatetics did, and Cato had shouted him down. Afterwards he had walked with his friends, given his orders for the night watch, and embraced his son and each friend more warmly than usual, and gone to his room. In the room he had found his sword gone from the head of the bed, where it always hung. His son had taken it.</w:t>
+      </w:r>
+    </w:p>
+    <w:p>
+      <w:r>
+        <w:rPr/>
+        <w:t>That was when he had called for it and struck the slave.</w:t>
+      </w:r>
+    </w:p>
+    <w:p>
+      <w:r>
+        <w:rPr/>
+        <w:t>Now the son stood in the doorway with his friends behind him, a young man of twenty-odd with his father’s nose and none of his calm, weeping openly. Cato looked at him over the physician’s head.</w:t>
+      </w:r>
+    </w:p>
+    <w:p>
+      <w:r>
+        <w:rPr/>
+        <w:t>“When was I judged out of my mind?” he said. “Has anyone come in to show me where I am wrong? No. You take my weapon. You would tie my hands next, I suppose, and keep me for Caesar like a present.”</w:t>
+      </w:r>
+    </w:p>
+    <w:p>
+      <w:r>
+        <w:rPr/>
+        <w:t>“Father…”</w:t>
+      </w:r>
+    </w:p>
+    <w:p>
+      <w:r>
+        <w:rPr/>
+        <w:t>“I do not need a sword to die. I can hold my breath. I can beat my head against a wall. Go.”</w:t>
+      </w:r>
+    </w:p>
+    <w:p>
+      <w:r>
+        <w:rPr/>
+        <w:t>They went. A little later a small boy came in with the sword and set it against the couch, not looking at anyone, and went out again. Cato drew it a hand’s breadth, looked at the edge, and slid it home.</w:t>
+      </w:r>
+    </w:p>
+    <w:p>
+      <w:r>
+        <w:rPr/>
+        <w:t>“Now I am my own master,” he said, to no one Cleanthes could see.</w:t>
+      </w:r>
+    </w:p>
+    <w:p>
+      <w:r>
+        <w:rPr/>
+        <w:t>He tied off the linen. Cato flexed the fingers once and winced, and took up the book again. Cleanthes had seen the title on the tag: Plato, on the soul. Socrates in prison, talking with his friends until the hemlock came. Cato read it as men read a contract, close, going back over a passage he had already passed. He had been through it once before dinner, the kitchen said. He was more than halfway through it again.</w:t>
+      </w:r>
+    </w:p>
+    <w:p>
+      <w:r>
+        <w:rPr/>
+        <w:t>Cleanthes went out and lay down on a mat in the passage. He did not sleep. Toward midnight he heard Cato snoring, deep and even, the snore of a man who has finished his work for the day, and he lay in the dark and listened to it and did not know what to think.</w:t>
+      </w:r>
+    </w:p>
+    <w:p>
+      <w:r>
+        <w:rPr/>
+        <w:t>Before the first birds Cato sent the freedman Butas down to the harbour to see whether all the ships were away. Butas came back with the sky going grey. The ships were gone, he said, all but one; the sea was rough; a wind had got up from the north. Cato groaned aloud at that, for the men at sea, and sent Butas back down to see whether anyone had been forced to put in again and needed help. Cleanthes heard him say it. He heard the concern in it, real concern, and that was the thing he could not afterward explain to anyone: the man had sent Butas out of the room for the sake of strangers on the water.</w:t>
+      </w:r>
+    </w:p>
+    <w:p>
+      <w:r>
+        <w:rPr/>
+        <w:t>Butas went. The house was quiet. A bird began in the courtyard, and then another.</w:t>
+      </w:r>
+    </w:p>
+    <w:p>
+      <w:r>
+        <w:rPr/>
+        <w:t>Then there was a sound from the room like a heavy sack falling, and after it a clatter of small things on the floor, many small things, and somebody in the passage screamed.</w:t>
+      </w:r>
+    </w:p>
+    <w:p>
+      <w:r>
+        <w:rPr/>
+        <w:t>Cleanthes was through the door before the scream ended. The couch was empty. Cato lay on the floor beside it in the lamp’s last light, on his side, with blood all down the front of his tunic and spreading on the tiles. The counting-board that stood by the couch had gone over with him, and its little ivory counters were everywhere, in the blood, under the couch, against Cleanthes’ foot. The sword lay a pace off. The bound hand had not had the strength to drive it home. The blow had gone in under the breast, and wide, and the belly was open, and Cleanthes could see what no physician wants to see in a living man, the bowel come out through the wound.</w:t>
+      </w:r>
+    </w:p>
+    <w:p>
+      <w:r>
+        <w:rPr/>
+        <w:t>He was alive. His eyes were open.</w:t>
+      </w:r>
+    </w:p>
+    <w:p>
+      <w:r>
+        <w:rPr/>
+        <w:t>The son was there, and the friends, and the household, all shouting. Cleanthes shouted louder than any of them for water and linen and a needle and gut, and for someone to hold the lamp still. Cato’s eyes were open but not seeing. That was a mercy, and Cleanthes used it. He knelt in the counters and the blood and looked. The bowel was not cut. He had expected it to be cut, and it was not; the bound hand had spared it. With clean hands and wine and great care he eased it back into the belly, a little at a time, while a slave held the lamp and wept and the lamp shook. Then he closed the wound and began to sew.</w:t>
+      </w:r>
+    </w:p>
+    <w:p>
+      <w:r>
+        <w:rPr/>
+        <w:t>He sewed well. He had been taught in Cos by a man who had been taught by men who had been taught by Hippocrates’ own pupils, and he was proud of his hands, and in the worst hours of that war he had never been prouder of them than now. Small stitches, close together, each knot drawn down firm. The bleeding slowed. Someone behind him began to pray. He tied the last knot, and sat back on his heels, and wiped his hands, and looked up at the son to tell him that his father might live.</w:t>
+      </w:r>
+    </w:p>
+    <w:p>
+      <w:r>
+        <w:rPr/>
+        <w:t>Cato was looking at him.</w:t>
+      </w:r>
+    </w:p>
+    <w:p>
+      <w:r>
+        <w:rPr/>
+        <w:t>The eyes were seeing now. They went from Cleanthes to the stitches and back, and something in the face changed, and Cleanthes had time to understand it and no time to move. Cato pushed him away with the bound hand, hard enough to put him on his back among the counters. Then he put both hands into the wound Cleanthes had closed and tore it open.</w:t>
+      </w:r>
+    </w:p>
+    <w:p>
+      <w:r>
+        <w:rPr/>
+        <w:t>The son caught at his arms. The friends caught at his arms. It was too late, and Cleanthes knew it was too late, because he had seen what the hands did and where they went. Cato did not cry out. He made a sound of effort, as a man does lifting something heavy, and his hands came out of himself red to the wrist, and he lay back on the tiles, and after a little while he died.</w:t>
+      </w:r>
+    </w:p>
+    <w:p>
+      <w:r>
+        <w:rPr/>
+        <w:t>He was forty-eight. Cleanthes heard someone say so later, as if it were an argument.</w:t>
+      </w:r>
+    </w:p>
+    <w:p>
+      <w:r>
+        <w:rPr/>
+        <w:t>By full light the whole town knew. People came to the door and stood in the street, Uticans who had never loved him, and wept. By the middle of the morning a rider came in from the south road with dust on him to say that Caesar’s horse were on the road, near, and that Caesar himself was not far behind, and was saying already that he meant to spare the town, and the son, and anyone who asked.</w:t>
+      </w:r>
+    </w:p>
+    <w:p>
+      <w:r>
+        <w:rPr/>
+        <w:t>Cleanthes sat in the court and washed the needle in a bowl of water until the water was pink and then clear. He had sewn well. That had been the trouble. He had given the man back his life without asking him, and the man would not take it from him either.</w:t>
+      </w:r>
+    </w:p>
+    <w:p>
+      <w:r>
+        <w:rPr/>
+        <w:t>Somebody had gathered the ivory counters and set them in a dish on the step, sticky still, all mixed together, so that there was no telling what sum they had been keeping. Caesar, the rider said, would be in Utica by evening, and he would want to know who had sewn him.</w:t>
+      </w:r>
+    </w:p>
     <w:p>
       <w:pPr>
         <w:spacing w:before="360"/>
@@ -74,6 +284,12 @@
       <w:r>
         <w:rPr/>
         <w:t>Cassius smiled with his teeth and counted who received what: commands, lands, praise.</w:t>
+      </w:r>
+    </w:p>
+    <w:p>
+      <w:r>
+        <w:rPr/>
+        <w:t>He had come for one thing. Caesar was going to Spain before the winter to finish Pompey’s sons, and the host was one of the men who drew up the names for his staff. A pardoned man who rode on the next campaign stopped being a pardoned man and became an officer again. Cassius had written to the host twice. Tonight he meant to hear the answer in the host’s voice, and he had decided on the way over that he would not ask.</w:t>
       </w:r>
     </w:p>
     <w:p>
@@ -125,19 +341,25 @@
     <w:p>
       <w:r>
         <w:rPr/>
-        <w:t>A lesser guest leaned too far toward the host’s couch while the toast was still warm. “If your house still remembers my brother’s petition…” he began, loud enough for the wrong ears.</w:t>
-      </w:r>
-    </w:p>
-    <w:p>
-      <w:r>
-        <w:rPr/>
-        <w:t>The host did not look at him. He looked at the wine, then at Sextilius, then past the petitioner. Sextilius’s laugh arrived a beat late and aimed at nothing. Cassius almost answered for him. He reached for bread instead.</w:t>
-      </w:r>
-    </w:p>
-    <w:p>
-      <w:r>
-        <w:rPr/>
-        <w:t>A servant leaned in with the jug. The petitioner swallowed the rest of his sentence with the pour. Someone talked about rain. Someone else about cousins. A mule that had thrown a clerk. Ordinary noise, the kind a table makes to cover a hole in itself.</w:t>
+        <w:t>“They say the Spanish roads are bad in winter,” Cassius said, to the fish.</w:t>
+      </w:r>
+    </w:p>
+    <w:p>
+      <w:r>
+        <w:rPr/>
+        <w:t>“Sextilius will tell us,” said the host. “He goes out with Caesar’s staff at the month’s end.” He lifted his cup toward the next couch. “To Spain, and a short war.”</w:t>
+      </w:r>
+    </w:p>
+    <w:p>
+      <w:r>
+        <w:rPr/>
+        <w:t>Sextilius lifted his own and laughed, exactly on the beat, the laugh of a man who had been told before dinner. The table drank. Cassius drank with it. He found that he had a piece of bread in his hand and did not remember taking it.</w:t>
+      </w:r>
+    </w:p>
+    <w:p>
+      <w:r>
+        <w:rPr/>
+        <w:t>So that was the answer, and it had come in the host’s voice after all, and he had not asked. A servant leaned in with the jug. Someone talked about rain. Someone else about cousins. A mule that had thrown a clerk. Ordinary noise, the kind a table makes to cover a hole in itself.</w:t>
       </w:r>
     </w:p>
     <w:p>
@@ -331,13 +553,19 @@
     <w:p>
       <w:r>
         <w:rPr/>
-        <w:t>“Nobody here owns a seal worth the wax,” said Aebutius, and the laugh went round again.</w:t>
-      </w:r>
-    </w:p>
-    <w:p>
-      <w:r>
-        <w:rPr/>
-        <w:t>The petitioner tried a smaller ask, only an introduction, a name in the right ear. The host’s shoulder was already turned toward better amusement. By the fruit course Cassius’s rib still knew the difference between the favour that shone and the one that had not.</w:t>
+        <w:t>“Nobody here owns a seal worth the wax,” said Aebutius, and the laugh went round again. He pointed a grape at Cassius. “Our friend is an Epicurean now, did you know? Gods who take no interest in us. Pleasure in moderation. It must save a fortune on sacrifices.”</w:t>
+      </w:r>
+    </w:p>
+    <w:p>
+      <w:r>
+        <w:rPr/>
+        <w:t>“It saves on gratitude,” Cassius said.</w:t>
+      </w:r>
+    </w:p>
+    <w:p>
+      <w:r>
+        <w:rPr/>
+        <w:t>That got a better laugh than he wanted. By the fruit course Sextilius had been toasted twice more for Spain, and Cassius’s rib still knew the difference between the favour that shone and the one that had not.</w:t>
       </w:r>
     </w:p>
     <w:p>
@@ -349,7 +577,7 @@
     <w:p>
       <w:r>
         <w:rPr/>
-        <w:t>Sextilius barked a laugh that wanted company. The host’s eyes narrowed a fraction. The petitioner laughed too, glad to be included in any sound, then looked sorry he had. Tettius laughed loudest, having understood none of it, which made him the only honest man at the table.</w:t>
+        <w:t>Sextilius barked a laugh that wanted company. The host’s eyes narrowed a fraction. Tettius laughed loudest, having understood none of it, which made him the only honest man at the table.</w:t>
       </w:r>
     </w:p>
     <w:p>
@@ -367,7 +595,7 @@
     <w:p>
       <w:r>
         <w:rPr/>
-        <w:t>“He feeds you forgiveness and keeps the favour for men who laugh on cue,” Sextilius said the moment the threshold lamp was behind them. “I laughed. I am not proud. I am employed.”</w:t>
+        <w:t>“He feeds you forgiveness and keeps Spain for men who laugh on cue,” Sextilius said the moment the threshold lamp was behind them. “I laughed. I am not proud. I am employed.”</w:t>
       </w:r>
     </w:p>
     <w:p>
@@ -433,7 +661,25 @@
     <w:p>
       <w:r>
         <w:rPr/>
-        <w:t>Cassius did not answer. He kept the queen talk, and the child, and Sextilius’s silence-on-land, with the names that had smiled wrong. Beneath them, unasked, went a fourth thing: a man who would not owe. He did not yet know which pocket it belonged in. Through the door-slaves’ gap, the petitioner was still smiling at nothing.</w:t>
+        <w:t>Cassius did not answer.</w:t>
+      </w:r>
+    </w:p>
+    <w:p>
+      <w:r>
+        <w:rPr/>
+        <w:t>At home he did not go to bed. He had a lamp lit and wrote to Cicero, because Cicero would enjoy the dinner and could be trusted to tell no one but Atticus. He wrote about the fish, and the country cousin, and an Epicurean’s view of gratitude, and made it light. Then, without having meant to, he wrote about Spain: that if it had to be one master or another, he would rather keep the old and clement one than try a new and cruel one.</w:t>
+      </w:r>
+    </w:p>
+    <w:p>
+      <w:r>
+        <w:rPr/>
+        <w:t>He read the sentence back. It was true. It sounded like a man thanking his chain. He scraped it off the wax with the flat of the stylus, and sat a while, and wrote it again word for word, because it was still true.</w:t>
+      </w:r>
+    </w:p>
+    <w:p>
+      <w:r>
+        <w:rPr/>
+        <w:t>Then he sat with the lamp and thought about a man at Utica who had been offered the same terms, and had not written anything at all.</w:t>
       </w:r>
     </w:p>
     <w:p>

</xml_diff>

<commit_message>
Regenerate Book 1 reading copy (Seius family)
Co-Authored-By: Claude Opus 5.5 (1M context) <noreply@anthropic.com>
Claude-Session: https://claude.ai/code/session_016J1A9VbrbaLp4Q5XYAjW4F
</commit_message>
<xml_diff>
--- a/exports/Ides_Book1_FULL_Ch01-34.docx
+++ b/exports/Ides_Book1_FULL_Ch01-34.docx
@@ -27,7 +27,7 @@
         <w:br/>
         <w:t>Book 1 reading export · Utica prologue, then Ch 1 dinner · ends at Philippi · author-voice (no em dash)</w:t>
         <w:br/>
-        <w:t>Source: Manuscript a25fdce (2026-10-23) · generated 2026-10-23 21:17 UTC from main @ a25fdce · source digest c45cb7e5df99c08c · prologue and chapters 1–34</w:t>
+        <w:t>Source: Manuscript 4606975 (2026-10-23) · generated 2026-10-23 21:30 UTC from main @ 4606975 · source digest 9f9f65f3fef5499b · prologue and chapters 1–34</w:t>
       </w:r>
     </w:p>
     <w:p>
@@ -1206,6 +1206,12 @@
     <w:p>
       <w:r>
         <w:rPr/>
+        <w:t>“You’re old Seius’s nephew,” Naevius added, still not moving his lips. “The grain man. My father ate cheap bread off your uncle the year the city went hungry. Every old client in this line remembers it. None of them will give you a nod for it.”</w:t>
+      </w:r>
+    </w:p>
+    <w:p>
+      <w:r>
+        <w:rPr/>
         <w:t>Naevius went up first. The patron said his name, warmly, and the nod travelled the whole distance. Naevius took it, bowed to the exact height, and came back past Seius with a face like a closed shop. “Thirty years,” he whispered. “The nod is a muscle. Yours will grow.”</w:t>
       </w:r>
     </w:p>
@@ -1242,7 +1248,7 @@
     <w:p>
       <w:r>
         <w:rPr/>
-        <w:t>Outside, in the lane’s cold, the middleman who smelled of Hordeonius’s wax waited with the patience of a professional accident. Seius had already borrowed for the toga and for a jar of oil good enough to be seen carrying. Now, it appeared, he would borrow for the borrowing. The sum was small enough to feel temporary and large enough to change what dinners Seius could refuse.</w:t>
+        <w:t>Outside, in the lane’s cold, the middleman who smelled of Hordeonius’s wax waited with the patience of a professional accident. Seius had already borrowed for the canvass: the whitened toga for the aedile elections, the small gifts a candidate is seen to give, a jar of oil good enough to be seen carrying. Now, it appeared, he would borrow for the borrowing. The sum was small enough to feel temporary and large enough to change what dinners Seius could refuse.</w:t>
       </w:r>
     </w:p>
     <w:p>
@@ -1338,7 +1344,7 @@
     <w:p>
       <w:r>
         <w:rPr/>
-        <w:t>Seius handed her the invented warmth first, then the true sum. She weighed both without raising her voice. “Then we dine as if the nod were meat,” she said, and turned back inside before the lane could hear her correct him. The middleman’s wax had followed him home; Seia Prima set an extra cup anyway and did not drink from it.</w:t>
+        <w:t>Seius handed her the invented warmth first, then the true sum. She weighed both without raising her voice. She was old Seius’s eldest, born to the name she had married back into, and her father had sold Rome its grain at a loss for a whole year and still had men nodding to him in the street for it, thirty years on. She had married his nephew to have that nod in the house again. “Then we dine as if the nod were meat,” she said, and turned back inside before the lane could hear her correct him. The middleman’s wax had followed him home; Seia Prima set an extra cup anyway and did not drink from it.</w:t>
       </w:r>
     </w:p>
     <w:p>
@@ -3922,7 +3928,7 @@
     <w:p>
       <w:r>
         <w:rPr/>
-        <w:t>He owed Hordeonius’s wax for the toga, for the oil, for the smile, and a man in his position did not have the leisure to be principled. He had come to the baths for the hot room and a little quiet. He had not come for this.</w:t>
+        <w:t>He owed Hordeonius’s wax for the canvass, for the toga, for the oil, for the smile, and a man in his position did not have the leisure to be principled. He had come to the baths for the hot room and a little quiet. He had not come for this.</w:t>
       </w:r>
     </w:p>
     <w:p>

</xml_diff>

<commit_message>
Regenerate Book 1 reading copy
Co-Authored-By: Claude Opus 5.5 (1M context) <noreply@anthropic.com>
Claude-Session: https://claude.ai/code/session_016J1A9VbrbaLp4Q5XYAjW4F
</commit_message>
<xml_diff>
--- a/exports/Ides_Book1_FULL_Ch01-34.docx
+++ b/exports/Ides_Book1_FULL_Ch01-34.docx
@@ -27,7 +27,7 @@
         <w:br/>
         <w:t>Book 1 reading export · Utica prologue, then Ch 1 dinner · ends at Philippi · author-voice (no em dash)</w:t>
         <w:br/>
-        <w:t>Source: Manuscript 4606975 (2026-10-23) · generated 2026-10-23 21:30 UTC from main @ 4606975 · source digest 9f9f65f3fef5499b · prologue and chapters 1–34</w:t>
+        <w:t>Source: Manuscript 649dd1b (2026-10-23) · generated 2026-10-23 21:30 UTC from main @ 649dd1b · source digest b516fd2681cf3e53 · prologue and chapters 1–34</w:t>
       </w:r>
     </w:p>
     <w:p>
@@ -1344,7 +1344,7 @@
     <w:p>
       <w:r>
         <w:rPr/>
-        <w:t>Seius handed her the invented warmth first, then the true sum. She weighed both without raising her voice. She was old Seius’s eldest, born to the name she had married back into, and her father had sold Rome its grain at a loss for a whole year and still had men nodding to him in the street for it, thirty years on. She had married his nephew to have that nod in the house again. “Then we dine as if the nod were meat,” she said, and turned back inside before the lane could hear her correct him. The middleman’s wax had followed him home; Seia Prima set an extra cup anyway and did not drink from it.</w:t>
+        <w:t>Seius handed her the invented warmth first, then the true sum. She weighed both without raising her voice. “My father sold this city its grain at a loss for a whole year,” she said, “and thirty years on men still nod to him in the street. I was born a Seia and married one, so that nod would stay in the house. Tonight we dine as if yours were meat.” She turned back inside before the lane could hear her correct him. The middleman’s wax had followed him home; Seia Prima set an extra cup anyway and did not drink from it.</w:t>
       </w:r>
     </w:p>
     <w:p>

</xml_diff>

<commit_message>
Regenerate Book 1 reading copy (tightening pass)
Co-Authored-By: Claude Opus 5.5 (1M context) <noreply@anthropic.com>
Claude-Session: https://claude.ai/code/session_016J1A9VbrbaLp4Q5XYAjW4F
</commit_message>
<xml_diff>
--- a/exports/Ides_Book1_FULL_Ch01-34.docx
+++ b/exports/Ides_Book1_FULL_Ch01-34.docx
@@ -27,7 +27,7 @@
         <w:br/>
         <w:t>Book 1 reading export · Utica prologue, then Ch 1 dinner · ends at Philippi · author-voice (no em dash)</w:t>
         <w:br/>
-        <w:t>Source: Manuscript 649dd1b (2026-10-23) · generated 2026-10-23 21:30 UTC from main @ 649dd1b · source digest b516fd2681cf3e53 · prologue and chapters 1–34</w:t>
+        <w:t>Source: Manuscript 2b2cd99 (2026-10-23) · generated 2026-10-23 21:59 UTC from main @ 2b2cd99 · source digest 846ab3353d3808fa · prologue and chapters 1–34</w:t>
       </w:r>
     </w:p>
     <w:p>
@@ -741,7 +741,7 @@
       </w:r>
       <w:r>
         <w:rPr/>
-        <w:t>, the line under it: the town behind the field, where Cato would not run and would not beg, sat up all night with a book, and closed his own account by hand. Caesar had been on the road with a pardon. That was the joke the Forum could not stop telling. Cato had died to avoid being forgiven.</w:t>
+        <w:t>, the line under it. Caesar had been on the road with a pardon. That was the joke the Forum could not stop telling. Cato had died to avoid being forgiven.</w:t>
       </w:r>
     </w:p>
     <w:p>
@@ -1134,7 +1134,7 @@
     <w:p>
       <w:r>
         <w:rPr/>
-        <w:t>She reported the early clients at the Domus smile, and the banker by the steps. She did not report the land spit. Carrying it upstairs made her the girl who brought politics in with the jars. Across the river, Phileros had muttered, a foreign household was learning Roman hours. She left that unsaid too. None of her oil. Parade noise still pressed the walls. Closed Africa had not closed the counting.</w:t>
+        <w:t>She reported the early clients at the Domus smile, and the banker by the steps. She did not report the land spit. Carrying it upstairs made her the girl who brought politics in with the jars. Across the river, Phileros had muttered, a foreign household was learning Roman hours. She left that unsaid too. None of her oil. Parade noise still pressed the walls.</w:t>
       </w:r>
     </w:p>
     <w:p>
@@ -1809,27 +1809,7 @@
     <w:p>
       <w:r>
         <w:rPr/>
-        <w:t xml:space="preserve">Before Porcia could press again, a steward brought word that his mother’s messenger waited in the outer court. Servilia. The whole city knew she was the woman Caesar had loved longest; Brutus had spent twenty years not knowing it. Not quite an invitation. A mother’s reminder: pardoned sons still owed dinners they did not choose. Soft chains got priced in women’s rooms first. Men’s masks judged later. Porcia’s mouth tightened. “She sends weather,” Porcia said. “I send refusal. Do not confuse the two.” Brutus heard </w:t>
-      </w:r>
-      <w:r>
-        <w:rPr>
-          <w:i/>
-        </w:rPr>
-        <w:t>plant</w:t>
-      </w:r>
-      <w:r>
-        <w:rPr/>
-        <w:t xml:space="preserve">, not </w:t>
-      </w:r>
-      <w:r>
-        <w:rPr>
-          <w:i/>
-        </w:rPr>
-        <w:t>summons</w:t>
-      </w:r>
-      <w:r>
-        <w:rPr/>
-        <w:t>. Women’s power was already arguing his courtesy while he still held a warm cup.</w:t>
+        <w:t>Before Porcia could press again, a steward brought word that his mother’s messenger waited in the outer court. Servilia. The whole city knew she was the woman Caesar had loved longest; Brutus had spent twenty years not knowing it. Not quite an invitation. A mother’s reminder: pardoned sons still owed dinners they did not choose. Soft chains got priced in women’s rooms first. Men’s masks judged later. Porcia’s mouth tightened. “She sends weather,” Porcia said. “I send refusal. Do not confuse the two.”</w:t>
       </w:r>
     </w:p>
     <w:p>
@@ -2177,7 +2157,7 @@
     <w:p>
       <w:r>
         <w:rPr/>
-        <w:t>“A Greek town with Italy’s heel for a view,” Agrippa had said from the boat rail, and that was description enough. Caesar had not chosen it for him. Over the hills in Macedonia the army was gathering, and the officers who came down to the coast said the numbers the way other men said prayers: sixteen legions, ten thousand horse, the best of what Spain and Africa had left alive. Then Parthia, beyond Syria. Crassus and his legions destroyed there nearly ten years ago, Crassus’s eagles still hanging in some Parthian temple. Whoever brought the eagles home, the officers said, would be remembered longer than the man who had only won the war at home, and then they glanced to see whether the boy had heard.</w:t>
+        <w:t>“A Greek town with Italy’s heel for a view,” Agrippa had said from the boat rail, and that was description enough. Caesar had not chosen it for him. Over the hills in Macedonia the army was gathering, and the officers who came down to the coast said the numbers the way other men said prayers: sixteen legions, ten thousand horse, the best of what Spain and Africa had left alive. Then Parthia, beyond Syria, where Crassus’s eagles still hung in some temple. Whoever brought the eagles home, the officers said, would be remembered longer than the man who had only won the war at home, and then they glanced to see whether the boy had heard.</w:t>
       </w:r>
     </w:p>
     <w:p>
@@ -2327,7 +2307,7 @@
     <w:p>
       <w:r>
         <w:rPr/>
-        <w:t>Before sleep they shared a heel of bread Agrippa had bullied from a cook who respected fists more than kin names. No officers. No Parthia sticks in dust. Just the ordinary theft of calories and Agrippa’s rule spoken twice without theatre: no shadows between them. Octavian practised a thank-you and discarded it. He bumped Agrippa’s shoulder back, clumsy, almost play, and lay down sore, young, and unfinished, exactly as far from Senate heat as the sea allowed. He didn’t dream of crowns. He dreamed of the reserved place offered to the wrong chest, then of missing a drill step and being laughed at by men whose names he needed. Both dreams felt like the same inventory.</w:t>
+        <w:t>Before sleep they shared a heel of bread Agrippa had bullied from a cook who respected fists more than kin names. No officers. No Parthia sticks in dust. Just the ordinary theft of calories and Agrippa’s rule spoken twice without theatre: no shadows between them. Octavian practised a thank-you and discarded it. He bumped Agrippa’s shoulder back, clumsy, almost play, and lay down sore, young, and unfinished, exactly as far from Senate heat as the sea allowed. He didn’t dream of crowns. He dreamed of the reserved place offered to the wrong chest, then of missing a drill step and being laughed at by men whose names he needed.</w:t>
       </w:r>
     </w:p>
     <w:p>
@@ -2431,7 +2411,7 @@
     <w:p>
       <w:r>
         <w:rPr/>
-        <w:t xml:space="preserve">Cicero’s smile held. Holding was his craft. He was the best speaker Rome had produced in a generation and had spent the last three years learning what a speaker was worth when the only audience that mattered had stopped needing speeches. Caesar had pardoned him with a courtesy that left no mark and no way to answer it. In private he dissected: </w:t>
+        <w:t xml:space="preserve">Cicero’s smile held. Holding was his craft. He had spent the last three years learning what the best speaker in Rome was worth when the only audience that mattered had stopped needing speeches. Caesar had pardoned him with a courtesy that left no mark and no way to answer it. In private he dissected: </w:t>
       </w:r>
       <w:r>
         <w:rPr>
@@ -2441,7 +2421,7 @@
       </w:r>
       <w:r>
         <w:rPr/>
-        <w:t xml:space="preserve"> was what kings borrowed from temples, not a republican word. In public he complied, spoke carefully, saved his knives for wax and for Atticus, who had been reading the sentences Cicero could not say aloud for thirty years, usually from Athens, where a banker with a taste for philosophy could wait out an unpleasant Rome. He drafted a sentence about the city’s appetite for extraordinary medicine, then softened it until it could travel without getting him killed by courtesy.</w:t>
+        <w:t xml:space="preserve"> was what kings borrowed from temples, not a republican word. In public he complied, spoke carefully, saved his knives for wax and for Atticus, who had been reading the sentences Cicero could not say aloud for thirty years. He drafted a sentence about the city’s appetite for extraordinary medicine, then softened it until it could travel without getting him killed by courtesy.</w:t>
       </w:r>
     </w:p>
     <w:p>
@@ -2670,7 +2650,7 @@
     <w:p>
       <w:r>
         <w:rPr/>
-        <w:t>He felt the market’s mood thicken. Thick markets made people invent virtues. Virtues, priced wrongly, became recruitment talk before anyone admitted the word. Forever at the doorway. Dead calendars at the stall. Eastern crates counting months. Same unfinished arithmetic, three faces.</w:t>
+        <w:t>He felt the market’s mood thicken. Thick markets made people invent virtues. Virtues, priced wrongly, became recruitment talk before anyone admitted the word. Forever at the doorway. Dead calendars at the stall. Eastern crates counting months.</w:t>
       </w:r>
     </w:p>
     <w:p>
@@ -3583,7 +3563,7 @@
     <w:p>
       <w:r>
         <w:rPr/>
-        <w:t>Cassius and Brutus found him on the Sacra Via, the Sacred Way, where processions walked and the noise of a hundred stalls could drown a dangerous sentence. Cassius spoke first; Brutus stood half a step back, the brand already tired of being used.</w:t>
+        <w:t>Cassius and Brutus found him on the Sacra Via, where processions walked and the noise of a hundred stalls could drown a dangerous sentence. Cassius spoke first; Brutus stood half a step back, the brand already tired of being used.</w:t>
       </w:r>
     </w:p>
     <w:p>
@@ -4569,19 +4549,7 @@
     <w:p>
       <w:r>
         <w:rPr/>
-        <w:t>“Then he may read my tablet in the room,” Cicero said, and sealed nothing that committed his body to anyone’s test balloon.</w:t>
-      </w:r>
-    </w:p>
-    <w:p>
-      <w:r>
-        <w:rPr/>
-        <w:t>The courier tried once more, almost kindly. “He said the talk is already in kitchens. Tablets. Beware. Same weather, cheaper cups.”</w:t>
-      </w:r>
-    </w:p>
-    <w:p>
-      <w:r>
-        <w:rPr/>
-        <w:t>Cicero’s mouth twitched, almost a smile, almost a bruise. “Then the kitchens are better informed than half the Senate. Tell him I remain occupied.”</w:t>
+        <w:t>“Then he may read my tablet in the room,” Cicero said.</w:t>
       </w:r>
     </w:p>
     <w:p>
@@ -4737,7 +4705,7 @@
     <w:p>
       <w:r>
         <w:rPr/>
-        <w:t>She didn’t have Senate words. She had body words, the ache behind the eyes, the taste of metal before dawn, the Domus Publica’s public smile on the Sacra Via looking like a painted lie about safety. She stopped pretending the dread was private. Privacy was a luxury the pontifex maximus’s wife didn’t keep. Even the bed belonged to the office: the chief priest’s house, lent with the calendar and the rites, and the city hung whispers on its curtains. Spurinna’s professional caution, Decimus’s open hand, the staff’s sudden piety: she stacked them beside the lesser nightmares and found the stack heavier than any one omen.</w:t>
+        <w:t>She didn’t have Senate words. She had body words, the ache behind the eyes, the taste of metal before dawn, the Domus Publica’s public smile on the Sacra Via looking like a painted lie about safety. She stopped pretending the dread was private. Privacy was a luxury the pontifex maximus’s wife didn’t keep. Even the bed belonged to the office, and the city hung whispers on its curtains. Spurinna’s professional caution, Decimus’s open hand, the staff’s sudden piety: she stacked them beside the lesser nightmares and found the stack heavier than any one omen.</w:t>
       </w:r>
     </w:p>
     <w:p>
@@ -4902,7 +4870,7 @@
     <w:p>
       <w:r>
         <w:rPr/>
-        <w:t>She went. The near-catch sat hotter than the muttered words. She had meant to leave the splinter somewhere safer before night, under a loose tile, behind a water jar, and Phileros’s basket had stolen the minute. Delayed handoff. Hunted feeling. In the court she passed Pallas again and neither named Calpurnia’s morning pauses. Naming made pauses into evidence. Medullina, if Nysa saw her in the Subura later, would want a trade. Nysa would give birds and chickens. Not this. The fragment was still only a splinter, mercy or trap depending on which word you stressed, and it hadn’t yet grown legs as street rumour. It had only almost become a door-search. The attendant’s muttered truth stuck beside it: schedules that smelled like knives. Cheer in the atrium; truth in the cloak-space.</w:t>
+        <w:t>She went. The near-catch sat hotter than the muttered words. She had meant to leave the splinter somewhere safer before night, under a loose tile, behind a water jar, and Phileros’s basket had stolen the minute. In the court she passed Pallas again and neither named Calpurnia’s morning pauses. Naming made pauses into evidence. Medullina, if Nysa saw her in the Subura later, would want a trade. Nysa would give birds and chickens. Not this. The fragment was still only a splinter, mercy or trap depending on which word you stressed, and it hadn’t yet grown legs as street rumour. It had only almost become a door-search. The attendant’s muttered truth stuck beside it: schedules that smelled like knives. Cheer in the atrium; truth in the cloak-space.</w:t>
       </w:r>
     </w:p>
     <w:p>
@@ -4971,7 +4939,7 @@
     <w:p>
       <w:r>
         <w:rPr/>
-        <w:t>If someone had handed him a clean list of knives, he might have read it. Nobody did. Weather does not arrive as a list.</w:t>
+        <w:t>If someone had handed him a clean list of knives, he might have read it. Nobody did.</w:t>
       </w:r>
     </w:p>
     <w:p>
@@ -5097,7 +5065,7 @@
     <w:p>
       <w:r>
         <w:rPr/>
-        <w:t>“Bores,” Trebonius said, “also hold consuls while better men invent their knives.” He sipped nothing from an empty hand and went to practise a longer hold. The spare-Antony mercy now had a body attached: Trebonius’s voice as a leash.</w:t>
+        <w:t>“Bores,” Trebonius said, “also hold consuls while better men invent their knives.” He sipped nothing from an empty hand and went to practise a longer hold.</w:t>
       </w:r>
     </w:p>
     <w:p>
@@ -5376,7 +5344,7 @@
     <w:p>
       <w:r>
         <w:rPr/>
-        <w:t>Not inventory. Choice. The word tasted like metal and unpaid interest.</w:t>
+        <w:t>The word tasted like metal and unpaid interest.</w:t>
       </w:r>
     </w:p>
     <w:p>
@@ -5791,7 +5759,7 @@
     <w:p>
       <w:r>
         <w:rPr/>
-        <w:t>Behind Phileros, Nysa stood with empty hands and a too-straight back, the posture of someone who had almost done something and been stopped. Phileros hissed without looking at her. “Mats. Not mornings.” Nysa did not move. The hiss became a third presence in the vestibule: key-holder, girl, and the fetch who needed the house to pretend this was ordinary.</w:t>
+        <w:t>Behind Phileros, Nysa stood with empty hands and a too-straight back, the posture of someone who had almost done something and been stopped. Phileros hissed without looking at her. “Mats. Not mornings.” Nysa did not move.</w:t>
       </w:r>
     </w:p>
     <w:p>
@@ -7822,37 +7790,7 @@
     <w:p>
       <w:r>
         <w:rPr/>
-        <w:t xml:space="preserve">Cicero heard enough to file </w:t>
-      </w:r>
-      <w:r>
-        <w:rPr>
-          <w:i/>
-        </w:rPr>
-        <w:t>gardens / boy / queen / wound</w:t>
-      </w:r>
-      <w:r>
-        <w:rPr/>
-        <w:t xml:space="preserve"> beside </w:t>
-      </w:r>
-      <w:r>
-        <w:rPr>
-          <w:i/>
-        </w:rPr>
-        <w:t>amnesty</w:t>
-      </w:r>
-      <w:r>
-        <w:rPr/>
-        <w:t xml:space="preserve">, and </w:t>
-      </w:r>
-      <w:r>
-        <w:rPr>
-          <w:i/>
-        </w:rPr>
-        <w:t>Decimus / second line</w:t>
-      </w:r>
-      <w:r>
-        <w:rPr/>
-        <w:t xml:space="preserve"> as a debt the dead man still held on the living. He did not enter the corridor argument. Entering would have made him a stall. He preferred rooms that asked for periods. The praise-smile lasted until the temple steps; then it was only a face arranging itself for Atticus.</w:t>
+        <w:t>Cicero heard enough. He did not enter the corridor argument. Entering would have made him a stall. He preferred rooms that asked for periods. The praise-smile lasted until the temple steps; then it was only a face arranging itself for Atticus.</w:t>
       </w:r>
     </w:p>
     <w:p>
@@ -8488,7 +8426,7 @@
     <w:p>
       <w:r>
         <w:rPr/>
-        <w:t>“I am Helvius,” the man said. “Helvius Cinna. I write poems. I was his friend, I came to mourn him. The other one is Cornelius, the praetor, his dead wife’s brother, who threw off his robe and called him tyrant from the Rostra. I am Helvius, not Cornelius, I am…”</w:t>
+        <w:t>“I am Helvius,” the man said. “Helvius Cinna. I write poems. I was his friend, I came to mourn him. I am Helvius, not Cornelius, I am…”</w:t>
       </w:r>
     </w:p>
     <w:p>
@@ -9143,7 +9081,7 @@
       </w:r>
       <w:r>
         <w:rPr/>
-        <w:t>. Same-room collision beat letter-stack. He could watch which mouth sweat.</w:t>
+        <w:t>. He could watch which mouth sweat.</w:t>
       </w:r>
     </w:p>
     <w:p>
@@ -10010,13 +9948,13 @@
     <w:p>
       <w:r>
         <w:rPr/>
-        <w:t>The whisperer bowed as if receiving a funeral oration. “Of course. Living seals.” His offence waited for the next pillar: “He’ll price a boy’s name and call a murder tablet poetry. Ask him for Basilus and he sells you piety.” Sosia’s mouth twitched, almost audible, then he drank so the twitch would look like thirst.</w:t>
-      </w:r>
-    </w:p>
-    <w:p>
-      <w:r>
-        <w:rPr/>
-        <w:t>The Puteoli man and Sosia argued the next question in the same breath, same stool-space: collision, not correspondence. “Young Caesar” changed land risk, the Puteoli man insisted. Sosia said only veterans changed land risk. A third voice from two stalls down asked whether Servilia’s people were already rewriting clauses in Antium talk, and whether old eagle men would take the boy’s pay or spit it back as wine-shop joke.</w:t>
+        <w:t>The whisperer bowed as if receiving a funeral oration. “Of course. Living seals.” Sosia’s mouth twitched, then he drank so the twitch would look like thirst.</w:t>
+      </w:r>
+    </w:p>
+    <w:p>
+      <w:r>
+        <w:rPr/>
+        <w:t>The Puteoli man and Sosia argued the next question in the same breath. “Young Caesar” changed land risk, the Puteoli man insisted. Sosia said only veterans changed land risk. A third voice from two stalls down asked whether Servilia’s people were already rewriting clauses in Antium talk, and whether old eagle men would take the boy’s pay or spit it back as wine-shop joke.</w:t>
       </w:r>
     </w:p>
     <w:p>
@@ -10888,17 +10826,7 @@
       </w:r>
       <w:r>
         <w:rPr/>
-        <w:t xml:space="preserve"> and not known whether to laugh. “Collecting means cities pay. Cities paying means we eat. Fleeing means we starve and call it philosophy. Tell your senators that when they stamp receipts.” One boy grinned. The other looked at Brutus’s courtesy like a second religion. Cassius heard the mate’s verdict as witness, not mutiny. </w:t>
-      </w:r>
-      <w:r>
-        <w:rPr>
-          <w:i/>
-        </w:rPr>
-        <w:t>Collecting</w:t>
-      </w:r>
-      <w:r>
-        <w:rPr/>
-        <w:t xml:space="preserve"> now had deck mouths attached. Not only a factor’s smile.</w:t>
+        <w:t xml:space="preserve"> and not known whether to laugh. “Collecting means cities pay. Cities paying means we eat. Fleeing means we starve and call it philosophy. Tell your senators that when they stamp receipts.” One boy grinned. The other looked at Brutus’s courtesy like a second religion.</w:t>
       </w:r>
     </w:p>
     <w:p>
@@ -11081,7 +11009,1541 @@
     <w:p>
       <w:r>
         <w:rPr/>
-        <w:t xml:space="preserve">Octavian, still not </w:t>
+        <w:t>Octavian could be a sword pointed at Antony. Swords didn’t need to be loved. They needed to be aimed. He drafted a period about Antony’s appetite and another about the state’s dignity. Then he joined them like carpentry.</w:t>
+      </w:r>
+    </w:p>
+    <w:p>
+      <w:r>
+        <w:rPr/>
+        <w:t>A courier waited with copies for men who would pretend they had not asked for copies. Cicero sealed the packets with a satisfaction that felt like courage and sent them into the city’s hungry mouths.</w:t>
+      </w:r>
+    </w:p>
+    <w:p>
+      <w:r>
+        <w:rPr/>
+        <w:t>One packet came back before dusk.</w:t>
+      </w:r>
+    </w:p>
+    <w:p>
+      <w:r>
+        <w:rPr/>
+        <w:t>The seal was broken. The wax had been thumb-smeared and pressed again badly: an insult, not a forgery. Across the top margin someone had scored a short line with a knife-point, deep enough to scar the wood beneath. No sentence. Only the mark. A smear of something that might have been wine or might have been worse.</w:t>
+      </w:r>
+    </w:p>
+    <w:p>
+      <w:r>
+        <w:rPr/>
+        <w:t>The friend, still in the atrium, went pale. “That is not literary criticism.”</w:t>
+      </w:r>
+    </w:p>
+    <w:p>
+      <w:r>
+        <w:rPr/>
+        <w:t>Cicero held the scarred tablet until his fingers stopped pretending to be steady. He thought of Atticus, of audiences, of the Capitol’s first day enlarged by memory. Then he ordered fresh copies. “Circulate it wider,” he said. “If they can mark one, let them learn there are many.”</w:t>
+      </w:r>
+    </w:p>
+    <w:p>
+      <w:r>
+        <w:rPr/>
+        <w:t>He slept poorly and woke eager. Eager men wrote faster than wise ones. He noticed the difference and wrote anyway.</w:t>
+      </w:r>
+    </w:p>
+    <w:p>
+      <w:pPr>
+        <w:spacing w:before="280"/>
+      </w:pPr>
+      <w:r>
+        <w:rPr/>
+        <w:t>Chapter 26</w:t>
+      </w:r>
+    </w:p>
+    <w:p>
+      <w:r>
+        <w:rPr/>
+        <w:t>Provinces and Shadows</w:t>
+      </w:r>
+    </w:p>
+    <w:p>
+      <w:pPr>
+        <w:spacing w:before="200"/>
+      </w:pPr>
+      <w:r>
+        <w:rPr/>
+        <w:t>A Hundred Apiece</w:t>
+      </w:r>
+    </w:p>
+    <w:p>
+      <w:r>
+        <w:rPr/>
+        <w:t>The legions came off the ships from Macedonia looking for a consul, and Antony gave them one.</w:t>
+      </w:r>
+    </w:p>
+    <w:p>
+      <w:r>
+        <w:rPr/>
+        <w:t>He stood on a platform of planks on the harbour ground at Brundisium with the sea behind him and four legions in front, the Martian, the Fourth, the Second, the Thirty-fifth, and the old excitement went up through his legs the way it always did before a crowd of soldiers. These were Caesar’s men, raised for Parthia, the best-drilled legions in the world. He had drunk with half their centurions in Gaul. He knew how to stand in front of them. Shoulders loose, voice from the belly. Give them a joke first.</w:t>
+      </w:r>
+    </w:p>
+    <w:p>
+      <w:r>
+        <w:rPr/>
+        <w:t>He gave them the joke. A few laughed. Then he gave them the money.</w:t>
+      </w:r>
+    </w:p>
+    <w:p>
+      <w:r>
+        <w:rPr/>
+        <w:t>“A hundred denarii a man,” he said, “as a gift from your consul, on the day you land.”</w:t>
+      </w:r>
+    </w:p>
+    <w:p>
+      <w:r>
+        <w:rPr/>
+        <w:t>He heard the laugh begin at the back. It was not the laugh he had asked for. It went forward through the ranks the way fire goes along a dry hedge, and the front ranks did not stop it. Somebody near the Martian eagle called out a number. Antony did not hear the number. He heard the shape of it, and that it was larger than his.</w:t>
+      </w:r>
+    </w:p>
+    <w:p>
+      <w:r>
+        <w:rPr/>
+        <w:t>He knew then that the boy’s men had been in the camp before him. He had seen the leaflets on the quay that morning, scraps of papyrus trodden into the wet, and had stepped on them.</w:t>
+      </w:r>
+    </w:p>
+    <w:p>
+      <w:r>
+        <w:rPr/>
+        <w:t>“Who said that?” he said.</w:t>
+      </w:r>
+    </w:p>
+    <w:p>
+      <w:r>
+        <w:rPr/>
+        <w:t>Nobody said who.</w:t>
+      </w:r>
+    </w:p>
+    <w:p>
+      <w:r>
+        <w:rPr/>
+        <w:t>“Tribunes,” Antony said, not loud now, and the tribunes came to the foot of the planks. “I want the names of the men who were talking in your camps before I landed. The ones with money in their mouths. You know them. Bring me the lists.”</w:t>
+      </w:r>
+    </w:p>
+    <w:p>
+      <w:r>
+        <w:rPr/>
+        <w:t>By evening there were lists. He did not read them. He had the names of the centurions on them written on sherds and put into a helmet, because a consul could not kill four legions and could not let one laugh go unpaid either. In his host’s house, in the colonnade off the courtyard, the men whose sherds came out of the helmet were brought in one at a time.</w:t>
+      </w:r>
+    </w:p>
+    <w:p>
+      <w:r>
+        <w:rPr/>
+        <w:t>Fulvia sat beside him. She had asked to. He had not refused her; he did not refuse her much, and tonight he wanted someone in the colonnade who would not look away first. The soldiers doing the work did it quickly, because he had told them quickly. The sound was not loud. A grunt, a scuff on the paving, a weight going down. The second time it was the same. After that he stopped hearing the differences between them.</w:t>
+      </w:r>
+    </w:p>
+    <w:p>
+      <w:r>
+        <w:rPr/>
+        <w:t>At some point he looked at his wife. There was a fleck of red high on her cheekbone, under the eye. She had not moved her head and she did not move it now. She did not wipe it away while the next man was brought in, or the one after.</w:t>
+      </w:r>
+    </w:p>
+    <w:p>
+      <w:r>
+        <w:rPr/>
+        <w:t>When it was over the courtyard smelled of the sea and of the other thing. A slave brought a basin. Fulvia dipped two fingers and touched them to her cheek, without hurry, and looked at the water afterward.</w:t>
+      </w:r>
+    </w:p>
+    <w:p>
+      <w:r>
+        <w:rPr/>
+        <w:t>“Tomorrow they will take your hundred,” she said, “and not laugh.”</w:t>
+      </w:r>
+    </w:p>
+    <w:p>
+      <w:r>
+        <w:rPr/>
+        <w:t>“That’s what I want.”</w:t>
+      </w:r>
+    </w:p>
+    <w:p>
+      <w:r>
+        <w:rPr/>
+        <w:t>“Is it?” She dried her fingers on the slave’s cloth. “A man who laughs at your money still thinks you have money. A man who takes it in silence is counting the other offer. The boy said five hundred. They know the sum. Now they also know you kill for less.”</w:t>
+      </w:r>
+    </w:p>
+    <w:p>
+      <w:r>
+        <w:rPr/>
+        <w:t>Antony drank. The wine did nothing he asked of it. “The boy has some farms,” he said, “and the loan of Matius’s strongbox. I have four legions.”</w:t>
+      </w:r>
+    </w:p>
+    <w:p>
+      <w:r>
+        <w:rPr/>
+        <w:t>“You have four legions on a beach,” Fulvia said. “March them to Rome before they finish counting.”</w:t>
+      </w:r>
+    </w:p>
+    <w:p>
+      <w:r>
+        <w:rPr/>
+        <w:t>In the morning the ranks filed past the pay-tables and took the hundred apiece. They took it without a word. Antony stood on the planks and watched them do it and could not find the joke for it. Along the quay the boy’s leaflets lay where they had lain the day before, wet through. No one had picked them up. No one had needed to. A tribune of the Martians came to report the camp quiet and stayed a breath too long, looking at the colonnade.</w:t>
+      </w:r>
+    </w:p>
+    <w:p>
+      <w:r>
+        <w:rPr/>
+        <w:t>“They’re saying a name in the Fourth,” he said. “Not yours, consul.”</w:t>
+      </w:r>
+    </w:p>
+    <w:p>
+      <w:r>
+        <w:rPr/>
+        <w:t>“Let them say it on the march,” Antony said. “Marching is a cure for most opinions.”</w:t>
+      </w:r>
+    </w:p>
+    <w:p>
+      <w:pPr>
+        <w:spacing w:before="200"/>
+      </w:pPr>
+      <w:r>
+        <w:rPr/>
+        <w:t>Five Hundred</w:t>
+      </w:r>
+    </w:p>
+    <w:p>
+      <w:r>
+        <w:rPr/>
+        <w:t>The boy came to Casilinum himself, which nobody had expected.</w:t>
+      </w:r>
+    </w:p>
+    <w:p>
+      <w:r>
+        <w:rPr/>
+        <w:t>Laberius had walked over from the colony because Vibius said there would be money and Vibius was usually right about money and wrong about everything else. The square by the Volturnus bridge was full of men who had been told the same thing. Some had come on mules. One had come on a crutch. The boy stood on the steps of a temple with a cloak too warm for the day, thinner than his name, with a big young man at his shoulder who did the looking for both of them.</w:t>
+      </w:r>
+    </w:p>
+    <w:p>
+      <w:r>
+        <w:rPr/>
+        <w:t xml:space="preserve">He made a short speech. It was a bad speech. He said </w:t>
+      </w:r>
+      <w:r>
+        <w:rPr>
+          <w:i/>
+        </w:rPr>
+        <w:t>my father</w:t>
+      </w:r>
+      <w:r>
+        <w:rPr/>
+        <w:t xml:space="preserve"> four times, and </w:t>
+      </w:r>
+      <w:r>
+        <w:rPr>
+          <w:i/>
+        </w:rPr>
+        <w:t>what is owed</w:t>
+      </w:r>
+      <w:r>
+        <w:rPr/>
+        <w:t xml:space="preserve"> twice, and he did not tell a single joke. The men listened the way men listen to a paymaster, which is to say for the number.</w:t>
+      </w:r>
+    </w:p>
+    <w:p>
+      <w:r>
+        <w:rPr/>
+        <w:t>“Five hundred denarii,” the boy said. “To every man who enrols. Now, at the tables. More when the work is done.”</w:t>
+      </w:r>
+    </w:p>
+    <w:p>
+      <w:r>
+        <w:rPr/>
+        <w:t>Nobody laughed. A noise went round the square that Laberius had heard twice in his life, both times on the morning of a donative, and the man on the crutch said “Five hundred” to himself as if the words had a taste.</w:t>
+      </w:r>
+    </w:p>
+    <w:p>
+      <w:r>
+        <w:rPr/>
+        <w:t xml:space="preserve">The scar-lipped veteran from the colony forum in the spring was standing three men along. He caught Laberius’s eye and lifted his chin. </w:t>
+      </w:r>
+      <w:r>
+        <w:rPr>
+          <w:i/>
+        </w:rPr>
+        <w:t>The shadow learned.</w:t>
+      </w:r>
+      <w:r>
+        <w:rPr/>
+        <w:t xml:space="preserve"> He did not need to say it.</w:t>
+      </w:r>
+    </w:p>
+    <w:p>
+      <w:r>
+        <w:rPr/>
+        <w:t>“Five hundred’s a number,” Laberius said to Vibius. “Brundisium will have heard it. Antony will say six.”</w:t>
+      </w:r>
+    </w:p>
+    <w:p>
+      <w:r>
+        <w:rPr/>
+        <w:t>“Antony said one,” Vibius said. “Ask the sailors.”</w:t>
+      </w:r>
+    </w:p>
+    <w:p>
+      <w:r>
+        <w:rPr/>
+        <w:t>There were three pay-tables under an awning by the bridge, and a clerk at each with the colony rolls open in front of him, the surveyor’s rolls, the ones with the plots marked in a neat hand. Laberius had not seen those rolls since a surveyor had read his name from one at Munda’s end and tied his twine. He had thought they lived in a cupboard in Rome where the dead man’s clerks kept them.</w:t>
+      </w:r>
+    </w:p>
+    <w:p>
+      <w:r>
+        <w:rPr/>
+        <w:t>The clerk at the middle table was a freedman with ink on his thumb and a cough. “Name.”</w:t>
+      </w:r>
+    </w:p>
+    <w:p>
+      <w:r>
+        <w:rPr/>
+        <w:t>“Sextus Laberius Cordus. Spain. Munda.”</w:t>
+      </w:r>
+    </w:p>
+    <w:p>
+      <w:r>
+        <w:rPr/>
+        <w:t>The clerk ran his thumb down a column, turned a leaf, ran it down again. “Laberius. Colony plot by Capua, fourth line from the Volturnus road, marked after Munda.” He looked up. “Twine, it says. Not stones yet.”</w:t>
+      </w:r>
+    </w:p>
+    <w:p>
+      <w:r>
+        <w:rPr/>
+        <w:t>“Twine,” Laberius said. “Still.”</w:t>
+      </w:r>
+    </w:p>
+    <w:p>
+      <w:r>
+        <w:rPr/>
+        <w:t>“The stones are a matter for after,” the clerk said, not unkindly. He had said it before that morning, many times. “The coin is now.” He wrote the day on a tablet, the fifth before the Ides of October, and Laberius’s name beside it, and pushed the tablet across for his mark.</w:t>
+      </w:r>
+    </w:p>
+    <w:p>
+      <w:r>
+        <w:rPr/>
+        <w:t>Laberius looked at the date. He looked at the column where his name sat in someone else’s neat hand, his row of twine, the road, Munda. The boy had not bought his land; the clerk had said as much. But the boy’s people had gone into the dead man’s cupboards and come out with the rolls, and carried them down the Appian Way to a bridge on the Volturnus, so that a clerk with a cough could find a man’s twine with his thumb. Antony’s man in the spring had offered wine and a road. This one knew where the dirt was.</w:t>
+      </w:r>
+    </w:p>
+    <w:p>
+      <w:r>
+        <w:rPr/>
+        <w:t>He made his mark.</w:t>
+      </w:r>
+    </w:p>
+    <w:p>
+      <w:r>
+        <w:rPr/>
+        <w:t>The bag the clerk counted out to him weighed about what a full water-skin weighed on the march. He felt it pull on his belt. Vibius, at the next table, was laughing for no reason with a bag in each hand, one of them borrowed off a man who had not enrolled.</w:t>
+      </w:r>
+    </w:p>
+    <w:p>
+      <w:r>
+        <w:rPr/>
+        <w:t>On the walk back over the bridge the scar-lipped veteran fell in beside him.</w:t>
+      </w:r>
+    </w:p>
+    <w:p>
+      <w:r>
+        <w:rPr/>
+        <w:t>“Feeds us now, the shadow,” the veteran said.</w:t>
+      </w:r>
+    </w:p>
+    <w:p>
+      <w:r>
+        <w:rPr/>
+        <w:t>“Pays us,” Laberius said. “It isn’t the same.”</w:t>
+      </w:r>
+    </w:p>
+    <w:p>
+      <w:r>
+        <w:rPr/>
+        <w:t>“Tastes the same.”</w:t>
+      </w:r>
+    </w:p>
+    <w:p>
+      <w:r>
+        <w:rPr/>
+        <w:t>“Ask me when he wants something for it,” Laberius said. The twine near Capua had not moved, and would not move tonight, and he knew it. He held the bag against his hip with one hand all the way home anyway.</w:t>
+      </w:r>
+    </w:p>
+    <w:p>
+      <w:pPr>
+        <w:spacing w:before="200"/>
+      </w:pPr>
+      <w:r>
+        <w:rPr/>
+        <w:t>The Statue</w:t>
+      </w:r>
+    </w:p>
+    <w:p>
+      <w:r>
+        <w:rPr/>
+        <w:t>He came into Rome with three thousand men and found the Forum smaller than he remembered.</w:t>
+      </w:r>
+    </w:p>
+    <w:p>
+      <w:r>
+        <w:rPr/>
+        <w:t>They held the Temple of Castor and its steps, which was the nearest thing in the Forum to a fort, and the men who had taken his five hundred stood about on the steps and in the street below with their swords on, looking at the city as if it might owe them something too. Octavian had written to Cicero every day for a week: come to Rome, stand beside me, the Senate listens to you. Cicero had written back from the coast with advice and without himself. Today he was still on the coast.</w:t>
+      </w:r>
+    </w:p>
+    <w:p>
+      <w:r>
+        <w:rPr/>
+        <w:t>The tribune Cannutius spoke first. He spoke against Antony well and at length, because he had nothing to lose by it and enjoyed the sound. Then he called Gaius Caesar to the front of the steps.</w:t>
+      </w:r>
+    </w:p>
+    <w:p>
+      <w:r>
+        <w:rPr/>
+        <w:t>Octavian had written the speech three times. He gave it the fourth way, shorter. He spoke of his father’s murder and his father’s friends, of the money Antony would not give the people and he had given them himself, of the consul who had killed Caesar’s centurions at Brundisium for laughing. Below him the veterans listened in a way he could not read. They had listened at Casilinum for the number. He did not know what they were listening for now.</w:t>
+      </w:r>
+    </w:p>
+    <w:p>
+      <w:r>
+        <w:rPr/>
+        <w:t>At the end, as he had planned, he turned to the bronze statue of Caesar that stood by the temple and lifted his right hand to it.</w:t>
+      </w:r>
+    </w:p>
+    <w:p>
+      <w:r>
+        <w:rPr/>
+        <w:t>“As I hope to attain my father’s honours,” he said, “I swear…”</w:t>
+      </w:r>
+    </w:p>
+    <w:p>
+      <w:r>
+        <w:rPr/>
+        <w:t>He heard the noise change before he finished. It came from the veterans, and it was not a cheer.</w:t>
+      </w:r>
+    </w:p>
+    <w:p>
+      <w:r>
+        <w:rPr/>
+        <w:t>“We came to guard you,” a man called from the street. Octavian knew the face a moment later: a scar through the lip, one of the Casilinum men. “From him. Not to kill him. He was Caesar’s too.”</w:t>
+      </w:r>
+    </w:p>
+    <w:p>
+      <w:r>
+        <w:rPr/>
+        <w:t xml:space="preserve">Others took it up. </w:t>
+      </w:r>
+      <w:r>
+        <w:rPr>
+          <w:i/>
+        </w:rPr>
+        <w:t>Caesar’s too.</w:t>
+      </w:r>
+      <w:r>
+        <w:rPr/>
+        <w:t xml:space="preserve"> </w:t>
+      </w:r>
+      <w:r>
+        <w:rPr>
+          <w:i/>
+        </w:rPr>
+        <w:t>We didn’t enrol to fight the consul.</w:t>
+      </w:r>
+      <w:r>
+        <w:rPr/>
+        <w:t xml:space="preserve"> A man near the steps took off his helmet and held it under his arm like a man leaving a dinner.</w:t>
+      </w:r>
+    </w:p>
+    <w:p>
+      <w:r>
+        <w:rPr/>
+        <w:t>Octavian finished the oath, because there was nothing to be done with half an oath. Then he stood and watched his army decide.</w:t>
+      </w:r>
+    </w:p>
+    <w:p>
+      <w:r>
+        <w:rPr/>
+        <w:t>By dark a third of them had gone. By the next morning it was more. They went in twos and threes, in the direction of their colonies, some of them still with his five hundred in their belts. He let them go. He could not have stopped them without asking the rest to stop them, and he did not know what the rest would do.</w:t>
+      </w:r>
+    </w:p>
+    <w:p>
+      <w:r>
+        <w:rPr/>
+        <w:t>A veteran by the temple steps did not go. He was an ordinary man, broad, quiet, with Campanian dust still on his boots, and he stood with his back to a column and counted the men who were leaving as they went past him, his lips moving. When he caught Octavian looking at him he stopped counting and did not explain.</w:t>
+      </w:r>
+    </w:p>
+    <w:p>
+      <w:r>
+        <w:rPr/>
+        <w:t>“Antony will be in the city in a fortnight,” Agrippa said that night. “With four legions.”</w:t>
+      </w:r>
+    </w:p>
+    <w:p>
+      <w:r>
+        <w:rPr/>
+        <w:t>“Then we will not be in it,” Octavian said.</w:t>
+      </w:r>
+    </w:p>
+    <w:p>
+      <w:r>
+        <w:rPr/>
+        <w:t>They went north into Etruria, to Arretium, where Maecenas’s family had money and houses and the winter came early. Octavian drilled what he had left on frozen ground and wrote to Cicero again, more carefully. He did not mention the oath, or the helmet. He had learned at the Temple of Castor that veterans would take his money to stand near Antony and would not take it to kill him. He did not yet know what he had that would change their minds.</w:t>
+      </w:r>
+    </w:p>
+    <w:p>
+      <w:r>
+        <w:rPr/>
+        <w:t>Toward the end of the month a rider came up the road from the south, one of Agrippa’s, with frost in his beard.</w:t>
+      </w:r>
+    </w:p>
+    <w:p>
+      <w:r>
+        <w:rPr/>
+        <w:t>“Alba Fucens,” he said. “The Martian legion. They shut the gates on Antony and shot at him from the walls. They’ve declared for you.”</w:t>
+      </w:r>
+    </w:p>
+    <w:p>
+      <w:r>
+        <w:rPr/>
+        <w:t>Octavian put the tablet down.</w:t>
+      </w:r>
+    </w:p>
+    <w:p>
+      <w:r>
+        <w:rPr/>
+        <w:t>“And the Fourth,” the rider said. “Two days after. Antony came to the walls with money in his hand and talked about Brundisium as if they’d forgotten it. They hadn’t.”</w:t>
+      </w:r>
+    </w:p>
+    <w:p>
+      <w:r>
+        <w:rPr/>
+        <w:t>Agrippa let out a breath that was almost a laugh. Octavian did not laugh. He sat down at the table, because his knees wanted him to, and kept his hands flat on it until they were still.</w:t>
+      </w:r>
+    </w:p>
+    <w:p>
+      <w:r>
+        <w:rPr/>
+        <w:t>“Pay them,” he said. “What I promised. Then the same again.”</w:t>
+      </w:r>
+    </w:p>
+    <w:p>
+      <w:r>
+        <w:rPr/>
+        <w:t>“With what?” Agrippa said.</w:t>
+      </w:r>
+    </w:p>
+    <w:p>
+      <w:r>
+        <w:rPr/>
+        <w:t>Octavian did not answer that. He took a clean tablet and began a letter to Cicero, the shortest he had written him. This time he knew he would have an answer.</w:t>
+      </w:r>
+    </w:p>
+    <w:p>
+      <w:pPr>
+        <w:spacing w:before="200"/>
+      </w:pPr>
+      <w:r>
+        <w:rPr/>
+        <w:t>Cisalpine</w:t>
+      </w:r>
+    </w:p>
+    <w:p>
+      <w:r>
+        <w:rPr/>
+        <w:t>Decimus read Antony’s pressure in dispatches before he heard it in hoofbeats.</w:t>
+      </w:r>
+    </w:p>
+    <w:p>
+      <w:r>
+        <w:rPr/>
+        <w:t>The tablets arrived with seals that looked like courtesy and read like a hand on a throat. One letter offered friendship in the same sentence as a deadline. Decimus set that letter under a stone so it couldn’t blow into the yard and become gossip.</w:t>
+      </w:r>
+    </w:p>
+    <w:p>
+      <w:r>
+        <w:rPr/>
+        <w:t>At mid-morning an envoy came anyway, cloak clean, smile practised, the sort of man who carried other men’s threats as if they were invitations to dinner. He stood in the command room where the wall map of the Via Aemilia still showed Decimus’s pins as facts. An aide hovered with a wax roll. A levy clerk waited at the door with pay marks still wet. The room wanted to be polite. It was already a siege rehearsal.</w:t>
+      </w:r>
+    </w:p>
+    <w:p>
+      <w:r>
+        <w:rPr/>
+        <w:t>“The consul asks only what the law already leans toward,” the envoy said. “Hand him Cisalpine in good order. Keep your honour. Keep your skin. Rome will find you another usefulness.”</w:t>
+      </w:r>
+    </w:p>
+    <w:p>
+      <w:r>
+        <w:rPr/>
+        <w:t>“Rome found me this one,” Decimus said. He didn’t offer a chair. Chairs made threats look like visits.</w:t>
+      </w:r>
+    </w:p>
+    <w:p>
+      <w:r>
+        <w:rPr/>
+        <w:t>“He will call it a swap,” the envoy went on, mild. “You will call it wisdom. The Senate will call it clarification, when clarification arrives.”</w:t>
+      </w:r>
+    </w:p>
+    <w:p>
+      <w:r>
+        <w:rPr/>
+        <w:t>Decimus knew the swap because it had been done to him while he was on the road, by an assembly full of Antony’s veterans. The Senate had never voted it back.</w:t>
+      </w:r>
+    </w:p>
+    <w:p>
+      <w:r>
+        <w:rPr/>
+        <w:t xml:space="preserve">Decimus heard the gap in that sentence: </w:t>
+      </w:r>
+      <w:r>
+        <w:rPr>
+          <w:i/>
+        </w:rPr>
+        <w:t>when</w:t>
+      </w:r>
+      <w:r>
+        <w:rPr/>
+        <w:t>. Clarification that might never leave the stable. “Tell him I call it mine until the Senate says otherwise, or until he brings enough men to rename facts. He can call the renaming breakfast if he likes.”</w:t>
+      </w:r>
+    </w:p>
+    <w:p>
+      <w:r>
+        <w:rPr/>
+        <w:t>The envoy’s eyes flicked once to the levy roll on the table: names, marks for pay, a smudge where someone’s thumb had been nervous. “Your men still love Caesar’s pay more than your legality. My principal has a longer memory for that love than you do.”</w:t>
+      </w:r>
+    </w:p>
+    <w:p>
+      <w:r>
+        <w:rPr/>
+        <w:t>That was the first true thing said. Decimus felt it land under the sternum where the Ides still sat like a key he couldn’t return. “Get out,” he said. “If you return with an army, return with an army. Do not return with grammar.”</w:t>
+      </w:r>
+    </w:p>
+    <w:p>
+      <w:r>
+        <w:rPr/>
+        <w:t>The envoy paused at the threshold long enough for the room to hear the complaint under the courtesy: “He will remember the refusal more than the wit.” Then he left.</w:t>
+      </w:r>
+    </w:p>
+    <w:p>
+      <w:r>
+        <w:rPr/>
+        <w:t>After the man was gone, Decimus walked the gates. Hinges took oil.</w:t>
+      </w:r>
+    </w:p>
+    <w:p>
+      <w:r>
+        <w:rPr/>
+        <w:t>In the yard he found the levy spokesman, an older miles with a Caesarian scar and a mouth that had learned to ask for bread without kneeling. “We heard the cloak,” the man said. “If Antony comes, do we fight men who still drink to the name we buried with?”</w:t>
+      </w:r>
+    </w:p>
+    <w:p>
+      <w:r>
+        <w:rPr/>
+        <w:t>“You fight the men who try to take the road,” Decimus said.</w:t>
+      </w:r>
+    </w:p>
+    <w:p>
+      <w:r>
+        <w:rPr/>
+        <w:t>“And pay?”</w:t>
+      </w:r>
+    </w:p>
+    <w:p>
+      <w:r>
+        <w:rPr/>
+        <w:t>Decimus looked at the chest. Coin still rattled when the lid shifted, but shallowly, honest about the bottom. He ordered a partial donative for the gate cohorts, coin he’d meant to hold for spring, and watched the spokesman’s shoulders drop half an inch.</w:t>
+      </w:r>
+    </w:p>
+    <w:p>
+      <w:r>
+        <w:rPr/>
+        <w:t>The spokesman weighed the purse with his eyes, not his hands. “Partial,” he said. “That’s a word that tastes like next week’s apology.”</w:t>
+      </w:r>
+    </w:p>
+    <w:p>
+      <w:r>
+        <w:rPr/>
+        <w:t>Decimus almost grinned, the old cheer that had opened mornings, and stopped it before it became a performance. “Then taste it and still hold the hinge. Next week’s apology is still coin I have to find.” The spokesman barked once, short, surprised, and the yard heard it as weather, not mutiny. Decimus scheduled the rest of the pay talk for morning.</w:t>
+      </w:r>
+    </w:p>
+    <w:p>
+      <w:r>
+        <w:rPr/>
+        <w:t>He wrote to Cicero with the stiff pride of a man who still believed praise from Rome was supply, and knew privately that praise was thinner than grain. The same week he wrote Plancus again, shorter, less perfume, asking for two cohorts’ worth of grain and a date, any date, for a meeting on the road.</w:t>
+      </w:r>
+    </w:p>
+    <w:p>
+      <w:r>
+        <w:rPr/>
+        <w:t xml:space="preserve">The answer did not arrive alone. A courier who had eaten at Plancus’s table stood in the yard with mud on one boot and perfume still clinging to the other, Plancus’s weather made flesh. “He admires your hinges,” the man said, practising the pretty line. “He understands Antony’s appetite. His own theatre is unsettled. Grain and cohorts cannot be spared.” Decimus waited for a date. The courier’s eyes found the gate-hinge instead. “He told me to say </w:t>
+      </w:r>
+      <w:r>
+        <w:rPr>
+          <w:i/>
+        </w:rPr>
+        <w:t>yet</w:t>
+      </w:r>
+      <w:r>
+        <w:rPr/>
+        <w:t xml:space="preserve">, if you pressed. </w:t>
+      </w:r>
+      <w:r>
+        <w:rPr>
+          <w:i/>
+        </w:rPr>
+        <w:t>Yet</w:t>
+      </w:r>
+      <w:r>
+        <w:rPr/>
+        <w:t xml:space="preserve"> is not a day on a road.” Decimus dismissed the man before admiration could invent another perfume. The Lepidus channel he had seeded on the road north, a roof near Mutina’s approaches, a messenger who would not meet his eyes, still returned nothing. He did not send a second tablet to ask why.</w:t>
+      </w:r>
+    </w:p>
+    <w:p>
+      <w:r>
+        <w:rPr/>
+        <w:t>The aide asked anyway, one finger holding open the empty slot in the letter-case. “Lepidus has more legions over the mountains than Plancus has. One word from him and Antony has friends at his back as well as a wall in front.”</w:t>
+      </w:r>
+    </w:p>
+    <w:p>
+      <w:r>
+        <w:rPr/>
+        <w:t>“One word from Lepidus goes to whoever is standing nearest when he has to say it,” Decimus said. “Pray it’s us.” He did not pray. He sent the aide to count the grain.</w:t>
+      </w:r>
+    </w:p>
+    <w:p>
+      <w:r>
+        <w:rPr/>
+        <w:t>A southern courier arrived near dusk with dust on his cloak and a packet that smelled of harbour pitch. The queen was home in Alexandria, boy and all, months gone from Caesar’s gardens, and her people were calling it continuity to anyone who asked, not flight. The courier said it like marketplace weather. Decimus did not chase the rumour across the sea. He had hinges. He had Antony’s hunger. He set the packet under the stone with Antony’s courtesy-threats. What the queen meant to do with Egypt was Egypt’s business until it had ships in his harbour.</w:t>
+      </w:r>
+    </w:p>
+    <w:p>
+      <w:r>
+        <w:rPr/>
+        <w:t>Cicero’s latest letter, opened on the same stone, carried a margin note in Cicero’s own hand, unease, not fact. Sextus still held, or seemed to hold, the western sea’s knife; do not invent a Republic that ignores fleets. A second report under the note claimed Sextus finished. Cicero had kept both coals. Decimus kept the contradiction as one more unfinished edge on a board already loud with Antony. He almost smiled at philosophers discovering docks. The smile died when he remembered his own thinning chest.</w:t>
+      </w:r>
+    </w:p>
+    <w:p>
+      <w:r>
+        <w:rPr/>
+        <w:t>A different courier asked whether to answer Antony’s latest written “request” with softness. Decimus chose a sentence that sounded like law and felt like a door barred from inside.</w:t>
+      </w:r>
+    </w:p>
+    <w:p>
+      <w:r>
+        <w:rPr/>
+        <w:t>The sentence did not need an answer. A rider came up the Via Aemilia from Ariminum with his horse lathered to the girth: Antony had left Rome with what the boy had left him of the Macedonian legions and was on the road north. Not hurrying. That was worse.</w:t>
+      </w:r>
+    </w:p>
+    <w:p>
+      <w:r>
+        <w:rPr/>
+        <w:t>Decimus did not wait to be caught on the open plain. He took his legions into Mutina, because Mutina had walls, a granary, and the road running past its gate. In the yard, while carts were loading, the levy spokesman asked what came next.</w:t>
+      </w:r>
+    </w:p>
+    <w:p>
+      <w:r>
+        <w:rPr/>
+        <w:t>“He comes up the road,” Decimus said. “He can’t march on into Gaul with a town full of legions at his back, so he stops. He digs ditches round us and waits for us to eat the last ox. We wait for an army from Rome to come and break his ring. Whoever’s count runs out first loses.”</w:t>
+      </w:r>
+    </w:p>
+    <w:p>
+      <w:r>
+        <w:rPr/>
+        <w:t>“Which army?” the spokesman said. “Rome’s busy writing.”</w:t>
+      </w:r>
+    </w:p>
+    <w:p>
+      <w:r>
+        <w:rPr/>
+        <w:t>“Next year’s,” Decimus said. “On the Kalends the consulship leaves Antony’s hands. Caesar named the next two before he died. Aulus Hirtius, who writes better than he rides and has been sick since spring. Gaius Vibius Pansa, who governed provinces for Caesar and can get farm boys into armour faster than most men get senators into a vote. Letters can’t raise legions. Consuls can, and lead them. Those two are the only swords the Senate owns.”</w:t>
+      </w:r>
+    </w:p>
+    <w:p>
+      <w:r>
+        <w:rPr/>
+        <w:t>“Hirtius and Pansa.” The spokesman worked it through aloud. “Caesar’s men. Coming to get Caesar’s…” He stopped. “Coming to get you out.”</w:t>
+      </w:r>
+    </w:p>
+    <w:p>
+      <w:r>
+        <w:rPr/>
+        <w:t>“Yes.” Decimus did not help him finish the first sentence. It would only be funny if they arrived.</w:t>
+      </w:r>
+    </w:p>
+    <w:p>
+      <w:r>
+        <w:rPr/>
+        <w:t xml:space="preserve">Inside Mutina he had the draught oxen killed and salted in the granary yard, every beast that could pull a cart, because a shut town had no use for carts and a great deal of use for meat. The butchers worked on past dark by torchlight. Brine and blood ran together in the gutter. The spokesman watched with his arms folded and did not say </w:t>
+      </w:r>
+      <w:r>
+        <w:rPr>
+          <w:i/>
+        </w:rPr>
+        <w:t>partial</w:t>
+      </w:r>
+      <w:r>
+        <w:rPr/>
+        <w:t>.</w:t>
+      </w:r>
+    </w:p>
+    <w:p>
+      <w:r>
+        <w:rPr/>
+        <w:t>Later he walked Mutina’s wall-walk and tasted snow early. The key in his chest cut both ways. It had opened Caesar’s morning. It might yet open his own throat. He checked a hinge twice and didn’t tell the sentry why.</w:t>
+      </w:r>
+    </w:p>
+    <w:p>
+      <w:pPr>
+        <w:spacing w:before="280"/>
+      </w:pPr>
+      <w:r>
+        <w:rPr/>
+        <w:t>Chapter 27</w:t>
+      </w:r>
+    </w:p>
+    <w:p>
+      <w:r>
+        <w:rPr/>
+        <w:t>Mutina Begins</w:t>
+      </w:r>
+    </w:p>
+    <w:p>
+      <w:pPr>
+        <w:spacing w:before="200"/>
+      </w:pPr>
+      <w:r>
+        <w:rPr/>
+        <w:t>Walls</w:t>
+      </w:r>
+    </w:p>
+    <w:p>
+      <w:pPr>
+        <w:spacing w:before="200"/>
+      </w:pPr>
+      <w:r>
+        <w:rPr/>
+        <w:t>Between the lines</w:t>
+      </w:r>
+    </w:p>
+    <w:p>
+      <w:r>
+        <w:rPr/>
+        <w:t>They met where the ditch stank of melt and horse and the kind of truce that lasted only as long as both sides wanted a witness.</w:t>
+      </w:r>
+    </w:p>
+    <w:p>
+      <w:r>
+        <w:rPr/>
+        <w:t>Snow threatened without committing. A herald’s voice cracked on a title. Someone on Antony’s side laughed and was glared quiet. Pacuvius waited two spear-lengths back with the patience of a man who preferred storm to grammar. On Decimus’s side an aide held a tablet of Antony’s demands that had already been refused twice in writing.</w:t>
+      </w:r>
+    </w:p>
+    <w:p>
+      <w:r>
+        <w:rPr/>
+        <w:t xml:space="preserve">Antony came on foot the last stretch, body first, cloak open enough to show he was not hiding a sword he intended to use </w:t>
+      </w:r>
+      <w:r>
+        <w:rPr>
+          <w:i/>
+        </w:rPr>
+        <w:t>yet</w:t>
+      </w:r>
+      <w:r>
+        <w:rPr/>
+        <w:t>. Decimus came with clean hands and dirty boots, the old habit of looking like the honest party. Cheer might still open a morning. It might not.</w:t>
+      </w:r>
+    </w:p>
+    <w:p>
+      <w:r>
+        <w:rPr/>
+        <w:t>“Last talk,” Antony said, not loud. Loud was for walls. “Yield Mutina. Keep your skin. I take the province the consul needs. You take a road south that isn’t a grave.”</w:t>
+      </w:r>
+    </w:p>
+    <w:p>
+      <w:r>
+        <w:rPr/>
+        <w:t>“I hold a legal command,” Decimus said. “The Senate…”</w:t>
+      </w:r>
+    </w:p>
+    <w:p>
+      <w:r>
+        <w:rPr/>
+        <w:t>“The Senate writes music,” Antony said. “I write pay. Your grain weeks are shorter than your letters to Cicero admit. I have counted your smoke. Cooking smoke, not forge smoke. You are eating carefully. Careful men surrender while they can still walk.”</w:t>
+      </w:r>
+    </w:p>
+    <w:p>
+      <w:r>
+        <w:rPr/>
+        <w:t>Decimus felt the hit. He had not known Antony’s count was that close. He kept his face officer-flat. “Hirtius will come.”</w:t>
+      </w:r>
+    </w:p>
+    <w:p>
+      <w:r>
+        <w:rPr/>
+        <w:t>“Hirtius will come when he can sit a horse,” Antony said. “Pansa will come when he has taught enough farm boys which end of a pilum goes forward. Neither of them is consul until the Kalends, and neither of them is here. Until then you have hinges and hope, and hope won’t fill a granary.” He glanced once at Mutina’s wall. “You killed a man who trusted your cheer. Do not ask me to trust your legality.”</w:t>
+      </w:r>
+    </w:p>
+    <w:p>
+      <w:r>
+        <w:rPr/>
+        <w:t>Decimus’s throat tightened, the old key turning. He didn’t climb down. Climbing down would’ve looked like confession.</w:t>
+      </w:r>
+    </w:p>
+    <w:p>
+      <w:r>
+        <w:rPr/>
+        <w:t>“No,” Decimus said. “Not for breakfast. Not for your count of my smoke.”</w:t>
+      </w:r>
+    </w:p>
+    <w:p>
+      <w:r>
+        <w:rPr/>
+        <w:t>Antony’s mouth did something almost like a smile. “Then we introduce you to winter.”</w:t>
+      </w:r>
+    </w:p>
+    <w:p>
+      <w:r>
+        <w:rPr/>
+        <w:t>They parted without clasping. The truce ended when the first boot left the ditch mud. Behind Decimus, the aide whispered, “He bluffed the grain.”</w:t>
+      </w:r>
+    </w:p>
+    <w:p>
+      <w:r>
+        <w:rPr/>
+        <w:t>“He might have,” Decimus said. “I cannot un-eat what we have already not eaten.” The aide’s mouth twitched. “At least he didn’t offer you a chair. Chairs make threats look like visits.” Decimus almost laughed, then didn’t.</w:t>
+      </w:r>
+    </w:p>
+    <w:p>
+      <w:r>
+        <w:rPr/>
+        <w:t>That night a courier brought Plancus’s newest courtesy, dated after a thaw that had not begun. Decimus set it under the same stone as Antony’s old threats.</w:t>
+      </w:r>
+    </w:p>
+    <w:p>
+      <w:pPr>
+        <w:spacing w:before="200"/>
+      </w:pPr>
+      <w:r>
+        <w:rPr/>
+        <w:t>Antony</w:t>
+      </w:r>
+    </w:p>
+    <w:p>
+      <w:r>
+        <w:rPr/>
+        <w:t>He rode back smelling snow and horse and impatience. Pacuvius wanted storm now. Antony held the storm one more day, not mercy, timing. Timing kept soldiers paid long enough to hate the right wall.</w:t>
+      </w:r>
+    </w:p>
+    <w:p>
+      <w:r>
+        <w:rPr/>
+        <w:t>A scout reported smoke from the town’s edge, cooking, not surrender. Antony nodded. “He thinks a province is a personality,” he told Pacuvius. “Let him eat posture.”</w:t>
+      </w:r>
+    </w:p>
+    <w:p>
+      <w:pPr>
+        <w:spacing w:before="200"/>
+      </w:pPr>
+      <w:r>
+        <w:rPr/>
+        <w:t>Decimus</w:t>
+      </w:r>
+    </w:p>
+    <w:p>
+      <w:r>
+        <w:rPr/>
+        <w:t>He watched the lines tighten and wrote fewer letters that pretended optimism.</w:t>
+      </w:r>
+    </w:p>
+    <w:p>
+      <w:r>
+        <w:rPr/>
+        <w:t>“Hirtius will come,” the aide said again, needing it.</w:t>
+      </w:r>
+    </w:p>
+    <w:p>
+      <w:r>
+        <w:rPr/>
+        <w:t>“After the Kalends,” Decimus said. “Him and Pansa both. Until then we eat salt ox and count hinges.”</w:t>
+      </w:r>
+    </w:p>
+    <w:p>
+      <w:r>
+        <w:rPr/>
+        <w:t>He walked the walls at night with a cloak that did not keep the Ides out. The deed felt far and stupidly intimate, a debt owed a corpse who had trusted his cheer. An aide offered wine. Decimus refused, then took half a cup anyway. Below, Antony’s fires multiplied.</w:t>
+      </w:r>
+    </w:p>
+    <w:p>
+      <w:pPr>
+        <w:spacing w:before="200"/>
+      </w:pPr>
+      <w:r>
+        <w:rPr/>
+        <w:t>The Senate’s Sword</w:t>
+      </w:r>
+    </w:p>
+    <w:p>
+      <w:r>
+        <w:rPr/>
+        <w:t>Cicero argued Octavian into usefulness the way he argued clauses into laws. A sweating senator on the end bench, near the doors, feared Antony more than boys. Octavian stood on the threshold among the men who listened through the open doors: not a senator, so not inside, and present enough to be aimed.</w:t>
+      </w:r>
+    </w:p>
+    <w:p>
+      <w:r>
+        <w:rPr/>
+        <w:t>The consuls’ chairs had new men in them. Antony’s year was over; Antony was in a ditch outside Mutina. Hirtius sat wrapped too warmly, the spring’s sickness still in his cheekbones. Octavian had read his last book of the Gallic war at Apollonia and privately thought it better than the dead man’s. Pansa sat beside him, broad and plain, a list of recruits and pay open on his knee before the auspices were cold. Cicero called them the Senate’s swords. Cicero wanted a third blade to go with them.</w:t>
+      </w:r>
+    </w:p>
+    <w:p>
+      <w:r>
+        <w:rPr/>
+        <w:t xml:space="preserve">Cicero read the motion in his court voice. Thanks to the Martian legion and the Fourth, “who left the consul Antony and came over to the Senate and to Gaius Caesar.” Thanks to the veterans “whom Gaius Caesar raised at his own cost.” And for Gaius Caesar himself a praetor’s command and a seat among the fathers, so that the legions he already had would at last belong to a law. Octavian heard </w:t>
+      </w:r>
+      <w:r>
+        <w:rPr>
+          <w:i/>
+        </w:rPr>
+        <w:t>at his own cost</w:t>
+      </w:r>
+      <w:r>
+        <w:rPr/>
+        <w:t xml:space="preserve"> and thought of the actual cost: five hundred denarii a man through the Campanian colonies in the autumn, Philippus’s face when the chests went out, Antony at Brundisium offering his own soldiers a hundred apiece and hearing the ranks laugh. The Senate was thanking him for a crime it had decided to need.</w:t>
+      </w:r>
+    </w:p>
+    <w:p>
+      <w:r>
+        <w:rPr/>
+        <w:t xml:space="preserve">“The young Caesar,” Cicero said, and the name seemed to catch in his throat on the way out, “will march with the consuls and defend the state against Antony’s madness.” The senator muttered </w:t>
+      </w:r>
+      <w:r>
+        <w:rPr>
+          <w:i/>
+        </w:rPr>
+        <w:t>adoption</w:t>
+      </w:r>
+      <w:r>
+        <w:rPr/>
+        <w:t xml:space="preserve"> and </w:t>
+      </w:r>
+      <w:r>
+        <w:rPr>
+          <w:i/>
+        </w:rPr>
+        <w:t>armies</w:t>
+      </w:r>
+      <w:r>
+        <w:rPr/>
+        <w:t xml:space="preserve"> in one breath, hoping grammar could make them one animal, then closed his mouth into agreement. Octavian watched Cicero take the closing for virtue’s return.</w:t>
+      </w:r>
+    </w:p>
+    <w:p>
+      <w:r>
+        <w:rPr/>
+        <w:t xml:space="preserve">Octavian listened to himself become a tool. When Cicero’s gaze sought approval, he gave a nod calibrated to obedience and nothing else. He didn’t think </w:t>
+      </w:r>
+      <w:r>
+        <w:rPr>
+          <w:i/>
+        </w:rPr>
+        <w:t>empire</w:t>
+      </w:r>
+      <w:r>
+        <w:rPr/>
+        <w:t xml:space="preserve">. He thought </w:t>
+      </w:r>
+      <w:r>
+        <w:rPr>
+          <w:i/>
+        </w:rPr>
+        <w:t>survive the week without looking grateful for their fear.</w:t>
+      </w:r>
+      <w:r>
+        <w:rPr/>
+        <w:t xml:space="preserve"> A clerk miswrote his age. He corrected the number and left the tone alone. Hirtius looked at him once, the look of a man who had copied out Caesar’s sentences for years and now found the name signed in a boy’s hand. Octavian held the look until Hirtius let it go. Pansa did not look up. He was counting.</w:t>
+      </w:r>
+    </w:p>
+    <w:p>
+      <w:r>
+        <w:rPr/>
+        <w:t>Agrippa stood where the Curia fringe still smelled of wet wool and ambition. Close enough to hear Pacuvius’s name travel in a courier’s mutter, Antony’s storm-man still pricing timing at Mutina. Far enough that senators could pretend the boy arrived alone. A sweating senator wanted Octavian to smile gratitude. Agrippa did not move. Octavian kept his own nod thin.</w:t>
+      </w:r>
+    </w:p>
+    <w:p>
+      <w:r>
+        <w:rPr/>
+        <w:t>Afterward a senator clasped his arm and called him the Republic’s luck. Octavian returned the clasp at half strength. Half strength still looked like gratitude if you did not measure. Agrippa’s stillness held until the clasp ended. Only then did he match pace toward the vendor street. A northern courier’s fragments stayed unmerged in Octavian’s hand: Decimus holding, Antony digging, Pacuvius still hungry for storm. Cicero left looking like a man certain he had saved the Republic. Outside, a vendor sold hot food and called no one Caesar. Octavian heard him and didn’t correct him.</w:t>
+      </w:r>
+    </w:p>
+    <w:p>
+      <w:pPr>
+        <w:spacing w:before="360"/>
+      </w:pPr>
+      <w:r>
+        <w:rPr/>
+        <w:t>Act 5: Mutina to Philippi</w:t>
+      </w:r>
+    </w:p>
+    <w:p>
+      <w:pPr>
+        <w:spacing w:before="280"/>
+      </w:pPr>
+      <w:r>
+        <w:rPr/>
+        <w:t>Chapter 28</w:t>
+      </w:r>
+    </w:p>
+    <w:p>
+      <w:r>
+        <w:rPr/>
+        <w:t>Mutina Field</w:t>
+      </w:r>
+    </w:p>
+    <w:p>
+      <w:pPr>
+        <w:spacing w:before="200"/>
+      </w:pPr>
+      <w:r>
+        <w:rPr/>
+        <w:t>Mud</w:t>
+      </w:r>
+    </w:p>
+    <w:p>
+      <w:r>
+        <w:rPr/>
+        <w:t>Laberius’s world narrowed to mud and which eagle still stood.</w:t>
+      </w:r>
+    </w:p>
+    <w:p>
+      <w:r>
+        <w:rPr/>
+        <w:t>In rooms with clean sandals this would be named success before the mud dried. In the ditch it was screaming. Martians refusing to be held. Someone’s javelin nearly killing him until a voice yelled his century’s joke-name. Antony’s men came out hard. Hard enough that Laberius smelled the old Spanish stubbornness again, the kind that did not care who Rome called consul. Hirtius hit harder when the day turned. Laberius didn’t see strategy. He saw a standard tilt. He saw a friend open at the neck. Blood mixed with meltwater and ran pink off the rim of his shield.</w:t>
+      </w:r>
+    </w:p>
+    <w:p>
+      <w:r>
+        <w:rPr/>
+        <w:t>Vibius spat black grit. “Win,” he said. “Then count.”</w:t>
+      </w:r>
+    </w:p>
+    <w:p>
+      <w:r>
+        <w:rPr/>
+        <w:t>“Count what?” said the man behind them. “Five hundred from the boy at Capua to stand in this.”</w:t>
+      </w:r>
+    </w:p>
+    <w:p>
+      <w:r>
+        <w:rPr/>
+        <w:t>“Five hundred beats Antony’s hundred,” Vibius said. Laberius had taken the boy’s coin in the end, in the autumn, when the shadow with a seal learned to feed men. It had bought his boots for the young Caesar’s ranks and this ditch. It had not moved the twine.</w:t>
+      </w:r>
+    </w:p>
+    <w:p>
+      <w:r>
+        <w:rPr/>
+        <w:t>Pay talk lived under the noise like a second drum. Who owed donatives. Which Caesar’s name still fed mouths. Whether Hirtius’s clean reputation meant Rome finally understood mud. Capua still sat in Laberius’s boots as an unpaid date. A boy from another century asked if they were fighting for the Senate or for bread. Laberius said, “Fight for the man on your left. Capua argues later, if later still has a road.”</w:t>
+      </w:r>
+    </w:p>
+    <w:p>
+      <w:r>
+        <w:rPr/>
+        <w:t>Between assaults, when the yelling thinned and the cold found room, Vibius and two men from the contubernium talked dirt the way other men talked gods. “Capua was a date when the paymaster breathed,” Vibius said, voice flat. Mud did not buy jokes. “Now Capua is only what we stand in.” The second man wiped pink melt from his shield rim. “Still wants a road, if we live.” Laberius did not finish the thought aloud. Finishing would have made Capua a speech. He kept his century from becoming a gap. When a signal dipped wrong in the wet air, he held the line anyway. Signals lied as often as clerks.</w:t>
+      </w:r>
+    </w:p>
+    <w:p>
+      <w:r>
+        <w:rPr/>
+        <w:t>Yell-rumours arrived before facts. Someone claimed a consul down. Someone claimed both. Someone claimed a victory large enough to make the ditch look like a lie. Laberius believed the ache in his forearms and nothing else. Until mid-afternoon, when a staff officer he recognised from Hirtius’s tent came past on a blown horse, cloak dark with more than rain, and said to a tribune three paces from Laberius’s ear: “The consul Hirtius is dead. I held his shoulder. Do not invent a better story.”</w:t>
+      </w:r>
+    </w:p>
+    <w:p>
+      <w:r>
+        <w:rPr/>
+        <w:t>That was one fact Laberius could keep: Hirtius down, confirmed by a man who had touched him. Pansa’s name still swam in the yell-water, wounded, dying, fine, poisoned, blessed. “They carried him off at Forum Gallorum,” Vibius said. “A week back. Javelin in the side. I saw the litter. I didn’t see inside it.” Laberius didn’t promote any Pansa version. Vibius had a litter. Nobody had a shoulder.</w:t>
+      </w:r>
+    </w:p>
+    <w:p>
+      <w:r>
+        <w:rPr/>
+        <w:t>Near dusk Antony’s near line pulled back toward the higher ground. Not a rout Laberius could swear to. Only a thinning of shields where shields had been thick. He saw that with his own eyes. A wounded Antonian left behind tried to crawl and was finished by someone Laberius did not know. Finishing was not glory either. Withdrawal or regroup: clerks would decide later. Laberius decided only that his century still had an eagle. And a gap where a friend had been.</w:t>
+      </w:r>
+    </w:p>
+    <w:p>
+      <w:r>
+        <w:rPr/>
+        <w:t>Water ran into his boots. He had stopped noticing wet hours ago; noticing returned when the fighting thinned and the cold found room. Vibius pointed at Mutina’s wall, still closed. “Town’s still his,” Vibius said, meaning Decimus. Laberius grunted. Walls didn’t feed the ditch.</w:t>
+      </w:r>
+    </w:p>
+    <w:p>
+      <w:r>
+        <w:rPr/>
+        <w:t>A mule train stuck in the same ditch as the dead. Drivers cursed gods and officers with equal accuracy. Laberius helped push because pushing was orders you could obey without understanding Senate talk. One mule went down and stayed down; they cut the traces and left it.</w:t>
+      </w:r>
+    </w:p>
+    <w:p>
+      <w:r>
+        <w:rPr/>
+        <w:t>He stacked a shield that was not his. The owner would not need it. Somewhere behind, gallopers already carried “great success” toward Rome. Laberius carried a friend’s boots, left boot split at the heel, still warm somehow. He knew Hirtius was dead. He knew Antony’s near shields had thinned. What Rome would buy with those two facts, he left to the gallopers. He didn’t follow their dust.</w:t>
+      </w:r>
+    </w:p>
+    <w:p>
+      <w:pPr>
+        <w:spacing w:before="200"/>
+      </w:pPr>
+      <w:r>
+        <w:rPr/>
+        <w:t>Poison Talk</w:t>
+      </w:r>
+    </w:p>
+    <w:p>
+      <w:r>
+        <w:rPr/>
+        <w:t>Hordeonius recorded three explanations for Pansa’s death before the man had finished dying:</w:t>
+      </w:r>
+    </w:p>
+    <w:p>
+      <w:r>
+        <w:rPr/>
+        <w:t>1. Battlefield medicine</w:t>
+      </w:r>
+    </w:p>
+    <w:p>
+      <w:r>
+        <w:rPr/>
+        <w:t>2. Antony’s smear</w:t>
+      </w:r>
+    </w:p>
+    <w:p>
+      <w:r>
+        <w:rPr/>
+        <w:t>3. The boy’s friends prefer fewer consuls</w:t>
+      </w:r>
+    </w:p>
+    <w:p>
+      <w:r>
+        <w:rPr/>
+        <w:t xml:space="preserve">He labelled all three </w:t>
+      </w:r>
+      <w:r>
+        <w:rPr>
+          <w:i/>
+        </w:rPr>
+        <w:t>Rumour</w:t>
+      </w:r>
+      <w:r>
+        <w:rPr/>
+        <w:t xml:space="preserve"> in Greek abbreviation, because Latin made gossip look like evidence. A client wanted to buy the third as fact, wanted a price on conspiracy that would make his dinner clever. Sosia sat on the next stool with a cup; a runner from camp hovered with ink still wet.</w:t>
+      </w:r>
+    </w:p>
+    <w:p>
+      <w:r>
+        <w:rPr/>
+        <w:t>Hordeonius refused the sale and charged for the refusal.</w:t>
+      </w:r>
+    </w:p>
+    <w:p>
+      <w:r>
+        <w:rPr/>
+        <w:t>“Do not sell poison as fact,” he told the man, gentle as a father closing a child’s eyes. “I keep seals. Seals are not dinner cleverness. Pay for the refusal if you want a clean margin.”</w:t>
+      </w:r>
+    </w:p>
+    <w:p>
+      <w:r>
+        <w:rPr/>
+        <w:t>The client bowed, grateful as a man receiving virtue. “Clean margins. Of course. Wisdom.”</w:t>
+      </w:r>
+    </w:p>
+    <w:p>
+      <w:r>
+        <w:rPr/>
+        <w:t>Sosia tipped his cup toward Hordeonius without drinking. “Only you could make refusing a sale sound like a temple tax.”</w:t>
+      </w:r>
+    </w:p>
+    <w:p>
+      <w:r>
+        <w:rPr/>
+        <w:t>Hordeonius did not smile. “Silence clears. Cleverness does not.”</w:t>
+      </w:r>
+    </w:p>
+    <w:p>
+      <w:r>
+        <w:rPr/>
+        <w:t xml:space="preserve">Sosia muttered, after, that dead consuls moved land prices either way. A letter from camp arrived with three different inks and one shared panic. Hirtius down as fact in one hand. Pansa still a menu of causes in another. Hordeonius priced land by the panic without crowning a cause and entered </w:t>
+      </w:r>
+      <w:r>
+        <w:rPr>
+          <w:i/>
+        </w:rPr>
+        <w:t>Pansa: cause open</w:t>
+      </w:r>
+      <w:r>
+        <w:rPr/>
+        <w:t>.</w:t>
+      </w:r>
+    </w:p>
+    <w:p>
+      <w:r>
+        <w:rPr/>
+        <w:t xml:space="preserve">A second client asked whether to short land near Mutina. Hordeonius took a fee for advising against it and wrote the fee under </w:t>
+      </w:r>
+      <w:r>
+        <w:rPr>
+          <w:i/>
+        </w:rPr>
+        <w:t>prudence</w:t>
+      </w:r>
+      <w:r>
+        <w:rPr/>
+        <w:t>. Sleep would argue with him later. For now the market argued louder.</w:t>
+      </w:r>
+    </w:p>
+    <w:p>
+      <w:pPr>
+        <w:spacing w:before="280"/>
+      </w:pPr>
+      <w:r>
+        <w:rPr/>
+        <w:t>Chapter 29</w:t>
+      </w:r>
+    </w:p>
+    <w:p>
+      <w:r>
+        <w:rPr/>
+        <w:t>Isolation and Fasces</w:t>
+      </w:r>
+    </w:p>
+    <w:p>
+      <w:pPr>
+        <w:spacing w:before="200"/>
+      </w:pPr>
+      <w:r>
+        <w:rPr/>
+        <w:t>Allies Evaporate</w:t>
+      </w:r>
+    </w:p>
+    <w:p>
+      <w:r>
+        <w:rPr/>
+        <w:t>Decimus left Mutina after the relief had made the wall honest again. Hirtius’s dirt still drying on the road. Antony thinned but not finished. The town’s hinges finally someone else’s problem for a morning. At the first milestone past the gate he waited half that morning for Plancus’s promised meeting-mark. No cohorts. No date. Only dust that refused to become wagons. Near noon a rider from the Lepidus channel he had seeded after the funeral handed back Decimus’s latest wax unopened. Same averted eyes as the messenger who would not take a return tablet on the road north in March. “The meeting near the approaches cannot yet be kept,” the man said, practising courtesy. “My principal sends goodwill.” Goodwill without a roof. Decimus kept the returned tablet.</w:t>
+      </w:r>
+    </w:p>
+    <w:p>
+      <w:r>
+        <w:rPr/>
+        <w:t>He looked for a destination mark on the itinerary and found only blank margin where a meeting date should have been. He rubbed the blank with his thumb until the wax warmed and still showed nothing. Antony, bleeding but unbroken, was already sliding toward friends Decimus could not buy.</w:t>
+      </w:r>
+    </w:p>
+    <w:p>
+      <w:r>
+        <w:rPr/>
+        <w:t>Cicero’s praise arrived sweet and late. Decimus read one line of congratulation twice, then folded it into a pack already too light on grain. He wrote one more letter that tried to sound steady, gates held, honour intact. He stopped mid-sentence when his hand cramped. He didn’t send a second copy.</w:t>
+      </w:r>
+    </w:p>
+    <w:p>
+      <w:r>
+        <w:rPr/>
+        <w:t>Plancus came after all, in June, when Antony had already walked into Lepidus’s camp. He brought legions and compliments and pitched beside Decimus under the Alps at Cularo, and for a summer the two armies ate the same valley bare and wrote the same letters to Rome asking for the boy to be sent north. The boy did not come. In August letters began arriving for Plancus from Pollio in Spain, under seals Decimus was not shown. In September Plancus took his legions over to Antony with the same apologetic face he had worn arriving, and Decimus’s own recruits, raw and unpaid, began walking off by the hundred.</w:t>
+      </w:r>
+    </w:p>
+    <w:p>
+      <w:r>
+        <w:rPr/>
+        <w:t>Then he rode with dwindling staff into country that did not care who freed the Republic. Rain made the road a trough. An aide counted purses and got a number that made him quiet. Another counted betrayals and got a higher number. A third asked whether they should wait for Cassius from the East.</w:t>
+      </w:r>
+    </w:p>
+    <w:p>
+      <w:r>
+        <w:rPr/>
+        <w:t>“Wait here and the road learns our number,” Decimus said.</w:t>
+      </w:r>
+    </w:p>
+    <w:p>
+      <w:r>
+        <w:rPr/>
+        <w:t>“They will say I did not pursue,” the first aide muttered.</w:t>
+      </w:r>
+    </w:p>
+    <w:p>
+      <w:r>
+        <w:rPr/>
+        <w:t>“Let them,” Decimus said. “We take the west fork before dark. The east ford is watched, I smelled horse-lines on the wind this morning. Plancus has crossed. Lepidus’s man returned the tablet. We do not wait for dates that practise absence.”</w:t>
+      </w:r>
+    </w:p>
+    <w:p>
+      <w:r>
+        <w:rPr/>
+        <w:t>The second aide, older, tablet-hand still inked from Mutina’s last courtesy copy, spoke the count Decimus had been avoiding as a list of people. “Plancus: gone to Antony. Lepidus: promised meeting, messenger who would not take a return tablet, twice, and in May his legions let Antony walk into their camp. Waded the river to embrace him, and Lepidus writes the Senate that his soldiers did it. The boy: will not share a road with the man who held Caesar’s door, and said so where his centurions could hear. Three names, and not one wagon among them.”</w:t>
+      </w:r>
+    </w:p>
+    <w:p>
+      <w:r>
+        <w:rPr/>
+        <w:t>Decimus heard the names as doors that had already closed while he counted hinges. “Then we do not invent a fifth name for hope,” he said. The first aide opened his mouth on another complaint. Decimus was already counting remaining waterskins aloud, making the count the argument beside the named absences. At a crossroads shrine someone had left a cheap wreath for “the liberators.” Rain had ruined it. Decimus didn’t stop to fix it. He checked his horse’s mouth for sores and found none.</w:t>
+      </w:r>
+    </w:p>
+    <w:p>
+      <w:r>
+        <w:rPr/>
+        <w:t>They slept once in a barn that smelled of wet hay and someone else’s fear. In the dark Decimus thought, briefly, without speech, of Caesar’s atrium and the cheer he had worn like a clean cloak on a March morning. Trust had been the key. He put the thought away the way he put away a broken strap: later, if later existed.</w:t>
+      </w:r>
+    </w:p>
+    <w:p>
+      <w:r>
+        <w:rPr/>
+        <w:t>On the second day the staff was smaller. One man had “gone for water” and not returned. Decimus didn’t send a search. Searches taught the road your remaining number.</w:t>
+      </w:r>
+    </w:p>
+    <w:p>
+      <w:r>
+        <w:rPr/>
+        <w:t>Near a river ford the map promised a contact who could pass them toward the mountains and, beyond rumour, toward Cassius. The contact was three men with ordinary faces and a mule. One smiled too quickly. Decimus’s remaining aide whispered, “Lepidus’s smile.”</w:t>
+      </w:r>
+    </w:p>
+    <w:p>
+      <w:r>
+        <w:rPr/>
+        <w:t>“Or anybody’s price,” Decimus said.</w:t>
+      </w:r>
+    </w:p>
+    <w:p>
+      <w:r>
+        <w:rPr/>
+        <w:t>He still dismounted. Refusing the ford meant the open road behind, where Antony’s friends were thicker. He kept his hands visible. Appearances, even here.</w:t>
+      </w:r>
+    </w:p>
+    <w:p>
+      <w:r>
+        <w:rPr/>
+        <w:t>They asked for his name. They already knew it. He gave it because lying would have bought minutes instead of miles. A purse changed hands: not his purse. Someone else’s coin for his head. He counted the pieces by glint before the knives moved, enough metal for a short road and a long silence.</w:t>
+      </w:r>
+    </w:p>
+    <w:p>
+      <w:r>
+        <w:rPr/>
+        <w:t>There was no speech. He went for the horse. A hand caught his cloak. Mud took his knee. The ditch at the ford’s edge was shallow and ordinary: meltwater, a broken rein, the smell of wet wool.</w:t>
+      </w:r>
+    </w:p>
+    <w:p>
+      <w:r>
+        <w:rPr/>
+        <w:t>If he thought of Caesar’s laugh one last time, the thought stayed inside.</w:t>
+      </w:r>
+    </w:p>
+    <w:p>
+      <w:pPr>
+        <w:spacing w:before="200"/>
+      </w:pPr>
+      <w:r>
+        <w:rPr/>
+        <w:t>Consul</w:t>
+      </w:r>
+    </w:p>
+    <w:p>
+      <w:r>
+        <w:rPr/>
+        <w:t>Octavian entered the politics of force with hands that still remembered shaking in Apollonia.</w:t>
+      </w:r>
+    </w:p>
+    <w:p>
+      <w:r>
+        <w:rPr/>
+        <w:t>A courier brought the Senate’s thanks for Mutina, and the thanks were not for him. The fathers had voted Decimus a triumph and handed him the dead consuls’ legions, the Martians among them, to chase Antony up the road. Octavian was to be thanked and left behind. He read the decree once and gave it to Agrippa, who read it twice.</w:t>
+      </w:r>
+    </w:p>
+    <w:p>
+      <w:r>
+        <w:rPr/>
+        <w:t>“They will say you let Antony get away,” Agrippa said.</w:t>
+      </w:r>
+    </w:p>
+    <w:p>
+      <w:r>
+        <w:rPr/>
+        <w:t>Octavian’s throat tightened once, shame or fever; he didn’t sort it. He looked at the pay chests, not at Agrippa’s face. “Then we pay before we argue. Men who are owed invent worse stories than senators do.”</w:t>
+      </w:r>
+    </w:p>
+    <w:p>
+      <w:r>
+        <w:rPr/>
+        <w:t>He had the clerks open the nearest chest where Agrippa could see the count. Late thanks; complete coin. The order of those facts was the lesson he was learning with his hands. When a tribune started a sentence about the Senate’s honours, Octavian cut him with a nod toward the queue of soldiers. “Honours after the line is fed.”</w:t>
+      </w:r>
+    </w:p>
+    <w:p>
+      <w:r>
+        <w:rPr/>
+        <w:t xml:space="preserve">The vacuum arrived as named pressure, not triumph. Both consuls were dead, Hirtius in the ditch at Mutina and Pansa of his wound a day after, and their chairs stood empty. A centurion from the Martians said it first, loud enough for the pay line: “They want us under the man who held Caesar’s door. Who feeds us now, old men with tablets, or Caesar’s name?” A tribune seconded without looking at Octavian’s face: the men would not march for an assassin on praise that arrived late and sweet. Agrippa translated the noise into one sentence Octavian could keep. The ranks wanted a consul who was </w:t>
+      </w:r>
+      <w:r>
+        <w:rPr>
+          <w:i/>
+        </w:rPr>
+        <w:t>theirs</w:t>
+      </w:r>
+      <w:r>
+        <w:rPr/>
+        <w:t>: paymaster, name, a face young enough to insult the old seats. Two chairs were empty.</w:t>
+      </w:r>
+    </w:p>
+    <w:p>
+      <w:r>
+        <w:rPr/>
+        <w:t xml:space="preserve">Senate pressure arrived in a different mouth. A senior voice, careful with consonants, told Octavian that with both consuls dead the House had no one in the chairs to point at and call the year settled. Decimus was a Liberator with a triumph and a thinning army, not a consul. Antony was over the Alps with Lepidus’s legions. They needed a miracle that obeyed. They needed it before Antony’s friends finished renaming the map. The same voice reminded him, as if reminding were a kindness, that the law asked forty-two years for a consul’s chair and he had nineteen. Octavian had already sent centurions to the Curia with the ranks’ request in writing. One came back and told the pay line what he had said on the steps when the fathers talked about age. He had put his hand on his sword. </w:t>
+      </w:r>
+      <w:r>
+        <w:rPr>
+          <w:i/>
+        </w:rPr>
+        <w:t>If you will not make him consul, this will.</w:t>
+      </w:r>
+      <w:r>
+        <w:rPr/>
+        <w:t xml:space="preserve"> Octavian offered them a nineteen-year-old with Caesar’s name and enough armed insistence to make elections look like a toll you paid at the gate. Not because destiny asked. Because two empty chairs had shortened every polite road.</w:t>
+      </w:r>
+    </w:p>
+    <w:p>
+      <w:r>
+        <w:rPr/>
+        <w:t xml:space="preserve">He felt sick after the first hard bargain, stomach, not omen. A taste of metal rose; he swallowed it and kept his fingers on the chest lid until the shake stopped. Publicly he accepted the fasces like owed homework. Twelve lictors shouldered the bound rods and walked ahead of him, and men stepped out of the street for the rods before they looked to see whose face came behind. A herald stumbled over </w:t>
+      </w:r>
+      <w:r>
+        <w:rPr>
+          <w:i/>
+        </w:rPr>
+        <w:t>consul</w:t>
+      </w:r>
+      <w:r>
+        <w:rPr/>
+        <w:t xml:space="preserve"> and </w:t>
+      </w:r>
+      <w:r>
+        <w:rPr>
+          <w:i/>
+        </w:rPr>
+        <w:t>nineteen</w:t>
+      </w:r>
+      <w:r>
+        <w:rPr/>
+        <w:t xml:space="preserve"> in the same breath, as if the two words had never met. Octavian let him find his way to the end.</w:t>
+      </w:r>
+    </w:p>
+    <w:p>
+      <w:r>
+        <w:rPr/>
+        <w:t>“They will hate this,” Agrippa said.</w:t>
+      </w:r>
+    </w:p>
+    <w:p>
+      <w:r>
+        <w:rPr/>
+        <w:t>Octavian wiped sweat from his upper lip with the back of his hand, ugly, visible, unfinished. “They hated the knives more. Let them hate a boy who pays after the line eats.”</w:t>
+      </w:r>
+    </w:p>
+    <w:p>
+      <w:r>
+        <w:rPr/>
+        <w:t>Agrippa’s mouth twitched, almost the old Apollonia play, then not. “Homework with fasces. Only you could make a consulship sound like a debt you intend to clear before bedtime.” Octavian did not smile. Smiling would have spoiled the pay line. He let the twitch count as the joke landing and kept his fingers on the chest.</w:t>
+      </w:r>
+    </w:p>
+    <w:p>
+      <w:r>
+        <w:rPr/>
+        <w:t xml:space="preserve">A senator who had voted him an ovation and then forgotten to pay for it called him the gods’ gift and waited for a smile of destiny. Octavian looked at him until the man found something to do with his hands. A soldier shouted the name </w:t>
       </w:r>
       <w:r>
         <w:rPr>
@@ -11091,1775 +12553,225 @@
       </w:r>
       <w:r>
         <w:rPr/>
-        <w:t xml:space="preserve"> in Cicero’s private mouth, and </w:t>
+        <w:t xml:space="preserve"> as paymaster; Octavian didn’t bow to it like a hymn. He let the shout stand because paymaster was a job his hands already understood better than luck.</w:t>
+      </w:r>
+    </w:p>
+    <w:p>
+      <w:r>
+        <w:rPr/>
+        <w:t>By autumn a courier brought Decimus’s end as three incompatible stories. Ditch. Alps. Lepidus’s smile. Antony’s purse, no purse, a speech, no speech. Octavian did not ask which was true. What the stories shared was enough for the ranks: the last Liberator in Italy was gone, and the north had no one left to hold it but Antony and Lepidus. In the same week a tablet came under two seals pressed side by side in the same wax, Lepidus’s and Antony’s: talk, on the river island below Bononia, between the camps, where no city could listen.</w:t>
+      </w:r>
+    </w:p>
+    <w:p>
+      <w:pPr>
+        <w:spacing w:before="280"/>
+      </w:pPr>
+      <w:r>
+        <w:rPr/>
+        <w:t>Chapter 30</w:t>
+      </w:r>
+    </w:p>
+    <w:p>
+      <w:r>
+        <w:rPr/>
+        <w:t>Lists</w:t>
+      </w:r>
+    </w:p>
+    <w:p>
+      <w:pPr>
+        <w:spacing w:before="200"/>
+      </w:pPr>
+      <w:r>
+        <w:rPr/>
+        <w:t>Bononia</w:t>
+      </w:r>
+    </w:p>
+    <w:p>
+      <w:r>
+        <w:rPr/>
+        <w:t>They met because none could kill the other two cheaply.</w:t>
+      </w:r>
+    </w:p>
+    <w:p>
+      <w:r>
+        <w:rPr/>
+        <w:t>The island sat low in the river below Bononia, a gravel tongue with a tent on it and two camps on the banks watching each other’s fires. Lepidus crossed first over the plank bridge and walked the island with his own eyes before he waved the other two across. On the sand each man let the others’ people pat him down for blades. Nobody pretended it was ceremony.</w:t>
+      </w:r>
+    </w:p>
+    <w:p>
+      <w:r>
+        <w:rPr/>
+        <w:t>Antony brought soldier gravity and a hunger that still smelled like Ops unlocked. He looked across the table at the Campania squeak grown into a man who could force a bargain, and whatever joke he had kept since spring did not come out. Octavian had brought the name, and a cold that still cracked sometimes when a room laughed wrong. He felt it crack now, and seal, like wax under a thumb. Lepidus brought the useful talent of being present when maps were drawn, and of surviving other men’s sentences without becoming their subject. He also brought the legions that had waded the river to Antony in the spring, which was why he had a chair. A table held bread nobody ate. Appetite had moved to paper.</w:t>
+      </w:r>
+    </w:p>
+    <w:p>
+      <w:r>
+        <w:rPr/>
+        <w:t>Lepidus wanted the law first, because Lepidus always wanted the law first. “A tribune carries it in Rome,” he said. “Three men for setting the state in order. Five years. A consul’s power for each of us, and no veto over any of it.”</w:t>
+      </w:r>
+    </w:p>
+    <w:p>
+      <w:r>
+        <w:rPr/>
+        <w:t>“Triumvirs,” Antony said, tasting it. “In Rome a board of three counts copper at the mint and minds the jail.”</w:t>
+      </w:r>
+    </w:p>
+    <w:p>
+      <w:r>
+        <w:rPr/>
+        <w:t>“Then this one minds both,” Octavian said.</w:t>
+      </w:r>
+    </w:p>
+    <w:p>
+      <w:r>
+        <w:rPr/>
+        <w:t>Nobody laughed. Antony laid his palm on the tablet where the money should have been. Forty-odd legions wanted paying, and the colonies Caesar had promised them were still surveyor’s stakes. “Sulla did this,” Lepidus said quietly, as if the dead could be asked for a precedent.</w:t>
+      </w:r>
+    </w:p>
+    <w:p>
+      <w:r>
+        <w:rPr/>
+        <w:t>“Sulla posted names,” Antony said. “That is all a list is. Names, heads, and a sale, and the sale pays the legions.”</w:t>
+      </w:r>
+    </w:p>
+    <w:p>
+      <w:r>
+        <w:rPr/>
+        <w:t>Victim lists began like shopping. A name, then a joke, then silence when the joke hit someone each man still half-liked. A guard outside coughed. Conversation became rain and cousins for three breaths. Then it returned to blood accounting. Paper took names faster than mouths could soften them.</w:t>
+      </w:r>
+    </w:p>
+    <w:p>
+      <w:r>
+        <w:rPr/>
+        <w:t>Antony’s stylus paused on a lesser enemy first, a man who had borrowed money and returned sermons. Easy. The stylus moved. Then it paused again on a blank that was not blank in anyone’s throat.</w:t>
+      </w:r>
+    </w:p>
+    <w:p>
+      <w:r>
+        <w:rPr/>
+        <w:t>“Cicero,” Antony said. He did not look up. Looking would have made it a request.</w:t>
+      </w:r>
+    </w:p>
+    <w:p>
+      <w:r>
+        <w:rPr/>
+        <w:t>Lepidus looked at his hands. Hands could not abstain. Octavian kept his face from moving enough to save anyone. For a breath he counted the cost of sparing Cicero: Antony’s favourite wound still open, the lists thinner when the next Kalends asked for blood.</w:t>
+      </w:r>
+    </w:p>
+    <w:p>
+      <w:r>
+        <w:rPr/>
+        <w:t>Antony’s finger stayed on the blank. “Say it,” he said, not loud. “Or strike a smaller name in his place. I have lesser enemies enough. Choose.”</w:t>
+      </w:r>
+    </w:p>
+    <w:p>
+      <w:r>
+        <w:rPr/>
+        <w:t>A lesser name sat two lines up, a man Octavian half-owed from Apollonia’s edge. Useful. Not loved. Killable without rearranging the map. Striking that name instead would buy a night of quieter conscience and leave Antony’s wound open. Octavian felt the cheaper exit in his hands: the stylus, the wax, the easy swap.</w:t>
+      </w:r>
+    </w:p>
+    <w:p>
+      <w:r>
+        <w:rPr/>
+        <w:t>Saving the orator would have cost a different war, one with Antony still armed and the coalition already smelling of unfinished business. Octavian kept that cost. Then he spent it aloud.</w:t>
+      </w:r>
+    </w:p>
+    <w:p>
+      <w:r>
+        <w:rPr/>
+        <w:t>“Cicero stays,” he said. Voice thin, audible, irreversible. He did not dress it as law. He set his seal ring on the tablet’s edge, metal clicking wood, so the assent had a body in the room, not only silence. “We do not trade him for a quieter cousin.”</w:t>
+      </w:r>
+    </w:p>
+    <w:p>
+      <w:r>
+        <w:rPr/>
+        <w:t>Lepidus cleared his throat. “He still has friends who write.”</w:t>
+      </w:r>
+    </w:p>
+    <w:p>
+      <w:r>
+        <w:rPr/>
+        <w:t>“Then they can write his epitaph,” Antony said. “Or they can join him.”</w:t>
+      </w:r>
+    </w:p>
+    <w:p>
+      <w:r>
+        <w:rPr/>
+        <w:t>Who had first thought the name did not matter on the wood. The name stood because Octavian had said it stood, and no one struck it out.</w:t>
+      </w:r>
+    </w:p>
+    <w:p>
+      <w:r>
+        <w:rPr/>
+        <w:t>“We buy the war with this,” Antony said, tapping the tablet beside the ring.</w:t>
+      </w:r>
+    </w:p>
+    <w:p>
+      <w:r>
+        <w:rPr/>
+        <w:t>“The war buys us,” Octavian answered, too soft to be a quip, too true to unsay. He took the ring back. The click leaving wood was quieter than the click arriving.</w:t>
+      </w:r>
+    </w:p>
+    <w:p>
+      <w:r>
+        <w:rPr/>
+        <w:t>They swapped one quieter enemy in a whisper: a man each of them half-owed and half-hated, traded so that no single list would look like one man’s revenge. The whisper would become three contradictory stories by morning. They sealed what could be sealed.</w:t>
+      </w:r>
+    </w:p>
+    <w:p>
+      <w:r>
+        <w:rPr/>
+        <w:t>Antony poured wine that did not taste like celebration. He did not look at Octavian while pouring. Octavian let him not look, and didn’t drink deep. Lepidus drank as men drink when they hope the cup will make them smaller than the map. Outside, a horse screamed at nothing. Inside, the lists grew.</w:t>
+      </w:r>
+    </w:p>
+    <w:p>
+      <w:pPr>
+        <w:spacing w:before="200"/>
+      </w:pPr>
+      <w:r>
+        <w:rPr/>
+        <w:t>Proscription Economy</w:t>
+      </w:r>
+    </w:p>
+    <w:p>
+      <w:pPr>
+        <w:spacing w:before="200"/>
+      </w:pPr>
+      <w:r>
+        <w:rPr/>
+        <w:t>F2: Seius</w:t>
+      </w:r>
+    </w:p>
+    <w:p>
+      <w:r>
+        <w:rPr/>
+        <w:t xml:space="preserve">Seius found his name absent and felt holy relief, then shame at the holiness. He walked past a posted list twice to be sure, eyes watering from more than wind. Above the names the clerk’s square letters ran: </w:t>
       </w:r>
       <w:r>
         <w:rPr>
           <w:i/>
         </w:rPr>
-        <w:t>young Caesar</w:t>
-      </w:r>
-      <w:r>
-        <w:rPr/>
-        <w:t xml:space="preserve"> in his public one when the Curia needed a handle, could be a sword pointed at Antony. Swords didn’t need to be loved. They needed to be aimed. He drafted a period about Antony’s appetite and another about the state’s dignity. Then he joined them like carpentry.</w:t>
-      </w:r>
-    </w:p>
-    <w:p>
-      <w:r>
-        <w:rPr/>
-        <w:t>A courier waited with copies for men who would pretend they had not asked for copies. Cicero sealed the packets with a satisfaction that felt like courage and sent them into the city’s hungry mouths.</w:t>
-      </w:r>
-    </w:p>
-    <w:p>
-      <w:r>
-        <w:rPr/>
-        <w:t>One packet came back before dusk.</w:t>
-      </w:r>
-    </w:p>
-    <w:p>
-      <w:r>
-        <w:rPr/>
-        <w:t>The seal was broken. The wax had been thumb-smeared and pressed again badly: an insult, not a forgery. Across the top margin someone had scored a short line with a knife-point, deep enough to scar the wood beneath. No sentence. Only the mark. A smear of something that might have been wine or might have been worse.</w:t>
-      </w:r>
-    </w:p>
-    <w:p>
-      <w:r>
-        <w:rPr/>
-        <w:t>The friend, still in the atrium, went pale. “That is not literary criticism.”</w:t>
-      </w:r>
-    </w:p>
-    <w:p>
-      <w:r>
-        <w:rPr/>
-        <w:t>Cicero held the scarred tablet until his fingers stopped pretending to be steady. He thought of Atticus, of audiences, of the Capitol’s first day enlarged by memory. Then he ordered fresh copies. “Circulate it wider,” he said. “If they can mark one, let them learn there are many.”</w:t>
-      </w:r>
-    </w:p>
-    <w:p>
-      <w:r>
-        <w:rPr/>
-        <w:t>He slept poorly and woke eager. Eager men wrote faster than wise ones. He noticed the difference and wrote anyway. The knife-scar sat as applause he refused to name fear.</w:t>
-      </w:r>
-    </w:p>
-    <w:p>
-      <w:pPr>
-        <w:spacing w:before="280"/>
-      </w:pPr>
-      <w:r>
-        <w:rPr/>
-        <w:t>Chapter 26</w:t>
-      </w:r>
-    </w:p>
-    <w:p>
-      <w:r>
-        <w:rPr/>
-        <w:t>Provinces and Shadows</w:t>
-      </w:r>
-    </w:p>
-    <w:p>
-      <w:pPr>
-        <w:spacing w:before="200"/>
-      </w:pPr>
-      <w:r>
-        <w:rPr/>
-        <w:t>A Hundred Apiece</w:t>
-      </w:r>
-    </w:p>
-    <w:p>
-      <w:r>
-        <w:rPr/>
-        <w:t>The legions came off the ships from Macedonia looking for a consul, and Antony gave them one.</w:t>
-      </w:r>
-    </w:p>
-    <w:p>
-      <w:r>
-        <w:rPr/>
-        <w:t>He stood on a platform of planks on the harbour ground at Brundisium with the sea behind him and four legions in front, the Martian, the Fourth, the Second, the Thirty-fifth, and the old excitement went up through his legs the way it always did before a crowd of soldiers. These were Caesar’s men, raised for Parthia, the best-drilled legions in the world. He had drunk with half their centurions in Gaul. He knew how to stand in front of them. Shoulders loose, voice from the belly. Give them a joke first.</w:t>
-      </w:r>
-    </w:p>
-    <w:p>
-      <w:r>
-        <w:rPr/>
-        <w:t>He gave them the joke. A few laughed. Then he gave them the money.</w:t>
-      </w:r>
-    </w:p>
-    <w:p>
-      <w:r>
-        <w:rPr/>
-        <w:t>“A hundred denarii a man,” he said, “as a gift from your consul, on the day you land.”</w:t>
-      </w:r>
-    </w:p>
-    <w:p>
-      <w:r>
-        <w:rPr/>
-        <w:t>He heard the laugh begin at the back. It was not the laugh he had asked for. It went forward through the ranks the way fire goes along a dry hedge, and the front ranks did not stop it. Somebody near the Martian eagle called out a number. Antony did not hear the number. He heard the shape of it, and that it was larger than his.</w:t>
-      </w:r>
-    </w:p>
-    <w:p>
-      <w:r>
-        <w:rPr/>
-        <w:t>He knew then that the boy’s men had been in the camp before him. He had seen the leaflets on the quay that morning, scraps of papyrus trodden into the wet, and had stepped on them.</w:t>
-      </w:r>
-    </w:p>
-    <w:p>
-      <w:r>
-        <w:rPr/>
-        <w:t>“Who said that?” he said.</w:t>
-      </w:r>
-    </w:p>
-    <w:p>
-      <w:r>
-        <w:rPr/>
-        <w:t>Nobody said who.</w:t>
-      </w:r>
-    </w:p>
-    <w:p>
-      <w:r>
-        <w:rPr/>
-        <w:t>“Tribunes,” Antony said, not loud now, and the tribunes came to the foot of the planks. “I want the names of the men who were talking in your camps before I landed. The ones with money in their mouths. You know them. Bring me the lists.”</w:t>
-      </w:r>
-    </w:p>
-    <w:p>
-      <w:r>
-        <w:rPr/>
-        <w:t>By evening there were lists. He did not read them. He had the names of the centurions on them written on sherds and put into a helmet, because a consul could not kill four legions and could not let one laugh go unpaid either. In his host’s house, in the colonnade off the courtyard, the men whose sherds came out of the helmet were brought in one at a time.</w:t>
-      </w:r>
-    </w:p>
-    <w:p>
-      <w:r>
-        <w:rPr/>
-        <w:t>Fulvia sat beside him. She had asked to. He had not refused her; he did not refuse her much, and tonight he wanted someone in the colonnade who would not look away first. The soldiers doing the work did it quickly, because he had told them quickly. The sound was not loud. A grunt, a scuff on the paving, a weight going down. The second time it was the same. After that he stopped hearing the differences between them.</w:t>
-      </w:r>
-    </w:p>
-    <w:p>
-      <w:r>
-        <w:rPr/>
-        <w:t>At some point he looked at his wife. There was a fleck of red high on her cheekbone, under the eye. She had not moved her head and she did not move it now. She did not wipe it away while the next man was brought in, or the one after.</w:t>
-      </w:r>
-    </w:p>
-    <w:p>
-      <w:r>
-        <w:rPr/>
-        <w:t>When it was over the courtyard smelled of the sea and of the other thing. A slave brought a basin. Fulvia dipped two fingers and touched them to her cheek, without hurry, and looked at the water afterward.</w:t>
-      </w:r>
-    </w:p>
-    <w:p>
-      <w:r>
-        <w:rPr/>
-        <w:t>“Tomorrow they will take your hundred,” she said, “and not laugh.”</w:t>
-      </w:r>
-    </w:p>
-    <w:p>
-      <w:r>
-        <w:rPr/>
-        <w:t>“That’s what I want.”</w:t>
-      </w:r>
-    </w:p>
-    <w:p>
-      <w:r>
-        <w:rPr/>
-        <w:t>“Is it?” She dried her fingers on the slave’s cloth. “A man who laughs at your money still thinks you have money. A man who takes it in silence is counting the other offer. The boy said five hundred. They know the sum. Now they also know you kill for less.”</w:t>
-      </w:r>
-    </w:p>
-    <w:p>
-      <w:r>
-        <w:rPr/>
-        <w:t>Antony drank. The wine did nothing he asked of it. “The boy has some farms,” he said, “and the loan of Matius’s strongbox. I have four legions.”</w:t>
-      </w:r>
-    </w:p>
-    <w:p>
-      <w:r>
-        <w:rPr/>
-        <w:t>“You have four legions on a beach,” Fulvia said. “March them to Rome before they finish counting.”</w:t>
-      </w:r>
-    </w:p>
-    <w:p>
-      <w:r>
-        <w:rPr/>
-        <w:t>In the morning the ranks filed past the pay-tables and took the hundred apiece. They took it without a word. Antony stood on the planks and watched them do it and could not find the joke for it. Along the quay the boy’s leaflets lay where they had lain the day before, wet through. No one had picked them up. No one had needed to. A tribune of the Martians came to report the camp quiet and stayed a breath too long, looking at the colonnade.</w:t>
-      </w:r>
-    </w:p>
-    <w:p>
-      <w:r>
-        <w:rPr/>
-        <w:t>“They’re saying a name in the Fourth,” he said. “Not yours, consul.”</w:t>
-      </w:r>
-    </w:p>
-    <w:p>
-      <w:r>
-        <w:rPr/>
-        <w:t>“Let them say it on the march,” Antony said. “Marching is a cure for most opinions.”</w:t>
-      </w:r>
-    </w:p>
-    <w:p>
-      <w:pPr>
-        <w:spacing w:before="200"/>
-      </w:pPr>
-      <w:r>
-        <w:rPr/>
-        <w:t>Five Hundred</w:t>
-      </w:r>
-    </w:p>
-    <w:p>
-      <w:r>
-        <w:rPr/>
-        <w:t>The boy came to Casilinum himself, which nobody had expected.</w:t>
-      </w:r>
-    </w:p>
-    <w:p>
-      <w:r>
-        <w:rPr/>
-        <w:t>Laberius had walked over from the colony because Vibius said there would be money and Vibius was usually right about money and wrong about everything else. The square by the Volturnus bridge was full of men who had been told the same thing. Some had come on mules. One had come on a crutch. The boy stood on the steps of a temple with a cloak too warm for the day, thinner than his name, with a big young man at his shoulder who did the looking for both of them.</w:t>
-      </w:r>
-    </w:p>
-    <w:p>
-      <w:r>
-        <w:rPr/>
-        <w:t xml:space="preserve">He made a short speech. It was a bad speech. He said </w:t>
+        <w:t>whoever brings the head… from the treasury… if a slave, his freedom…</w:t>
+      </w:r>
+      <w:r>
+        <w:rPr/>
+        <w:t xml:space="preserve"> and lower, </w:t>
       </w:r>
       <w:r>
         <w:rPr>
           <w:i/>
         </w:rPr>
-        <w:t>my father</w:t>
-      </w:r>
-      <w:r>
-        <w:rPr/>
-        <w:t xml:space="preserve"> four times, and </w:t>
-      </w:r>
-      <w:r>
-        <w:rPr>
-          <w:i/>
-        </w:rPr>
-        <w:t>what is owed</w:t>
-      </w:r>
-      <w:r>
-        <w:rPr/>
-        <w:t xml:space="preserve"> twice, and he did not tell a single joke. The men listened the way men listen to a paymaster, which is to say for the number.</w:t>
-      </w:r>
-    </w:p>
-    <w:p>
-      <w:r>
-        <w:rPr/>
-        <w:t>“Five hundred denarii,” the boy said. “To every man who enrols. Now, at the tables. More when the work is done.”</w:t>
-      </w:r>
-    </w:p>
-    <w:p>
-      <w:r>
-        <w:rPr/>
-        <w:t>Nobody laughed. A noise went round the square that Laberius had heard twice in his life, both times on the morning of a donative, and the man on the crutch said “Five hundred” to himself as if the words had a taste.</w:t>
-      </w:r>
-    </w:p>
-    <w:p>
-      <w:r>
-        <w:rPr/>
-        <w:t xml:space="preserve">The scar-lipped veteran from the colony forum in the spring was standing three men along. He caught Laberius’s eye and lifted his chin. </w:t>
-      </w:r>
-      <w:r>
-        <w:rPr>
-          <w:i/>
-        </w:rPr>
-        <w:t>The shadow learned.</w:t>
-      </w:r>
-      <w:r>
-        <w:rPr/>
-        <w:t xml:space="preserve"> He did not need to say it.</w:t>
-      </w:r>
-    </w:p>
-    <w:p>
-      <w:r>
-        <w:rPr/>
-        <w:t>“Five hundred’s a number,” Laberius said to Vibius. “Brundisium will have heard it. Antony will say six.”</w:t>
-      </w:r>
-    </w:p>
-    <w:p>
-      <w:r>
-        <w:rPr/>
-        <w:t>“Antony said one,” Vibius said. “Ask the sailors.”</w:t>
-      </w:r>
-    </w:p>
-    <w:p>
-      <w:r>
-        <w:rPr/>
-        <w:t>There were three pay-tables under an awning by the bridge, and a clerk at each with the colony rolls open in front of him, the surveyor’s rolls, the ones with the plots marked in a neat hand. Laberius had not seen those rolls since a surveyor had read his name from one at Munda’s end and tied his twine. He had thought they lived in a cupboard in Rome where the dead man’s clerks kept them.</w:t>
-      </w:r>
-    </w:p>
-    <w:p>
-      <w:r>
-        <w:rPr/>
-        <w:t>The clerk at the middle table was a freedman with ink on his thumb and a cough. “Name.”</w:t>
-      </w:r>
-    </w:p>
-    <w:p>
-      <w:r>
-        <w:rPr/>
-        <w:t>“Sextus Laberius Cordus. Spain. Munda.”</w:t>
-      </w:r>
-    </w:p>
-    <w:p>
-      <w:r>
-        <w:rPr/>
-        <w:t>The clerk ran his thumb down a column, turned a leaf, ran it down again. “Laberius. Colony plot by Capua, fourth line from the Volturnus road, marked after Munda.” He looked up. “Twine, it says. Not stones yet.”</w:t>
-      </w:r>
-    </w:p>
-    <w:p>
-      <w:r>
-        <w:rPr/>
-        <w:t>“Twine,” Laberius said. “Still.”</w:t>
-      </w:r>
-    </w:p>
-    <w:p>
-      <w:r>
-        <w:rPr/>
-        <w:t>“The stones are a matter for after,” the clerk said, not unkindly. He had said it before that morning, many times. “The coin is now.” He wrote the day on a tablet, the fifth before the Ides of October, and Laberius’s name beside it, and pushed the tablet across for his mark.</w:t>
-      </w:r>
-    </w:p>
-    <w:p>
-      <w:r>
-        <w:rPr/>
-        <w:t>Laberius looked at the date. He looked at the column where his name sat in someone else’s neat hand, his row of twine, the road, Munda. The boy had not bought his land; the clerk had said as much. But the boy’s people had gone into the dead man’s cupboards and come out with the rolls, and carried them down the Appian Way to a bridge on the Volturnus, so that a clerk with a cough could find a man’s twine with his thumb. Antony’s man in the spring had offered wine and a road. This one knew where the dirt was.</w:t>
-      </w:r>
-    </w:p>
-    <w:p>
-      <w:r>
-        <w:rPr/>
-        <w:t>He made his mark.</w:t>
-      </w:r>
-    </w:p>
-    <w:p>
-      <w:r>
-        <w:rPr/>
-        <w:t>The bag the clerk counted out to him weighed about what a full water-skin weighed on the march. He felt it pull on his belt. Vibius, at the next table, was laughing for no reason with a bag in each hand, one of them borrowed off a man who had not enrolled.</w:t>
-      </w:r>
-    </w:p>
-    <w:p>
-      <w:r>
-        <w:rPr/>
-        <w:t>On the walk back over the bridge the scar-lipped veteran fell in beside him.</w:t>
-      </w:r>
-    </w:p>
-    <w:p>
-      <w:r>
-        <w:rPr/>
-        <w:t>“Feeds us now, the shadow,” the veteran said.</w:t>
-      </w:r>
-    </w:p>
-    <w:p>
-      <w:r>
-        <w:rPr/>
-        <w:t>“Pays us,” Laberius said. “It isn’t the same.”</w:t>
-      </w:r>
-    </w:p>
-    <w:p>
-      <w:r>
-        <w:rPr/>
-        <w:t>“Tastes the same.”</w:t>
-      </w:r>
-    </w:p>
-    <w:p>
-      <w:r>
-        <w:rPr/>
-        <w:t>“Ask me when he wants something for it,” Laberius said. The twine near Capua had not moved, and would not move tonight, and he knew it. He held the bag against his hip with one hand all the way home anyway.</w:t>
-      </w:r>
-    </w:p>
-    <w:p>
-      <w:pPr>
-        <w:spacing w:before="200"/>
-      </w:pPr>
-      <w:r>
-        <w:rPr/>
-        <w:t>The Statue</w:t>
-      </w:r>
-    </w:p>
-    <w:p>
-      <w:r>
-        <w:rPr/>
-        <w:t>He came into Rome with three thousand men and found the Forum smaller than he remembered.</w:t>
-      </w:r>
-    </w:p>
-    <w:p>
-      <w:r>
-        <w:rPr/>
-        <w:t>They held the Temple of Castor and its steps, which was the nearest thing in the Forum to a fort, and the men who had taken his five hundred stood about on the steps and in the street below with their swords on, looking at the city as if it might owe them something too. Octavian had written to Cicero every day for a week: come to Rome, stand beside me, the Senate listens to you. Cicero had written back from the coast with advice and without himself. Today he was still on the coast.</w:t>
-      </w:r>
-    </w:p>
-    <w:p>
-      <w:r>
-        <w:rPr/>
-        <w:t>The tribune Cannutius spoke first. He spoke against Antony well and at length, because he had nothing to lose by it and enjoyed the sound. Then he called Gaius Caesar to the front of the steps.</w:t>
-      </w:r>
-    </w:p>
-    <w:p>
-      <w:r>
-        <w:rPr/>
-        <w:t>Octavian had written the speech three times. He gave it the fourth way, shorter. He spoke of his father’s murder and his father’s friends, of the money Antony would not give the people and he had given them himself, of the consul who had killed Caesar’s centurions at Brundisium for laughing. Below him the veterans listened in a way he could not read. They had listened at Casilinum for the number. He did not know what they were listening for now.</w:t>
-      </w:r>
-    </w:p>
-    <w:p>
-      <w:r>
-        <w:rPr/>
-        <w:t>At the end, as he had planned, he turned to the bronze statue of Caesar that stood by the temple and lifted his right hand to it.</w:t>
-      </w:r>
-    </w:p>
-    <w:p>
-      <w:r>
-        <w:rPr/>
-        <w:t>“As I hope to attain my father’s honours,” he said, “I swear…”</w:t>
-      </w:r>
-    </w:p>
-    <w:p>
-      <w:r>
-        <w:rPr/>
-        <w:t>He heard the noise change before he finished. It came from the veterans, and it was not a cheer.</w:t>
-      </w:r>
-    </w:p>
-    <w:p>
-      <w:r>
-        <w:rPr/>
-        <w:t>“We came to guard you,” a man called from the street. Octavian knew the face a moment later: a scar through the lip, one of the Casilinum men. “From him. Not to kill him. He was Caesar’s too.”</w:t>
-      </w:r>
-    </w:p>
-    <w:p>
-      <w:r>
-        <w:rPr/>
-        <w:t xml:space="preserve">Others took it up. </w:t>
-      </w:r>
-      <w:r>
-        <w:rPr>
-          <w:i/>
-        </w:rPr>
-        <w:t>Caesar’s too.</w:t>
-      </w:r>
-      <w:r>
-        <w:rPr/>
-        <w:t xml:space="preserve"> </w:t>
-      </w:r>
-      <w:r>
-        <w:rPr>
-          <w:i/>
-        </w:rPr>
-        <w:t>We didn’t enrol to fight the consul.</w:t>
-      </w:r>
-      <w:r>
-        <w:rPr/>
-        <w:t xml:space="preserve"> A man near the steps took off his helmet and held it under his arm like a man leaving a dinner.</w:t>
-      </w:r>
-    </w:p>
-    <w:p>
-      <w:r>
-        <w:rPr/>
-        <w:t>Octavian finished the oath, because there was nothing to be done with half an oath. Then he stood and watched his army decide.</w:t>
-      </w:r>
-    </w:p>
-    <w:p>
-      <w:r>
-        <w:rPr/>
-        <w:t>By dark a third of them had gone. By the next morning it was more. They went in twos and threes, in the direction of their colonies, some of them still with his five hundred in their belts. He let them go. He could not have stopped them without asking the rest to stop them, and he did not know what the rest would do.</w:t>
-      </w:r>
-    </w:p>
-    <w:p>
-      <w:r>
-        <w:rPr/>
-        <w:t>A veteran by the temple steps did not go. He was an ordinary man, broad, quiet, with Campanian dust still on his boots, and he stood with his back to a column and counted the men who were leaving as they went past him, his lips moving. When he caught Octavian looking at him he stopped counting and did not explain.</w:t>
-      </w:r>
-    </w:p>
-    <w:p>
-      <w:r>
-        <w:rPr/>
-        <w:t>“Antony will be in the city in a fortnight,” Agrippa said that night. “With four legions.”</w:t>
-      </w:r>
-    </w:p>
-    <w:p>
-      <w:r>
-        <w:rPr/>
-        <w:t>“Then we will not be in it,” Octavian said.</w:t>
-      </w:r>
-    </w:p>
-    <w:p>
-      <w:r>
-        <w:rPr/>
-        <w:t>They went north into Etruria, to Arretium, where Maecenas’s family had money and houses and the winter came early. Octavian drilled what he had left on frozen ground and wrote to Cicero again, more carefully. He did not mention the oath, or the helmet. He had learned at the Temple of Castor that veterans would take his money to stand near Antony and would not take it to kill him. He did not yet know what he had that would change their minds.</w:t>
-      </w:r>
-    </w:p>
-    <w:p>
-      <w:r>
-        <w:rPr/>
-        <w:t>Toward the end of the month a rider came up the road from the south, one of Agrippa’s, with frost in his beard.</w:t>
-      </w:r>
-    </w:p>
-    <w:p>
-      <w:r>
-        <w:rPr/>
-        <w:t>“Alba Fucens,” he said. “The Martian legion. They shut the gates on Antony and shot at him from the walls. They’ve declared for you.”</w:t>
-      </w:r>
-    </w:p>
-    <w:p>
-      <w:r>
-        <w:rPr/>
-        <w:t>Octavian put the tablet down.</w:t>
-      </w:r>
-    </w:p>
-    <w:p>
-      <w:r>
-        <w:rPr/>
-        <w:t>“And the Fourth,” the rider said. “Two days after. Antony came to the walls with money in his hand and talked about Brundisium as if they’d forgotten it. They hadn’t.”</w:t>
-      </w:r>
-    </w:p>
-    <w:p>
-      <w:r>
-        <w:rPr/>
-        <w:t>Agrippa let out a breath that was almost a laugh. Octavian did not laugh. He sat down at the table, because his knees wanted him to, and kept his hands flat on it until they were still.</w:t>
-      </w:r>
-    </w:p>
-    <w:p>
-      <w:r>
-        <w:rPr/>
-        <w:t>“Pay them,” he said. “What I promised. Then the same again.”</w:t>
-      </w:r>
-    </w:p>
-    <w:p>
-      <w:r>
-        <w:rPr/>
-        <w:t>“With what?” Agrippa said.</w:t>
-      </w:r>
-    </w:p>
-    <w:p>
-      <w:r>
-        <w:rPr/>
-        <w:t>Octavian did not answer that. He took a clean tablet and began a letter to Cicero, the shortest he had written him. This time he knew he would have an answer.</w:t>
-      </w:r>
-    </w:p>
-    <w:p>
-      <w:pPr>
-        <w:spacing w:before="200"/>
-      </w:pPr>
-      <w:r>
-        <w:rPr/>
-        <w:t>Cisalpine</w:t>
-      </w:r>
-    </w:p>
-    <w:p>
-      <w:r>
-        <w:rPr/>
-        <w:t>Decimus read Antony’s pressure in dispatches before he heard it in hoofbeats.</w:t>
-      </w:r>
-    </w:p>
-    <w:p>
-      <w:r>
-        <w:rPr/>
-        <w:t>The tablets arrived with seals that looked like courtesy and read like a hand on a throat. One letter offered friendship in the same sentence as a deadline. Decimus set that letter under a stone so it couldn’t blow into the yard and become gossip.</w:t>
-      </w:r>
-    </w:p>
-    <w:p>
-      <w:r>
-        <w:rPr/>
-        <w:t>At mid-morning an envoy came anyway, cloak clean, smile practised, the sort of man who carried other men’s threats as if they were invitations to dinner. He stood in the command room where the wall map of the Via Aemilia still showed Decimus’s pins as facts. An aide hovered with a wax roll. A levy clerk waited at the door with pay marks still wet. The room wanted to be polite. It was already a siege rehearsal.</w:t>
-      </w:r>
-    </w:p>
-    <w:p>
-      <w:r>
-        <w:rPr/>
-        <w:t>“The consul asks only what the law already leans toward,” the envoy said. “Hand him Cisalpine in good order. Keep your honour. Keep your skin. Rome will find you another usefulness.”</w:t>
-      </w:r>
-    </w:p>
-    <w:p>
-      <w:r>
-        <w:rPr/>
-        <w:t>“Rome found me this one,” Decimus said. He didn’t offer a chair. Chairs made threats look like visits.</w:t>
-      </w:r>
-    </w:p>
-    <w:p>
-      <w:r>
-        <w:rPr/>
-        <w:t>“He will call it a swap,” the envoy went on, mild. “You will call it wisdom. The Senate will call it clarification, when clarification arrives.”</w:t>
-      </w:r>
-    </w:p>
-    <w:p>
-      <w:r>
-        <w:rPr/>
-        <w:t>Decimus knew the swap because it had been done to him while he was on the road. In early summer Antony had walked a law through an assembly crowded with his veterans: Cisalpine to Antony for five years, and the Macedonian legions brought home across the sea to go with him. Decimus held the province on Caesar’s grant. The Senate had never voted to take it from him. It had never voted to keep it for him either, and he had stopped waiting for that letter.</w:t>
-      </w:r>
-    </w:p>
-    <w:p>
-      <w:r>
-        <w:rPr/>
-        <w:t xml:space="preserve">Decimus heard the gap in that sentence: </w:t>
-      </w:r>
-      <w:r>
-        <w:rPr>
-          <w:i/>
-        </w:rPr>
-        <w:t>when</w:t>
-      </w:r>
-      <w:r>
-        <w:rPr/>
-        <w:t>. Clarification that might never leave the stable. “Tell him I call it mine until the Senate says otherwise, or until he brings enough men to rename facts. He can call the renaming breakfast if he likes.”</w:t>
-      </w:r>
-    </w:p>
-    <w:p>
-      <w:r>
-        <w:rPr/>
-        <w:t>The envoy’s eyes flicked once to the levy roll on the table: names, marks for pay, a smudge where someone’s thumb had been nervous. “Your men still love Caesar’s pay more than your legality. My principal has a longer memory for that love than you do.”</w:t>
-      </w:r>
-    </w:p>
-    <w:p>
-      <w:r>
-        <w:rPr/>
-        <w:t>That was the first true thing said. Decimus felt it land under the sternum where the Ides still sat like a key he couldn’t return. “Get out,” he said. “If you return with an army, return with an army. Do not return with grammar.”</w:t>
-      </w:r>
-    </w:p>
-    <w:p>
-      <w:r>
-        <w:rPr/>
-        <w:t>The envoy paused at the threshold long enough for the room to hear the complaint under the courtesy: “He will remember the refusal more than the wit.” Then he left.</w:t>
-      </w:r>
-    </w:p>
-    <w:p>
-      <w:r>
-        <w:rPr/>
-        <w:t>After the man was gone, Decimus walked the gates. Hinges took oil. Oil was easier than ideology. Ideology had not kept his street from burning in March.</w:t>
-      </w:r>
-    </w:p>
-    <w:p>
-      <w:r>
-        <w:rPr/>
-        <w:t>In the yard he found the levy spokesman, an older miles with a Caesarian scar and a mouth that had learned to ask for bread without kneeling. “We heard the cloak,” the man said. “If Antony comes, do we fight men who still drink to the name we buried with?”</w:t>
-      </w:r>
-    </w:p>
-    <w:p>
-      <w:r>
-        <w:rPr/>
-        <w:t>“You fight the men who try to take the road,” Decimus said.</w:t>
-      </w:r>
-    </w:p>
-    <w:p>
-      <w:r>
-        <w:rPr/>
-        <w:t>“And pay?”</w:t>
-      </w:r>
-    </w:p>
-    <w:p>
-      <w:r>
-        <w:rPr/>
-        <w:t>Decimus looked at the chest. Coin still rattled when the lid shifted, but shallowly, honest about the bottom. He ordered a partial donative for the gate cohorts, coin he’d meant to hold for spring, and watched the spokesman’s shoulders drop half an inch. Loyalty bought today might still open a gate tomorrow.</w:t>
-      </w:r>
-    </w:p>
-    <w:p>
-      <w:r>
-        <w:rPr/>
-        <w:t>The spokesman weighed the purse with his eyes, not his hands. “Partial,” he said. “That’s a word that tastes like next week’s apology.”</w:t>
-      </w:r>
-    </w:p>
-    <w:p>
-      <w:r>
-        <w:rPr/>
-        <w:t>Decimus almost grinned, the old cheer that had opened mornings, and stopped it before it became a performance. “Then taste it and still hold the hinge. Next week’s apology is still coin I have to find.” The spokesman barked once, short, surprised, and the yard heard it as weather, not mutiny. Decimus scheduled the rest of the pay talk for morning. He hated that mornings now had prices.</w:t>
-      </w:r>
-    </w:p>
-    <w:p>
-      <w:r>
-        <w:rPr/>
-        <w:t>He wrote to Cicero with the stiff pride of a man who still believed praise from Rome was supply, and knew privately that praise was thinner than grain. The same week he wrote Plancus again, shorter, less perfume, asking for two cohorts’ worth of grain and a date, any date, for a meeting on the road.</w:t>
-      </w:r>
-    </w:p>
-    <w:p>
-      <w:r>
-        <w:rPr/>
-        <w:t xml:space="preserve">The answer did not arrive alone. A courier who had eaten at Plancus’s table stood in the yard with mud on one boot and perfume still clinging to the other, Plancus’s weather made flesh. “He admires your hinges,” the man said, practising the pretty line. “He understands Antony’s appetite. His own theatre is unsettled. Grain and cohorts cannot be spared.” Decimus waited for a date. The courier’s eyes found the gate-hinge instead. “He told me to say </w:t>
-      </w:r>
-      <w:r>
-        <w:rPr>
-          <w:i/>
-        </w:rPr>
-        <w:t>yet</w:t>
-      </w:r>
-      <w:r>
-        <w:rPr/>
-        <w:t xml:space="preserve">, if you pressed. </w:t>
-      </w:r>
-      <w:r>
-        <w:rPr>
-          <w:i/>
-        </w:rPr>
-        <w:t>Yet</w:t>
-      </w:r>
-      <w:r>
-        <w:rPr/>
-        <w:t xml:space="preserve"> is not a day on a road.” Soft refusal with a human face stacked the same height as Antony’s hard threats on the table. Decimus dismissed the man before admiration could invent another perfume. The Lepidus channel he had seeded on the road north, a roof near Mutina’s approaches, a messenger who would not meet his eyes, still returned nothing. He did not send a second tablet to ask why.</w:t>
-      </w:r>
-    </w:p>
-    <w:p>
-      <w:r>
-        <w:rPr/>
-        <w:t>The aide asked anyway, one finger holding open the empty slot in the letter-case. “Lepidus has more legions over the mountains than Plancus has. The whole coast from the Alps to Spain, and the chief priest’s robe on top of it. One word from him and Antony has friends at his back as well as a wall in front.”</w:t>
-      </w:r>
-    </w:p>
-    <w:p>
-      <w:r>
-        <w:rPr/>
-        <w:t>“One word from Lepidus goes to whoever is standing nearest when he has to say it,” Decimus said. “Pray it’s us.” He did not pray. He sent the aide to count the grain.</w:t>
-      </w:r>
-    </w:p>
-    <w:p>
-      <w:r>
-        <w:rPr/>
-        <w:t>A southern courier arrived near dusk with dust on his cloak and a packet that smelled of harbour pitch. The queen was home in Alexandria, boy and all, months gone from Caesar’s gardens, and her people were calling it continuity to anyone who asked, not flight. The courier said it like marketplace weather. Decimus did not chase the rumour across the sea. He had hinges. He had Antony’s hunger. A queen on salt water was confirmation that one fuse had left Italy without needing his map to light it. He set the packet under the stone with Antony’s courtesy-threats. What the queen meant to do with Egypt was Egypt’s business until it had ships in his harbour.</w:t>
-      </w:r>
-    </w:p>
-    <w:p>
-      <w:r>
-        <w:rPr/>
-        <w:t>Cicero’s latest letter, opened on the same stone, carried a margin note in Cicero’s own hand, unease, not fact. Sextus still held, or seemed to hold, the western sea’s knife; do not invent a Republic that ignores fleets. A second report under the note claimed Sextus finished. Cicero had kept both coals. Decimus kept the contradiction as one more unfinished edge on a board already loud with Antony. He almost smiled at philosophers discovering docks. The smile died when he remembered his own thinning chest.</w:t>
-      </w:r>
-    </w:p>
-    <w:p>
-      <w:r>
-        <w:rPr/>
-        <w:t>A different courier asked whether to answer Antony’s latest written “request” with softness. Decimus chose a sentence that sounded like law and felt like a door barred from inside.</w:t>
-      </w:r>
-    </w:p>
-    <w:p>
-      <w:r>
-        <w:rPr/>
-        <w:t>The sentence did not need an answer. A rider came up the Via Aemilia from Ariminum with his horse lathered to the girth: Antony had left Rome with what the boy had left him of the Macedonian legions and was on the road north. Not hurrying. That was worse.</w:t>
-      </w:r>
-    </w:p>
-    <w:p>
-      <w:r>
-        <w:rPr/>
-        <w:t>Decimus did not wait to be caught on the open plain. He took his legions into Mutina, because Mutina had walls, a granary, and the road running past its gate. In the yard, while carts were loading, the levy spokesman asked what came next.</w:t>
-      </w:r>
-    </w:p>
-    <w:p>
-      <w:r>
-        <w:rPr/>
-        <w:t>“He comes up the road,” Decimus said. “He can’t march on into Gaul with a town full of legions at his back, so he stops. He digs ditches round us and waits for us to eat the last ox. We wait for an army from Rome to come and break his ring. Whoever’s count runs out first loses.”</w:t>
-      </w:r>
-    </w:p>
-    <w:p>
-      <w:r>
-        <w:rPr/>
-        <w:t>“Which army?” the spokesman said. “Rome’s busy writing.”</w:t>
-      </w:r>
-    </w:p>
-    <w:p>
-      <w:r>
-        <w:rPr/>
-        <w:t>“Next year’s,” Decimus said. “On the Kalends the consulship leaves Antony’s hands. Caesar named the next two before he died. Aulus Hirtius, who writes better than he rides and has been sick since spring. Gaius Vibius Pansa, who governed provinces for Caesar and can get farm boys into armour faster than most men get senators into a vote. Letters can’t raise legions. Consuls can, and lead them. Those two are the only swords the Senate owns.”</w:t>
-      </w:r>
-    </w:p>
-    <w:p>
-      <w:r>
-        <w:rPr/>
-        <w:t>“Hirtius and Pansa.” The spokesman worked it through aloud. “Caesar’s men. Coming to get Caesar’s…” He stopped. “Coming to get you out.”</w:t>
-      </w:r>
-    </w:p>
-    <w:p>
-      <w:r>
-        <w:rPr/>
-        <w:t>“Yes.” Decimus did not help him finish the first sentence. It would only be funny if they arrived.</w:t>
-      </w:r>
-    </w:p>
-    <w:p>
-      <w:r>
-        <w:rPr/>
-        <w:t xml:space="preserve">Inside Mutina he had the draught oxen killed and salted in the granary yard, every beast that could pull a cart, because a shut town had no use for carts and a great deal of use for meat. The butchers worked on past dark by torchlight. Brine and blood ran together in the gutter. The spokesman watched with his arms folded and did not say </w:t>
-      </w:r>
-      <w:r>
-        <w:rPr>
-          <w:i/>
-        </w:rPr>
-        <w:t>partial</w:t>
-      </w:r>
-      <w:r>
-        <w:rPr/>
-        <w:t>.</w:t>
-      </w:r>
-    </w:p>
-    <w:p>
-      <w:r>
-        <w:rPr/>
-        <w:t>Later he walked Mutina’s wall-walk and tasted snow early. The key in his chest cut both ways. It had opened Caesar’s morning. It might yet open his own throat. He checked a hinge twice and didn’t tell the sentry why.</w:t>
-      </w:r>
-    </w:p>
-    <w:p>
-      <w:pPr>
-        <w:spacing w:before="280"/>
-      </w:pPr>
-      <w:r>
-        <w:rPr/>
-        <w:t>Chapter 27</w:t>
-      </w:r>
-    </w:p>
-    <w:p>
-      <w:r>
-        <w:rPr/>
-        <w:t>Mutina Begins</w:t>
-      </w:r>
-    </w:p>
-    <w:p>
-      <w:pPr>
-        <w:spacing w:before="200"/>
-      </w:pPr>
-      <w:r>
-        <w:rPr/>
-        <w:t>Walls</w:t>
-      </w:r>
-    </w:p>
-    <w:p>
-      <w:pPr>
-        <w:spacing w:before="200"/>
-      </w:pPr>
-      <w:r>
-        <w:rPr/>
-        <w:t>Between the lines</w:t>
-      </w:r>
-    </w:p>
-    <w:p>
-      <w:r>
-        <w:rPr/>
-        <w:t>They met where the ditch stank of melt and horse and the kind of truce that lasted only as long as both sides wanted a witness.</w:t>
-      </w:r>
-    </w:p>
-    <w:p>
-      <w:r>
-        <w:rPr/>
-        <w:t>Snow threatened without committing. A herald’s voice cracked on a title. Someone on Antony’s side laughed and was glared quiet. Pacuvius waited two spear-lengths back with the patience of a man who preferred storm to grammar. On Decimus’s side an aide held a tablet of Antony’s demands that had already been refused twice in writing.</w:t>
-      </w:r>
-    </w:p>
-    <w:p>
-      <w:r>
-        <w:rPr/>
-        <w:t xml:space="preserve">Antony came on foot the last stretch, body first, cloak open enough to show he was not hiding a sword he intended to use </w:t>
-      </w:r>
-      <w:r>
-        <w:rPr>
-          <w:i/>
-        </w:rPr>
-        <w:t>yet</w:t>
-      </w:r>
-      <w:r>
-        <w:rPr/>
-        <w:t>. Decimus came with clean hands and dirty boots, the old habit of looking like the honest party. Cheer might still open a morning. It might not.</w:t>
-      </w:r>
-    </w:p>
-    <w:p>
-      <w:r>
-        <w:rPr/>
-        <w:t>“Last talk,” Antony said, not loud. Loud was for walls. “Yield Mutina. Keep your skin. I take the province the consul needs. You take a road south that isn’t a grave.”</w:t>
-      </w:r>
-    </w:p>
-    <w:p>
-      <w:r>
-        <w:rPr/>
-        <w:t>“I hold a legal command,” Decimus said. “The Senate…”</w:t>
-      </w:r>
-    </w:p>
-    <w:p>
-      <w:r>
-        <w:rPr/>
-        <w:t>“The Senate writes music,” Antony said. “I write pay. Your grain weeks are shorter than your letters to Cicero admit. I have counted your smoke. Cooking smoke, not forge smoke. You are eating carefully. Careful men surrender while they can still walk.”</w:t>
-      </w:r>
-    </w:p>
-    <w:p>
-      <w:r>
-        <w:rPr/>
-        <w:t>Decimus felt the hit. He had not known Antony’s count was that close. He kept his face officer-flat. “Hirtius will come.”</w:t>
-      </w:r>
-    </w:p>
-    <w:p>
-      <w:r>
-        <w:rPr/>
-        <w:t>“Hirtius will come when he can sit a horse,” Antony said. “Pansa will come when he has taught enough farm boys which end of a pilum goes forward. Neither of them is consul until the Kalends, and neither of them is here. Until then you have hinges and hope, and hope won’t fill a granary.” He glanced once at Mutina’s wall. “You killed a man who trusted your cheer. Do not ask me to trust your legality.”</w:t>
-      </w:r>
-    </w:p>
-    <w:p>
-      <w:r>
-        <w:rPr/>
-        <w:t>Antony had opened a count in public, not a negotiation. Decimus’s throat tightened, the old key turning. He didn’t climb down. Climbing down would’ve looked like confession.</w:t>
-      </w:r>
-    </w:p>
-    <w:p>
-      <w:r>
-        <w:rPr/>
-        <w:t>“No,” Decimus said. “Not for breakfast. Not for your count of my smoke.”</w:t>
-      </w:r>
-    </w:p>
-    <w:p>
-      <w:r>
-        <w:rPr/>
-        <w:t>Antony’s mouth did something almost like a smile. “Then we introduce you to winter.”</w:t>
-      </w:r>
-    </w:p>
-    <w:p>
-      <w:r>
-        <w:rPr/>
-        <w:t>They parted without clasping. The truce ended when the first boot left the ditch mud. Behind Decimus, the aide whispered, “He bluffed the grain.”</w:t>
-      </w:r>
-    </w:p>
-    <w:p>
-      <w:r>
-        <w:rPr/>
-        <w:t>“He might have,” Decimus said. “I cannot un-eat what we have already not eaten.” The aide’s mouth twitched. “At least he didn’t offer you a chair. Chairs make threats look like visits.” Decimus almost laughed, then didn’t. Laughing in a ditch after refusing winter was how men became other men’s stories.</w:t>
-      </w:r>
-    </w:p>
-    <w:p>
-      <w:r>
-        <w:rPr/>
-        <w:t>That night a courier brought Plancus’s newest courtesy: admiration for Mutina’s hinges, regret that his own columns were “not yet free to join,” a promise dated after a thaw that had not begun. Decimus set the tablet under the same stone as Antony’s old threats. Plancus’s courtesy weighed like another empty sack. The smoke count was already short.</w:t>
-      </w:r>
-    </w:p>
-    <w:p>
-      <w:pPr>
-        <w:spacing w:before="200"/>
-      </w:pPr>
-      <w:r>
-        <w:rPr/>
-        <w:t>Antony</w:t>
-      </w:r>
-    </w:p>
-    <w:p>
-      <w:r>
-        <w:rPr/>
-        <w:t>He rode back smelling snow and horse and impatience. Pacuvius wanted storm now. Antony held the storm one more day, not mercy, timing. Timing kept soldiers paid long enough to hate the right wall.</w:t>
-      </w:r>
-    </w:p>
-    <w:p>
-      <w:r>
-        <w:rPr/>
-        <w:t>A scout reported smoke from the town’s edge, cooking, not surrender. Antony nodded. “He thinks a province is a personality,” he told Pacuvius. “Let him eat posture.”</w:t>
-      </w:r>
-    </w:p>
-    <w:p>
-      <w:pPr>
-        <w:spacing w:before="200"/>
-      </w:pPr>
-      <w:r>
-        <w:rPr/>
-        <w:t>Decimus</w:t>
-      </w:r>
-    </w:p>
-    <w:p>
-      <w:r>
-        <w:rPr/>
-        <w:t>He watched the lines tighten and wrote fewer letters that pretended optimism.</w:t>
-      </w:r>
-    </w:p>
-    <w:p>
-      <w:r>
-        <w:rPr/>
-        <w:t>“Hirtius will come,” the aide said again, needing it.</w:t>
-      </w:r>
-    </w:p>
-    <w:p>
-      <w:r>
-        <w:rPr/>
-        <w:t>“After the Kalends,” Decimus said. “Him and Pansa both. Until then we eat salt ox and count hinges.”</w:t>
-      </w:r>
-    </w:p>
-    <w:p>
-      <w:r>
-        <w:rPr/>
-        <w:t>He walked the walls at night with a cloak that did not keep the Ides out. The deed felt far and stupidly intimate, a debt owed a corpse who had trusted his cheer. An aide offered wine. Decimus refused, then took half a cup anyway. He checked a gate twice and didn’t tell anyone why the second check felt like apology. Below, Antony’s fires multiplied. The siege had a face now. The face that had counted his smoke.</w:t>
-      </w:r>
-    </w:p>
-    <w:p>
-      <w:pPr>
-        <w:spacing w:before="200"/>
-      </w:pPr>
-      <w:r>
-        <w:rPr/>
-        <w:t>The Senate’s Sword</w:t>
-      </w:r>
-    </w:p>
-    <w:p>
-      <w:r>
-        <w:rPr/>
-        <w:t>Cicero argued Octavian into usefulness the way he argued clauses into laws. A sweating senator on the end bench, near the doors, feared Antony more than boys. Octavian stood on the threshold among the men who listened through the open doors: not a senator, so not inside, and present enough to be aimed.</w:t>
-      </w:r>
-    </w:p>
-    <w:p>
-      <w:r>
-        <w:rPr/>
-        <w:t>The consuls’ chairs had new men in them. Antony’s year was over; Antony was in a ditch outside Mutina. Hirtius sat wrapped too warmly, the spring’s sickness still in his cheekbones. Octavian had read his last book of the Gallic war at Apollonia and privately thought it better than the dead man’s. Pansa sat beside him, broad and plain, a list of recruits and pay open on his knee before the auspices were cold. Both had been Caesar’s men. Caesar had named both to this year himself. Cicero called them the Senate’s swords. Octavian counted it plainer from the doorway: the only two men in the room with the right to raise legions and lead them, and the fathers meant to send them north to break the ring around Decimus. Cicero wanted a third blade to go with them.</w:t>
-      </w:r>
-    </w:p>
-    <w:p>
-      <w:r>
-        <w:rPr/>
-        <w:t xml:space="preserve">Cicero read the motion in his court voice. Thanks to the Martian legion and the Fourth, “who left the consul Antony and came over to the Senate and to Gaius Caesar.” Thanks to the veterans “whom Gaius Caesar raised at his own cost.” And for Gaius Caesar himself a praetor’s command and a seat among the fathers, so that the legions he already had would at last belong to a law. Octavian heard </w:t>
-      </w:r>
-      <w:r>
-        <w:rPr>
-          <w:i/>
-        </w:rPr>
-        <w:t>at his own cost</w:t>
-      </w:r>
-      <w:r>
-        <w:rPr/>
-        <w:t xml:space="preserve"> and thought of the actual cost: five hundred denarii a man through the Campanian colonies in the autumn, Philippus’s face when the chests went out, Antony at Brundisium offering his own soldiers a hundred apiece and hearing the ranks laugh. The Senate was thanking him for a crime it had decided to need.</w:t>
-      </w:r>
-    </w:p>
-    <w:p>
-      <w:r>
-        <w:rPr/>
-        <w:t xml:space="preserve">“The young Caesar,” Cicero said, and the name seemed to catch in his throat on the way out, “will march with the consuls and defend the state against Antony’s madness.” The senator muttered </w:t>
-      </w:r>
-      <w:r>
-        <w:rPr>
-          <w:i/>
-        </w:rPr>
-        <w:t>adoption</w:t>
-      </w:r>
-      <w:r>
-        <w:rPr/>
-        <w:t xml:space="preserve"> and </w:t>
-      </w:r>
-      <w:r>
-        <w:rPr>
-          <w:i/>
-        </w:rPr>
-        <w:t>armies</w:t>
-      </w:r>
-      <w:r>
-        <w:rPr/>
-        <w:t xml:space="preserve"> in one breath, hoping grammar could make them one animal, then closed his mouth into agreement. Octavian watched Cicero take the closing for virtue’s return.</w:t>
-      </w:r>
-    </w:p>
-    <w:p>
-      <w:r>
-        <w:rPr/>
-        <w:t xml:space="preserve">Octavian listened to himself become a tool. When Cicero’s gaze sought approval, he gave a nod calibrated to obedience and nothing else. He didn’t think </w:t>
-      </w:r>
-      <w:r>
-        <w:rPr>
-          <w:i/>
-        </w:rPr>
-        <w:t>empire</w:t>
-      </w:r>
-      <w:r>
-        <w:rPr/>
-        <w:t xml:space="preserve">. He thought </w:t>
-      </w:r>
-      <w:r>
-        <w:rPr>
-          <w:i/>
-        </w:rPr>
-        <w:t>survive the week without looking grateful for their fear.</w:t>
-      </w:r>
-      <w:r>
-        <w:rPr/>
-        <w:t xml:space="preserve"> A clerk miswrote his age. He corrected the number and left the tone alone. Hirtius looked at him once, the look of a man who had copied out Caesar’s sentences for years and now found the name signed in a boy’s hand. Octavian held the look until Hirtius let it go. Pansa did not look up. He was counting.</w:t>
-      </w:r>
-    </w:p>
-    <w:p>
-      <w:r>
-        <w:rPr/>
-        <w:t>Agrippa stood where the Curia fringe still smelled of wet wool and ambition. Close enough to hear Pacuvius’s name travel in a courier’s mutter, Antony’s storm-man still pricing timing at Mutina. Far enough that senators could pretend the boy arrived alone. A sweating senator wanted Octavian to smile gratitude. Agrippa did not move. Stillness was the cost: if he filled the silence, they would aim him next. Octavian felt the stillness as a withheld hand, Apollonia’s old inventory without the bread joke, and kept his own nod thin.</w:t>
-      </w:r>
-    </w:p>
-    <w:p>
-      <w:r>
-        <w:rPr/>
-        <w:t>Afterward a senator clasped his arm and called him the Republic’s luck. Octavian returned the clasp at half strength. Half strength still looked like gratitude if you did not measure. Agrippa’s stillness held until the clasp ended. Only then did he match pace toward the vendor street. A northern courier’s fragments stayed unmerged in Octavian’s hand: Decimus holding, Antony digging, Pacuvius still hungry for storm. Cicero left looking like a man certain he had saved the Republic. Outside, a vendor sold hot food and called no one Caesar. Octavian heard him and didn’t correct him.</w:t>
-      </w:r>
-    </w:p>
-    <w:p>
-      <w:pPr>
-        <w:spacing w:before="360"/>
-      </w:pPr>
-      <w:r>
-        <w:rPr/>
-        <w:t>Act 5: Mutina to Philippi</w:t>
-      </w:r>
-    </w:p>
-    <w:p>
-      <w:pPr>
-        <w:spacing w:before="280"/>
-      </w:pPr>
-      <w:r>
-        <w:rPr/>
-        <w:t>Chapter 28</w:t>
-      </w:r>
-    </w:p>
-    <w:p>
-      <w:r>
-        <w:rPr/>
-        <w:t>Mutina Field</w:t>
-      </w:r>
-    </w:p>
-    <w:p>
-      <w:pPr>
-        <w:spacing w:before="200"/>
-      </w:pPr>
-      <w:r>
-        <w:rPr/>
-        <w:t>Mud</w:t>
-      </w:r>
-    </w:p>
-    <w:p>
-      <w:r>
-        <w:rPr/>
-        <w:t>Laberius’s world narrowed to mud and which eagle still stood.</w:t>
-      </w:r>
-    </w:p>
-    <w:p>
-      <w:r>
-        <w:rPr/>
-        <w:t>In rooms with clean sandals this would be named success before the mud dried. In the ditch it was screaming. Martians refusing to be held. Someone’s javelin nearly killing him until a voice yelled his century’s joke-name. Antony’s men came out hard. Hard enough that Laberius smelled the old Spanish stubbornness again, the kind that did not care who Rome called consul. Hirtius hit harder when the day turned. Laberius didn’t see strategy. He saw a standard tilt. He saw a friend open at the neck. Blood mixed with meltwater and ran pink off the rim of his shield.</w:t>
-      </w:r>
-    </w:p>
-    <w:p>
-      <w:r>
-        <w:rPr/>
-        <w:t>Vibius spat black grit. “Win,” he said. “Then count.”</w:t>
-      </w:r>
-    </w:p>
-    <w:p>
-      <w:r>
-        <w:rPr/>
-        <w:t>“Count what?” said the man behind them. “Five hundred from the boy at Capua to stand in this.”</w:t>
-      </w:r>
-    </w:p>
-    <w:p>
-      <w:r>
-        <w:rPr/>
-        <w:t>“Five hundred beats Antony’s hundred,” Vibius said. Laberius had taken the boy’s coin in the end, in the autumn, when the shadow with a seal learned to feed men. It had bought his boots for the young Caesar’s ranks and this ditch. It had not moved the twine.</w:t>
-      </w:r>
-    </w:p>
-    <w:p>
-      <w:r>
-        <w:rPr/>
-        <w:t>Pay talk lived under the noise like a second drum. Who owed donatives. Which Caesar’s name still fed mouths. Whether Hirtius’s clean reputation meant Rome finally understood mud. Capua still sat in Laberius’s boots as an unpaid date. Forum smoke had taught him the dirt could walk without clerks. Mutina mud taught him it could drown you while walking. A boy from another century asked if they were fighting for the Senate or for bread. Laberius said, “Fight for the man on your left. Capua argues later, if later still has a road.”</w:t>
-      </w:r>
-    </w:p>
-    <w:p>
-      <w:r>
-        <w:rPr/>
-        <w:t>Between assaults, when the yelling thinned and the cold found room, Vibius and two men from the contubernium talked dirt the way other men talked gods. “Capua was a date when the paymaster breathed,” Vibius said, voice flat. Mud did not buy jokes. “Now Capua is only what we stand in.” The second man wiped pink melt from his shield rim. “Still wants a road, if we live.” Laberius did not finish the thought aloud. Finishing would have made Capua a speech. He kept his century from becoming a gap. When a signal dipped wrong in the wet air, he held the line anyway. Signals lied as often as clerks.</w:t>
-      </w:r>
-    </w:p>
-    <w:p>
-      <w:r>
-        <w:rPr/>
-        <w:t>Yell-rumours arrived before facts. Someone claimed a consul down. Someone claimed both. Someone claimed a victory large enough to make the ditch look like a lie. Laberius believed the ache in his forearms and nothing else. Until mid-afternoon, when a staff officer he recognised from Hirtius’s tent came past on a blown horse, cloak dark with more than rain, and said to a tribune three paces from Laberius’s ear: “The consul Hirtius is dead. I held his shoulder. Do not invent a better story.”</w:t>
-      </w:r>
-    </w:p>
-    <w:p>
-      <w:r>
-        <w:rPr/>
-        <w:t>That was one fact Laberius could keep: Hirtius down, confirmed by a man who had touched him. Pansa’s name still swam in the yell-water, wounded, dying, fine, poisoned, blessed. “They carried him off at Forum Gallorum,” Vibius said. “A week back, that village down the road with a market’s name. Javelin in the side. I saw the litter. I didn’t see inside it.” Laberius didn’t promote any Pansa version. Vibius had a litter. Nobody had a shoulder.</w:t>
-      </w:r>
-    </w:p>
-    <w:p>
-      <w:r>
-        <w:rPr/>
-        <w:t>Near dusk Antony’s near line pulled back toward the higher ground. Not a rout Laberius could swear to. Only a thinning of shields where shields had been thick. He saw that with his own eyes. A wounded Antonian left behind tried to crawl and was finished by someone Laberius did not know. Finishing was not glory either. Withdrawal or regroup: clerks would decide later. Laberius decided only that his century still had an eagle. And a gap where a friend had been.</w:t>
-      </w:r>
-    </w:p>
-    <w:p>
-      <w:r>
-        <w:rPr/>
-        <w:t>Water ran into his boots. He had stopped noticing wet hours ago; noticing returned when the fighting thinned and the cold found room. Vibius pointed at Mutina’s wall, still closed. “Town’s still his,” Vibius said, meaning Decimus. Laberius grunted. Walls didn’t feed the ditch.</w:t>
-      </w:r>
-    </w:p>
-    <w:p>
-      <w:r>
-        <w:rPr/>
-        <w:t>A mule train stuck in the same ditch as the dead. Drivers cursed gods and officers with equal accuracy. Laberius helped push because pushing was orders you could obey without understanding Senate talk. One mule went down and stayed down; they cut the traces and left it. Leaving was becoming the day’s other habit.</w:t>
-      </w:r>
-    </w:p>
-    <w:p>
-      <w:r>
-        <w:rPr/>
-        <w:t>He stacked a shield that was not his. The owner would not need it. Somewhere behind, gallopers already carried “great success” toward Rome. Laberius carried a friend’s boots, left boot split at the heel, still warm somehow. He knew Hirtius was dead. He knew Antony’s near shields had thinned. What Rome would buy with those two facts, he left to the gallopers. He didn’t follow their dust.</w:t>
-      </w:r>
-    </w:p>
-    <w:p>
-      <w:pPr>
-        <w:spacing w:before="200"/>
-      </w:pPr>
-      <w:r>
-        <w:rPr/>
-        <w:t>Poison Talk</w:t>
-      </w:r>
-    </w:p>
-    <w:p>
-      <w:r>
-        <w:rPr/>
-        <w:t>Hordeonius recorded three explanations for Pansa’s death before the man had finished dying:</w:t>
-      </w:r>
-    </w:p>
-    <w:p>
-      <w:r>
-        <w:rPr/>
-        <w:t>1. Battlefield medicine</w:t>
-      </w:r>
-    </w:p>
-    <w:p>
-      <w:r>
-        <w:rPr/>
-        <w:t>2. Antony’s smear</w:t>
-      </w:r>
-    </w:p>
-    <w:p>
-      <w:r>
-        <w:rPr/>
-        <w:t>3. The boy’s friends prefer fewer consuls</w:t>
-      </w:r>
-    </w:p>
-    <w:p>
-      <w:r>
-        <w:rPr/>
-        <w:t xml:space="preserve">He labelled all three </w:t>
-      </w:r>
-      <w:r>
-        <w:rPr>
-          <w:i/>
-        </w:rPr>
-        <w:t>Rumour</w:t>
-      </w:r>
-      <w:r>
-        <w:rPr/>
-        <w:t xml:space="preserve"> in Greek abbreviation, because Latin made gossip look like evidence. A client wanted to buy the third as fact, wanted a price on conspiracy that would make his dinner clever. Sosia sat on the next stool with a cup; a runner from camp hovered with ink still wet.</w:t>
-      </w:r>
-    </w:p>
-    <w:p>
-      <w:r>
-        <w:rPr/>
-        <w:t>Hordeonius refused the sale and charged for the refusal.</w:t>
-      </w:r>
-    </w:p>
-    <w:p>
-      <w:r>
-        <w:rPr/>
-        <w:t>“Do not sell poison as fact,” he told the man, gentle as a father closing a child’s eyes. “I keep seals. Seals are not dinner cleverness. Pay for the refusal if you want a clean margin.”</w:t>
-      </w:r>
-    </w:p>
-    <w:p>
-      <w:r>
-        <w:rPr/>
-        <w:t>The client bowed, grateful as a man receiving virtue. “Clean margins. Of course. Wisdom.” Past the first pillar, loud enough to carry back to the stool, he told the runner: “He’ll bill you for not gossiping and call it piety. Ask him for poison and he sells you a sermon with interest.”</w:t>
-      </w:r>
-    </w:p>
-    <w:p>
-      <w:r>
-        <w:rPr/>
-        <w:t>Sosia tipped his cup toward Hordeonius without drinking. “Only you could make refusing a sale sound like a temple tax.”</w:t>
-      </w:r>
-    </w:p>
-    <w:p>
-      <w:r>
-        <w:rPr/>
-        <w:t>Hordeonius did not smile. “Silence clears. Cleverness does not.”</w:t>
-      </w:r>
-    </w:p>
-    <w:p>
-      <w:r>
-        <w:rPr/>
-        <w:t xml:space="preserve">Sosia muttered, after, that dead consuls moved land prices either way. A letter from camp arrived with three different inks and one shared panic. Hirtius down as fact in one hand. Pansa still a menu of causes in another. Hordeonius priced land by the panic without crowning a cause and entered </w:t>
-      </w:r>
-      <w:r>
-        <w:rPr>
-          <w:i/>
-        </w:rPr>
-        <w:t>Pansa: cause open</w:t>
-      </w:r>
-      <w:r>
-        <w:rPr/>
-        <w:t>. The poison talk lived. The ledger did not.</w:t>
-      </w:r>
-    </w:p>
-    <w:p>
-      <w:r>
-        <w:rPr/>
-        <w:t xml:space="preserve">A second client asked whether to short land near Mutina. Hordeonius took a fee for advising against it and wrote the fee under </w:t>
-      </w:r>
-      <w:r>
-        <w:rPr>
-          <w:i/>
-        </w:rPr>
-        <w:t>prudence</w:t>
-      </w:r>
-      <w:r>
-        <w:rPr/>
-        <w:t>. Sleep would argue with him later. For now the market argued louder.</w:t>
-      </w:r>
-    </w:p>
-    <w:p>
-      <w:pPr>
-        <w:spacing w:before="280"/>
-      </w:pPr>
-      <w:r>
-        <w:rPr/>
-        <w:t>Chapter 29</w:t>
-      </w:r>
-    </w:p>
-    <w:p>
-      <w:r>
-        <w:rPr/>
-        <w:t>Isolation and Fasces</w:t>
-      </w:r>
-    </w:p>
-    <w:p>
-      <w:pPr>
-        <w:spacing w:before="200"/>
-      </w:pPr>
-      <w:r>
-        <w:rPr/>
-        <w:t>Allies Evaporate</w:t>
-      </w:r>
-    </w:p>
-    <w:p>
-      <w:r>
-        <w:rPr/>
-        <w:t xml:space="preserve">Decimus left Mutina after the relief had made the wall honest again. Hirtius’s dirt still drying on the road. Antony thinned but not finished. The town’s hinges finally someone else’s problem for a morning. At the first milestone past the gate he waited half that morning for Plancus’s promised meeting-mark. No cohorts. No date. Only dust that refused to become wagons. Near noon a rider from the Lepidus channel he had seeded after the funeral handed back Decimus’s latest wax unopened. Same averted eyes as the messenger who would not take a return tablet on the road north in March. “The meeting near the approaches cannot yet be kept,” the man said, practising courtesy. “My principal sends goodwill.” Goodwill without a roof. Decimus kept the returned tablet. He did not invent a fourth meaning for </w:t>
-      </w:r>
-      <w:r>
-        <w:rPr>
-          <w:i/>
-        </w:rPr>
-        <w:t>yet</w:t>
-      </w:r>
-      <w:r>
-        <w:rPr/>
-        <w:t>.</w:t>
-      </w:r>
-    </w:p>
-    <w:p>
-      <w:r>
-        <w:rPr/>
-        <w:t>He looked for a destination mark on the itinerary and found only blank margin where a meeting date should have been. He rubbed the blank with his thumb until the wax warmed and still showed nothing. Antony, bleeding but unbroken, was already sliding toward friends Decimus could not buy.</w:t>
-      </w:r>
-    </w:p>
-    <w:p>
-      <w:r>
-        <w:rPr/>
-        <w:t>Cicero’s praise arrived sweet and late. Decimus read one line of congratulation twice, then folded it into a pack already too light on grain. He wrote one more letter that tried to sound steady, gates held, honour intact. He stopped mid-sentence when his hand cramped. He didn’t send a second copy.</w:t>
-      </w:r>
-    </w:p>
-    <w:p>
-      <w:r>
-        <w:rPr/>
-        <w:t>Plancus came after all, in June, when Antony had already walked into Lepidus’s camp. He brought legions and compliments and pitched beside Decimus under the Alps at Cularo, and for a summer the two armies ate the same valley bare and wrote the same letters to Rome asking for the boy to be sent north. The boy did not come. In August letters began arriving for Plancus from Pollio in Spain, under seals Decimus was not shown. In September Plancus took his legions over to Antony with the same apologetic face he had worn arriving, and Decimus’s own recruits, raw and unpaid, began walking off by the hundred.</w:t>
-      </w:r>
-    </w:p>
-    <w:p>
-      <w:r>
-        <w:rPr/>
-        <w:t>Then he rode with dwindling staff into country that did not care who freed the Republic. Rain made the road a trough. An aide counted purses and got a number that made him quiet. Another counted betrayals and got a higher number. A third asked whether they should wait for Cassius from the East.</w:t>
-      </w:r>
-    </w:p>
-    <w:p>
-      <w:r>
-        <w:rPr/>
-        <w:t>“Wait here and the road learns our number,” Decimus said.</w:t>
-      </w:r>
-    </w:p>
-    <w:p>
-      <w:r>
-        <w:rPr/>
-        <w:t>“They will say I did not pursue,” the first aide muttered.</w:t>
-      </w:r>
-    </w:p>
-    <w:p>
-      <w:r>
-        <w:rPr/>
-        <w:t>“Let them,” Decimus said. “We take the west fork before dark. The east ford is watched, I smelled horse-lines on the wind this morning. Plancus has crossed. Lepidus’s man returned the tablet. We do not wait for dates that practise absence.”</w:t>
-      </w:r>
-    </w:p>
-    <w:p>
-      <w:r>
-        <w:rPr/>
-        <w:t>The second aide, older, tablet-hand still inked from Mutina’s last courtesy copy, spoke the count Decimus had been avoiding as a list of people. “Plancus: came in June, ate our valley all summer, crossed to Antony with Pollio the week before last. Lepidus: promised meeting, messenger who would not take a return tablet, twice, and in May his legions let Antony walk into their camp. Waded the river to embrace him, and Lepidus writes the Senate that his soldiers did it. The boy: will not share a road with the man who held Caesar’s door, and said so where his centurions could hear. Pacuvius’s orbit: Antony’s storm still eating roads we needed soft. Four names, and not one wagon among them. That is the betrayal number, not weather.”</w:t>
-      </w:r>
-    </w:p>
-    <w:p>
-      <w:r>
-        <w:rPr/>
-        <w:t>Decimus heard the names as doors that had already closed while he counted hinges. “Then we do not invent a fifth name for hope,” he said. The first aide opened his mouth on another complaint. Decimus was already counting remaining waterskins aloud, making the count the argument beside the named absences. At a crossroads shrine someone had left a cheap wreath for “the liberators.” Rain had ruined it. Decimus didn’t stop to fix it. He checked his horse’s mouth for sores and found none. The sores were in the map. Every promised friend a thinner line than yesterday.</w:t>
-      </w:r>
-    </w:p>
-    <w:p>
-      <w:r>
-        <w:rPr/>
-        <w:t>They slept once in a barn that smelled of wet hay and someone else’s fear. In the dark Decimus thought, briefly, without speech, of Caesar’s atrium and the cheer he had worn like a clean cloak on a March morning. Trust had been the key. He put the thought away the way he put away a broken strap: later, if later existed.</w:t>
-      </w:r>
-    </w:p>
-    <w:p>
-      <w:r>
-        <w:rPr/>
-        <w:t>On the second day the staff was smaller. One man had “gone for water” and not returned. Decimus didn’t send a search. Searches taught the road your remaining number.</w:t>
-      </w:r>
-    </w:p>
-    <w:p>
-      <w:r>
-        <w:rPr/>
-        <w:t>Near a river ford the map promised a contact who could pass them toward the mountains and, beyond rumour, toward Cassius. The contact was three men with ordinary faces and a mule. One smiled too quickly. Decimus’s remaining aide whispered, “Lepidus’s smile.”</w:t>
-      </w:r>
-    </w:p>
-    <w:p>
-      <w:r>
-        <w:rPr/>
-        <w:t>“Or anybody’s price,” Decimus said.</w:t>
-      </w:r>
-    </w:p>
-    <w:p>
-      <w:r>
-        <w:rPr/>
-        <w:t>He still dismounted. Refusing the ford meant the open road behind, where Antony’s friends were thicker. He kept his hands visible. Appearances, even here.</w:t>
-      </w:r>
-    </w:p>
-    <w:p>
-      <w:r>
-        <w:rPr/>
-        <w:t>They asked for his name. They already knew it. He gave it because lying would have bought minutes instead of miles. A purse changed hands: not his purse. Someone else’s coin for his head. He counted the pieces by glint before the knives moved, enough metal for a short road and a long silence.</w:t>
-      </w:r>
-    </w:p>
-    <w:p>
-      <w:r>
-        <w:rPr/>
-        <w:t>There was no speech. He went for the horse. A hand caught his cloak. Mud took his knee. The ditch at the ford’s edge was shallow and ordinary: meltwater, a broken rein, the smell of wet wool.</w:t>
-      </w:r>
-    </w:p>
-    <w:p>
-      <w:r>
-        <w:rPr/>
-        <w:t>If he thought of Caesar’s laugh one last time, the thought stayed inside. Pain was brief and specific.</w:t>
-      </w:r>
-    </w:p>
-    <w:p>
-      <w:pPr>
-        <w:spacing w:before="200"/>
-      </w:pPr>
-      <w:r>
-        <w:rPr/>
-        <w:t>Consul</w:t>
-      </w:r>
-    </w:p>
-    <w:p>
-      <w:r>
-        <w:rPr/>
-        <w:t>Octavian entered the politics of force with hands that still remembered shaking in Apollonia.</w:t>
-      </w:r>
-    </w:p>
-    <w:p>
-      <w:r>
-        <w:rPr/>
-        <w:t>A courier brought the Senate’s thanks for Mutina, and the thanks were not for him. The fathers had voted Decimus a triumph and handed him the dead consuls’ legions, the Martians among them, to chase Antony up the road. Octavian was to be thanked and left behind. He read the decree once and gave it to Agrippa, who read it twice.</w:t>
-      </w:r>
-    </w:p>
-    <w:p>
-      <w:r>
-        <w:rPr/>
-        <w:t>“They will say you let Antony get away,” Agrippa said.</w:t>
-      </w:r>
-    </w:p>
-    <w:p>
-      <w:r>
-        <w:rPr/>
-        <w:t>Octavian’s throat tightened once, shame or fever; he didn’t sort it. He looked at the pay chests, not at Agrippa’s face. “Then we pay before we argue. Men who are owed invent worse stories than senators do.”</w:t>
-      </w:r>
-    </w:p>
-    <w:p>
-      <w:r>
-        <w:rPr/>
-        <w:t>He had the clerks open the nearest chest where Agrippa could see the count. Late thanks; complete coin. The order of those facts was the lesson he was learning with his hands. When a tribune started a sentence about the Senate’s honours, Octavian cut him with a nod toward the queue of soldiers. “Honours after the line is fed.”</w:t>
-      </w:r>
-    </w:p>
-    <w:p>
-      <w:r>
-        <w:rPr/>
-        <w:t xml:space="preserve">The vacuum arrived as named pressure, not triumph. Both consuls were dead, Hirtius in the ditch at Mutina and Pansa of his wound a day after, and their chairs stood empty. A centurion from the Martians said it first, loud enough for the pay line: “They want us under the man who held Caesar’s door. Who feeds us now, old men with tablets, or Caesar’s name?” A tribune seconded without looking at Octavian’s face: the men would not march for an assassin on praise that arrived late and sweet. Agrippa translated the noise into one sentence Octavian could keep. The ranks wanted a consul who was </w:t>
-      </w:r>
-      <w:r>
-        <w:rPr>
-          <w:i/>
-        </w:rPr>
-        <w:t>theirs</w:t>
-      </w:r>
-      <w:r>
-        <w:rPr/>
-        <w:t>: paymaster, name, a face young enough to insult the old seats. Two chairs were empty.</w:t>
-      </w:r>
-    </w:p>
-    <w:p>
-      <w:r>
-        <w:rPr/>
-        <w:t xml:space="preserve">Senate pressure arrived in a different mouth. A senior voice, careful with consonants, told Octavian that with both consuls dead the House had no one in the chairs to point at and call the year settled. Decimus was a Liberator with a triumph and a thinning army, not a consul. Antony was over the Alps with Lepidus’s legions. They needed a miracle that obeyed. They needed it before Antony’s friends finished renaming the map. The same voice reminded him, as if reminding were a kindness, that the law asked forty-two years for a consul’s chair and he had nineteen. Octavian had already sent centurions to the Curia with the ranks’ request in writing. One came back and told the pay line what he had said on the steps when the fathers talked about age. He had put his hand on his sword. </w:t>
-      </w:r>
-      <w:r>
-        <w:rPr>
-          <w:i/>
-        </w:rPr>
-        <w:t>If you will not make him consul, this will.</w:t>
-      </w:r>
-      <w:r>
-        <w:rPr/>
-        <w:t xml:space="preserve"> Octavian offered them a nineteen-year-old with Caesar’s name and enough armed insistence to make elections look like a toll you paid at the gate. Not because destiny asked. Because two empty chairs had shortened every polite road. Agrippa’s silence beside him was heavier than speeches. Apollodorus adjusted cloaks. Cloth did not bargain.</w:t>
-      </w:r>
-    </w:p>
-    <w:p>
-      <w:r>
-        <w:rPr/>
-        <w:t xml:space="preserve">He felt sick after the first hard bargain, stomach, not omen. A taste of metal rose; he swallowed it and kept his fingers on the chest lid until the shake stopped. Publicly he accepted the fasces like owed homework. Twelve lictors shouldered the bound rods and walked ahead of him, and men stepped out of the street for the rods before they looked to see whose face came behind. A herald stumbled over </w:t>
-      </w:r>
-      <w:r>
-        <w:rPr>
-          <w:i/>
-        </w:rPr>
-        <w:t>consul</w:t>
-      </w:r>
-      <w:r>
-        <w:rPr/>
-        <w:t xml:space="preserve"> and </w:t>
-      </w:r>
-      <w:r>
-        <w:rPr>
-          <w:i/>
-        </w:rPr>
-        <w:t>nineteen</w:t>
-      </w:r>
-      <w:r>
-        <w:rPr/>
-        <w:t xml:space="preserve"> in the same breath, as if the two words had never met. Octavian let him find his way to the end.</w:t>
-      </w:r>
-    </w:p>
-    <w:p>
-      <w:r>
-        <w:rPr/>
-        <w:t>“They will hate this,” Agrippa said.</w:t>
-      </w:r>
-    </w:p>
-    <w:p>
-      <w:r>
-        <w:rPr/>
-        <w:t>Octavian wiped sweat from his upper lip with the back of his hand, ugly, visible, unfinished. “They hated the knives more. Let them hate a boy who pays after the line eats.”</w:t>
-      </w:r>
-    </w:p>
-    <w:p>
-      <w:r>
-        <w:rPr/>
-        <w:t>Agrippa’s mouth twitched, almost the old Apollonia play, then not. “Homework with fasces. Only you could make a consulship sound like a debt you intend to clear before bedtime.” Octavian did not smile. Smiling would have spoiled the pay line. He let the twitch count as the joke landing and kept his fingers on the chest.</w:t>
-      </w:r>
-    </w:p>
-    <w:p>
-      <w:r>
-        <w:rPr/>
-        <w:t xml:space="preserve">A senator who had voted him an ovation and then forgotten to pay for it called him the gods’ gift and waited for a smile of destiny. Octavian looked at him until the man found something to do with his hands. A soldier shouted the name </w:t>
-      </w:r>
-      <w:r>
-        <w:rPr>
-          <w:i/>
-        </w:rPr>
-        <w:t>Caesar</w:t>
-      </w:r>
-      <w:r>
-        <w:rPr/>
-        <w:t xml:space="preserve"> as paymaster; Octavian didn’t bow to it like a hymn. He let the shout stand because paymaster was a job his hands already understood better than luck.</w:t>
-      </w:r>
-    </w:p>
-    <w:p>
-      <w:r>
-        <w:rPr/>
-        <w:t>Still not serene. Still learning where ruthlessness lived in the body, usually behind the teeth, not in a speech about forever.</w:t>
-      </w:r>
-    </w:p>
-    <w:p>
-      <w:r>
-        <w:rPr/>
-        <w:t>By autumn a courier brought Decimus’s end as three incompatible stories. Ditch. Alps. Lepidus’s smile. Antony’s purse, no purse, a speech, no speech. Octavian kept all three on separate scraps and didn’t let the clerks merge them. What the stories shared was enough for the ranks: the last Liberator in Italy was gone, and the north had no one left to hold it but Antony and Lepidus. In the same week a tablet came under two seals pressed side by side in the same wax, Lepidus’s and Antony’s: talk, on the river island below Bononia, between the camps, where no city could listen. Decimus’s absence didn’t make him wise. It made Bononia feel caused. The empty north. The men behind him louder.</w:t>
-      </w:r>
-    </w:p>
-    <w:p>
-      <w:pPr>
-        <w:spacing w:before="280"/>
-      </w:pPr>
-      <w:r>
-        <w:rPr/>
-        <w:t>Chapter 30</w:t>
-      </w:r>
-    </w:p>
-    <w:p>
-      <w:r>
-        <w:rPr/>
-        <w:t>Lists</w:t>
-      </w:r>
-    </w:p>
-    <w:p>
-      <w:pPr>
-        <w:spacing w:before="200"/>
-      </w:pPr>
-      <w:r>
-        <w:rPr/>
-        <w:t>Bononia</w:t>
-      </w:r>
-    </w:p>
-    <w:p>
-      <w:r>
-        <w:rPr/>
-        <w:t>They met because none could kill the other two cheaply.</w:t>
-      </w:r>
-    </w:p>
-    <w:p>
-      <w:r>
-        <w:rPr/>
-        <w:t>The island sat low in the river below Bononia, a gravel tongue with a tent on it and two camps on the banks watching each other’s fires. Lepidus crossed first over the plank bridge and walked the island with his own eyes before he waved the other two across. On the sand each man let the others’ people pat him down for blades. Nobody pretended it was ceremony.</w:t>
-      </w:r>
-    </w:p>
-    <w:p>
-      <w:r>
-        <w:rPr/>
-        <w:t>Antony brought soldier gravity and a hunger that still smelled like Ops unlocked. He looked across the table at the Campania squeak grown into a man who could force a bargain, and whatever joke he had kept since spring did not come out. Octavian had brought the name, and a cold that still cracked sometimes when a room laughed wrong. He felt it crack now, and seal, like wax under a thumb. Lepidus brought the useful talent of being present when maps were drawn, and of surviving other men’s sentences without becoming their subject. He also brought the legions that had waded the river to Antony in the spring, which was why he had a chair. A table held bread nobody ate. Appetite had moved to paper.</w:t>
-      </w:r>
-    </w:p>
-    <w:p>
-      <w:r>
-        <w:rPr/>
-        <w:t>Lepidus wanted the law first, because Lepidus always wanted the law first. “A tribune carries it in Rome,” he said. “Three men for setting the state in order. Five years. A consul’s power for each of us, and no veto over any of it.”</w:t>
-      </w:r>
-    </w:p>
-    <w:p>
-      <w:r>
-        <w:rPr/>
-        <w:t>“Triumvirs,” Antony said, tasting it. “In Rome a board of three counts copper at the mint and minds the jail.”</w:t>
-      </w:r>
-    </w:p>
-    <w:p>
-      <w:r>
-        <w:rPr/>
-        <w:t>“Then this one minds both,” Octavian said.</w:t>
-      </w:r>
-    </w:p>
-    <w:p>
-      <w:r>
-        <w:rPr/>
-        <w:t>Nobody laughed. Antony laid his palm on the tablet where the money should have been. Forty-odd legions wanted paying, and the colonies Caesar had promised them were still surveyor’s stakes. “Sulla did this,” Lepidus said quietly, as if the dead could be asked for a precedent.</w:t>
-      </w:r>
-    </w:p>
-    <w:p>
-      <w:r>
-        <w:rPr/>
-        <w:t>“Sulla posted names,” Antony said. “Any man may kill one of the men on the board and bring in the head for silver from the treasury. A slave who does it walks free. The dead man’s house and land go to auction, and the auction pays the legions. That is all a list is. Names, heads, and a sale.”</w:t>
-      </w:r>
-    </w:p>
-    <w:p>
-      <w:r>
-        <w:rPr/>
-        <w:t>Victim lists began like shopping. A name, then a joke, then silence when the joke hit someone each man still half-liked. A guard outside coughed. Conversation became rain and cousins for three breaths. Then it returned to blood accounting. Paper took names faster than mouths could soften them.</w:t>
-      </w:r>
-    </w:p>
-    <w:p>
-      <w:r>
-        <w:rPr/>
-        <w:t>Antony’s stylus paused on a lesser enemy first, a man who had borrowed money and returned sermons. Easy. The stylus moved. Then it paused again on a blank that was not blank in anyone’s throat.</w:t>
-      </w:r>
-    </w:p>
-    <w:p>
-      <w:r>
-        <w:rPr/>
-        <w:t>“Cicero,” Antony said. He did not look up. Looking would have made it a request.</w:t>
-      </w:r>
-    </w:p>
-    <w:p>
-      <w:r>
-        <w:rPr/>
-        <w:t>Lepidus looked at his hands. Hands could not abstain. Octavian kept his face from moving enough to save anyone. For a breath he counted the cost of sparing Cicero: Antony’s favourite wound still open, the lists thinner when the next Kalends asked for blood.</w:t>
-      </w:r>
-    </w:p>
-    <w:p>
-      <w:r>
-        <w:rPr/>
-        <w:t>Antony’s finger stayed on the blank. “Say it,” he said, not loud. “Or strike a smaller name in his place. I have lesser enemies enough. Choose.”</w:t>
-      </w:r>
-    </w:p>
-    <w:p>
-      <w:r>
-        <w:rPr/>
-        <w:t>A lesser name sat two lines up, a man Octavian half-owed from Apollonia’s edge. Useful. Not loved. Killable without rearranging the map. Striking that name instead would buy a night of quieter conscience and leave Antony’s wound open. Octavian felt the cheaper exit in his hands: the stylus, the wax, the easy swap.</w:t>
-      </w:r>
-    </w:p>
-    <w:p>
-      <w:r>
-        <w:rPr/>
-        <w:t>Saving the orator would have cost a different war, one with Antony still armed and the coalition already smelling of unfinished business. Octavian kept that cost. Then he spent it aloud.</w:t>
-      </w:r>
-    </w:p>
-    <w:p>
-      <w:r>
-        <w:rPr/>
-        <w:t>“Cicero stays,” he said. Voice thin, audible, irreversible. He did not dress it as law. He set his seal ring on the tablet’s edge, metal clicking wood, so the assent had a body in the room, not only silence. “We do not trade him for a quieter cousin.”</w:t>
-      </w:r>
-    </w:p>
-    <w:p>
-      <w:r>
-        <w:rPr/>
-        <w:t>Lepidus cleared his throat. “He still has friends who write.”</w:t>
-      </w:r>
-    </w:p>
-    <w:p>
-      <w:r>
-        <w:rPr/>
-        <w:t>“Then they can write his epitaph,” Antony said. “Or they can join him.”</w:t>
-      </w:r>
-    </w:p>
-    <w:p>
-      <w:r>
-        <w:rPr/>
-        <w:t>Who had first thought the name did not matter on the wood. The name stood because Octavian had said it stood, and no one struck it out.</w:t>
-      </w:r>
-    </w:p>
-    <w:p>
-      <w:r>
-        <w:rPr/>
-        <w:t>“We buy the war with this,” Antony said, tapping the tablet beside the ring.</w:t>
-      </w:r>
-    </w:p>
-    <w:p>
-      <w:r>
-        <w:rPr/>
-        <w:t>“The war buys us,” Octavian answered, too soft to be a quip, too true to unsay. He took the ring back. The click leaving wood was quieter than the click arriving.</w:t>
-      </w:r>
-    </w:p>
-    <w:p>
-      <w:r>
-        <w:rPr/>
-        <w:t>They swapped one quieter enemy in a whisper: a man each of them half-owed and half-hated, traded so that no single list would look like one man’s revenge. The whisper would become three contradictory stories by morning. They sealed what could be sealed. Seals did not wash.</w:t>
-      </w:r>
-    </w:p>
-    <w:p>
-      <w:r>
-        <w:rPr/>
-        <w:t>Antony poured wine that did not taste like celebration. He did not look at Octavian while pouring. Octavian let him not look, and didn’t drink deep. Lepidus drank as men drink when they hope the cup will make them smaller than the map. Outside, a horse screamed at nothing. Inside, the lists grew.</w:t>
-      </w:r>
-    </w:p>
-    <w:p>
-      <w:pPr>
-        <w:spacing w:before="200"/>
-      </w:pPr>
-      <w:r>
-        <w:rPr/>
-        <w:t>Proscription Economy</w:t>
-      </w:r>
-    </w:p>
-    <w:p>
-      <w:pPr>
-        <w:spacing w:before="200"/>
-      </w:pPr>
-      <w:r>
-        <w:rPr/>
-        <w:t>F2: Seius</w:t>
-      </w:r>
-    </w:p>
-    <w:p>
-      <w:r>
-        <w:rPr/>
-        <w:t>Seius found his name absent and felt holy relief, then shame at the holiness. He walked past a posted list twice to be sure, eyes watering from more than wind. A neighbour who had once loaned him applause was present in black letters. Seius didn’t stop walking. Stopping looked like guilt.</w:t>
-      </w:r>
-    </w:p>
-    <w:p>
-      <w:r>
-        <w:rPr/>
-        <w:t>At the corner Gavius from the next block, petition-tablet man, dinner-circuit memory, stood under the same wood with a woman who had borrowed Seius’s mule last Kalends. “There,” Gavius said, finger on a cognomen that was almost Seius’s cousin’s, almost a stranger’s, wrong by one letter if you wanted it wrong. “Is that your house’s blood?” The woman looked at Seius. Expectation closed like the old petition trap. Seius heard his own flinch from the baths and the dinner return as street weather. A name collision that wanted him to claim or deny kinship with ink that killed.</w:t>
+        <w:t>the goods to be sold</w:t>
+      </w:r>
+      <w:r>
+        <w:rPr/>
+        <w:t>. A neighbour who had once loaned him applause was present in black letters. Seius didn’t stop walking. Stopping looked like guilt.</w:t>
+      </w:r>
+    </w:p>
+    <w:p>
+      <w:r>
+        <w:rPr/>
+        <w:t>At the corner Gavius from the next block, petition-tablet man, dinner-circuit memory, stood under the same wood with a woman who had borrowed Seius’s mule last Kalends. “There,” Gavius said, finger on a cognomen that was almost Seius’s cousin’s, almost a stranger’s, wrong by one letter if you wanted it wrong. “Is that your house’s blood?” The woman looked at Seius. Expectation closed like the old petition trap.</w:t>
       </w:r>
     </w:p>
     <w:p>
@@ -12923,7 +12835,7 @@
     <w:p>
       <w:r>
         <w:rPr/>
-        <w:t>Phileros drank less now; fear sobered some men and ruined others. He came to the Carinae kitchen door, where Nysa had carried for Antony’s steward since the spring before last, and asked her if the Domus still had a mistress worth fearing. She said fear had moved house. She kept her eyes down and her feet moving. Survival was an unprinted decree. In a side court she found a broken seal stamp and left it; broken seals let new law pretend to be old. She passed a posted list without reading every name. Reading every name invited your own onto the wood. She still felt the ink like heat. She did not look for Calpurnia’s old corridors of dread. Those corridors had been sold with the seals.</w:t>
+        <w:t>Phileros drank less now; fear sobered some men and ruined others. He came to the Carinae kitchen door, where Nysa had carried for Antony’s steward since the spring before last, and asked her if the Domus still had a mistress worth fearing. She said fear had moved house. She kept her eyes down and her feet moving. In a side court she found a broken seal stamp and left it; broken seals let new law pretend to be old. She passed a posted list without reading every name. Reading every name invited your own onto the wood. She still felt the ink like heat. She did not look for Calpurnia’s old corridors of dread. Those corridors had been sold with the seals.</w:t>
       </w:r>
     </w:p>
     <w:p>
@@ -12987,7 +12899,7 @@
     <w:p>
       <w:r>
         <w:rPr/>
-        <w:t>Atticus lived in his head as audience. So did the Capitol’s first day after the knives, enlarged by memory into courage. So did the boy he had aimed at Antony and called statecraft. The boy had learned. Antony had remembered. Somewhere between them, lists had become the Republic’s new literature. Brutus’s polite exile at Lanuvium felt, suddenly, like a kinder country. A cage with a view. Not a price with a blade.</w:t>
+        <w:t>Atticus lived in his head as audience. So did the Capitol’s first day after the knives, enlarged by memory into courage. So did the boy he had aimed at Antony and called statecraft. The boy had learned. Antony had remembered. Brutus’s polite exile at Lanuvium felt, suddenly, like a kinder country. A cage with a view.</w:t>
       </w:r>
     </w:p>
     <w:p>
@@ -13005,7 +12917,7 @@
     <w:p>
       <w:r>
         <w:rPr/>
-        <w:t>“Faster,” he told the bearers, then hated the undignified word. Speed wasn’t eloquence. Speed was what animals did when the forest closed. He tried a mental period about courage and found only the rhythm of poles on stone. The litter didn’t care about antithesis.</w:t>
+        <w:t>“Faster,” he told the bearers, then hated the undignified word. Speed wasn’t eloquence. Speed was what animals did when the forest closed.</w:t>
       </w:r>
     </w:p>
     <w:p>
@@ -13147,7 +13059,7 @@
       </w:r>
       <w:r>
         <w:rPr/>
-        <w:t>. Softening did not soften the silver leaving. A chest lid knocked; Cassius noted the hinge and did not flinch. Publicly he was mathematics in a cuirass. The recruitment engine turned tax engine without changing the face that had once counted dinner slight and dinner power.</w:t>
+        <w:t>. Softening did not soften the silver leaving. A chest lid knocked; Cassius noted the hinge and did not flinch. Publicly he was mathematics in a cuirass.</w:t>
       </w:r>
     </w:p>
     <w:p>
@@ -13183,7 +13095,13 @@
     <w:p>
       <w:r>
         <w:rPr/>
-        <w:t xml:space="preserve">Before the audience closed, a courier from the west, dust, salt, a seal cracked by too many hands, brought news that arrived as three incompatible tablets. Mutina won and lost. Consuls dead. Lists in Italy. The boy with fasces, and a court in his consulship that had called the names of every man of March, Cassius’s among them, to empty benches and condemned the benches. Antony still breathing, and the three of them looking east. One tablet named Decimus without poetry: gone, or going, or already a line item in someone else’s revenge. Cassius kept all three and didn’t merge them for the hall. Privately the Decimus line cracked something the extraction had been keeping neat. The man who had opened Caesar’s morning with cheer, who had taken the nearer knife and Cisalpine as if a road were still a friendship, now travelled west as rumour ink: lists, fasces, a name that had once been access. Cassius had recruited doors through that access. The west was pricing the door-opener as meat. He didn’t halt the silver for a rumour’s sake. He entered </w:t>
+        <w:t>Before the audience closed, a courier from the west came in, dust, salt, a seal cracked by too many hands, with three tablets that did not agree. Mutina won and lost. Consuls dead. Lists in Italy. The boy with fasces, and a court in his consulship that had called the names of every man of March, Cassius’s among them, to empty benches and condemned the benches. Antony still breathing, and the three of them looking east. One tablet named Decimus without poetry: gone, or going.</w:t>
+      </w:r>
+    </w:p>
+    <w:p>
+      <w:r>
+        <w:rPr/>
+        <w:t xml:space="preserve">Cassius read none of it aloud to the hall. He didn’t halt the silver for a rumour’s sake. But the Decimus line cracked something the extraction had been keeping neat. The man had opened Caesar’s morning with cheer and taken the nearer knife and Cisalpine as if a road were still a friendship, and Cassius had recruited doors through him. He entered </w:t>
       </w:r>
       <w:r>
         <w:rPr>
@@ -13193,17 +13111,7 @@
       </w:r>
       <w:r>
         <w:rPr/>
-        <w:t xml:space="preserve"> beside </w:t>
-      </w:r>
-      <w:r>
-        <w:rPr>
-          <w:i/>
-        </w:rPr>
-        <w:t>lists: Italy</w:t>
-      </w:r>
-      <w:r>
-        <w:rPr/>
-        <w:t xml:space="preserve"> in the only ledger he trusted, the one behind his eyes. Trebonius had stood in that column since the winter, since Dolabella’s soldiers came into his bedroom at Smyrna before dawn and carried the market-day man’s head out with them. Laodicea had settled Trebonius. Decimus had no Laodicea. He felt the entry as personal debit, not geography. The crack travelled with him anyway.</w:t>
+        <w:t xml:space="preserve"> in the only ledger he trusted, the one behind his eyes, under Trebonius, who had stood in that column since the winter, since Dolabella’s soldiers came into his bedroom at Smyrna before dawn and carried the market-day man’s head out with them. Laodicea had settled Trebonius. Decimus had no Laodicea.</w:t>
       </w:r>
     </w:p>
     <w:p>
@@ -13328,7 +13236,285 @@
     <w:p>
       <w:r>
         <w:rPr/>
-        <w:t xml:space="preserve">Cassius, somewhere else on the same war, would call this necessity, and would, Brutus guessed, already be entering west names as debits. Brutus called it necessity too, and hated that their mouths agreed while their sleep did not. Sleep, unlike coinage, still refused to clear. In the dark he held the warm coin until it cooled, then put it away. Putting away did not stop a crack from spreading. Decimus. Lists. </w:t>
+        <w:t>Cassius, somewhere else on the same war, would call this necessity, and would, Brutus guessed, already be entering west names as debits. Brutus called it necessity too, and hated that their mouths agreed while their sleep did not. Sleep, unlike coinage, still refused to clear. In the dark he held the warm coin until it cooled, then put it away.</w:t>
+      </w:r>
+    </w:p>
+    <w:p>
+      <w:pPr>
+        <w:spacing w:before="280"/>
+      </w:pPr>
+      <w:r>
+        <w:rPr/>
+        <w:t>Chapter 33</w:t>
+      </w:r>
+    </w:p>
+    <w:p>
+      <w:r>
+        <w:rPr/>
+        <w:t>Philippi I</w:t>
+      </w:r>
+    </w:p>
+    <w:p>
+      <w:pPr>
+        <w:spacing w:before="200"/>
+      </w:pPr>
+      <w:r>
+        <w:rPr/>
+        <w:t>Dust</w:t>
+      </w:r>
+    </w:p>
+    <w:p>
+      <w:pPr>
+        <w:spacing w:before="200"/>
+      </w:pPr>
+      <w:r>
+        <w:rPr/>
+        <w:t>Antony</w:t>
+      </w:r>
+    </w:p>
+    <w:p>
+      <w:r>
+        <w:rPr/>
+        <w:t>Antony liked the plain’s honesty: kill or be rearranged. Marshes and hills broke sightlines; he liked that too, when it broke the other man’s map.</w:t>
+      </w:r>
+    </w:p>
+    <w:p>
+      <w:r>
+        <w:rPr/>
+        <w:t>They had sat down on two hills astride the road west, Brutus on the northern one, Cassius on the southern above the marsh, with the sea behind them bringing grain every morning. Antony had the plain and bread for less than a month. So he had given his men spades. For ten nights they had cut a causeway through the reeds toward Cassius’s flank, as quiet as men can be up to the thigh in water. This morning Cassius had seen it, and Antony had stopped being quiet.</w:t>
+      </w:r>
+    </w:p>
+    <w:p>
+      <w:r>
+        <w:rPr/>
+        <w:t>He rode the near wing until the dust made faces into guesses. “Weight left,” he told a tribune, hand chopping air. “Do not chase the pretty gap. Fill it. Timing, not poetry.” The tribune’s mouth opened on a question; Antony was already past him. Omens were for the tents. On the field he trusted weight and the sound of men who still obeyed.</w:t>
+      </w:r>
+    </w:p>
+    <w:p>
+      <w:r>
+        <w:rPr/>
+        <w:t>Dust coated his teeth. He spat and pointed and the pointing became cohorts moving, not clean, not parade, but moving. Someone shouted Cassius’s name from a direction that might have been victory or panic. Antony didn’t pause to translate the shout. Another came down the line from the north, carried by a rider with no helmet: Brutus’s men were in the boy’s camp, cutting up the tents. The boy had a fever and Agrippa. Let them keep their own camp. Translation was for after the counting, if counting still had owners.</w:t>
+      </w:r>
+    </w:p>
+    <w:p>
+      <w:r>
+        <w:rPr/>
+        <w:t>A standard dipped, rose, dipped again in the marsh glare. Antony cursed once, short, practical, and sent a second line into the dip before the dip became a story.</w:t>
+      </w:r>
+    </w:p>
+    <w:p>
+      <w:r>
+        <w:rPr/>
+        <w:t>He did not think of Italian acres. Acres were for clerks after dust. For one breath a courier’s report from weeks ago surfaced anyway. Solvent men sleeping badly on neighbours’ soil. Auction quarrels nobody settled. Antony shoved it under the next order. Italy would complain. Italy always complained. The plain was louder.</w:t>
+      </w:r>
+    </w:p>
+    <w:p>
+      <w:pPr>
+        <w:spacing w:before="200"/>
+      </w:pPr>
+      <w:r>
+        <w:rPr/>
+        <w:t>F3: Laberius</w:t>
+      </w:r>
+    </w:p>
+    <w:p>
+      <w:r>
+        <w:rPr/>
+        <w:t>Dust found every gap in Laberius’s teeth; the eagle staff was the only upright fact he trusted. The young Caesar’s men had been lent to the spades, so it was Antony’s marsh his century stood in this morning. Behind him, from the north, the shouting said the boy’s own camp was gone, tents, mules and Laberius’s spare tunic with it.</w:t>
+      </w:r>
+    </w:p>
+    <w:p>
+      <w:r>
+        <w:rPr/>
+        <w:t>He saw a signal, or thought he did: flags in dust, an eagle dipping toward a ditch that might have been a marsh yesterday. Vibius yelled that Cassius’s side was broken. Someone else yelled the opposite with equal faith and a different god’s name attached. Laberius believed the yell nearest his ear and the ache in his forearms. Plains lied through mouths that needed the story more than the mud did.</w:t>
+      </w:r>
+    </w:p>
+    <w:p>
+      <w:r>
+        <w:rPr/>
+        <w:t>He kept his century’s shield-line from becoming a rumour of its own. A javelin stuck in dirt near his foot; he left it. Trophies mid-fight got men killed decorated.</w:t>
+      </w:r>
+    </w:p>
+    <w:p>
+      <w:r>
+        <w:rPr/>
+        <w:t>His own eagle still stood. He put his hand on the staff once: wood, sweat, the crack that had been there since Mutina’s ditch. He kept it there while the shouts about Cassius’s hill cancelled each other. He did not know Cassius’s hill. He knew thirst and the next order that might be wrong.</w:t>
+      </w:r>
+    </w:p>
+    <w:p>
+      <w:r>
+        <w:rPr/>
+        <w:t>Pay would come later, if later existed: farms promised by dead men and living boys. For now the staff fit in a hand. That was enough for the dust.</w:t>
+      </w:r>
+    </w:p>
+    <w:p>
+      <w:pPr>
+        <w:spacing w:before="200"/>
+      </w:pPr>
+      <w:r>
+        <w:rPr/>
+        <w:t>Mistaken Loss</w:t>
+      </w:r>
+    </w:p>
+    <w:p>
+      <w:r>
+        <w:rPr/>
+        <w:t>The messenger’s mouth was wrong before the words were.</w:t>
+      </w:r>
+    </w:p>
+    <w:p>
+      <w:r>
+        <w:rPr/>
+        <w:t xml:space="preserve">Dust made the man’s tongue thick; fear made it thicker. He had lost a sandal somewhere on the climb; one foot bled into the packed dirt of Cassius’s forward post. The map in Cassius’s head hungered for confirmation anyway. The first report said </w:t>
+      </w:r>
+      <w:r>
+        <w:rPr>
+          <w:i/>
+        </w:rPr>
+        <w:t>lost</w:t>
+      </w:r>
+      <w:r>
+        <w:rPr/>
+        <w:t xml:space="preserve"> in a shape that matched Cassius’s worst sketch of the day. Standards gone. Wing broken. Brutus somewhere beyond the marsh and silent. Cassius’s hand found a tablet edge and gripped until the wax remembered his thumb.</w:t>
+      </w:r>
+    </w:p>
+    <w:p>
+      <w:r>
+        <w:rPr/>
+        <w:t>“Say it again,” Cassius said. “Slower. Names. Directions. Which standard.”</w:t>
+      </w:r>
+    </w:p>
+    <w:p>
+      <w:r>
+        <w:rPr/>
+        <w:t>The messenger tried. Names arrived missing: a century mark without a cognomen, a hill that might have been the left ditch. Directions softened into gestures at dust. A standard might have fallen or only dipped. Cassius made him point at the wax sketch of the sector. The finger landed between two lines and stayed there, trembling.</w:t>
+      </w:r>
+    </w:p>
+    <w:p>
+      <w:r>
+        <w:rPr/>
+        <w:t>Cassius sent a runner down the reverse slope for a second count: cohort numbers, eagle sightings, anything with a body attached. He checked the water jars himself while he waited. Half full. He moved a shield that did not need moving. Do the next countable thing while the uncountable arrives.</w:t>
+      </w:r>
+    </w:p>
+    <w:p>
+      <w:r>
+        <w:rPr/>
+        <w:t>The runner came back empty-mouthed. No second count. Only another man who had heard the first yell secondhand and wanted to be useful by repeating it louder. A friend, attendant, someone with too much loyalty and not enough eyes, tried to amend the first report and only added fog. Brutus’s success, if it existed beyond the lying air, did not fit in either throat.</w:t>
+      </w:r>
+    </w:p>
+    <w:p>
+      <w:r>
+        <w:rPr/>
+        <w:t xml:space="preserve">“Brutus,” Cassius said. One clarifying question about the sector. The answer came as a shrug wearing words: </w:t>
+      </w:r>
+      <w:r>
+        <w:rPr>
+          <w:i/>
+        </w:rPr>
+        <w:t>no word; marsh between; dust.</w:t>
+      </w:r>
+    </w:p>
+    <w:p>
+      <w:r>
+        <w:rPr/>
+        <w:t>Cassius, who had trusted numbers, trusted a broken number because broken numbers still looked like numbers if you needed them enough to hate delay. Incomplete had always been his enemy in other men’s mouths. Now it lived in his own ears. He looked once toward the dust where Brutus might still be winning and saw only glare, nothing he could count, nothing he could punish.</w:t>
+      </w:r>
+    </w:p>
+    <w:p>
+      <w:r>
+        <w:rPr/>
+        <w:t>He almost waited. Waiting was the mathematician’s virtue. Waiting here meant listening to more mouths invent geometry. He felt the old contempt for delay rise and catch on something softer: hope, or the habit of correcting clerks before they ruined a sum. For three breaths he held both. The incomplete report as a sum that would not clear. And the possibility that Brutus was still rearranging the other half of the plain without him.</w:t>
+      </w:r>
+    </w:p>
+    <w:p>
+      <w:r>
+        <w:rPr/>
+        <w:t>The softer thing lost.</w:t>
+      </w:r>
+    </w:p>
+    <w:p>
+      <w:r>
+        <w:rPr/>
+        <w:t xml:space="preserve">He dismissed the messengers with a bow that meant </w:t>
+      </w:r>
+      <w:r>
+        <w:rPr>
+          <w:i/>
+        </w:rPr>
+        <w:t>done</w:t>
+      </w:r>
+      <w:r>
+        <w:rPr/>
+        <w:t>. With only two men left near him, whose faces already disagreed about everything except the steel, he called Pindarus over. He had kept the freedman at his elbow since Carrhae, since the desert where he had watched what the Parthians did with Crassus’s head, for this one errand. Pindarus held the blade where Cassius set it. Cassius made the end himself rather than wait for the plain to invent a worse one.</w:t>
+      </w:r>
+    </w:p>
+    <w:p>
+      <w:r>
+        <w:rPr/>
+        <w:t>He didn’t speechify liberty. He didn’t correct the map. He treated the incomplete report as closed by belief. He closed the account the only way left.</w:t>
+      </w:r>
+    </w:p>
+    <w:p>
+      <w:pPr>
+        <w:spacing w:before="280"/>
+      </w:pPr>
+      <w:r>
+        <w:rPr/>
+        <w:t>Chapter 34</w:t>
+      </w:r>
+    </w:p>
+    <w:p>
+      <w:r>
+        <w:rPr/>
+        <w:t>Philippi II and Hooks</w:t>
+      </w:r>
+    </w:p>
+    <w:p>
+      <w:pPr>
+        <w:spacing w:before="200"/>
+      </w:pPr>
+      <w:r>
+        <w:rPr/>
+        <w:t>Second Day</w:t>
+      </w:r>
+    </w:p>
+    <w:p>
+      <w:pPr>
+        <w:spacing w:before="200"/>
+      </w:pPr>
+      <w:r>
+        <w:rPr/>
+        <w:t>Brutus</w:t>
+      </w:r>
+    </w:p>
+    <w:p>
+      <w:r>
+        <w:rPr/>
+        <w:t>Brutus pressed two fingers under his ribs where the reports had lodged and found no relief there.</w:t>
+      </w:r>
+    </w:p>
+    <w:p>
+      <w:r>
+        <w:rPr/>
+        <w:t>He had the versions in incompatible shapes. Cassius broken. Cassius mistaken. Cassius ended by his own hand on a lie the plain told. It did not matter which. What they shared was enough: Cassius was gone. The weight of that sat in the body first, breath short, ribs tight, the old courtesy habit wanting a sentence that would arrange grief into something useful. He had no sentence. He had a line that still needed bodies.</w:t>
+      </w:r>
+    </w:p>
+    <w:p>
+      <w:r>
+        <w:rPr/>
+        <w:t>Twenty days since the first fight. He had sent Cassius’s body across the strait to Thasos by night, so the camp would not have to watch it burn and count what was left. Then he had sat on his hill and let the other side go hungry. The sea fed him; the plain fed no one. It had been a good plan and his officers could not bear it. Men slipped across to Antony’s fires after dark, and the ones who stayed called waiting cowardice to his face, in Cassius’s words, as if they had inherited them. This morning he had given them their battle.</w:t>
+      </w:r>
+    </w:p>
+    <w:p>
+      <w:r>
+        <w:rPr/>
+        <w:t>He didn’t deliver a speech about it. This was weight and breath and mud that took boots the way grief took time.</w:t>
+      </w:r>
+    </w:p>
+    <w:p>
+      <w:r>
+        <w:rPr/>
+        <w:t xml:space="preserve">He fought like a man hoping philosophy could stiffen a shield-wall. For a while it did. Faces that had minted </w:t>
       </w:r>
       <w:r>
         <w:rPr>
@@ -13338,285 +13524,19 @@
       </w:r>
       <w:r>
         <w:rPr/>
-        <w:t xml:space="preserve"> heat. The same crack under different Latin.</w:t>
-      </w:r>
-    </w:p>
-    <w:p>
-      <w:pPr>
-        <w:spacing w:before="280"/>
-      </w:pPr>
-      <w:r>
-        <w:rPr/>
-        <w:t>Chapter 33</w:t>
-      </w:r>
-    </w:p>
-    <w:p>
-      <w:r>
-        <w:rPr/>
-        <w:t>Philippi I</w:t>
-      </w:r>
-    </w:p>
-    <w:p>
-      <w:pPr>
-        <w:spacing w:before="200"/>
-      </w:pPr>
-      <w:r>
-        <w:rPr/>
-        <w:t>Dust</w:t>
-      </w:r>
-    </w:p>
-    <w:p>
-      <w:pPr>
-        <w:spacing w:before="200"/>
-      </w:pPr>
-      <w:r>
-        <w:rPr/>
-        <w:t>Antony</w:t>
-      </w:r>
-    </w:p>
-    <w:p>
-      <w:r>
-        <w:rPr/>
-        <w:t>Antony liked the plain’s honesty: kill or be rearranged. Marshes and hills broke sightlines; he liked that too, when it broke the other man’s map.</w:t>
-      </w:r>
-    </w:p>
-    <w:p>
-      <w:r>
-        <w:rPr/>
-        <w:t>They had sat down on two hills astride the road west, Brutus on the northern one, Cassius on the southern above the marsh, with the sea behind them bringing grain every morning. Antony had the plain and bread for less than a month. So he had given his men spades. For ten nights they had cut a causeway through the reeds toward Cassius’s flank, as quiet as men can be up to the thigh in water. This morning Cassius had seen it, and Antony had stopped being quiet.</w:t>
-      </w:r>
-    </w:p>
-    <w:p>
-      <w:r>
-        <w:rPr/>
-        <w:t>He rode the near wing until the dust made faces into guesses. “Weight left,” he told a tribune, hand chopping air. “Do not chase the pretty gap. Fill it. Timing, not poetry.” The tribune’s mouth opened on a question; Antony was already past him. Omens were for the tents. On the field he trusted weight and the sound of men who still obeyed.</w:t>
-      </w:r>
-    </w:p>
-    <w:p>
-      <w:r>
-        <w:rPr/>
-        <w:t>Dust coated his teeth. He spat and pointed and the pointing became cohorts moving, not clean, not parade, but moving. Someone shouted Cassius’s name from a direction that might have been victory or panic. Antony didn’t pause to translate the shout. Another came down the line from the north, carried by a rider with no helmet: Brutus’s men were in the boy’s camp, cutting up the tents. The boy had a fever and Agrippa. Let them keep their own camp. Translation was for after the counting, if counting still had owners.</w:t>
-      </w:r>
-    </w:p>
-    <w:p>
-      <w:r>
-        <w:rPr/>
-        <w:t>A standard dipped, rose, dipped again in the marsh glare. Antony cursed once, short, practical, and sent a second line into the dip before the dip became a story.</w:t>
-      </w:r>
-    </w:p>
-    <w:p>
-      <w:r>
-        <w:rPr/>
-        <w:t>He did not think of Italian acres. Acres were for clerks after dust. For one breath a courier’s report from weeks ago surfaced anyway. Solvent men sleeping badly on neighbours’ soil. Auction quarrels nobody settled. Antony shoved it under the next order. Italy would complain. Italy always complained. The plain was louder.</w:t>
-      </w:r>
-    </w:p>
-    <w:p>
-      <w:pPr>
-        <w:spacing w:before="200"/>
-      </w:pPr>
-      <w:r>
-        <w:rPr/>
-        <w:t>F3: Laberius</w:t>
-      </w:r>
-    </w:p>
-    <w:p>
-      <w:r>
-        <w:rPr/>
-        <w:t>Dust found every gap in Laberius’s teeth; the eagle staff was the only upright fact he trusted. The young Caesar’s men had been lent to the spades, so it was Antony’s marsh his century stood in this morning. Behind him, from the north, the shouting said the boy’s own camp was gone, tents, mules and Laberius’s spare tunic with it.</w:t>
-      </w:r>
-    </w:p>
-    <w:p>
-      <w:r>
-        <w:rPr/>
-        <w:t>He saw a signal, or thought he did: flags in dust, an eagle dipping toward a ditch that might have been a marsh yesterday. Vibius yelled that Cassius’s side was broken. Someone else yelled the opposite with equal faith and a different god’s name attached. Laberius believed the yell nearest his ear and the ache in his forearms. Plains lied through mouths that needed the story more than the mud did.</w:t>
-      </w:r>
-    </w:p>
-    <w:p>
-      <w:r>
-        <w:rPr/>
-        <w:t>He kept his century’s shield-line from becoming a rumour of its own. A javelin stuck in dirt near his foot; he left it. Trophies mid-fight got men killed decorated.</w:t>
-      </w:r>
-    </w:p>
-    <w:p>
-      <w:r>
-        <w:rPr/>
-        <w:t>His own eagle still stood. He put his hand on the staff once: wood, sweat, the crack that had been there since Mutina’s ditch. He kept it there while the shouts about Cassius’s hill cancelled each other. He did not know Cassius’s hill. He knew thirst and the next order that might be wrong.</w:t>
-      </w:r>
-    </w:p>
-    <w:p>
-      <w:r>
-        <w:rPr/>
-        <w:t>Pay would come later, if later existed: farms promised by dead men and living boys. For now the staff fit in a hand. That was enough for the dust.</w:t>
-      </w:r>
-    </w:p>
-    <w:p>
-      <w:pPr>
-        <w:spacing w:before="200"/>
-      </w:pPr>
-      <w:r>
-        <w:rPr/>
-        <w:t>Mistaken Loss</w:t>
-      </w:r>
-    </w:p>
-    <w:p>
-      <w:r>
-        <w:rPr/>
-        <w:t>The messenger’s mouth was wrong before the words were.</w:t>
-      </w:r>
-    </w:p>
-    <w:p>
-      <w:r>
-        <w:rPr/>
-        <w:t xml:space="preserve">Dust made the man’s tongue thick; fear made it thicker. He had lost a sandal somewhere on the climb; one foot bled into the packed dirt of Cassius’s forward post. The map in Cassius’s head hungered for confirmation anyway. The first report said </w:t>
-      </w:r>
-      <w:r>
-        <w:rPr>
-          <w:i/>
-        </w:rPr>
-        <w:t>lost</w:t>
-      </w:r>
-      <w:r>
-        <w:rPr/>
-        <w:t xml:space="preserve"> in a shape that matched Cassius’s worst sketch of the day. Standards gone. Wing broken. Brutus somewhere beyond the marsh and silent. Cassius’s hand found a tablet edge and gripped until the wax remembered his thumb.</w:t>
-      </w:r>
-    </w:p>
-    <w:p>
-      <w:r>
-        <w:rPr/>
-        <w:t>“Say it again,” Cassius said. “Slower. Names. Directions. Which standard.”</w:t>
-      </w:r>
-    </w:p>
-    <w:p>
-      <w:r>
-        <w:rPr/>
-        <w:t>The messenger tried. Names arrived missing: a century mark without a cognomen, a hill that might have been the left ditch. Directions softened into gestures at dust. A standard might have fallen or only dipped. Cassius made him point at the wax sketch of the sector. The finger landed between two lines and stayed there, trembling. The map itself had fog.</w:t>
-      </w:r>
-    </w:p>
-    <w:p>
-      <w:r>
-        <w:rPr/>
-        <w:t>Cassius sent a runner down the reverse slope for a second count: cohort numbers, eagle sightings, anything with a body attached. He checked the water jars himself while he waited. Half full. He moved a shield that did not need moving. Do the next countable thing while the uncountable arrives.</w:t>
-      </w:r>
-    </w:p>
-    <w:p>
-      <w:r>
-        <w:rPr/>
-        <w:t>The runner came back empty-mouthed. No second count. Only another man who had heard the first yell secondhand and wanted to be useful by repeating it louder. A friend, attendant, someone with too much loyalty and not enough eyes, tried to amend the first report and only added fog. Brutus’s success, if it existed beyond the lying air, did not fit in either throat.</w:t>
-      </w:r>
-    </w:p>
-    <w:p>
-      <w:r>
-        <w:rPr/>
-        <w:t xml:space="preserve">“Brutus,” Cassius said. One clarifying question about the sector. The answer came as a shrug wearing words: </w:t>
-      </w:r>
-      <w:r>
-        <w:rPr>
-          <w:i/>
-        </w:rPr>
-        <w:t>no word; marsh between; dust.</w:t>
-      </w:r>
-    </w:p>
-    <w:p>
-      <w:r>
-        <w:rPr/>
-        <w:t>Cassius, who had trusted numbers, trusted a broken number because broken numbers still looked like numbers if you needed them enough to hate delay. Incomplete had always been his enemy in other men’s mouths. Now it lived in his own ears. He looked once toward the dust where Brutus might still be winning and saw only glare, nothing he could count, nothing he could punish.</w:t>
-      </w:r>
-    </w:p>
-    <w:p>
-      <w:r>
-        <w:rPr/>
-        <w:t>He almost waited. Waiting was the mathematician’s virtue. Waiting here meant listening to more mouths invent geometry. He felt the old contempt for delay rise and catch on something softer: hope, or the habit of correcting clerks before they ruined a sum. For three breaths he held both. The incomplete report as a sum that would not clear. And the possibility that Brutus was still rearranging the other half of the plain without him.</w:t>
-      </w:r>
-    </w:p>
-    <w:p>
-      <w:r>
-        <w:rPr/>
-        <w:t>The softer thing lost.</w:t>
-      </w:r>
-    </w:p>
-    <w:p>
-      <w:r>
-        <w:rPr/>
-        <w:t xml:space="preserve">He dismissed the messengers with a bow that meant </w:t>
-      </w:r>
-      <w:r>
-        <w:rPr>
-          <w:i/>
-        </w:rPr>
-        <w:t>done</w:t>
-      </w:r>
-      <w:r>
-        <w:rPr/>
-        <w:t>. With only two men left near him, whose faces already disagreed about everything except the steel, he called Pindarus over. He had kept the freedman at his elbow since Carrhae, since the desert where he had watched what the Parthians did with Crassus’s head, for this one errand. Pindarus held the blade where Cassius set it. Cassius made the end himself rather than wait for the plain to invent a worse one.</w:t>
-      </w:r>
-    </w:p>
-    <w:p>
-      <w:r>
-        <w:rPr/>
-        <w:t>He didn’t speechify liberty. He didn’t correct the map. He treated the incomplete report as closed by belief. He closed the account the only way left.</w:t>
-      </w:r>
-    </w:p>
-    <w:p>
-      <w:pPr>
-        <w:spacing w:before="280"/>
-      </w:pPr>
-      <w:r>
-        <w:rPr/>
-        <w:t>Chapter 34</w:t>
-      </w:r>
-    </w:p>
-    <w:p>
-      <w:r>
-        <w:rPr/>
-        <w:t>Philippi II and Hooks</w:t>
-      </w:r>
-    </w:p>
-    <w:p>
-      <w:pPr>
-        <w:spacing w:before="200"/>
-      </w:pPr>
-      <w:r>
-        <w:rPr/>
-        <w:t>Second Day</w:t>
-      </w:r>
-    </w:p>
-    <w:p>
-      <w:pPr>
-        <w:spacing w:before="200"/>
-      </w:pPr>
-      <w:r>
-        <w:rPr/>
-        <w:t>Brutus</w:t>
-      </w:r>
-    </w:p>
-    <w:p>
-      <w:r>
-        <w:rPr/>
-        <w:t>Brutus pressed two fingers under his ribs where the reports had lodged and found no relief there.</w:t>
-      </w:r>
-    </w:p>
-    <w:p>
-      <w:r>
-        <w:rPr/>
-        <w:t>He had the versions in incompatible shapes. Cassius broken. Cassius mistaken. Cassius ended by his own hand on a lie the plain told. Brutus kept all three without choosing. What they shared was enough: Cassius was gone. The weight of that sat in the body first, breath short, ribs tight, the old courtesy habit wanting a sentence that would arrange grief into something useful. He had no sentence. He had a line that still needed bodies.</w:t>
-      </w:r>
-    </w:p>
-    <w:p>
-      <w:r>
-        <w:rPr/>
-        <w:t>Twenty days since the first fight. He had sent Cassius’s body across the strait to Thasos by night, so the camp would not have to watch it burn and count what was left. Then he had sat on his hill and let the other side go hungry. The sea fed him; the plain fed no one. It had been a good plan and his officers could not bear it. Men slipped across to Antony’s fires after dark, and the ones who stayed called waiting cowardice to his face, in Cassius’s words, as if they had inherited them. This morning he had given them their battle.</w:t>
-      </w:r>
-    </w:p>
-    <w:p>
-      <w:r>
-        <w:rPr/>
-        <w:t>He didn’t deliver a speech about it. This was weight and breath and mud that took boots the way grief took time.</w:t>
-      </w:r>
-    </w:p>
-    <w:p>
-      <w:r>
-        <w:rPr/>
-        <w:t xml:space="preserve">He fought like a man hoping philosophy could stiffen a shield-wall. For a while it did. Faces that had minted </w:t>
+        <w:t xml:space="preserve"> with him held because holding was what they still knew how to do. He moved among them with the old etiquette of a man who still believed posture mattered: nod, correct a gap, refuse the luxury of sitting when the men stood. Mud took his boots. Dust took his mouth. He tasted metal and did not ask whether it was blood or only fear. An aide offered water. Brutus took it, swallowed wrong, coughed once, ugly, human, and went back to the gap.</w:t>
+      </w:r>
+    </w:p>
+    <w:p>
+      <w:r>
+        <w:rPr/>
+        <w:t>Then mud and numbers undid the stiffening. He saw men who wanted tomorrow’s grain more than yesterday’s brand. Both kinds broke when the plain insisted. An officer, face known from the minting days, caught his sleeve and begged him to pull back to a cleaner hill. The cleaner hill was visible. Higher ground. Fresher air. A place where the day might be lost slower and with more witnesses who could later invent dignity.</w:t>
+      </w:r>
+    </w:p>
+    <w:p>
+      <w:r>
+        <w:rPr/>
+        <w:t xml:space="preserve">Brutus looked at it. The cost of taking it was clear in the body. Abandon the knot that still held. Leave the men who still answered </w:t>
       </w:r>
       <w:r>
         <w:rPr>
@@ -13626,19 +13546,37 @@
       </w:r>
       <w:r>
         <w:rPr/>
-        <w:t xml:space="preserve"> with him held because holding was what they still knew how to do. He moved among them with the old etiquette of a man who still believed posture mattered: nod, correct a gap, refuse the luxury of sitting when the men stood. Mud took his boots. Dust took his mouth. He tasted metal and did not ask whether it was blood or only fear. An aide offered water. Brutus took it, swallowed wrong, coughed once, ugly, human, and went back to the gap.</w:t>
-      </w:r>
-    </w:p>
-    <w:p>
-      <w:r>
-        <w:rPr/>
-        <w:t>Then mud and numbers undid the stiffening. He saw men who wanted tomorrow’s grain more than yesterday’s brand. Both kinds broke when the plain insisted. An officer, face known from the minting days, caught his sleeve and begged him to pull back to a cleaner hill. The cleaner hill was visible. Higher ground. Fresher air. A place where the day might be lost slower and with more witnesses who could later invent dignity.</w:t>
-      </w:r>
-    </w:p>
-    <w:p>
-      <w:r>
-        <w:rPr/>
-        <w:t xml:space="preserve">Brutus looked at it. The cost of taking it was clear in the body. Abandon the knot that still held. Leave the men who still answered </w:t>
+        <w:t xml:space="preserve"> with their shoulders. Trade the day’s shape for a cleaner story about retreat. Cassius would have called delay contemptible. Cassius was not here to call anything.</w:t>
+      </w:r>
+    </w:p>
+    <w:p>
+      <w:r>
+        <w:rPr/>
+        <w:t>“Hold what you can,” Brutus said. Not a period. Not an antithesis. Only an order with the paint worn off.</w:t>
+      </w:r>
+    </w:p>
+    <w:p>
+      <w:r>
+        <w:rPr/>
+        <w:t>He refused the cleaner hill. The knot shrank. The breath got shorter. The officer’s face went from hope to something flatter. Brutus held what he could until what he could was a shrinking knot that no philosophy could stiffen again. Only then, at dusk, with nothing left on the plain to hold, did he take what remained up into the hills behind the line: the retreat the morning had refused, now with no day left to save.</w:t>
+      </w:r>
+    </w:p>
+    <w:p>
+      <w:r>
+        <w:rPr/>
+        <w:t>Night came down cold over a stream bed among rocks. A few hundred men had followed him; fewer were there by midnight. He sent a man down to see whether the camp could be retaken. The man did not come back. Volumnius, who had argued Plato with him for twenty years, refused when Brutus asked him to hold the sword, and wept, and Brutus did not ask him twice.</w:t>
+      </w:r>
+    </w:p>
+    <w:p>
+      <w:r>
+        <w:rPr/>
+        <w:t>Strato held it, a friend from the rhetoric schools in Athens, when rhetoric had seemed the hard part. Brutus took his hand first. Then he set the point under his ribs, where the reports had lodged and Cassius had been sitting all day, and leaned. He did not arrange his posture. There was no one left to arrange it for, only Strato, and Strato looked away.</w:t>
+      </w:r>
+    </w:p>
+    <w:p>
+      <w:r>
+        <w:rPr/>
+        <w:t xml:space="preserve">On the plain below, an </w:t>
       </w:r>
       <w:r>
         <w:rPr>
@@ -13648,46 +13586,6 @@
       </w:r>
       <w:r>
         <w:rPr/>
-        <w:t xml:space="preserve"> with their shoulders. Trade the day’s shape for a cleaner story about retreat. Cassius would have called delay contemptible. Cassius was not here to call anything.</w:t>
-      </w:r>
-    </w:p>
-    <w:p>
-      <w:r>
-        <w:rPr/>
-        <w:t>“Hold what you can,” Brutus said. Not a period. Not an antithesis. Only an order with the paint worn off.</w:t>
-      </w:r>
-    </w:p>
-    <w:p>
-      <w:r>
-        <w:rPr/>
-        <w:t>He refused the cleaner hill. The knot shrank. The breath got shorter. The officer’s face went from hope to something flatter. Brutus held what he could until what he could was a shrinking knot that no philosophy could stiffen again. Only then, at dusk, with nothing left on the plain to hold, did he take what remained up into the hills behind the line: the retreat the morning had refused, now with no day left to save.</w:t>
-      </w:r>
-    </w:p>
-    <w:p>
-      <w:r>
-        <w:rPr/>
-        <w:t>Night came down cold over a stream bed among rocks. A few hundred men had followed him; fewer were there by midnight. He sent a man down to see whether the camp could be retaken. The man did not come back. Volumnius, who had argued Plato with him for twenty years, refused when Brutus asked him to hold the sword, and wept, and Brutus did not ask him twice.</w:t>
-      </w:r>
-    </w:p>
-    <w:p>
-      <w:r>
-        <w:rPr/>
-        <w:t>Strato held it, a friend from the rhetoric schools in Athens, when rhetoric had seemed the hard part. Brutus took his hand first. Then he set the point under his ribs, where the reports had lodged and Cassius had been sitting all day, and leaned. He did not arrange his posture. There was no one left to arrange it for, only Strato, and Strato looked away.</w:t>
-      </w:r>
-    </w:p>
-    <w:p>
-      <w:r>
-        <w:rPr/>
-        <w:t xml:space="preserve">On the plain below, an </w:t>
-      </w:r>
-      <w:r>
-        <w:rPr>
-          <w:i/>
-        </w:rPr>
-        <w:t>EID MAR</w:t>
-      </w:r>
-      <w:r>
-        <w:rPr/>
         <w:t xml:space="preserve"> coin lay in the dust with the rest of the metal.</w:t>
       </w:r>
     </w:p>
@@ -13782,7 +13680,7 @@
     <w:p>
       <w:r>
         <w:rPr/>
-        <w:t>By the tent-flap, a cup further into the wine than his rank allowed, a junior officer said it to the horse-holder loud enough to carry: “Italy always complains, until it bills you in veterans who already know which farms have owners. Capua dates. Mutina mud. Same unpaid dirt, new maps. When the East stops bleeding, the soil still owes.” The horse stamped. Antony heard it, laughed once, short, and went back to the map.</w:t>
+        <w:t>By the tent-flap, a cup further into the wine than his rank allowed, a junior officer said it to the horse-holder loud enough to carry: “Italy always complains until it bills you in veterans who know which farms have owners.” The horse stamped. Antony heard it, laughed once, short, and went back to the map.</w:t>
       </w:r>
     </w:p>
     <w:p>

</xml_diff>

<commit_message>
Regenerate Book 1 reading docx
Co-Authored-By: Claude Opus 5.5 (1M context) <noreply@anthropic.com>
Claude-Session: https://claude.ai/code/session_016J1A9VbrbaLp4Q5XYAjW4F
</commit_message>
<xml_diff>
--- a/exports/Ides_Book1_FULL_Ch01-34.docx
+++ b/exports/Ides_Book1_FULL_Ch01-34.docx
@@ -27,7 +27,7 @@
         <w:br/>
         <w:t>Book 1 reading export · Utica prologue, then Ch 1 dinner · ends at Philippi · author-voice (no em dash)</w:t>
         <w:br/>
-        <w:t>Source: Manuscript ffdd9d7 (2026-10-23) · generated 2026-10-24 00:00 UTC from main @ fdbfa7d · source digest ba985021c92337a0 · prologue and chapters 1–34</w:t>
+        <w:t>Source: Manuscript 970cbef (2026-10-24) · generated 2026-10-24 00:11 UTC from main @ 970cbef · source digest 1833a61a5d995dd0 · prologue and chapters 1–34</w:t>
       </w:r>
     </w:p>
     <w:p>
@@ -12801,19 +12801,29 @@
       </w:r>
       <w:r>
         <w:rPr/>
-        <w:t xml:space="preserve"> A neighbour who had once loaned him applause was present in black letters. Seius didn’t stop walking. Stopping looked like guilt.</w:t>
-      </w:r>
-    </w:p>
-    <w:p>
-      <w:r>
-        <w:rPr/>
-        <w:t>At the corner Gavius from the next block, petition-tablet man, dinner-circuit memory, stood under the same wood with a woman who had borrowed Seius’s mule last Kalends. “There,” Gavius said, finger on a cognomen that was almost Seius’s cousin’s, almost a stranger’s, wrong by one letter if you wanted it wrong. “Is that your house’s blood?” The woman looked at Seius. Expectation closed like the old petition trap.</w:t>
-      </w:r>
-    </w:p>
-    <w:p>
-      <w:r>
-        <w:rPr/>
-        <w:t>“I do not know that spelling,” Seius said. True enough to keep his door; false enough that Gavius’s mouth flattened. The woman stepped back. Kinship itself felt contagious. Seius bought oil he did not need so his hands would look busy. He congratulated no one. He locked doors and checked the locks twice. Seia Prima asked if honesty still mattered. He said honesty was a peacetime crop. She didn’t laugh. “Then harvest carefully,” she said. “Peacetime crops still get taxed when the lists are hungry.” He almost smiled at her, old Seia who audited his atrium smile against paper. He stopped before smiling looked like relief worth posting. In bed he rehearsed congratulations for whoever won the next rumour, and hated the rehearsal even as he perfected it.</w:t>
+        <w:t xml:space="preserve"> Eleven lines down, in the same black letters, stood Gavius from the next block, the petition-tablet man who had called him a coward over dessert. Seius didn’t stop walking. Stopping looked like guilt.</w:t>
+      </w:r>
+    </w:p>
+    <w:p>
+      <w:r>
+        <w:rPr/>
+        <w:t>At the corner Gavius himself stood under the same wood with a woman who had borrowed Seius’s mule last Kalends. He read the way he returned tools, slowly and from the top, and he had not got eleven lines down. “There,” Gavius said, finger on a cognomen that was almost Seius’s cousin’s, almost a stranger’s, wrong by one letter if you wanted it wrong. “Is that your house’s blood?” The woman looked at Seius. Expectation closed like the old petition trap.</w:t>
+      </w:r>
+    </w:p>
+    <w:p>
+      <w:r>
+        <w:rPr/>
+        <w:t xml:space="preserve">“I do not know that spelling,” Seius said. True enough to keep his door; false enough that Gavius’s mouth flattened. He did not say </w:t>
+      </w:r>
+      <w:r>
+        <w:rPr>
+          <w:i/>
+        </w:rPr>
+        <w:t>eleven lines down</w:t>
+      </w:r>
+      <w:r>
+        <w:rPr/>
+        <w:t>. The woman stepped back. Kinship itself felt contagious. Seius bought oil he did not need so his hands would look busy. He congratulated no one. He locked doors and checked the locks twice. Seia Prima asked if honesty still mattered. He said honesty was a peacetime crop. She didn’t laugh. “Then harvest carefully,” she said. “Peacetime crops still get taxed when the lists are hungry.” He almost smiled at her, old Seia who audited his atrium smile against paper. He stopped before smiling looked like relief worth posting. In bed he rehearsed congratulations for whoever won the next rumour, and hated the rehearsal even as he perfected it.</w:t>
       </w:r>
     </w:p>
     <w:p>
@@ -12859,19 +12869,1049 @@
     <w:p>
       <w:r>
         <w:rPr/>
-        <w:t>Nysa saw a slave, Festus or a man using Festus’s method, sell a household with a sentence. Informers priced breath. A woman in the street paid with a bracelet and a name; the bracelet was prettier than the mercy it bought. A wrong cognomen nearly got a poet-adjacent man beaten until someone remembered Cinna and laughed wrong. Laughter that sounded like March smoke returning.</w:t>
-      </w:r>
-    </w:p>
-    <w:p>
-      <w:r>
-        <w:rPr/>
-        <w:t>Near the Subura corner a boy chalked names from a list onto a wall for men who could not read wood but could read chalk. A woman stopped him mid-letter, pressed a coin into his palm, and whispered a different spelling. The boy hesitated, coin versus chalk. Then he rubbed one stroke out and wrote the lie. Nysa watched the wall become a market. She did not correct him. Correction joined you to the wood.</w:t>
+        <w:t>Nysa saw Festus sell a household with a sentence. By the third day the whole Subura knew the name: a slave from the Esquiline who had walked his master’s hiding place to the tribunal and walked back a citizen. Informers priced breath. A woman in the street paid with a bracelet and a name; the bracelet was prettier than the mercy it bought. A wrong cognomen nearly got a poet-adjacent man beaten until someone remembered Cinna and laughed wrong. Laughter that sounded like March smoke returning.</w:t>
+      </w:r>
+    </w:p>
+    <w:p>
+      <w:r>
+        <w:rPr/>
+        <w:t>Near the Subura corner a boy chalked names from a list onto a wall for men who could not read wood but could read chalk. Medullina stopped him mid-letter, Medullina who had once wanted senators from Nysa and got chickens, pressed a coin into his palm, and whispered a different spelling. The boy hesitated, coin versus chalk. Then he rubbed one stroke out and wrote the lie. Nysa watched the wall become a market. She did not ask whose name Medullina was saving or selling, and she did not correct him. Correction joined you to the wood.</w:t>
       </w:r>
     </w:p>
     <w:p>
       <w:r>
         <w:rPr/>
         <w:t>Phileros drank less now; fear sobered some men and ruined others. He came to the Carinae kitchen door, where Nysa had carried for Antony’s steward since the spring before last, and asked her if the Domus still had a mistress worth fearing. She said fear had moved house. She kept her eyes down and her feet moving. In a side court she found a broken seal stamp and left it; broken seals let new law pretend to be old. She passed a posted list without reading every name. Reading every name invited your own onto the wood. She still felt the ink like heat. She did not look for Calpurnia’s old corridors of dread. Those corridors had been sold with the seals.</w:t>
+      </w:r>
+    </w:p>
+    <w:p>
+      <w:pPr>
+        <w:spacing w:before="200"/>
+      </w:pPr>
+      <w:r>
+        <w:rPr/>
+        <w:t>Your General’s Mother</w:t>
+      </w:r>
+    </w:p>
+    <w:p>
+      <w:r>
+        <w:rPr/>
+        <w:t>The steward gave her two jars of Alban, a basket of bread and a direction. “The mistress’s mother has sent half her people home to their villages,” he said. “She wants hands that carry and don’t talk. You don’t talk.”</w:t>
+      </w:r>
+    </w:p>
+    <w:p>
+      <w:r>
+        <w:rPr/>
+        <w:t>Nysa didn’t ask why a house would send its people away in the week the walls grew names. She took the basket on her hip and the jars by their necks and went down the lane with her eyes on the cobbles.</w:t>
+      </w:r>
+    </w:p>
+    <w:p>
+      <w:r>
+        <w:rPr/>
+        <w:t>Julia’s house was older than Antony’s and smaller, and it had kept its old masks on the atrium shelf. A doorkeeper with white stubble let her in and locked behind her. The atrium smelled of lamp oil and quinces. Two maids were left, both grey, and they looked at Nysa the way the Domus Publica women had once looked at a new girl: the size of her, whether she would stay.</w:t>
+      </w:r>
+    </w:p>
+    <w:p>
+      <w:r>
+        <w:rPr/>
+        <w:t>Julia came out of the inner room herself. She was small and straight, with Antony’s jaw gone thin with age, and she looked at the jars before she looked at Nysa.</w:t>
+      </w:r>
+    </w:p>
+    <w:p>
+      <w:r>
+        <w:rPr/>
+        <w:t>“My son sends wine,” she said. “Of course he does. Put it in the back room. My steward is doing the accounts there. Pour for him. He drinks slowly, and he forgets to ask.”</w:t>
+      </w:r>
+    </w:p>
+    <w:p>
+      <w:r>
+        <w:rPr/>
+        <w:t>The back room had a brazier, a table, a lamp, and a man of sixty in a plain brown tunic bent over a wax tablet as though accounts were the whole world. He looked up when she set the jar down.</w:t>
+      </w:r>
+    </w:p>
+    <w:p>
+      <w:r>
+        <w:rPr/>
+        <w:t xml:space="preserve">Nysa had poured for this face before. It had come to the Domus Publica in the winter before the Ides, in a better tunic, and stood with Caesar under the pediment talking about a priesthood. It had the nose that all the Julii seemed to grow, and it had been on the first board in the Forum, near the top. The Carinae kitchen had talked about little else for two days. </w:t>
+      </w:r>
+      <w:r>
+        <w:rPr>
+          <w:i/>
+        </w:rPr>
+        <w:t>The master has put his own uncle on it.</w:t>
+      </w:r>
+      <w:r>
+        <w:rPr/>
+        <w:t xml:space="preserve"> The cook had laughed. Nobody else had.</w:t>
+      </w:r>
+    </w:p>
+    <w:p>
+      <w:r>
+        <w:rPr/>
+        <w:t>She poured. Her hand did not shake, which surprised her.</w:t>
+      </w:r>
+    </w:p>
+    <w:p>
+      <w:r>
+        <w:rPr/>
+        <w:t>“You were in my cousin’s house,” said Lucius Caesar. “On the Sacra Via.”</w:t>
+      </w:r>
+    </w:p>
+    <w:p>
+      <w:r>
+        <w:rPr/>
+        <w:t>“I carried there.”</w:t>
+      </w:r>
+    </w:p>
+    <w:p>
+      <w:r>
+        <w:rPr/>
+        <w:t>“Then you know how to carry a cup without asking what is in it.” He drank. He did drink slowly. “Does my nephew’s kitchen know where you are?”</w:t>
+      </w:r>
+    </w:p>
+    <w:p>
+      <w:r>
+        <w:rPr/>
+        <w:t>“The steward does.”</w:t>
+      </w:r>
+    </w:p>
+    <w:p>
+      <w:r>
+        <w:rPr/>
+        <w:t>“Then the steward knows something.” He set the cup down and went back to the tablet, and Nysa saw that there were no figures on it, only the same line of wax smoothed over and over with the flat of the stylus.</w:t>
+      </w:r>
+    </w:p>
+    <w:p>
+      <w:r>
+        <w:rPr/>
+        <w:t xml:space="preserve">She stood by the brazier because there was nowhere else to stand. In the Carinae kitchen they had read the edict out, one of the boys who could read, standing on a bench while the cook stirred. Twenty-five thousand denarii for a head. A slave, ten thousand, with his freedom and his master’s citizenship. Informers the same. Nysa was not a slave. She had worked out, without wanting to, what </w:t>
+      </w:r>
+      <w:r>
+        <w:rPr>
+          <w:i/>
+        </w:rPr>
+        <w:t>informers the same</w:t>
+      </w:r>
+      <w:r>
+        <w:rPr/>
+        <w:t xml:space="preserve"> would be for a freedwoman who knew which back room held a consular. She had worked it out on the walk down the lane, and she had carried the number the rest of the way like a coin held under the tongue.</w:t>
+      </w:r>
+    </w:p>
+    <w:p>
+      <w:r>
+        <w:rPr/>
+        <w:t>Julia came in and sat on the only other stool. “He has eaten nothing,” she said to Nysa, as if Lucius were a child or a dog. “Bread. Then wine.”</w:t>
+      </w:r>
+    </w:p>
+    <w:p>
+      <w:r>
+        <w:rPr/>
+        <w:t>Nysa broke bread and set it by him. He ate a corner to please his sister.</w:t>
+      </w:r>
+    </w:p>
+    <w:p>
+      <w:r>
+        <w:rPr/>
+        <w:t>“My first husband was a fool who lost a fleet,” Julia said to the brazier. “My second, Cicero had strangled in the prison under the Capitol, without a trial, because the Senate was frightened. That was twenty years ago. I have given this city one husband for a consul’s speech.” She smoothed her skirt over her knees. “It does not get my brother for my son’s arithmetic.”</w:t>
+      </w:r>
+    </w:p>
+    <w:p>
+      <w:r>
+        <w:rPr/>
+        <w:t>“Your son did not write my name alone,” Lucius said, mild. “I sat in the Senate that voted him an enemy of the state in the spring. He is only returning the tablet.”</w:t>
+      </w:r>
+    </w:p>
+    <w:p>
+      <w:r>
+        <w:rPr/>
+        <w:t>“He is my son. He can return it to me.”</w:t>
+      </w:r>
+    </w:p>
+    <w:p>
+      <w:r>
+        <w:rPr/>
+        <w:t>The knock came on the street door while Nysa was pouring the second cup. It was not a client’s knock. It was the knock of a man who had a list and a key to every house on it.</w:t>
+      </w:r>
+    </w:p>
+    <w:p>
+      <w:r>
+        <w:rPr/>
+        <w:t>Julia stood up. For a moment she was old: one hand on the table, the other on the stool, the knees deciding. Then she was not.</w:t>
+      </w:r>
+    </w:p>
+    <w:p>
+      <w:r>
+        <w:rPr/>
+        <w:t>“Stay with the wine,” she told Nysa. To her brother she said nothing at all.</w:t>
+      </w:r>
+    </w:p>
+    <w:p>
+      <w:r>
+        <w:rPr/>
+        <w:t>Nysa heard the doorkeeper’s voice, then a louder one. Boots on the threshold stone. She stood in the passage with the jug because her feet had taken her there, and from the passage she could see the length of the atrium to the street door.</w:t>
+      </w:r>
+    </w:p>
+    <w:p>
+      <w:r>
+        <w:rPr/>
+        <w:t>A centurion stood in it, helmet under his arm, a tablet in his other hand. Four men behind him in the lane. He was polite. That was worse.</w:t>
+      </w:r>
+    </w:p>
+    <w:p>
+      <w:r>
+        <w:rPr/>
+        <w:t>“By order of the triumvirs,” he said. “We have a name for this house.”</w:t>
+      </w:r>
+    </w:p>
+    <w:p>
+      <w:r>
+        <w:rPr/>
+        <w:t>Julia walked down the atrium to him. She did not hurry. When she reached the door she put one hand on each post, so that her arms made a bar across it, and she looked up at him.</w:t>
+      </w:r>
+    </w:p>
+    <w:p>
+      <w:r>
+        <w:rPr/>
+        <w:t>“You will not kill Lucius Caesar,” she said, “unless you first kill me. I bore your general.”</w:t>
+      </w:r>
+    </w:p>
+    <w:p>
+      <w:r>
+        <w:rPr/>
+        <w:t>The centurion did not move. His men did not move. In the lane a cart went by, and the driver looked, and looked away.</w:t>
+      </w:r>
+    </w:p>
+    <w:p>
+      <w:r>
+        <w:rPr/>
+        <w:t>“Lady,” the centurion said.</w:t>
+      </w:r>
+    </w:p>
+    <w:p>
+      <w:r>
+        <w:rPr/>
+        <w:t>“Say it to him. Say it to my son. Tell him his mother stood in her own door and you went through her.”</w:t>
+      </w:r>
+    </w:p>
+    <w:p>
+      <w:r>
+        <w:rPr/>
+        <w:t>The centurion’s eyes left her and travelled down the atrium, past the masks, past the grey maids, to the passage, and found Nysa with the jug.</w:t>
+      </w:r>
+    </w:p>
+    <w:p>
+      <w:r>
+        <w:rPr/>
+        <w:t>“You,” he said. “Whose house do you serve?”</w:t>
+      </w:r>
+    </w:p>
+    <w:p>
+      <w:r>
+        <w:rPr/>
+        <w:t>The whole of her life had been a training for this question, and for the answer that left the most out.</w:t>
+      </w:r>
+    </w:p>
+    <w:p>
+      <w:r>
+        <w:rPr/>
+        <w:t>“The triumvir’s,” Nysa said. “Antony’s. His steward sent me with wine for his mother.”</w:t>
+      </w:r>
+    </w:p>
+    <w:p>
+      <w:r>
+        <w:rPr/>
+        <w:t>“Is there a man in this house who is not of it?”</w:t>
+      </w:r>
+    </w:p>
+    <w:p>
+      <w:r>
+        <w:rPr/>
+        <w:t>She thought of the coin under her tongue. She thought of the stylus smoothing a line of wax over and over. She thought, absurdly, of Medullina in the Subura, who had always wanted names and never got any.</w:t>
+      </w:r>
+    </w:p>
+    <w:p>
+      <w:r>
+        <w:rPr/>
+        <w:t>“There is the mistress’s steward,” she said. “I pour for him. He drinks slow.”</w:t>
+      </w:r>
+    </w:p>
+    <w:p>
+      <w:r>
+        <w:rPr/>
+        <w:t>The centurion looked at her a breath longer than he needed. Then he looked back at Julia, at the two thin arms across the door, and he did the arithmetic every soldier in Rome had learned that month. A head was twenty-five thousand denarii. The general’s mother was not a sum anyone had written.</w:t>
+      </w:r>
+    </w:p>
+    <w:p>
+      <w:r>
+        <w:rPr/>
+        <w:t>“I will put a man at the end of the lane,” he said. “For your protection, lady.”</w:t>
+      </w:r>
+    </w:p>
+    <w:p>
+      <w:r>
+        <w:rPr/>
+        <w:t>“Put two,” said Julia. “It is a long lane.”</w:t>
+      </w:r>
+    </w:p>
+    <w:p>
+      <w:r>
+        <w:rPr/>
+        <w:t>He went. The doorkeeper shut the door, and barred it, and then sat down on the floor with his back against it, which made one of the grey maids laugh in a way that turned into something else.</w:t>
+      </w:r>
+    </w:p>
+    <w:p>
+      <w:r>
+        <w:rPr/>
+        <w:t>Julia came back up the atrium. Her hands were shaking now, both of them. She held them out in front of her and looked at them as if they belonged to somebody else’s mother.</w:t>
+      </w:r>
+    </w:p>
+    <w:p>
+      <w:r>
+        <w:rPr/>
+        <w:t>“Tomorrow,” she said, “I go to the Forum. He sits on a tribunal with the other two. He can say no to me in front of the whole city or he can say yes.”</w:t>
+      </w:r>
+    </w:p>
+    <w:p>
+      <w:r>
+        <w:rPr/>
+        <w:t>In the back room Lucius Caesar had not moved. The cup was empty. He had heard all of it.</w:t>
+      </w:r>
+    </w:p>
+    <w:p>
+      <w:r>
+        <w:rPr/>
+        <w:t>“Pour,” he said to Nysa. “Please.”</w:t>
+      </w:r>
+    </w:p>
+    <w:p>
+      <w:r>
+        <w:rPr/>
+        <w:t>She poured. Her hand still did not shake. She noticed it the way she noticed a seal that had been lifted and pressed again, a thing that was the same and not the same.</w:t>
+      </w:r>
+    </w:p>
+    <w:p>
+      <w:r>
+        <w:rPr/>
+        <w:t>At dusk she went back up the lane past the soldier at the end of it, who did not look at her basket. In the Carinae kitchen the steward asked how the old lady did.</w:t>
+      </w:r>
+    </w:p>
+    <w:p>
+      <w:r>
+        <w:rPr/>
+        <w:t>“Short of hands,” Nysa said.</w:t>
+      </w:r>
+    </w:p>
+    <w:p>
+      <w:r>
+        <w:rPr/>
+        <w:t>“Then you’ll go back tomorrow.”</w:t>
+      </w:r>
+    </w:p>
+    <w:p>
+      <w:r>
+        <w:rPr/>
+        <w:t>She would. She had a name on her tongue now, a consul’s name, the kind Medullina had begged her for in every winter she could remember. She had always kept names off her tongue by having none. This one she had, and kept. It sat there all evening while she scrubbed the pans, heavier than chickens.</w:t>
+      </w:r>
+    </w:p>
+    <w:p>
+      <w:pPr>
+        <w:spacing w:before="200"/>
+      </w:pPr>
+      <w:r>
+        <w:rPr/>
+        <w:t>The Door That Closes</w:t>
+      </w:r>
+    </w:p>
+    <w:p>
+      <w:r>
+        <w:rPr/>
+        <w:t>The knock came after the second lamp, soft, the knock of a man who knew the house had a dog and didn’t want it.</w:t>
+      </w:r>
+    </w:p>
+    <w:p>
+      <w:r>
+        <w:rPr/>
+        <w:t>Dromo the doorkeeper looked through the grille and then looked back at Seius with his face gone careful. Seius knew who it was before Dromo said it. He had known since the corner that afternoon, since eleven lines down.</w:t>
+      </w:r>
+    </w:p>
+    <w:p>
+      <w:r>
+        <w:rPr/>
+        <w:t>“Tell him I am asleep,” Seius said.</w:t>
+      </w:r>
+    </w:p>
+    <w:p>
+      <w:r>
+        <w:rPr/>
+        <w:t>“He says you will say that,” said Dromo. “He says to tell you he read it.”</w:t>
+      </w:r>
+    </w:p>
+    <w:p>
+      <w:r>
+        <w:rPr/>
+        <w:t>So Gavius had got to the bottom of the board after all.</w:t>
+      </w:r>
+    </w:p>
+    <w:p>
+      <w:r>
+        <w:rPr/>
+        <w:t>Seius went to the door himself because a man should do his own refusing. Through the grille Gavius was a cloak and a nose and two hands holding the cloak shut at the throat. He had shaved off his beard. Without it his face looked like someone else’s younger brother.</w:t>
+      </w:r>
+    </w:p>
+    <w:p>
+      <w:r>
+        <w:rPr/>
+        <w:t>“I won’t keep you,” Gavius said. “I know what I called you. At the dinner. At the baker’s corner. To your wife, in front of the Calventii.” His breath smoked through the bars. “You were right not to sign. That’s why my name is up there and yours isn’t. You’re a coward and you’re alive. I’d like to be one of those.”</w:t>
+      </w:r>
+    </w:p>
+    <w:p>
+      <w:r>
+        <w:rPr/>
+        <w:t>“Go to your cousins.”</w:t>
+      </w:r>
+    </w:p>
+    <w:p>
+      <w:r>
+        <w:rPr/>
+        <w:t>“My cousins have read the clause.”</w:t>
+      </w:r>
+    </w:p>
+    <w:p>
+      <w:r>
+        <w:rPr>
+          <w:i/>
+        </w:rPr>
+        <w:t>Whoever hides one of them, or helps him away, shall be one of them.</w:t>
+      </w:r>
+      <w:r>
+        <w:rPr/>
+        <w:t xml:space="preserve"> Seius had read it too. He had read it twice. He had walked past it with his eyes watering and bought oil he didn’t need.</w:t>
+      </w:r>
+    </w:p>
+    <w:p>
+      <w:r>
+        <w:rPr/>
+        <w:t>“I have a household,” Seius said.</w:t>
+      </w:r>
+    </w:p>
+    <w:p>
+      <w:r>
+        <w:rPr/>
+        <w:t>“You told me that. At the dinner. You said you still had a door that closes.” Gavius put his forehead against the bars, not begging, only tired. “Close it behind me, then.”</w:t>
+      </w:r>
+    </w:p>
+    <w:p>
+      <w:r>
+        <w:rPr/>
+        <w:t>Seius stood with his hand on the bar. Behind him he heard Seia Prima come into the atrium. She had a lamp. She didn’t say anything. She didn’t need to; the old trap of expectation had her face in it, but it was a different expectation now and he could not tell which way it pointed.</w:t>
+      </w:r>
+    </w:p>
+    <w:p>
+      <w:r>
+        <w:rPr/>
+        <w:t>He did what he always did. He looked for the cheaper exit. There was a good one. Shut the grille, go back to bed, tell Dromo the man had been a drunk. By morning Gavius would be in someone else’s doorway or in a ditch, and nobody would ever know Seius had been asked, except Gavius, and Gavius would be dead.</w:t>
+      </w:r>
+    </w:p>
+    <w:p>
+      <w:r>
+        <w:rPr/>
+        <w:t>“Her father,” Seius said, not turning round, “sold grain at a loss in a famine year and they put up a statue of him for it. Did you know that?”</w:t>
+      </w:r>
+    </w:p>
+    <w:p>
+      <w:r>
+        <w:rPr/>
+        <w:t>“Everybody knows that,” said Gavius.</w:t>
+      </w:r>
+    </w:p>
+    <w:p>
+      <w:r>
+        <w:rPr/>
+        <w:t>“I didn’t,” Seius said, “until I married her.”</w:t>
+      </w:r>
+    </w:p>
+    <w:p>
+      <w:r>
+        <w:rPr/>
+        <w:t>He lifted the bar.</w:t>
+      </w:r>
+    </w:p>
+    <w:p>
+      <w:r>
+        <w:rPr/>
+        <w:t>They put him in the oil store, behind the jars. There were more jars than there had been a week ago; Seius had bought oil every day that week so his hands would look busy, and now his hands had made a wall. Gavius sat down behind it on a folded sack and laughed once, a cracked sound, and put his face in his cloak.</w:t>
+      </w:r>
+    </w:p>
+    <w:p>
+      <w:r>
+        <w:rPr/>
+        <w:t>In the atrium Seia Prima set the lamp down. “Dromo saw,” she said.</w:t>
+      </w:r>
+    </w:p>
+    <w:p>
+      <w:r>
+        <w:rPr/>
+        <w:t>“Dromo sees everything. He is a doorkeeper.”</w:t>
+      </w:r>
+    </w:p>
+    <w:p>
+      <w:r>
+        <w:rPr/>
+        <w:t>“Dromo heard the edict read at the fountain. So did every slave in Rome. Ten thousand denarii and his freedom and your citizenship.” She kept her voice low and level, the voice she used on the household accounts. “Do you know Festus? The one from the Esquiline? He walked his master’s hiding place to the tribunal on the second day. He is a citizen now, with his old master’s name, and he drinks in the same wine shop as our cook.”</w:t>
+      </w:r>
+    </w:p>
+    <w:p>
+      <w:r>
+        <w:rPr/>
+        <w:t>Seius sat on the edge of the impluvium. The water was black and had a leaf in it.</w:t>
+      </w:r>
+    </w:p>
+    <w:p>
+      <w:r>
+        <w:rPr/>
+        <w:t>“Then I free Dromo,” he said.</w:t>
+      </w:r>
+    </w:p>
+    <w:p>
+      <w:r>
+        <w:rPr/>
+        <w:t>“Before he frees himself.”</w:t>
+      </w:r>
+    </w:p>
+    <w:p>
+      <w:r>
+        <w:rPr/>
+        <w:t>“Before.”</w:t>
+      </w:r>
+    </w:p>
+    <w:p>
+      <w:r>
+        <w:rPr/>
+        <w:t>“With what? A freedman needs something to live on, or he is a beggar with a cap, and a beggar sells what he knows.” She folded her arms. “And Gavius cannot stay behind the oil for the rest of the triumvirs’ five years.”</w:t>
+      </w:r>
+    </w:p>
+    <w:p>
+      <w:r>
+        <w:rPr/>
+        <w:t>There were boats. Everyone said so, in the way everyone said things that month, with no one’s name attached. Pompey’s son held Sicily, and his ships came in along the coast below Circeii at night and took off anyone who could reach the beach, and paid whoever brought them twice what the triumvirs paid for the head. A carter could be found. A carter cost money. The gate guards cost money. Silence cost money. Every door in the city had a rate now, and Seius had none of it. He had a whitened toga in a chest, and a canvass that had eaten his credit, and a debt to Hordeonius that had been rolling over since before Munda.</w:t>
+      </w:r>
+    </w:p>
+    <w:p>
+      <w:r>
+        <w:rPr/>
+        <w:t>In the morning he went to Dromo in the porter’s cell by the door. The old man was sitting on his cot with his sandals on, which he never did before the first client.</w:t>
+      </w:r>
+    </w:p>
+    <w:p>
+      <w:r>
+        <w:rPr/>
+        <w:t>“You heard,” Seius said.</w:t>
+      </w:r>
+    </w:p>
+    <w:p>
+      <w:r>
+        <w:rPr/>
+        <w:t>“I hear the door, master. That’s the work.”</w:t>
+      </w:r>
+    </w:p>
+    <w:p>
+      <w:r>
+        <w:rPr/>
+        <w:t>Seius had prepared something wine-bright and generous to say, the kind of thing he said at dinners. It wouldn’t come. He sat down on the stool instead, which a master did not do in a porter’s cell, and Dromo looked at the stool and then at him.</w:t>
+      </w:r>
+    </w:p>
+    <w:p>
+      <w:r>
+        <w:rPr/>
+        <w:t>“I am going to free you,” Seius said. “Before the praetor, as soon as I can find one who isn’t hunting. And I am going to give you enough to live on. Not ten thousand. I haven’t got ten thousand. But enough, and a room, and my name as your patron, which is worth less than it was.”</w:t>
+      </w:r>
+    </w:p>
+    <w:p>
+      <w:r>
+        <w:rPr/>
+        <w:t>Dromo said nothing for a while. Then he said, “The Gavius man borrowed my mule-rope two years ago and brought it back with a knot in it I couldn’t undo.”</w:t>
+      </w:r>
+    </w:p>
+    <w:p>
+      <w:r>
+        <w:rPr/>
+        <w:t>“I know. He did the same to me.”</w:t>
+      </w:r>
+    </w:p>
+    <w:p>
+      <w:r>
+        <w:rPr/>
+        <w:t>“I don’t want his head, master. I don’t want anybody’s head. I want to sleep in a room with a door I can bar from the inside.” Dromo looked at his sandals. “But I’d sleep better with the money in my hand than in your mouth.”</w:t>
+      </w:r>
+    </w:p>
+    <w:p>
+      <w:r>
+        <w:rPr/>
+        <w:t>“So would I,” said Seius.</w:t>
+      </w:r>
+    </w:p>
+    <w:p>
+      <w:r>
+        <w:rPr/>
+        <w:t>He went to find Hordeonius.</w:t>
+      </w:r>
+    </w:p>
+    <w:p>
+      <w:pPr>
+        <w:spacing w:before="200"/>
+      </w:pPr>
+      <w:r>
+        <w:rPr/>
+        <w:t>Surety</w:t>
+      </w:r>
+    </w:p>
+    <w:p>
+      <w:r>
+        <w:rPr/>
+        <w:t>Sosia brought the news with the bread, which was how Sosia brought all news, so that Hordeonius could never tell whether he was being fed or charged.</w:t>
+      </w:r>
+    </w:p>
+    <w:p>
+      <w:r>
+        <w:rPr/>
+        <w:t>“Atticus is off,” Sosia said.</w:t>
+      </w:r>
+    </w:p>
+    <w:p>
+      <w:r>
+        <w:rPr/>
+        <w:t>“Off what?”</w:t>
+      </w:r>
+    </w:p>
+    <w:p>
+      <w:r>
+        <w:rPr/>
+        <w:t>“Off the board. Not that he was ever on it in ink. He was in a cupboard at Canus’s house with Canus, and Antony sent a letter in his own hand: come out, you have nothing to fear, and Canus too, for your sake.” Sosia tore the bread in half and kept the larger half. “In his own hand. The freedman showed it round the moneychangers at first light. Half the Janus has read it already.”</w:t>
+      </w:r>
+    </w:p>
+    <w:p>
+      <w:r>
+        <w:rPr/>
+        <w:t>Hordeonius sat very still on his stool. “Why?”</w:t>
+      </w:r>
+    </w:p>
+    <w:p>
+      <w:r>
+        <w:rPr/>
+        <w:t>“Fulvia.”</w:t>
+      </w:r>
+    </w:p>
+    <w:p>
+      <w:r>
+        <w:rPr/>
+        <w:t>He knew. He knew before Sosia said the rest, the way a man knows the figure at the bottom of a column he has been adding for a year. But Sosia said it anyway, because Sosia liked the sound of other men’s debts.</w:t>
+      </w:r>
+    </w:p>
+    <w:p>
+      <w:r>
+        <w:rPr/>
+        <w:t>“In the spring,” Sosia said, “when the Senate voted her husband an enemy and every creditor in Rome came at her with paper. She’d bought an estate on terms, remember? And the terms came due the week he lost Mutina. Atticus went to court with her. Stood surety. Lent her the money for the estate himself, no interest, no contract.” He chewed. “Everybody on the Janus called in her paper that month. Everybody.”</w:t>
+      </w:r>
+    </w:p>
+    <w:p>
+      <w:r>
+        <w:rPr/>
+        <w:t>“Everybody,” said Hordeonius.</w:t>
+      </w:r>
+    </w:p>
+    <w:p>
+      <w:r>
+        <w:rPr/>
+        <w:t>“Including you.”</w:t>
+      </w:r>
+    </w:p>
+    <w:p>
+      <w:r>
+        <w:rPr/>
+        <w:t xml:space="preserve">He did not need the tablet. He remembered the entry: </w:t>
+      </w:r>
+      <w:r>
+        <w:rPr>
+          <w:i/>
+        </w:rPr>
+        <w:t>Fulvia, wife of M. Antonius, hostis: called, per Sosia, in full</w:t>
+      </w:r>
+      <w:r>
+        <w:rPr/>
+        <w:t>, and the fee for prudence beneath it, and the day. He had been right. Every man on the Janus had been right. An enemy of the state’s wife was a bad debt by definition. He had called it in with the same blessing-flat face he used for widows and bakers, and her steward had paid it, and gone away down the Sacred Way with his ears red.</w:t>
+      </w:r>
+    </w:p>
+    <w:p>
+      <w:r>
+        <w:rPr/>
+        <w:t>“Antony doesn’t keep ledgers,” Hordeonius said.</w:t>
+      </w:r>
+    </w:p>
+    <w:p>
+      <w:r>
+        <w:rPr/>
+        <w:t>“No,” said Sosia. “She does.”</w:t>
+      </w:r>
+    </w:p>
+    <w:p>
+      <w:r>
+        <w:rPr/>
+        <w:t xml:space="preserve">A client came, a grain factor wanting to know what a proscribed man’s warehouse would fetch at auction. Hordeonius named a figure and refused to bid. He wrote the refusal under </w:t>
+      </w:r>
+      <w:r>
+        <w:rPr>
+          <w:i/>
+        </w:rPr>
+        <w:t>prudence</w:t>
+      </w:r>
+      <w:r>
+        <w:rPr/>
+        <w:t>, from habit, and then sat looking at the word.</w:t>
+      </w:r>
+    </w:p>
+    <w:p>
+      <w:r>
+        <w:rPr/>
+        <w:t>There was a kind of security that held when everything else failed, and it turned out to be the kind nobody on the Janus wrote down. Atticus had put kindness on the books when kindness was the worst risk in Rome, and now it had cleared, in Antony’s own hand, at a rate no banker could match. Hordeonius could not buy it now. You could not backdate a kindness. The market in it had closed in April, and he had been on the wrong side.</w:t>
+      </w:r>
+    </w:p>
+    <w:p>
+      <w:r>
+        <w:rPr/>
+        <w:t>Seius came at the third hour. He came the long way round, past the posted board, and stood at the stall with the face Hordeonius had seen on every borrower since the lists went up, the face of a man doing arithmetic he would rather not be seen doing.</w:t>
+      </w:r>
+    </w:p>
+    <w:p>
+      <w:r>
+        <w:rPr/>
+        <w:t>“A loan,” Seius said. “Small.”</w:t>
+      </w:r>
+    </w:p>
+    <w:p>
+      <w:r>
+        <w:rPr/>
+        <w:t>“Nothing is small this month.”</w:t>
+      </w:r>
+    </w:p>
+    <w:p>
+      <w:r>
+        <w:rPr/>
+        <w:t>“Three thousand denarii.” He did not sit. “A manumission and something to live on. A carter to the coast. The gate.”</w:t>
+      </w:r>
+    </w:p>
+    <w:p>
+      <w:r>
+        <w:rPr/>
+        <w:t xml:space="preserve">Hordeonius heard </w:t>
+      </w:r>
+      <w:r>
+        <w:rPr>
+          <w:i/>
+        </w:rPr>
+        <w:t>the coast</w:t>
+      </w:r>
+      <w:r>
+        <w:rPr/>
+        <w:t xml:space="preserve"> and </w:t>
+      </w:r>
+      <w:r>
+        <w:rPr>
+          <w:i/>
+        </w:rPr>
+        <w:t>the gate</w:t>
+      </w:r>
+      <w:r>
+        <w:rPr/>
+        <w:t xml:space="preserve"> and let them go past him like carts. He did not ask who. A banker who asked who was a banker who knew, and a banker who knew was a man who had helped one of them away. He looked at Seius instead: the good tunic gone a little loose, the soft hands, the wine-bright manner switched off for once so that the face underneath showed. It was not a brave face. It was the face of a coward who had made a decision and was now trying to finance it.</w:t>
+      </w:r>
+    </w:p>
+    <w:p>
+      <w:r>
+        <w:rPr/>
+        <w:t>“You already owe me,” Hordeonius said. “The canvass. The toga, the gifts, the games you were going to give. Rolled over since the spring before Munda.”</w:t>
+      </w:r>
+    </w:p>
+    <w:p>
+      <w:r>
+        <w:rPr/>
+        <w:t>“I know.”</w:t>
+      </w:r>
+    </w:p>
+    <w:p>
+      <w:r>
+        <w:rPr/>
+        <w:t>“You will never stand for aedile now. Not this year. Perhaps not under these three.”</w:t>
+      </w:r>
+    </w:p>
+    <w:p>
+      <w:r>
+        <w:rPr/>
+        <w:t>“I know that too.”</w:t>
+      </w:r>
+    </w:p>
+    <w:p>
+      <w:r>
+        <w:rPr/>
+        <w:t>“Then I want the Sabine land,” Hordeonius said. “All of it, as security. The old debt rolled in, the new one on top, the whole of it secured on the farm. If you default, I take the farm.”</w:t>
+      </w:r>
+    </w:p>
+    <w:p>
+      <w:r>
+        <w:rPr/>
+        <w:t>Seius closed his eyes. The farm was where his wife’s father had been born, Hordeonius knew. He knew because Seius had pledged it once before and taken it back, years ago, when the canvass still looked like a road to a statue.</w:t>
+      </w:r>
+    </w:p>
+    <w:p>
+      <w:r>
+        <w:rPr/>
+        <w:t>“Done,” said Seius.</w:t>
+      </w:r>
+    </w:p>
+    <w:p>
+      <w:r>
+        <w:rPr/>
+        <w:t>Sosia, on the next stool, stopped chewing.</w:t>
+      </w:r>
+    </w:p>
+    <w:p>
+      <w:r>
+        <w:rPr/>
+        <w:t>Hordeonius counted it out himself: worn silver, no Caesar on it, nothing anyone would remember. He wrapped it in a cloth that smelled of the shelf and pushed it across the board, and Seius took it under his cloak with the careful hands of a man carrying eggs.</w:t>
+      </w:r>
+    </w:p>
+    <w:p>
+      <w:r>
+        <w:rPr/>
+        <w:t>When he had gone Sosia said, “You know what that is for.”</w:t>
+      </w:r>
+    </w:p>
+    <w:p>
+      <w:r>
+        <w:rPr/>
+        <w:t>“I know it is secured on a farm.”</w:t>
+      </w:r>
+    </w:p>
+    <w:p>
+      <w:r>
+        <w:rPr/>
+        <w:t>“That’s not what I asked.”</w:t>
+      </w:r>
+    </w:p>
+    <w:p>
+      <w:r>
+        <w:rPr/>
+        <w:t xml:space="preserve">“It’s what I answered.” Hordeonius opened his private tablet, the one with the cipher, where he had written </w:t>
+      </w:r>
+      <w:r>
+        <w:rPr>
+          <w:i/>
+        </w:rPr>
+        <w:t>acquired: unclean</w:t>
+      </w:r>
+      <w:r>
+        <w:rPr/>
+        <w:t xml:space="preserve"> the week before. Under it he wrote the date, and the sum, and </w:t>
+      </w:r>
+      <w:r>
+        <w:rPr>
+          <w:i/>
+        </w:rPr>
+        <w:t>Seius: lent</w:t>
+      </w:r>
+      <w:r>
+        <w:rPr/>
+        <w:t>. His stylus stopped. Then he wrote one more word after it, small, in the cipher only he could read.</w:t>
+      </w:r>
+    </w:p>
+    <w:p>
+      <w:r>
+        <w:rPr>
+          <w:i/>
+        </w:rPr>
+        <w:t>Clean.</w:t>
+      </w:r>
+    </w:p>
+    <w:p>
+      <w:r>
+        <w:rPr/>
+        <w:t>It looked strange on the wax. He did not rub it out. He did not know yet whether it would clear. He knew only that it was the first entry in a long time he could have shown to Atticus without being ashamed of it.</w:t>
+      </w:r>
+    </w:p>
+    <w:p>
+      <w:r>
+        <w:rPr/>
+        <w:t>“Sosia,” he said. “If anyone asks, Seius came about his canvass debt.”</w:t>
+      </w:r>
+    </w:p>
+    <w:p>
+      <w:r>
+        <w:rPr/>
+        <w:t>“Nobody will ask,” said Sosia. “Everybody’s too busy asking about everybody else.” But he said it gently, for him, and he gave back the smaller half of the bread.</w:t>
+      </w:r>
+    </w:p>
+    <w:p>
+      <w:pPr>
+        <w:spacing w:before="200"/>
+      </w:pPr>
+      <w:r>
+        <w:rPr/>
+        <w:t>Twice the Price</w:t>
+      </w:r>
+    </w:p>
+    <w:p>
+      <w:r>
+        <w:rPr/>
+        <w:t>The carter wanted the money first, and Seius gave it to him first, because there was no way to make a carter trust you that did not end with a carter knowing too much.</w:t>
+      </w:r>
+    </w:p>
+    <w:p>
+      <w:r>
+        <w:rPr/>
+        <w:t>Gavius lay under sacks of chaff in the bed of the cart with his knees up. Dromo had led the mule round from the stable, Seius’s own mule, the good one, and backed it between the shafts himself, and now he stood at the house door in a cap he had never worn before, holding a purse he kept looking at.</w:t>
+      </w:r>
+    </w:p>
+    <w:p>
+      <w:r>
+        <w:rPr/>
+        <w:t>“You could stay,” Seius said to him. “As a freedman. On wages.”</w:t>
+      </w:r>
+    </w:p>
+    <w:p>
+      <w:r>
+        <w:rPr/>
+        <w:t>“I’ll stay till he’s through the gate,” said Dromo. “After that I want my own door.”</w:t>
+      </w:r>
+    </w:p>
+    <w:p>
+      <w:r>
+        <w:rPr/>
+        <w:t>Seius walked beside the cart. A master walking beside a load of chaff looked strange, but a master riding on it looked stranger, and a master staying home while his mule went out before light looked like a man with something to hide. He had thought about all three for most of the night and chosen the one that let him talk.</w:t>
+      </w:r>
+    </w:p>
+    <w:p>
+      <w:r>
+        <w:rPr/>
+        <w:t>At the Capena gate there were soldiers with torches, six of them, and a decurion with a tablet. They stopped every cart. They were bored, which was the only hope Seius had.</w:t>
+      </w:r>
+    </w:p>
+    <w:p>
+      <w:r>
+        <w:rPr/>
+        <w:t>“Chaff,” said the carter. “For the villa at Bovillae.”</w:t>
+      </w:r>
+    </w:p>
+    <w:p>
+      <w:r>
+        <w:rPr/>
+        <w:t>The decurion lifted his torch and looked at the sacks and then at Seius. “And you?”</w:t>
+      </w:r>
+    </w:p>
+    <w:p>
+      <w:r>
+        <w:rPr/>
+        <w:t>Seius had been congratulating men for his whole adult life. He had congratulated Caesar’s friends and Caesar’s killers and Caesar’s heir, sometimes in the same week. He had done it at dinners and in doorways and on the steps of the Senate, with wine-bright eyes and his spine already planning its exit. He had always despised himself a little for how well he did it. He did it now.</w:t>
+      </w:r>
+    </w:p>
+    <w:p>
+      <w:r>
+        <w:rPr/>
+        <w:t>“I am Seius,” he said, “nephew of the Seius who gave the people grain, you’ll have heard of him, and I am up before the cocks because the triumvirs have had their first good week and I want to be at my farm before the auctions make the roads impossible. Have you eaten, soldier? You look like a man on a long watch. Three good men saving the state, and the state sends its guards out without breakfast.” He took a coin from his own purse, not Hordeonius’s, and put it in the decurion’s hand as if it were a gift between friends. “For bread. Drink to the three of them.”</w:t>
+      </w:r>
+    </w:p>
+    <w:p>
+      <w:r>
+        <w:rPr/>
+        <w:t>The decurion looked at the coin. He looked at the cart. A sack near the back moved, very slightly, as a man under it breathed.</w:t>
+      </w:r>
+    </w:p>
+    <w:p>
+      <w:r>
+        <w:rPr/>
+        <w:t>“The mule’s restless,” Seius said, and slapped its rump, and the mule, which had never been restless in its life, threw its head and stamped.</w:t>
+      </w:r>
+    </w:p>
+    <w:p>
+      <w:r>
+        <w:rPr/>
+        <w:t>“Go on,” said the decurion.</w:t>
+      </w:r>
+    </w:p>
+    <w:p>
+      <w:r>
+        <w:rPr/>
+        <w:t>Beyond the gate the road was dark between the tombs. A mile out, by a milestone, the carter stopped and Gavius sat up in the chaff with it in his hair and his eyebrows. He looked back at the walls.</w:t>
+      </w:r>
+    </w:p>
+    <w:p>
+      <w:r>
+        <w:rPr/>
+        <w:t>“There are boats,” Seius said. “Below Circeii. Pompey’s son pays twice the triumvirs’ price for any man brought to the beach alive. The carter knows. He’ll want paying twice, I expect.”</w:t>
+      </w:r>
+    </w:p>
+    <w:p>
+      <w:r>
+        <w:rPr/>
+        <w:t>“He can have it,” said Gavius. “If I get there I’ll owe Pompey’s son a head I’m still wearing.” He looked at Seius. “I called you a coward.”</w:t>
+      </w:r>
+    </w:p>
+    <w:p>
+      <w:r>
+        <w:rPr/>
+        <w:t>“You were right.”</w:t>
+      </w:r>
+    </w:p>
+    <w:p>
+      <w:r>
+        <w:rPr/>
+        <w:t>“I know I was.” Gavius pulled a straw out of his collar. “You did it anyway.”</w:t>
+      </w:r>
+    </w:p>
+    <w:p>
+      <w:r>
+        <w:rPr/>
+        <w:t>“Once,” said Seius. “Don’t tell anyone. It would ruin me.”</w:t>
+      </w:r>
+    </w:p>
+    <w:p>
+      <w:r>
+        <w:rPr/>
+        <w:t>Gavius laughed, the cracked laugh from the oil store, and the carter clicked to the mule, and the cart went on south into the dark with Seius’s good mule pulling it and not looking back.</w:t>
+      </w:r>
+    </w:p>
+    <w:p>
+      <w:r>
+        <w:rPr/>
+        <w:t>Seius walked home. It took a long time. At the gate the decurion nodded to him like an old friend. In the lane Dromo was gone, the porter’s cell swept, the cot stripped, the bar of the door left leaning against the wall so that whoever came next could put it up.</w:t>
+      </w:r>
+    </w:p>
+    <w:p>
+      <w:r>
+        <w:rPr/>
+        <w:t>Seia Prima was in the atrium. She had not slept either.</w:t>
+      </w:r>
+    </w:p>
+    <w:p>
+      <w:r>
+        <w:rPr/>
+        <w:t>“Well?” she said.</w:t>
+      </w:r>
+    </w:p>
+    <w:p>
+      <w:r>
+        <w:rPr/>
+        <w:t>He did not count faces, as he had counted them after the dinner, the faces that would lend him a mule if the wind turned. He had no mule now. He had a debt on her father’s farm and a free man’s empty cell and nothing at all to show anyone.</w:t>
+      </w:r>
+    </w:p>
+    <w:p>
+      <w:r>
+        <w:rPr/>
+        <w:t>“Gone,” he said. “South.”</w:t>
+      </w:r>
+    </w:p>
+    <w:p>
+      <w:r>
+        <w:rPr/>
+        <w:t>She came and put her hand flat on his chest, over the heart, the way she checked a jar for a crack. He almost made a joke. For once, he didn’t.</w:t>
       </w:r>
     </w:p>
     <w:p>
@@ -13002,6 +14042,472 @@
       <w:r>
         <w:rPr/>
         <w:t>His last clear thought was the petty wish that Atticus would understand the silence without needing a courier to explain it. And that the boy wouldn’t mistake silence for permission.</w:t>
+      </w:r>
+    </w:p>
+    <w:p>
+      <w:pPr>
+        <w:spacing w:before="200"/>
+      </w:pPr>
+      <w:r>
+        <w:rPr/>
+        <w:t>Brothers</w:t>
+      </w:r>
+    </w:p>
+    <w:p>
+      <w:r>
+        <w:rPr/>
+        <w:t>Plancus triumphed over the Gauls in a cold that made the trumpets crack.</w:t>
+      </w:r>
+    </w:p>
+    <w:p>
+      <w:r>
+        <w:rPr/>
+        <w:t>Laberius stood on the Sacred Way with Vibius and two men from the old tent, shoulder to shoulder with bakers and clerks and men in good cloaks who did not look at anybody. They were the boy’s soldiers now, the four of them, quartered outside the walls with the rest of his legions, and nobody had asked them to march. It was not their triumph. It was Plancus’s, and in two days it would be Lepidus’s, and the soldiers of both men had been drinking since before light.</w:t>
+      </w:r>
+    </w:p>
+    <w:p>
+      <w:r>
+        <w:rPr/>
+        <w:t>The carts went by with the spoils: shields, a gilt boar, tablets with the names of tribes Laberius had never heard of painted in red. Then the captives, not many. Then the lictors, their rods wound with laurel. Then Plancus in the chariot with his face painted red like Jupiter’s, his eyes fixed on the Capitol, a slave behind him holding the gold crown over his head and saying the thing slaves said into a general’s ear on his triumph. Laberius had always wondered whether they really said it, or only moved their lips.</w:t>
+      </w:r>
+    </w:p>
+    <w:p>
+      <w:r>
+        <w:rPr/>
+        <w:t>Behind the chariot came the legions, and the legions were singing.</w:t>
+      </w:r>
+    </w:p>
+    <w:p>
+      <w:r>
+        <w:rPr/>
+        <w:t>They sang the old songs first, the filthy ones about the general’s debts and the general’s women, because that was the custom and the general had to smile. Then, somewhere in the third cohort, a new verse started, and it went up the column faster than a fire up a thatch, and by the time the eagle came past Laberius the whole legion had it.</w:t>
+      </w:r>
+    </w:p>
+    <w:p>
+      <w:r>
+        <w:rPr>
+          <w:i/>
+        </w:rPr>
+        <w:t>De germanis, non de Gallis, duo triumphant consules.</w:t>
+      </w:r>
+    </w:p>
+    <w:p>
+      <w:r>
+        <w:rPr/>
+        <w:t>The man beside Laberius, a clerk by his ink, snorted and then looked round to see whether anybody had heard him snort.</w:t>
+      </w:r>
+    </w:p>
+    <w:p>
+      <w:r>
+        <w:rPr/>
+        <w:t>“What is it?” said one of the tent men. His Latin was for orders and prices.</w:t>
+      </w:r>
+    </w:p>
+    <w:p>
+      <w:r>
+        <w:rPr/>
+        <w:t>“Germani,” Vibius said. “Germans. Or brothers. Same word. ‘Not over the Gauls but over their brothers, the two consuls triumph.’” He did not laugh. He was counting the column. “Plancus put his brother on the list. Lepidus put his. That’s the joke.”</w:t>
+      </w:r>
+    </w:p>
+    <w:p>
+      <w:r>
+        <w:rPr/>
+        <w:t>Laberius knew about Lepidus’s brother. Paullus had got away; the camp said he had reached the coast and Brutus’s people, and that Lepidus’s soldiers had let him go because they could not face their general across the dinner table if they brought his brother’s head to it. Plancus’s brother had not got away. The story had come up from Salernum in the mouths of carters. Plotius had hidden on his estate there, and the soldiers had come and found nothing, and taken his slaves and put them to the question, and the slaves had said nothing at all, for days, while it went on. Then the soldiers smelled perfume. Plotius had always worn too much of it, a scent from the East that cost more than a slave. They followed it to the cupboard. Some said he had come out of his own accord, to stop what was being done to his people. Some said the smell came out first. Either way he was dead, and his brother was in a red-painted chariot going up to thank Jupiter.</w:t>
+      </w:r>
+    </w:p>
+    <w:p>
+      <w:r>
+        <w:rPr/>
+        <w:t xml:space="preserve">The legion sang it again. </w:t>
+      </w:r>
+      <w:r>
+        <w:rPr>
+          <w:i/>
+        </w:rPr>
+        <w:t>De germanis, non de Gallis.</w:t>
+      </w:r>
+      <w:r>
+        <w:rPr/>
+        <w:t xml:space="preserve"> Plancus, in the chariot, kept his eyes on the Capitol.</w:t>
+      </w:r>
+    </w:p>
+    <w:p>
+      <w:r>
+        <w:rPr/>
+        <w:t>“His own men,” said the clerk, quietly, to nobody.</w:t>
+      </w:r>
+    </w:p>
+    <w:p>
+      <w:r>
+        <w:rPr/>
+        <w:t>“That’s what a triumph’s for,” Vibius said. “One day a year you can say it to his face.” He spat to the side. “Tomorrow you can’t.”</w:t>
+      </w:r>
+    </w:p>
+    <w:p>
+      <w:r>
+        <w:rPr/>
+        <w:t>When the eagle had passed and the crowd began to break up behind the last cohort, Vibius took Laberius by the elbow and pulled him into the mouth of an alley that smelled of piss and cabbage.</w:t>
+      </w:r>
+    </w:p>
+    <w:p>
+      <w:r>
+        <w:rPr/>
+        <w:t>“There’s a man in the tombs on the Appian Way,” he said. “A praetorian. Was a praetor, anyway. A carter saw a woman take bread out there three nights running. Five of us are going tonight. Old Mutina hands.”</w:t>
+      </w:r>
+    </w:p>
+    <w:p>
+      <w:r>
+        <w:rPr/>
+        <w:t>Laberius looked at him.</w:t>
+      </w:r>
+    </w:p>
+    <w:p>
+      <w:r>
+        <w:rPr/>
+        <w:t>“Twenty-five thousand,” Vibius said. “Split five ways, that’s still five thousand each. That’s Capua. That’s Capua twice. That’s a plough and an ox and a roof, and you never have to stand in another line in front of another clerk with a thumb on your name.”</w:t>
+      </w:r>
+    </w:p>
+    <w:p>
+      <w:r>
+        <w:rPr/>
+        <w:t>“And the woman with the bread?”</w:t>
+      </w:r>
+    </w:p>
+    <w:p>
+      <w:r>
+        <w:rPr/>
+        <w:t>“She’s not on the list.”</w:t>
+      </w:r>
+    </w:p>
+    <w:p>
+      <w:r>
+        <w:rPr/>
+        <w:t>“The slaves at Salernum weren’t on the list,” Laberius said.</w:t>
+      </w:r>
+    </w:p>
+    <w:p>
+      <w:r>
+        <w:rPr/>
+        <w:t>Vibius let go of his elbow. “Don’t make it philosophy. You hate philosophy.”</w:t>
+      </w:r>
+    </w:p>
+    <w:p>
+      <w:r>
+        <w:rPr/>
+        <w:t>“I do.” Laberius looked down at his boots, the same boots, resoled twice since Mutina. “I fight for the man on my left. I don’t dig him out of a tomb for a clerk to count.”</w:t>
+      </w:r>
+    </w:p>
+    <w:p>
+      <w:r>
+        <w:rPr/>
+        <w:t>“He isn’t on your left. He’s a praetor. He’d have voted your land to his cousins.”</w:t>
+      </w:r>
+    </w:p>
+    <w:p>
+      <w:r>
+        <w:rPr/>
+        <w:t>“Probably.”</w:t>
+      </w:r>
+    </w:p>
+    <w:p>
+      <w:r>
+        <w:rPr/>
+        <w:t>“Then come.”</w:t>
+      </w:r>
+    </w:p>
+    <w:p>
+      <w:r>
+        <w:rPr/>
+        <w:t>Laberius thought about it honestly, because Vibius deserved honesty. Five thousand denarii. He thought of the twine and the dirt near Capua that was always a matter for after. He thought about digging in the cold among the dead, and the woman’s bread, and the smell of a frightened man in a tomb. He thought about Plancus’s face, painted red, not moving while his own men sang.</w:t>
+      </w:r>
+    </w:p>
+    <w:p>
+      <w:r>
+        <w:rPr/>
+        <w:t>“No,” he said.</w:t>
+      </w:r>
+    </w:p>
+    <w:p>
+      <w:r>
+        <w:rPr/>
+        <w:t>Vibius looked at him for a long moment. Then he shrugged the shrug they had both learned in Spain, the one that meant the other man was a fool and would probably live longer for it.</w:t>
+      </w:r>
+    </w:p>
+    <w:p>
+      <w:r>
+        <w:rPr/>
+        <w:t>“Win,” Vibius said. “Then count.”</w:t>
+      </w:r>
+    </w:p>
+    <w:p>
+      <w:r>
+        <w:rPr/>
+        <w:t>“You count,” said Laberius. “I’ll be at the brazier.”</w:t>
+      </w:r>
+    </w:p>
+    <w:p>
+      <w:r>
+        <w:rPr/>
+        <w:t>Vibius went. Laberius walked back out through the gate alone, in the cold, past the end of the procession where the soldiers were still singing, and found that the tune was stuck in his head. It was a good tune. He hummed it all the way to the camp, without the words.</w:t>
+      </w:r>
+    </w:p>
+    <w:p>
+      <w:pPr>
+        <w:spacing w:before="200"/>
+      </w:pPr>
+      <w:r>
+        <w:rPr/>
+        <w:t>The Daughter of Hortensius</w:t>
+      </w:r>
+    </w:p>
+    <w:p>
+      <w:r>
+        <w:rPr/>
+        <w:t>The women came to the Carinae in the middle of the morning, more of them than the vestibule could hold, and Nysa saw them first because she was on her knees scrubbing the threshold.</w:t>
+      </w:r>
+    </w:p>
+    <w:p>
+      <w:r>
+        <w:rPr/>
+        <w:t>They were not the kind of women who walked. They came in litters and got out of them at the corner, as if walking the last stretch were part of what they had come to say. Old women and young, matrons in good wool with their hair dressed high, a few with a slave girl each and most without. The doorkeeper looked at them the way a man looks at weather coming over a hill.</w:t>
+      </w:r>
+    </w:p>
+    <w:p>
+      <w:r>
+        <w:rPr/>
+        <w:t>There was an edict. The whole city knew it, and the Carinae kitchen had known it a day sooner. Fourteen hundred of the richest women in Rome to declare their property, and pay what the triumvirs assessed for the war against the men in the East. Any who hid anything to be fined. Informers rewarded. The kitchen had laughed at that last part, because by now informers were rewarded for everything.</w:t>
+      </w:r>
+    </w:p>
+    <w:p>
+      <w:r>
+        <w:rPr/>
+        <w:t>A woman at the front spoke to the doorkeeper. She was perhaps forty, tall, plain, with a voice that carried without being raised.</w:t>
+      </w:r>
+    </w:p>
+    <w:p>
+      <w:r>
+        <w:rPr/>
+        <w:t>“We have been to Octavia,” she said. “The triumvir’s sister received us. We have been to Julia, the triumvir’s mother. She received us. We ask to see Fulvia.”</w:t>
+      </w:r>
+    </w:p>
+    <w:p>
+      <w:r>
+        <w:rPr/>
+        <w:t>The doorkeeper went in. Nysa went on scrubbing the same stone.</w:t>
+      </w:r>
+    </w:p>
+    <w:p>
+      <w:r>
+        <w:rPr/>
+        <w:t>Fulvia came out herself. She stood in the vestibule in a house dress with a stylus still in her hand, and she looked at the women for about as long as it took to count them.</w:t>
+      </w:r>
+    </w:p>
+    <w:p>
+      <w:r>
+        <w:rPr/>
+        <w:t>“You have come to the wrong door,” she said. “I don’t make the laws in this house.” And she turned and went back in, and the doorkeeper shut the door on fourteen hundred women, or on the forty of them who had come, and Nysa was on the inside of it with her brush.</w:t>
+      </w:r>
+    </w:p>
+    <w:p>
+      <w:r>
+        <w:rPr/>
+        <w:t>Fulvia’s woman found her in the passage a little later, the one who counted the silver, the one who had asked Nysa for the true number at the games.</w:t>
+      </w:r>
+    </w:p>
+    <w:p>
+      <w:r>
+        <w:rPr/>
+        <w:t>“They’re going to the Forum,” she said. “To the tribunal. All three are sitting this morning. Go and count them. Not for the steward. For me.”</w:t>
+      </w:r>
+    </w:p>
+    <w:p>
+      <w:r>
+        <w:rPr/>
+        <w:t>The women had gone ahead. Nysa caught them in the Argiletum, and by the time they reached the Forum there were more of them, and more people following to see what the women would do, and the crowd had that quality Nysa had learned to read on the morning of the Ides: it did not know yet what it was for.</w:t>
+      </w:r>
+    </w:p>
+    <w:p>
+      <w:r>
+        <w:rPr/>
+        <w:t>The triumvirs sat on their chairs on the tribunal in a row. Lepidus in the middle, because he was consul. Antony on one side, big and bored. On the other side the boy, who was not a boy any more, in a toga with a purple border, his face still and pale.</w:t>
+      </w:r>
+    </w:p>
+    <w:p>
+      <w:r>
+        <w:rPr/>
+        <w:t>Nysa had seen him once since he came back to Rome, at a distance, in the street with the lictors in front of him. He was her patron. In law, the old man’s freedwoman belonged to the old man’s son. She owed him her duty and her vote, if she had had a vote, and her presence when he called for it, which he never had. She did not think he knew her name. She stood at the edge of the crowd and counted.</w:t>
+      </w:r>
+    </w:p>
+    <w:p>
+      <w:r>
+        <w:rPr/>
+        <w:t>The lictors stood across the front of the tribunal with their rods. The tall woman walked straight up to them, as if they were not there, and the lictors looked at each other, and somehow she was through, and the others behind her.</w:t>
+      </w:r>
+    </w:p>
+    <w:p>
+      <w:r>
+        <w:rPr/>
+        <w:t>Somebody near Nysa said, “That’s Hortensia. The orator’s girl. Hortensius.”</w:t>
+      </w:r>
+    </w:p>
+    <w:p>
+      <w:r>
+        <w:rPr/>
+        <w:t>“Who?”</w:t>
+      </w:r>
+    </w:p>
+    <w:p>
+      <w:r>
+        <w:rPr/>
+        <w:t>“Her father argued against Cicero in the courts for thirty years. Won half the time.”</w:t>
+      </w:r>
+    </w:p>
+    <w:p>
+      <w:r>
+        <w:rPr/>
+        <w:t>Hortensia did not shout. She spoke the way her father must have spoken, Nysa thought, the voice placed and let go so that it reached the back of the Forum without seeming to try.</w:t>
+      </w:r>
+    </w:p>
+    <w:p>
+      <w:r>
+        <w:rPr/>
+        <w:t>“You have already taken our fathers,” she said, “our sons, our husbands and our brothers, on the charge that they wronged you. If you take our property too, you will bring us down to a condition unworthy of our birth and our ways and our sex.”</w:t>
+      </w:r>
+    </w:p>
+    <w:p>
+      <w:r>
+        <w:rPr/>
+        <w:t>The Forum went quiet in the way it had not been quiet since the funeral.</w:t>
+      </w:r>
+    </w:p>
+    <w:p>
+      <w:r>
+        <w:rPr/>
+        <w:t>“If we have done you wrong, as you say our husbands did, proscribe us as you proscribed them. But if we women have voted none of you an enemy, nor pulled down your houses, nor destroyed your army, nor led another against you, nor kept you from office or honour, why should we share the penalty when we did not share the crime?”</w:t>
+      </w:r>
+    </w:p>
+    <w:p>
+      <w:r>
+        <w:rPr/>
+        <w:t>Antony shifted in his chair. Lepidus looked at his hands. The boy did not move at all.</w:t>
+      </w:r>
+    </w:p>
+    <w:p>
+      <w:r>
+        <w:rPr/>
+        <w:t>“Why should we pay taxes,” said Hortensia, “when we have no part in the honours, the commands, the statecraft, for which you fight each other with such harm to us all?”</w:t>
+      </w:r>
+    </w:p>
+    <w:p>
+      <w:r>
+        <w:rPr/>
+        <w:t>A man near Nysa laughed, and then stopped laughing because nobody else had.</w:t>
+      </w:r>
+    </w:p>
+    <w:p>
+      <w:r>
+        <w:rPr/>
+        <w:t>Hortensia went on. She spoke of the women of the old wars who had given their gold freely when Hannibal was at the gates, and how they had given it of their own will, not from their land, not under assessment by informers. Nysa stopped listening to the words after a while and listened to the voice instead. She had heard Antony speak over Caesar’s body and heard the crowd turn under it like a ship. This was not that. This voice did not turn anybody. It simply stood in the middle of the Forum and would not get out of the way.</w:t>
+      </w:r>
+    </w:p>
+    <w:p>
+      <w:r>
+        <w:rPr>
+          <w:i/>
+        </w:rPr>
+        <w:t>No part in the honours.</w:t>
+      </w:r>
+      <w:r>
+        <w:rPr/>
+        <w:t xml:space="preserve"> Nysa had no honours and no property, and no husband or son to lose. She owned two tunics, a comb, a cracked oil flask she had stolen back from a steward, and her duty to a pale man on a chair who did not know her name. If there was a list below the bottom of all the lists, she was on it. She found that she did not mind as much as she had expected. Nobody was going to tax her.</w:t>
+      </w:r>
+    </w:p>
+    <w:p>
+      <w:r>
+        <w:rPr/>
+        <w:t>The triumvirs were angry. Nysa saw it go along the row like a lamp passed from hand to hand. Antony said something to the lictors, and the lictors stepped forward with their rods to drive the women off the tribunal.</w:t>
+      </w:r>
+    </w:p>
+    <w:p>
+      <w:r>
+        <w:rPr/>
+        <w:t xml:space="preserve">The crowd made a noise. Nysa had never heard it make that noise before. It was not a roar. It was lower and uglier, the sound of a lot of men who had lost brothers and fathers in the last six weeks discovering that they all minded the same thing at once. Somewhere behind her someone shouted </w:t>
+      </w:r>
+      <w:r>
+        <w:rPr>
+          <w:i/>
+        </w:rPr>
+        <w:t>Shame!</w:t>
+      </w:r>
+      <w:r>
+        <w:rPr/>
+        <w:t xml:space="preserve"> and someone else took it up, and the lictors stopped with their rods half raised and looked back at the tribunal.</w:t>
+      </w:r>
+    </w:p>
+    <w:p>
+      <w:r>
+        <w:rPr/>
+        <w:t>Lepidus stood up and said that the matter would be considered tomorrow.</w:t>
+      </w:r>
+    </w:p>
+    <w:p>
+      <w:r>
+        <w:rPr/>
+        <w:t>The women left the Forum the way they had come, walking. The crowd let them through.</w:t>
+      </w:r>
+    </w:p>
+    <w:p>
+      <w:r>
+        <w:rPr/>
+        <w:t>Nysa had counted forty-one at the Carinae door, and three hundred and something by the time they reached the tribunal, though the count had grown too fast to be sure past the first hundred. She held the numbers ready, the way she had held the count at the games.</w:t>
+      </w:r>
+    </w:p>
+    <w:p>
+      <w:r>
+        <w:rPr/>
+        <w:t>At the corner of the Argiletum a hand caught her sleeve. Medullina, from the Subura, older and thinner, with chalk on her fingers.</w:t>
+      </w:r>
+    </w:p>
+    <w:p>
+      <w:r>
+        <w:rPr/>
+        <w:t>“You were in it,” Medullina said. “You came from that way. From his house. Who was she? The tall one. Give me her name.”</w:t>
+      </w:r>
+    </w:p>
+    <w:p>
+      <w:r>
+        <w:rPr/>
+        <w:t>For years Medullina had wanted names from her, senators’ names, the names of men in rooms, and for years Nysa had given her chickens. This month the walls were full of names and Medullina sold them by the spelling.</w:t>
+      </w:r>
+    </w:p>
+    <w:p>
+      <w:r>
+        <w:rPr/>
+        <w:t>“Hortensia,” Nysa said. “The daughter of Hortensius.”</w:t>
+      </w:r>
+    </w:p>
+    <w:p>
+      <w:r>
+        <w:rPr/>
+        <w:t>Medullina stared at her, waiting for the price.</w:t>
+      </w:r>
+    </w:p>
+    <w:p>
+      <w:r>
+        <w:rPr/>
+        <w:t>“It’s free,” said Nysa. “Everyone in the Forum is saying it.” And she pulled her sleeve away and went back up the hill.</w:t>
+      </w:r>
+    </w:p>
+    <w:p>
+      <w:r>
+        <w:rPr/>
+        <w:t>The next day it was given out that the list of women was cut from fourteen hundred to four hundred, and that men with more than a hundred thousand would pay instead. The kitchen talked about nothing else. The cook said it was the first time in living memory the three of them had taken a step back. The steward said it was arithmetic. The boy who could read said Lucius Caesar was off the lists too, and had been since before the Saturnalia, after his sister stood in front of this same tribunal and said she had hidden him and would go with him if he went. Nysa had heard the beginning of that, at a door, with a jug in her hand.</w:t>
+      </w:r>
+    </w:p>
+    <w:p>
+      <w:r>
+        <w:rPr/>
+        <w:t>She gave Fulvia’s woman the true number, as near as she could make it. Fulvia’s woman wrote it down and did not thank her. Nysa found she had not wanted thanks.</w:t>
       </w:r>
     </w:p>
     <w:p>

</xml_diff>

<commit_message>
Regenerate Book 1 docx
Co-Authored-By: Claude Opus 5.5 (1M context) <noreply@anthropic.com>
Claude-Session: https://claude.ai/code/session_01QzTnAQdqzqWqU7hcRERq1c
</commit_message>
<xml_diff>
--- a/exports/Ides_Book1_FULL_Ch01-34.docx
+++ b/exports/Ides_Book1_FULL_Ch01-34.docx
@@ -27,7 +27,7 @@
         <w:br/>
         <w:t>Book 1 reading export · Utica prologue, then Ch 1 dinner · ends at Philippi · author-voice (no em dash)</w:t>
         <w:br/>
-        <w:t>Source: Manuscript 8e225b8 (2026-10-24) · generated 2026-10-24 00:39 UTC from main @ 8e225b8 · source digest 5c3de913daee824a · prologue and chapters 1–34</w:t>
+        <w:t>Source: Manuscript 064e923 (2026-10-24) · generated 2026-10-24 00:46 UTC from claude/project-thread-v93zm0 @ 064e923 · source digest 973011a1c0f0636f · prologue and chapters 1–34</w:t>
       </w:r>
     </w:p>
     <w:p>
@@ -2540,7 +2540,7 @@
     <w:p>
       <w:r>
         <w:rPr/>
-        <w:t>“Two a year,” a young senator’s agent muttered. “Elected. Each to check the other. That was the consulship. Now he names them two years ahead because he will be in Parthia at election time, and we are to cheer the list.” He held up a tablet with the names already on it, passed hand to hand round the Forum like a price list for a game nobody had been invited to play. “It is not fair.”</w:t>
+        <w:t>“Two a year,” a young senator’s agent muttered. “My master’s father stood for it three times and bought half the Velabrum doing it. Now he names them two years ahead because he will be in Parthia at election time, and we are to cheer the list.” He held up a tablet with the names already on it, passed hand to hand round the Forum like a price list for a game nobody had been invited to play. “It is not fair.”</w:t>
       </w:r>
     </w:p>
     <w:p>
@@ -3022,13 +3022,13 @@
     <w:p>
       <w:r>
         <w:rPr/>
-        <w:t>“Galba,” Brutus said. “He had a legion for Caesar in Gaul.”</w:t>
-      </w:r>
-    </w:p>
-    <w:p>
-      <w:r>
-        <w:rPr/>
-        <w:t>“And was passed over for a consulship he thinks he earned. He has not forgotten it. Ligarius fought for Pompey in Africa and lives under his pardon like a man under a roof he thinks is rotten.” Cassius left the rest to what Brutus already knew.</w:t>
+        <w:t>“Galba carried a legion for Caesar in Gaul,” Brutus said. “Why would Galba?”</w:t>
+      </w:r>
+    </w:p>
+    <w:p>
+      <w:r>
+        <w:rPr/>
+        <w:t>“Ask him how long he has waited for the consulship he thinks Caesar owes him. And you have watched Ligarius since the pardon. He lives under it like a man under a roof he thinks is rotten.”</w:t>
       </w:r>
     </w:p>
     <w:p>
@@ -4318,7 +4318,13 @@
     <w:p>
       <w:r>
         <w:rPr/>
-        <w:t>“Capys founded Capua,” she said, pleased with the name. “In the old days. And Trojan blood is the Julii, everyone knows they come down from Aeneas. Balbus swears the find is real.”</w:t>
+        <w:t>“Who’s Capys?” said Dama.</w:t>
+      </w:r>
+    </w:p>
+    <w:p>
+      <w:r>
+        <w:rPr/>
+        <w:t>“Founded Capua, in the old days,” she said, pleased to have the name and a boy who lacked it. “And Trojan blood is the Julii. Even you know they come down from Aeneas. Balbus swears the find is real.”</w:t>
       </w:r>
     </w:p>
     <w:p>
@@ -8616,7 +8622,7 @@
     <w:p>
       <w:r>
         <w:rPr/>
-        <w:t>“You and Cassius,” Decimus said. “Macedonia for you, Syria for him, where Caesar marked you, where the legions are, and as far from the Forum as a man can sit. I take the nearer knife. Someone has to hold a road in Italy.”</w:t>
+        <w:t>“You and Cassius,” Decimus said. “How in Hades do two men stab the giver and keep the gift? Macedonia and Syria, still yours on his paper. Go and sit in them. That is where the legions are, and as far from the Forum as a man can sit. I take the nearer knife. Someone has to hold a road in Italy.”</w:t>
       </w:r>
     </w:p>
     <w:p>
@@ -9982,7 +9988,7 @@
     <w:p>
       <w:r>
         <w:rPr/>
-        <w:t>“Brutus’s sea house,” Sosia said, “a day down the coast. He’s sitting there out of Rome’s reach, and his mother has moved her clerks in after him.”</w:t>
+        <w:t>“Brutus’s sea house,” Sosia said. “Where else does a praetor sit when he can’t walk the Forum? His mother has moved her clerks in after him.”</w:t>
       </w:r>
     </w:p>
     <w:p>
@@ -10425,7 +10431,7 @@
     <w:p>
       <w:r>
         <w:rPr/>
-        <w:t>Brutus asked Cicero to speak as if speech could still be strategy. He had a tablet on his knee with the Senate’s seal broken, and he tapped it once. “Grain buyers,” he said. “Asia for me, Sicily for Cassius. A praetor’s excuse to be out of Rome past ten nights, and a merchant’s errand to dress it.” The room held Porcia’s severity, Tertulla’s stillness, Favonius’s moral cough, and Servilia, who listened the way bankers listened to interest. Servilia had married that daughter to Cassius. One family, both knives; Cicero had always admired the economy. Favonius he remembered barefoot behind Cato in the Forum, copying the old man’s feet, and remembered the story that he had told Brutus last winter that a civil war was worse than a king. Nobody had handed him a dagger in March. He had come to Antium anyway, to cough. A steward, Hilarus if Cicero’s memory of names still worked, poured wine that nobody truly tasted.</w:t>
+        <w:t>Brutus asked Cicero to speak as if speech could still be strategy. He had a tablet on his knee with the Senate’s seal broken, and he tapped it once. “You have read more decrees than the Senate ever wrote, Cicero. Tell me how this one reads.” He did not wait. “Grain buyers. Corn factors with a praetor’s ring.” The room held Porcia’s severity, Tertulla’s stillness, Favonius’s moral cough, and Servilia, who listened the way bankers listened to interest. Servilia had married that daughter to Cassius. One family, both knives; Cicero had always admired the economy. Favonius he remembered barefoot behind Cato in the Forum, copying the old man’s feet, and remembered the story that he had told Brutus last winter that a civil war was worse than a king. Nobody had handed him a dagger in March. He had come to Antium anyway, to cough. A steward, Hilarus if Cicero’s memory of names still worked, poured wine that nobody truly tasted.</w:t>
       </w:r>
     </w:p>
     <w:p>
@@ -11893,7 +11899,7 @@
     <w:p>
       <w:r>
         <w:rPr/>
-        <w:t>“Hirtius will come when he can sit a horse,” Antony said. “Pansa will come when he has taught enough farm boys which end of a pilum goes forward. Neither of them is consul until the Kalends, and neither of them is here. Until then you have hinges and hope, and hope won’t fill a granary.” He glanced once at Mutina’s wall. “You killed a man who trusted your cheer. Do not ask me to trust your legality.”</w:t>
+        <w:t>“I have drunk with Hirtius,” Antony said. “He will come when his physician lets him, and write it up beautifully after. Pansa will come when he has finished counting. Neither of them is consul until the Kalends, and neither of them is here. Until then you have hinges and hope, and hope won’t fill a granary.” He glanced once at Mutina’s wall. “You killed a man who trusted your cheer. Do not ask me to trust your legality.”</w:t>
       </w:r>
     </w:p>
     <w:p>
@@ -12004,7 +12010,7 @@
     <w:p>
       <w:r>
         <w:rPr/>
-        <w:t>The consuls’ chairs had new men in them. Antony’s year was over; Antony was in a ditch outside Mutina. Hirtius sat wrapped too warmly, the spring’s sickness still in his cheekbones. Octavian had read his last book of the Gallic war at Apollonia and privately thought it better than the dead man’s. Pansa sat beside him, broad and plain, a list of recruits and pay open on his knee before the auspices were cold. Cicero called them the Senate’s swords. Cicero wanted a third blade to go with them.</w:t>
+        <w:t>The consuls’ chairs had new men in them. Antony’s year was over; Antony was in a ditch outside Mutina. Hirtius sat wrapped too warmly, the spring’s sickness still in his cheekbones. Octavian had read his last book of the Gallic war at Apollonia and privately thought it better than the dead man’s. Pansa sat beside him, broad and plain, a list of recruits and pay open on his knee before the auspices were cold. Cicero had two consuls and wanted a third blade to go with them.</w:t>
       </w:r>
     </w:p>
     <w:p>
@@ -13223,7 +13229,7 @@
     <w:p>
       <w:r>
         <w:rPr/>
-        <w:t>Lepidus wanted the law first, because Lepidus always wanted the law first. “A tribune carries it in Rome,” he said. “Three men for setting the state in order. Five years. A consul’s power for each of us, and no veto over any of it.”</w:t>
+        <w:t>Lepidus wanted the law first, because Lepidus always wanted the law first. They had haggled it by letter for a month, and he read it out anyway, as if a thing were not agreed until he had heard it in his own voice. “A tribune carries it in Rome. Three men for setting the state in order. Five years. A consul’s power for each of us, and no veto over any of it.”</w:t>
       </w:r>
     </w:p>
     <w:p>

</xml_diff>